<commit_message>
Primi Casi d'uso e bozza RAD in docx
</commit_message>
<xml_diff>
--- a/Documents/01_NovaBiblioteca_ProblemStatement.docx
+++ b/Documents/01_NovaBiblioteca_ProblemStatement.docx
@@ -154,7 +154,7 @@
           <w:b/>
           <w:sz w:val="36"/>
         </w:rPr>
-        <w:t>3</w:t>
+        <w:t>4</w:t>
       </w:r>
     </w:p>
     <w:p>
@@ -396,13 +396,13 @@
         <w:rPr>
           <w:sz w:val="32"/>
         </w:rPr>
-        <w:t>1</w:t>
+        <w:t>2</w:t>
       </w:r>
       <w:r>
         <w:rPr>
           <w:sz w:val="32"/>
         </w:rPr>
-        <w:t>4</w:t>
+        <w:t>3</w:t>
       </w:r>
       <w:r>
         <w:rPr>
@@ -1780,6 +1780,13 @@
                 <w:sz w:val="20"/>
               </w:rPr>
             </w:pPr>
+            <w:r>
+              <w:rPr>
+                <w:rFonts w:asciiTheme="minorHAnsi" w:hAnsiTheme="minorHAnsi"/>
+                <w:sz w:val="20"/>
+              </w:rPr>
+              <w:t>23/10/2026</w:t>
+            </w:r>
           </w:p>
         </w:tc>
         <w:tc>
@@ -1800,6 +1807,13 @@
                 <w:sz w:val="20"/>
               </w:rPr>
             </w:pPr>
+            <w:r>
+              <w:rPr>
+                <w:rFonts w:asciiTheme="minorHAnsi" w:hAnsiTheme="minorHAnsi"/>
+                <w:sz w:val="20"/>
+              </w:rPr>
+              <w:t>0.4</w:t>
+            </w:r>
           </w:p>
         </w:tc>
         <w:tc>
@@ -1820,6 +1834,13 @@
                 <w:sz w:val="20"/>
               </w:rPr>
             </w:pPr>
+            <w:r>
+              <w:rPr>
+                <w:rFonts w:asciiTheme="minorHAnsi" w:hAnsiTheme="minorHAnsi"/>
+                <w:sz w:val="20"/>
+              </w:rPr>
+              <w:t>Modifica scenari Problem Statement</w:t>
+            </w:r>
           </w:p>
         </w:tc>
         <w:tc>
@@ -1841,6 +1862,13 @@
                 <w:sz w:val="20"/>
               </w:rPr>
             </w:pPr>
+            <w:r>
+              <w:rPr>
+                <w:rFonts w:asciiTheme="minorHAnsi" w:hAnsiTheme="minorHAnsi"/>
+                <w:sz w:val="20"/>
+              </w:rPr>
+              <w:t>Tutti i partecipanti</w:t>
+            </w:r>
           </w:p>
         </w:tc>
       </w:tr>
@@ -2261,7 +2289,7 @@
         <w:rPr>
           <w:noProof/>
         </w:rPr>
-        <w:instrText xml:space="preserve"> PAGEREF _Toc242888475 \h </w:instrText>
+        <w:instrText xml:space="preserve"> PAGEREF _Toc243652268 \h </w:instrText>
       </w:r>
       <w:r>
         <w:rPr>
@@ -2339,7 +2367,7 @@
         <w:rPr>
           <w:noProof/>
         </w:rPr>
-        <w:instrText xml:space="preserve"> PAGEREF _Toc242888476 \h </w:instrText>
+        <w:instrText xml:space="preserve"> PAGEREF _Toc243652269 \h </w:instrText>
       </w:r>
       <w:r>
         <w:rPr>
@@ -2417,7 +2445,7 @@
         <w:rPr>
           <w:noProof/>
         </w:rPr>
-        <w:instrText xml:space="preserve"> PAGEREF _Toc242888477 \h </w:instrText>
+        <w:instrText xml:space="preserve"> PAGEREF _Toc243652270 \h </w:instrText>
       </w:r>
       <w:r>
         <w:rPr>
@@ -2476,7 +2504,7 @@
         <w:rPr>
           <w:noProof/>
         </w:rPr>
-        <w:instrText xml:space="preserve"> PAGEREF _Toc242888478 \h </w:instrText>
+        <w:instrText xml:space="preserve"> PAGEREF _Toc243652271 \h </w:instrText>
       </w:r>
       <w:r>
         <w:rPr>
@@ -2535,7 +2563,7 @@
         <w:rPr>
           <w:noProof/>
         </w:rPr>
-        <w:instrText xml:space="preserve"> PAGEREF _Toc242888479 \h </w:instrText>
+        <w:instrText xml:space="preserve"> PAGEREF _Toc243652272 \h </w:instrText>
       </w:r>
       <w:r>
         <w:rPr>
@@ -2594,7 +2622,7 @@
         <w:rPr>
           <w:noProof/>
         </w:rPr>
-        <w:instrText xml:space="preserve"> PAGEREF _Toc242888480 \h </w:instrText>
+        <w:instrText xml:space="preserve"> PAGEREF _Toc243652273 \h </w:instrText>
       </w:r>
       <w:r>
         <w:rPr>
@@ -2653,7 +2681,7 @@
         <w:rPr>
           <w:noProof/>
         </w:rPr>
-        <w:instrText xml:space="preserve"> PAGEREF _Toc242888481 \h </w:instrText>
+        <w:instrText xml:space="preserve"> PAGEREF _Toc243652274 \h </w:instrText>
       </w:r>
       <w:r>
         <w:rPr>
@@ -2712,7 +2740,7 @@
         <w:rPr>
           <w:noProof/>
         </w:rPr>
-        <w:instrText xml:space="preserve"> PAGEREF _Toc242888482 \h </w:instrText>
+        <w:instrText xml:space="preserve"> PAGEREF _Toc243652275 \h </w:instrText>
       </w:r>
       <w:r>
         <w:rPr>
@@ -2771,7 +2799,7 @@
         <w:rPr>
           <w:noProof/>
         </w:rPr>
-        <w:instrText xml:space="preserve"> PAGEREF _Toc242888483 \h </w:instrText>
+        <w:instrText xml:space="preserve"> PAGEREF _Toc243652276 \h </w:instrText>
       </w:r>
       <w:r>
         <w:rPr>
@@ -2830,7 +2858,7 @@
         <w:rPr>
           <w:noProof/>
         </w:rPr>
-        <w:instrText xml:space="preserve"> PAGEREF _Toc242888484 \h </w:instrText>
+        <w:instrText xml:space="preserve"> PAGEREF _Toc243652277 \h </w:instrText>
       </w:r>
       <w:r>
         <w:rPr>
@@ -2889,7 +2917,7 @@
         <w:rPr>
           <w:noProof/>
         </w:rPr>
-        <w:instrText xml:space="preserve"> PAGEREF _Toc242888485 \h </w:instrText>
+        <w:instrText xml:space="preserve"> PAGEREF _Toc243652278 \h </w:instrText>
       </w:r>
       <w:r>
         <w:rPr>
@@ -2948,7 +2976,7 @@
         <w:rPr>
           <w:noProof/>
         </w:rPr>
-        <w:instrText xml:space="preserve"> PAGEREF _Toc242888486 \h </w:instrText>
+        <w:instrText xml:space="preserve"> PAGEREF _Toc243652279 \h </w:instrText>
       </w:r>
       <w:r>
         <w:rPr>
@@ -2965,7 +2993,7 @@
         <w:rPr>
           <w:noProof/>
         </w:rPr>
-        <w:t>6</w:t>
+        <w:t>7</w:t>
       </w:r>
       <w:r>
         <w:rPr>
@@ -3007,7 +3035,7 @@
         <w:rPr>
           <w:noProof/>
         </w:rPr>
-        <w:instrText xml:space="preserve"> PAGEREF _Toc242888487 \h </w:instrText>
+        <w:instrText xml:space="preserve"> PAGEREF _Toc243652280 \h </w:instrText>
       </w:r>
       <w:r>
         <w:rPr>
@@ -3066,7 +3094,7 @@
         <w:rPr>
           <w:noProof/>
         </w:rPr>
-        <w:instrText xml:space="preserve"> PAGEREF _Toc242888488 \h </w:instrText>
+        <w:instrText xml:space="preserve"> PAGEREF _Toc243652281 \h </w:instrText>
       </w:r>
       <w:r>
         <w:rPr>
@@ -3125,7 +3153,7 @@
         <w:rPr>
           <w:noProof/>
         </w:rPr>
-        <w:instrText xml:space="preserve"> PAGEREF _Toc242888489 \h </w:instrText>
+        <w:instrText xml:space="preserve"> PAGEREF _Toc243652282 \h </w:instrText>
       </w:r>
       <w:r>
         <w:rPr>
@@ -3184,7 +3212,7 @@
         <w:rPr>
           <w:noProof/>
         </w:rPr>
-        <w:instrText xml:space="preserve"> PAGEREF _Toc242888490 \h </w:instrText>
+        <w:instrText xml:space="preserve"> PAGEREF _Toc243652283 \h </w:instrText>
       </w:r>
       <w:r>
         <w:rPr>
@@ -3243,7 +3271,7 @@
         <w:rPr>
           <w:noProof/>
         </w:rPr>
-        <w:instrText xml:space="preserve"> PAGEREF _Toc242888491 \h </w:instrText>
+        <w:instrText xml:space="preserve"> PAGEREF _Toc243652284 \h </w:instrText>
       </w:r>
       <w:r>
         <w:rPr>
@@ -3261,6 +3289,301 @@
           <w:noProof/>
         </w:rPr>
         <w:t>7</w:t>
+      </w:r>
+      <w:r>
+        <w:rPr>
+          <w:noProof/>
+        </w:rPr>
+        <w:fldChar w:fldCharType="end"/>
+      </w:r>
+    </w:p>
+    <w:p>
+      <w:pPr>
+        <w:pStyle w:val="TOC3"/>
+        <w:rPr>
+          <w:rFonts w:asciiTheme="minorHAnsi" w:eastAsiaTheme="minorEastAsia" w:hAnsiTheme="minorHAnsi" w:cstheme="minorBidi"/>
+          <w:noProof/>
+          <w:kern w:val="2"/>
+          <w14:ligatures w14:val="standardContextual"/>
+        </w:rPr>
+      </w:pPr>
+      <w:r>
+        <w:rPr>
+          <w:rFonts w:asciiTheme="minorHAnsi" w:hAnsiTheme="minorHAnsi"/>
+          <w:noProof/>
+        </w:rPr>
+        <w:t>1.2.15. Scenario 15 – Modifica di un edizione presente nel catalogo</w:t>
+      </w:r>
+      <w:r>
+        <w:rPr>
+          <w:noProof/>
+        </w:rPr>
+        <w:tab/>
+      </w:r>
+      <w:r>
+        <w:rPr>
+          <w:noProof/>
+        </w:rPr>
+        <w:fldChar w:fldCharType="begin"/>
+      </w:r>
+      <w:r>
+        <w:rPr>
+          <w:noProof/>
+        </w:rPr>
+        <w:instrText xml:space="preserve"> PAGEREF _Toc243652285 \h </w:instrText>
+      </w:r>
+      <w:r>
+        <w:rPr>
+          <w:noProof/>
+        </w:rPr>
+      </w:r>
+      <w:r>
+        <w:rPr>
+          <w:noProof/>
+        </w:rPr>
+        <w:fldChar w:fldCharType="separate"/>
+      </w:r>
+      <w:r>
+        <w:rPr>
+          <w:noProof/>
+        </w:rPr>
+        <w:t>8</w:t>
+      </w:r>
+      <w:r>
+        <w:rPr>
+          <w:noProof/>
+        </w:rPr>
+        <w:fldChar w:fldCharType="end"/>
+      </w:r>
+    </w:p>
+    <w:p>
+      <w:pPr>
+        <w:pStyle w:val="TOC3"/>
+        <w:rPr>
+          <w:rFonts w:asciiTheme="minorHAnsi" w:eastAsiaTheme="minorEastAsia" w:hAnsiTheme="minorHAnsi" w:cstheme="minorBidi"/>
+          <w:noProof/>
+          <w:kern w:val="2"/>
+          <w14:ligatures w14:val="standardContextual"/>
+        </w:rPr>
+      </w:pPr>
+      <w:r>
+        <w:rPr>
+          <w:rFonts w:asciiTheme="minorHAnsi" w:hAnsiTheme="minorHAnsi"/>
+          <w:noProof/>
+        </w:rPr>
+        <w:t>1.2.16. Scenario 16 – Modifica delle informazioni di un account lettore</w:t>
+      </w:r>
+      <w:r>
+        <w:rPr>
+          <w:noProof/>
+        </w:rPr>
+        <w:tab/>
+      </w:r>
+      <w:r>
+        <w:rPr>
+          <w:noProof/>
+        </w:rPr>
+        <w:fldChar w:fldCharType="begin"/>
+      </w:r>
+      <w:r>
+        <w:rPr>
+          <w:noProof/>
+        </w:rPr>
+        <w:instrText xml:space="preserve"> PAGEREF _Toc243652286 \h </w:instrText>
+      </w:r>
+      <w:r>
+        <w:rPr>
+          <w:noProof/>
+        </w:rPr>
+      </w:r>
+      <w:r>
+        <w:rPr>
+          <w:noProof/>
+        </w:rPr>
+        <w:fldChar w:fldCharType="separate"/>
+      </w:r>
+      <w:r>
+        <w:rPr>
+          <w:noProof/>
+        </w:rPr>
+        <w:t>8</w:t>
+      </w:r>
+      <w:r>
+        <w:rPr>
+          <w:noProof/>
+        </w:rPr>
+        <w:fldChar w:fldCharType="end"/>
+      </w:r>
+    </w:p>
+    <w:p>
+      <w:pPr>
+        <w:pStyle w:val="TOC3"/>
+        <w:rPr>
+          <w:rFonts w:asciiTheme="minorHAnsi" w:eastAsiaTheme="minorEastAsia" w:hAnsiTheme="minorHAnsi" w:cstheme="minorBidi"/>
+          <w:noProof/>
+          <w:kern w:val="2"/>
+          <w14:ligatures w14:val="standardContextual"/>
+        </w:rPr>
+      </w:pPr>
+      <w:r>
+        <w:rPr>
+          <w:rFonts w:asciiTheme="minorHAnsi" w:hAnsiTheme="minorHAnsi"/>
+          <w:noProof/>
+        </w:rPr>
+        <w:t>1.2.17. Scenario 17 – Richiesta di modifica della password dell’account</w:t>
+      </w:r>
+      <w:r>
+        <w:rPr>
+          <w:noProof/>
+        </w:rPr>
+        <w:tab/>
+      </w:r>
+      <w:r>
+        <w:rPr>
+          <w:noProof/>
+        </w:rPr>
+        <w:fldChar w:fldCharType="begin"/>
+      </w:r>
+      <w:r>
+        <w:rPr>
+          <w:noProof/>
+        </w:rPr>
+        <w:instrText xml:space="preserve"> PAGEREF _Toc243652287 \h </w:instrText>
+      </w:r>
+      <w:r>
+        <w:rPr>
+          <w:noProof/>
+        </w:rPr>
+      </w:r>
+      <w:r>
+        <w:rPr>
+          <w:noProof/>
+        </w:rPr>
+        <w:fldChar w:fldCharType="separate"/>
+      </w:r>
+      <w:r>
+        <w:rPr>
+          <w:noProof/>
+        </w:rPr>
+        <w:t>8</w:t>
+      </w:r>
+      <w:r>
+        <w:rPr>
+          <w:noProof/>
+        </w:rPr>
+        <w:fldChar w:fldCharType="end"/>
+      </w:r>
+    </w:p>
+    <w:p>
+      <w:pPr>
+        <w:pStyle w:val="TOC3"/>
+        <w:rPr>
+          <w:rFonts w:asciiTheme="minorHAnsi" w:eastAsiaTheme="minorEastAsia" w:hAnsiTheme="minorHAnsi" w:cstheme="minorBidi"/>
+          <w:noProof/>
+          <w:kern w:val="2"/>
+          <w14:ligatures w14:val="standardContextual"/>
+        </w:rPr>
+      </w:pPr>
+      <w:r>
+        <w:rPr>
+          <w:rFonts w:asciiTheme="minorHAnsi" w:hAnsiTheme="minorHAnsi"/>
+          <w:noProof/>
+        </w:rPr>
+        <w:t>1.2.18. Scenario 18 – Registrazione di una sospensione</w:t>
+      </w:r>
+      <w:r>
+        <w:rPr>
+          <w:noProof/>
+        </w:rPr>
+        <w:tab/>
+      </w:r>
+      <w:r>
+        <w:rPr>
+          <w:noProof/>
+        </w:rPr>
+        <w:fldChar w:fldCharType="begin"/>
+      </w:r>
+      <w:r>
+        <w:rPr>
+          <w:noProof/>
+        </w:rPr>
+        <w:instrText xml:space="preserve"> PAGEREF _Toc243652288 \h </w:instrText>
+      </w:r>
+      <w:r>
+        <w:rPr>
+          <w:noProof/>
+        </w:rPr>
+      </w:r>
+      <w:r>
+        <w:rPr>
+          <w:noProof/>
+        </w:rPr>
+        <w:fldChar w:fldCharType="separate"/>
+      </w:r>
+      <w:r>
+        <w:rPr>
+          <w:noProof/>
+        </w:rPr>
+        <w:t>8</w:t>
+      </w:r>
+      <w:r>
+        <w:rPr>
+          <w:noProof/>
+        </w:rPr>
+        <w:fldChar w:fldCharType="end"/>
+      </w:r>
+    </w:p>
+    <w:p>
+      <w:pPr>
+        <w:pStyle w:val="TOC3"/>
+        <w:rPr>
+          <w:rFonts w:asciiTheme="minorHAnsi" w:eastAsiaTheme="minorEastAsia" w:hAnsiTheme="minorHAnsi" w:cstheme="minorBidi"/>
+          <w:noProof/>
+          <w:kern w:val="2"/>
+          <w14:ligatures w14:val="standardContextual"/>
+        </w:rPr>
+      </w:pPr>
+      <w:r>
+        <w:rPr>
+          <w:rFonts w:asciiTheme="minorHAnsi" w:hAnsiTheme="minorHAnsi"/>
+          <w:noProof/>
+        </w:rPr>
+        <w:t>1.2.19. Scenario 19 – Annullamento di una sospensione in anticipo</w:t>
+      </w:r>
+      <w:r>
+        <w:rPr>
+          <w:noProof/>
+        </w:rPr>
+        <w:tab/>
+      </w:r>
+      <w:r>
+        <w:rPr>
+          <w:noProof/>
+        </w:rPr>
+        <w:fldChar w:fldCharType="begin"/>
+      </w:r>
+      <w:r>
+        <w:rPr>
+          <w:noProof/>
+        </w:rPr>
+        <w:instrText xml:space="preserve"> PAGEREF _Toc243652289 \h </w:instrText>
+      </w:r>
+      <w:r>
+        <w:rPr>
+          <w:noProof/>
+        </w:rPr>
+      </w:r>
+      <w:r>
+        <w:rPr>
+          <w:noProof/>
+        </w:rPr>
+        <w:fldChar w:fldCharType="separate"/>
+      </w:r>
+      <w:r>
+        <w:rPr>
+          <w:noProof/>
+        </w:rPr>
+        <w:t>9</w:t>
       </w:r>
       <w:r>
         <w:rPr>
@@ -3321,7 +3644,7 @@
         <w:rPr>
           <w:noProof/>
         </w:rPr>
-        <w:instrText xml:space="preserve"> PAGEREF _Toc242888492 \h </w:instrText>
+        <w:instrText xml:space="preserve"> PAGEREF _Toc243652290 \h </w:instrText>
       </w:r>
       <w:r>
         <w:rPr>
@@ -3338,7 +3661,7 @@
         <w:rPr>
           <w:noProof/>
         </w:rPr>
-        <w:t>8</w:t>
+        <w:t>9</w:t>
       </w:r>
       <w:r>
         <w:rPr>
@@ -3399,7 +3722,7 @@
         <w:rPr>
           <w:noProof/>
         </w:rPr>
-        <w:instrText xml:space="preserve"> PAGEREF _Toc242888493 \h </w:instrText>
+        <w:instrText xml:space="preserve"> PAGEREF _Toc243652291 \h </w:instrText>
       </w:r>
       <w:r>
         <w:rPr>
@@ -3416,7 +3739,7 @@
         <w:rPr>
           <w:noProof/>
         </w:rPr>
-        <w:t>9</w:t>
+        <w:t>10</w:t>
       </w:r>
       <w:r>
         <w:rPr>
@@ -3477,7 +3800,7 @@
         <w:rPr>
           <w:noProof/>
         </w:rPr>
-        <w:instrText xml:space="preserve"> PAGEREF _Toc242888494 \h </w:instrText>
+        <w:instrText xml:space="preserve"> PAGEREF _Toc243652292 \h </w:instrText>
       </w:r>
       <w:r>
         <w:rPr>
@@ -3494,7 +3817,7 @@
         <w:rPr>
           <w:noProof/>
         </w:rPr>
-        <w:t>10</w:t>
+        <w:t>11</w:t>
       </w:r>
       <w:r>
         <w:rPr>
@@ -3555,7 +3878,7 @@
         <w:rPr>
           <w:noProof/>
         </w:rPr>
-        <w:instrText xml:space="preserve"> PAGEREF _Toc242888495 \h </w:instrText>
+        <w:instrText xml:space="preserve"> PAGEREF _Toc243652293 \h </w:instrText>
       </w:r>
       <w:r>
         <w:rPr>
@@ -3572,7 +3895,7 @@
         <w:rPr>
           <w:noProof/>
         </w:rPr>
-        <w:t>10</w:t>
+        <w:t>11</w:t>
       </w:r>
       <w:r>
         <w:rPr>
@@ -3626,7 +3949,7 @@
           <w:rFonts w:asciiTheme="minorHAnsi" w:hAnsiTheme="minorHAnsi"/>
         </w:rPr>
       </w:pPr>
-      <w:bookmarkStart w:id="0" w:name="_Toc242888475"/>
+      <w:bookmarkStart w:id="0" w:name="_Toc243652268"/>
       <w:r>
         <w:rPr>
           <w:rFonts w:asciiTheme="minorHAnsi" w:hAnsiTheme="minorHAnsi"/>
@@ -3646,7 +3969,7 @@
           <w:iCs w:val="0"/>
         </w:rPr>
       </w:pPr>
-      <w:bookmarkStart w:id="1" w:name="_Toc242888476"/>
+      <w:bookmarkStart w:id="1" w:name="_Toc243652269"/>
       <w:r>
         <w:rPr>
           <w:rFonts w:ascii="Aptos" w:hAnsi="Aptos"/>
@@ -4203,7 +4526,7 @@
           <w:iCs w:val="0"/>
         </w:rPr>
       </w:pPr>
-      <w:bookmarkStart w:id="2" w:name="_Toc242888477"/>
+      <w:bookmarkStart w:id="2" w:name="_Toc243652270"/>
       <w:r>
         <w:rPr>
           <w:rFonts w:asciiTheme="minorHAnsi" w:hAnsiTheme="minorHAnsi"/>
@@ -4222,7 +4545,7 @@
           <w:rFonts w:asciiTheme="minorHAnsi" w:hAnsiTheme="minorHAnsi"/>
         </w:rPr>
       </w:pPr>
-      <w:bookmarkStart w:id="3" w:name="_Toc242888478"/>
+      <w:bookmarkStart w:id="3" w:name="_Toc243652271"/>
       <w:r>
         <w:rPr>
           <w:rFonts w:asciiTheme="minorHAnsi" w:hAnsiTheme="minorHAnsi"/>
@@ -4474,7 +4797,7 @@
           <w:rFonts w:asciiTheme="minorHAnsi" w:hAnsiTheme="minorHAnsi"/>
         </w:rPr>
       </w:pPr>
-      <w:bookmarkStart w:id="4" w:name="_Toc242888479"/>
+      <w:bookmarkStart w:id="4" w:name="_Toc243652272"/>
       <w:r>
         <w:rPr>
           <w:rFonts w:asciiTheme="minorHAnsi" w:hAnsiTheme="minorHAnsi"/>
@@ -4743,7 +5066,7 @@
           <w:rFonts w:ascii="Aptos" w:hAnsi="Aptos"/>
         </w:rPr>
       </w:pPr>
-      <w:bookmarkStart w:id="5" w:name="_Toc242888480"/>
+      <w:bookmarkStart w:id="5" w:name="_Toc243652273"/>
       <w:r>
         <w:rPr>
           <w:rFonts w:ascii="Aptos" w:hAnsi="Aptos"/>
@@ -4973,7 +5296,7 @@
           <w:rFonts w:asciiTheme="minorHAnsi" w:hAnsiTheme="minorHAnsi"/>
         </w:rPr>
       </w:pPr>
-      <w:bookmarkStart w:id="6" w:name="_Toc242888481"/>
+      <w:bookmarkStart w:id="6" w:name="_Toc243652274"/>
       <w:r>
         <w:rPr>
           <w:rFonts w:asciiTheme="minorHAnsi" w:hAnsiTheme="minorHAnsi"/>
@@ -5104,7 +5427,7 @@
           <w:rFonts w:ascii="Aptos" w:hAnsi="Aptos"/>
         </w:rPr>
       </w:pPr>
-      <w:bookmarkStart w:id="7" w:name="_Toc242888482"/>
+      <w:bookmarkStart w:id="7" w:name="_Toc243652275"/>
       <w:r>
         <w:rPr>
           <w:rFonts w:ascii="Aptos" w:hAnsi="Aptos"/>
@@ -5304,7 +5627,7 @@
           <w:rFonts w:asciiTheme="minorHAnsi" w:hAnsiTheme="minorHAnsi"/>
         </w:rPr>
       </w:pPr>
-      <w:bookmarkStart w:id="8" w:name="_Toc242888483"/>
+      <w:bookmarkStart w:id="8" w:name="_Toc243652276"/>
       <w:r>
         <w:rPr>
           <w:rFonts w:asciiTheme="minorHAnsi" w:hAnsiTheme="minorHAnsi"/>
@@ -5493,7 +5816,7 @@
           <w:rFonts w:asciiTheme="minorHAnsi" w:hAnsiTheme="minorHAnsi"/>
         </w:rPr>
       </w:pPr>
-      <w:bookmarkStart w:id="9" w:name="_Toc242888484"/>
+      <w:bookmarkStart w:id="9" w:name="_Toc243652277"/>
       <w:r>
         <w:rPr>
           <w:rFonts w:asciiTheme="minorHAnsi" w:hAnsiTheme="minorHAnsi"/>
@@ -5617,7 +5940,7 @@
           <w:rFonts w:asciiTheme="minorHAnsi" w:hAnsiTheme="minorHAnsi"/>
         </w:rPr>
       </w:pPr>
-      <w:bookmarkStart w:id="10" w:name="_Toc242888485"/>
+      <w:bookmarkStart w:id="10" w:name="_Toc243652278"/>
       <w:r>
         <w:rPr>
           <w:rFonts w:asciiTheme="minorHAnsi" w:hAnsiTheme="minorHAnsi"/>
@@ -5760,7 +6083,7 @@
           <w:rFonts w:asciiTheme="minorHAnsi" w:hAnsiTheme="minorHAnsi"/>
         </w:rPr>
       </w:pPr>
-      <w:bookmarkStart w:id="11" w:name="_Toc242888486"/>
+      <w:bookmarkStart w:id="11" w:name="_Toc243652279"/>
       <w:r>
         <w:rPr>
           <w:rFonts w:asciiTheme="minorHAnsi" w:hAnsiTheme="minorHAnsi"/>
@@ -5933,7 +6256,7 @@
           <w:rFonts w:asciiTheme="minorHAnsi" w:hAnsiTheme="minorHAnsi"/>
         </w:rPr>
       </w:pPr>
-      <w:bookmarkStart w:id="12" w:name="_Toc242888487"/>
+      <w:bookmarkStart w:id="12" w:name="_Toc243652280"/>
       <w:r>
         <w:rPr>
           <w:rFonts w:asciiTheme="minorHAnsi" w:hAnsiTheme="minorHAnsi"/>
@@ -6134,7 +6457,7 @@
           <w:rFonts w:asciiTheme="minorHAnsi" w:hAnsiTheme="minorHAnsi"/>
         </w:rPr>
       </w:pPr>
-      <w:bookmarkStart w:id="13" w:name="_Toc242888488"/>
+      <w:bookmarkStart w:id="13" w:name="_Toc243652281"/>
       <w:r>
         <w:rPr>
           <w:rFonts w:asciiTheme="minorHAnsi" w:hAnsiTheme="minorHAnsi"/>
@@ -6290,31 +6613,7 @@
         <w:rPr>
           <w:rFonts w:asciiTheme="minorHAnsi" w:hAnsiTheme="minorHAnsi"/>
         </w:rPr>
-        <w:t xml:space="preserve">, </w:t>
-      </w:r>
-      <w:r>
-        <w:rPr>
-          <w:rFonts w:asciiTheme="minorHAnsi" w:hAnsiTheme="minorHAnsi"/>
-        </w:rPr>
-        <w:t>e una copia</w:t>
-      </w:r>
-      <w:r>
-        <w:rPr>
-          <w:rFonts w:asciiTheme="minorHAnsi" w:hAnsiTheme="minorHAnsi"/>
-        </w:rPr>
-        <w:t>, a cui il sistema assegnerà un identificativo,</w:t>
-      </w:r>
-      <w:r>
-        <w:rPr>
-          <w:rFonts w:asciiTheme="minorHAnsi" w:hAnsiTheme="minorHAnsi"/>
-        </w:rPr>
-        <w:t xml:space="preserve"> risulterà</w:t>
-      </w:r>
-      <w:r>
-        <w:rPr>
-          <w:rFonts w:asciiTheme="minorHAnsi" w:hAnsiTheme="minorHAnsi"/>
-        </w:rPr>
-        <w:t xml:space="preserve"> disponibile nel catalogo.</w:t>
+        <w:t>.</w:t>
       </w:r>
     </w:p>
     <w:p>
@@ -6325,7 +6624,7 @@
           <w:rFonts w:asciiTheme="minorHAnsi" w:hAnsiTheme="minorHAnsi"/>
         </w:rPr>
       </w:pPr>
-      <w:bookmarkStart w:id="14" w:name="_Toc242888489"/>
+      <w:bookmarkStart w:id="14" w:name="_Toc243652282"/>
       <w:r>
         <w:rPr>
           <w:rFonts w:asciiTheme="minorHAnsi" w:hAnsiTheme="minorHAnsi"/>
@@ -6461,18 +6760,6 @@
         <w:rPr>
           <w:rFonts w:asciiTheme="minorHAnsi" w:hAnsiTheme="minorHAnsi"/>
         </w:rPr>
-        <w:t>,</w:t>
-      </w:r>
-      <w:r>
-        <w:rPr>
-          <w:rFonts w:asciiTheme="minorHAnsi" w:hAnsiTheme="minorHAnsi"/>
-        </w:rPr>
-        <w:t xml:space="preserve"> e aggiorna il numero di copie disponibili</w:t>
-      </w:r>
-      <w:r>
-        <w:rPr>
-          <w:rFonts w:asciiTheme="minorHAnsi" w:hAnsiTheme="minorHAnsi"/>
-        </w:rPr>
         <w:t>.</w:t>
       </w:r>
     </w:p>
@@ -6483,7 +6770,7 @@
           <w:rFonts w:asciiTheme="minorHAnsi" w:hAnsiTheme="minorHAnsi"/>
         </w:rPr>
       </w:pPr>
-      <w:bookmarkStart w:id="15" w:name="_Toc242888490"/>
+      <w:bookmarkStart w:id="15" w:name="_Toc243652283"/>
       <w:r>
         <w:rPr>
           <w:rFonts w:asciiTheme="minorHAnsi" w:hAnsiTheme="minorHAnsi"/>
@@ -6603,46 +6890,52 @@
           <w:rFonts w:asciiTheme="minorHAnsi" w:hAnsiTheme="minorHAnsi"/>
         </w:rPr>
       </w:pPr>
-      <w:bookmarkStart w:id="16" w:name="_Toc242888491"/>
+      <w:bookmarkStart w:id="16" w:name="_Toc243652284"/>
+      <w:r>
+        <w:rPr>
+          <w:rFonts w:asciiTheme="minorHAnsi" w:hAnsiTheme="minorHAnsi"/>
+        </w:rPr>
+        <w:t xml:space="preserve">Scenario 14 – </w:t>
+      </w:r>
+      <w:r>
+        <w:rPr>
+          <w:rFonts w:asciiTheme="minorHAnsi" w:hAnsiTheme="minorHAnsi"/>
+        </w:rPr>
+        <w:t xml:space="preserve">Ricerca di informazioni su un </w:t>
+      </w:r>
+      <w:r>
+        <w:rPr>
+          <w:rFonts w:asciiTheme="minorHAnsi" w:hAnsiTheme="minorHAnsi"/>
+        </w:rPr>
+        <w:t>lettore</w:t>
+      </w:r>
+      <w:bookmarkEnd w:id="16"/>
+    </w:p>
+    <w:p>
+      <w:pPr>
+        <w:jc w:val="both"/>
+        <w:rPr>
+          <w:rFonts w:asciiTheme="minorHAnsi" w:hAnsiTheme="minorHAnsi"/>
+        </w:rPr>
+      </w:pPr>
+      <w:r>
+        <w:rPr>
+          <w:rFonts w:asciiTheme="minorHAnsi" w:hAnsiTheme="minorHAnsi"/>
+        </w:rPr>
+        <w:t xml:space="preserve">Grazia, operatrice della biblioteca, deve </w:t>
+      </w:r>
+      <w:r>
+        <w:rPr>
+          <w:rFonts w:asciiTheme="minorHAnsi" w:hAnsiTheme="minorHAnsi"/>
+        </w:rPr>
+        <w:t xml:space="preserve">ottenere delle informazioni su un lettore della </w:t>
+      </w:r>
       <w:r>
         <w:rPr>
           <w:rFonts w:asciiTheme="minorHAnsi" w:hAnsiTheme="minorHAnsi"/>
         </w:rPr>
         <w:lastRenderedPageBreak/>
-        <w:t xml:space="preserve">Scenario 14 – </w:t>
-      </w:r>
-      <w:r>
-        <w:rPr>
-          <w:rFonts w:asciiTheme="minorHAnsi" w:hAnsiTheme="minorHAnsi"/>
-        </w:rPr>
-        <w:t xml:space="preserve">Ricerca di informazioni su un </w:t>
-      </w:r>
-      <w:r>
-        <w:rPr>
-          <w:rFonts w:asciiTheme="minorHAnsi" w:hAnsiTheme="minorHAnsi"/>
-        </w:rPr>
-        <w:t>lettore</w:t>
-      </w:r>
-      <w:bookmarkEnd w:id="16"/>
-    </w:p>
-    <w:p>
-      <w:pPr>
-        <w:jc w:val="both"/>
-        <w:rPr>
-          <w:rFonts w:asciiTheme="minorHAnsi" w:hAnsiTheme="minorHAnsi"/>
-        </w:rPr>
-      </w:pPr>
-      <w:r>
-        <w:rPr>
-          <w:rFonts w:asciiTheme="minorHAnsi" w:hAnsiTheme="minorHAnsi"/>
-        </w:rPr>
-        <w:t xml:space="preserve">Grazia, operatrice della biblioteca, deve </w:t>
-      </w:r>
-      <w:r>
-        <w:rPr>
-          <w:rFonts w:asciiTheme="minorHAnsi" w:hAnsiTheme="minorHAnsi"/>
-        </w:rPr>
-        <w:t>ottenere delle informazioni su un lettore della biblioteca.</w:t>
+        <w:t>biblioteca.</w:t>
       </w:r>
     </w:p>
     <w:p>
@@ -6728,6 +7021,7 @@
           <w:rFonts w:asciiTheme="minorHAnsi" w:hAnsiTheme="minorHAnsi"/>
         </w:rPr>
       </w:pPr>
+      <w:bookmarkStart w:id="17" w:name="_Toc243652285"/>
       <w:r>
         <w:rPr>
           <w:rFonts w:asciiTheme="minorHAnsi" w:hAnsiTheme="minorHAnsi"/>
@@ -6752,6 +7046,7 @@
         </w:rPr>
         <w:t>Modifica di un edizione presente nel catalogo</w:t>
       </w:r>
+      <w:bookmarkEnd w:id="17"/>
     </w:p>
     <w:p>
       <w:pPr>
@@ -6769,79 +7064,243 @@
     <w:p>
       <w:pPr>
         <w:pStyle w:val="Heading3"/>
-      </w:pPr>
-      <w:r>
+        <w:rPr>
+          <w:rFonts w:asciiTheme="minorHAnsi" w:hAnsiTheme="minorHAnsi"/>
+        </w:rPr>
+      </w:pPr>
+      <w:bookmarkStart w:id="18" w:name="_Toc243652286"/>
+      <w:r>
+        <w:rPr>
+          <w:rFonts w:asciiTheme="minorHAnsi" w:hAnsiTheme="minorHAnsi"/>
+        </w:rPr>
+        <w:t>Scenario 16 – Modifica delle informazioni di un account lettore</w:t>
+      </w:r>
+      <w:bookmarkEnd w:id="18"/>
+    </w:p>
+    <w:p>
+      <w:pPr>
+        <w:jc w:val="both"/>
+        <w:rPr>
+          <w:rFonts w:asciiTheme="minorHAnsi" w:hAnsiTheme="minorHAnsi"/>
+        </w:rPr>
+      </w:pPr>
+      <w:r>
+        <w:rPr>
+          <w:rFonts w:asciiTheme="minorHAnsi" w:hAnsiTheme="minorHAnsi"/>
+        </w:rPr>
+        <w:t>Grazia, operatrice della biblioteca, deve modificare un’informazione associata all’account di Giuseppe, lettore registrato.</w:t>
+      </w:r>
+    </w:p>
+    <w:p>
+      <w:pPr>
+        <w:jc w:val="both"/>
+        <w:rPr>
+          <w:rFonts w:asciiTheme="minorHAnsi" w:hAnsiTheme="minorHAnsi"/>
+        </w:rPr>
+      </w:pPr>
+    </w:p>
+    <w:p>
+      <w:pPr>
+        <w:jc w:val="both"/>
+        <w:rPr>
+          <w:rFonts w:asciiTheme="minorHAnsi" w:hAnsiTheme="minorHAnsi"/>
+        </w:rPr>
+      </w:pPr>
+      <w:r>
+        <w:rPr>
+          <w:rFonts w:asciiTheme="minorHAnsi" w:hAnsiTheme="minorHAnsi"/>
+        </w:rPr>
+        <w:t>Grazia accede al sistema e ricerca il lettore tramite codice fiscale. Il sistema presenta a Grazia le sue informazioni.</w:t>
+      </w:r>
+    </w:p>
+    <w:p>
+      <w:pPr>
+        <w:jc w:val="both"/>
+        <w:rPr>
+          <w:rFonts w:asciiTheme="minorHAnsi" w:hAnsiTheme="minorHAnsi"/>
+        </w:rPr>
+      </w:pPr>
+    </w:p>
+    <w:p>
+      <w:pPr>
+        <w:jc w:val="both"/>
+        <w:rPr>
+          <w:rFonts w:asciiTheme="minorHAnsi" w:hAnsiTheme="minorHAnsi"/>
+        </w:rPr>
+      </w:pPr>
+      <w:r>
+        <w:rPr>
+          <w:rFonts w:asciiTheme="minorHAnsi" w:hAnsiTheme="minorHAnsi"/>
+        </w:rPr>
+        <w:t xml:space="preserve">Grazia procede modificando le informazioni del lettore. </w:t>
+      </w:r>
+      <w:r>
+        <w:rPr>
+          <w:rFonts w:asciiTheme="minorHAnsi" w:hAnsiTheme="minorHAnsi"/>
+        </w:rPr>
+        <w:t>Il sistema verifica la validità delle modifiche. Se sono valide, aggiorna le informazioni dell’account; altrimenti le rifiuta e segnala a Grazia i problemi riscontrati.</w:t>
+      </w:r>
+    </w:p>
+    <w:p>
+      <w:pPr>
+        <w:pStyle w:val="Heading3"/>
+        <w:rPr>
+          <w:rFonts w:asciiTheme="minorHAnsi" w:hAnsiTheme="minorHAnsi"/>
+        </w:rPr>
+      </w:pPr>
+      <w:bookmarkStart w:id="19" w:name="_Toc243652287"/>
+      <w:r>
+        <w:rPr>
+          <w:rFonts w:asciiTheme="minorHAnsi" w:hAnsiTheme="minorHAnsi"/>
+        </w:rPr>
         <w:t>Scenario 1</w:t>
       </w:r>
       <w:r>
-        <w:t>6</w:t>
-      </w:r>
-      <w:r>
-        <w:t xml:space="preserve"> – Modifica delle informazioni di un account lettore</w:t>
-      </w:r>
-    </w:p>
-    <w:p>
-      <w:pPr>
-        <w:jc w:val="both"/>
-        <w:rPr>
-          <w:rFonts w:asciiTheme="minorHAnsi" w:hAnsiTheme="minorHAnsi"/>
-        </w:rPr>
-      </w:pPr>
-      <w:r>
-        <w:rPr>
-          <w:rFonts w:asciiTheme="minorHAnsi" w:hAnsiTheme="minorHAnsi"/>
-        </w:rPr>
-        <w:t>Grazia, operatrice della biblioteca, deve modificare un’informazione associata all’account di Giuseppe, lettore registrato.</w:t>
-      </w:r>
-    </w:p>
-    <w:p>
-      <w:pPr>
-        <w:jc w:val="both"/>
-        <w:rPr>
-          <w:rFonts w:asciiTheme="minorHAnsi" w:hAnsiTheme="minorHAnsi"/>
-        </w:rPr>
-      </w:pPr>
-    </w:p>
-    <w:p>
-      <w:pPr>
-        <w:jc w:val="both"/>
-        <w:rPr>
-          <w:rFonts w:asciiTheme="minorHAnsi" w:hAnsiTheme="minorHAnsi"/>
-        </w:rPr>
-      </w:pPr>
-      <w:r>
-        <w:rPr>
-          <w:rFonts w:asciiTheme="minorHAnsi" w:hAnsiTheme="minorHAnsi"/>
-        </w:rPr>
-        <w:t>Grazia accede al sistema e ricerca il lettore tramite codice fiscale. Il sistema presenta a Grazia le sue informazioni.</w:t>
-      </w:r>
-    </w:p>
-    <w:p>
-      <w:pPr>
-        <w:jc w:val="both"/>
-        <w:rPr>
-          <w:rFonts w:asciiTheme="minorHAnsi" w:hAnsiTheme="minorHAnsi"/>
-        </w:rPr>
-      </w:pPr>
-    </w:p>
-    <w:p>
-      <w:pPr>
-        <w:jc w:val="both"/>
-        <w:rPr>
-          <w:rFonts w:asciiTheme="minorHAnsi" w:hAnsiTheme="minorHAnsi"/>
-        </w:rPr>
-      </w:pPr>
-      <w:r>
-        <w:rPr>
-          <w:rFonts w:asciiTheme="minorHAnsi" w:hAnsiTheme="minorHAnsi"/>
-        </w:rPr>
-        <w:t xml:space="preserve">Grazia procede modificando le informazioni del lettore. </w:t>
-      </w:r>
-      <w:r>
-        <w:rPr>
-          <w:rFonts w:asciiTheme="minorHAnsi" w:hAnsiTheme="minorHAnsi"/>
-        </w:rPr>
-        <w:t>Il sistema verifica la validità delle modifiche. Se sono valide, aggiorna le informazioni dell’account; altrimenti le rifiuta e segnala a Grazia i problemi riscontrati.</w:t>
+        <w:rPr>
+          <w:rFonts w:asciiTheme="minorHAnsi" w:hAnsiTheme="minorHAnsi"/>
+        </w:rPr>
+        <w:t>7</w:t>
+      </w:r>
+      <w:r>
+        <w:rPr>
+          <w:rFonts w:asciiTheme="minorHAnsi" w:hAnsiTheme="minorHAnsi"/>
+        </w:rPr>
+        <w:t xml:space="preserve"> – </w:t>
+      </w:r>
+      <w:r>
+        <w:rPr>
+          <w:rFonts w:asciiTheme="minorHAnsi" w:hAnsiTheme="minorHAnsi"/>
+        </w:rPr>
+        <w:t xml:space="preserve">Richiesta di modifica della password </w:t>
+      </w:r>
+      <w:r>
+        <w:rPr>
+          <w:rFonts w:asciiTheme="minorHAnsi" w:hAnsiTheme="minorHAnsi"/>
+        </w:rPr>
+        <w:t>dell’account</w:t>
+      </w:r>
+      <w:bookmarkEnd w:id="19"/>
+    </w:p>
+    <w:p>
+      <w:pPr>
+        <w:rPr>
+          <w:rFonts w:asciiTheme="minorHAnsi" w:hAnsiTheme="minorHAnsi"/>
+        </w:rPr>
+      </w:pPr>
+      <w:r>
+        <w:rPr>
+          <w:rFonts w:asciiTheme="minorHAnsi" w:hAnsiTheme="minorHAnsi"/>
+        </w:rPr>
+        <w:t>Alessandro, lettore registrato, si reca in biblioteca per richiedere una modifica della password del proprio account.</w:t>
+      </w:r>
+    </w:p>
+    <w:p>
+      <w:pPr>
+        <w:rPr>
+          <w:rFonts w:asciiTheme="minorHAnsi" w:hAnsiTheme="minorHAnsi"/>
+        </w:rPr>
+      </w:pPr>
+    </w:p>
+    <w:p>
+      <w:pPr>
+        <w:rPr>
+          <w:rFonts w:asciiTheme="minorHAnsi" w:hAnsiTheme="minorHAnsi"/>
+        </w:rPr>
+      </w:pPr>
+      <w:r>
+        <w:rPr>
+          <w:rFonts w:asciiTheme="minorHAnsi" w:hAnsiTheme="minorHAnsi"/>
+        </w:rPr>
+        <w:t xml:space="preserve">Grazia, operatrice della biblioteca, </w:t>
+      </w:r>
+      <w:r>
+        <w:rPr>
+          <w:rFonts w:asciiTheme="minorHAnsi" w:hAnsiTheme="minorHAnsi"/>
+        </w:rPr>
+        <w:t>accede al sistema e ricerca il lettore tramite codice fiscale. Il sistema presenta a Grazia le informazioni che riguardano il lettore, e se è registrato, mostrerà anche un’opzione che consente di resettare la password dell’account di Alessandro.</w:t>
+      </w:r>
+    </w:p>
+    <w:p>
+      <w:pPr>
+        <w:rPr>
+          <w:rFonts w:asciiTheme="minorHAnsi" w:hAnsiTheme="minorHAnsi"/>
+        </w:rPr>
+      </w:pPr>
+    </w:p>
+    <w:p>
+      <w:pPr>
+        <w:rPr>
+          <w:rFonts w:asciiTheme="minorHAnsi" w:hAnsiTheme="minorHAnsi"/>
+        </w:rPr>
+      </w:pPr>
+      <w:r>
+        <w:rPr>
+          <w:rFonts w:asciiTheme="minorHAnsi" w:hAnsiTheme="minorHAnsi"/>
+        </w:rPr>
+        <w:t xml:space="preserve">Una </w:t>
+      </w:r>
+      <w:r>
+        <w:rPr>
+          <w:rFonts w:asciiTheme="minorHAnsi" w:hAnsiTheme="minorHAnsi"/>
+        </w:rPr>
+        <w:t xml:space="preserve">volta </w:t>
+      </w:r>
+      <w:r>
+        <w:rPr>
+          <w:rFonts w:asciiTheme="minorHAnsi" w:hAnsiTheme="minorHAnsi"/>
+        </w:rPr>
+        <w:t>che Grazia ha richiesto il reset, i</w:t>
+      </w:r>
+      <w:r>
+        <w:rPr>
+          <w:rFonts w:asciiTheme="minorHAnsi" w:hAnsiTheme="minorHAnsi"/>
+        </w:rPr>
+        <w:t>l sistema mostra su schermo la nuova password temporanea che</w:t>
+      </w:r>
+      <w:r>
+        <w:rPr>
+          <w:rFonts w:asciiTheme="minorHAnsi" w:hAnsiTheme="minorHAnsi"/>
+        </w:rPr>
+        <w:t xml:space="preserve"> viene</w:t>
+      </w:r>
+      <w:r>
+        <w:rPr>
+          <w:rFonts w:asciiTheme="minorHAnsi" w:hAnsiTheme="minorHAnsi"/>
+        </w:rPr>
+        <w:t xml:space="preserve"> comunica</w:t>
+      </w:r>
+      <w:r>
+        <w:rPr>
+          <w:rFonts w:asciiTheme="minorHAnsi" w:hAnsiTheme="minorHAnsi"/>
+        </w:rPr>
+        <w:t xml:space="preserve">ta </w:t>
+      </w:r>
+      <w:r>
+        <w:rPr>
+          <w:rFonts w:asciiTheme="minorHAnsi" w:hAnsiTheme="minorHAnsi"/>
+        </w:rPr>
+        <w:t>ad Alessandro.</w:t>
+      </w:r>
+    </w:p>
+    <w:p>
+      <w:pPr>
+        <w:rPr>
+          <w:rFonts w:asciiTheme="minorHAnsi" w:hAnsiTheme="minorHAnsi"/>
+        </w:rPr>
+      </w:pPr>
+    </w:p>
+    <w:p>
+      <w:pPr>
+        <w:jc w:val="both"/>
+        <w:rPr>
+          <w:rFonts w:asciiTheme="minorHAnsi" w:hAnsiTheme="minorHAnsi"/>
+        </w:rPr>
+      </w:pPr>
+      <w:r>
+        <w:rPr>
+          <w:rFonts w:asciiTheme="minorHAnsi" w:hAnsiTheme="minorHAnsi"/>
+        </w:rPr>
+        <w:t>Quando Alessandro accede al sistema tramite e-mail e password temporanea, il sistema gli chiede di scegliere una nuova password.</w:t>
       </w:r>
     </w:p>
     <w:p>
@@ -6851,6 +7310,7 @@
           <w:rFonts w:asciiTheme="minorHAnsi" w:hAnsiTheme="minorHAnsi"/>
         </w:rPr>
       </w:pPr>
+      <w:bookmarkStart w:id="20" w:name="_Toc243652288"/>
       <w:r>
         <w:rPr>
           <w:rFonts w:asciiTheme="minorHAnsi" w:hAnsiTheme="minorHAnsi"/>
@@ -6861,147 +7321,249 @@
         <w:rPr>
           <w:rFonts w:asciiTheme="minorHAnsi" w:hAnsiTheme="minorHAnsi"/>
         </w:rPr>
-        <w:t>7</w:t>
-      </w:r>
-      <w:r>
-        <w:rPr>
-          <w:rFonts w:asciiTheme="minorHAnsi" w:hAnsiTheme="minorHAnsi"/>
-        </w:rPr>
-        <w:t xml:space="preserve"> – </w:t>
-      </w:r>
-      <w:r>
-        <w:rPr>
-          <w:rFonts w:asciiTheme="minorHAnsi" w:hAnsiTheme="minorHAnsi"/>
-        </w:rPr>
-        <w:t xml:space="preserve">Richiesta di modifica della password </w:t>
-      </w:r>
-      <w:r>
-        <w:rPr>
-          <w:rFonts w:asciiTheme="minorHAnsi" w:hAnsiTheme="minorHAnsi"/>
-        </w:rPr>
-        <w:t>dell’account</w:t>
-      </w:r>
-    </w:p>
-    <w:p>
-      <w:pPr>
-        <w:rPr>
-          <w:rFonts w:asciiTheme="minorHAnsi" w:hAnsiTheme="minorHAnsi"/>
-        </w:rPr>
-      </w:pPr>
-      <w:r>
-        <w:rPr>
-          <w:rFonts w:asciiTheme="minorHAnsi" w:hAnsiTheme="minorHAnsi"/>
-        </w:rPr>
-        <w:t>Alessandro, lettore registrato, si reca in biblioteca per richiedere una modifica della password del proprio account.</w:t>
-      </w:r>
-    </w:p>
-    <w:p>
-      <w:pPr>
-        <w:rPr>
-          <w:rFonts w:asciiTheme="minorHAnsi" w:hAnsiTheme="minorHAnsi"/>
-        </w:rPr>
-      </w:pPr>
-    </w:p>
-    <w:p>
-      <w:pPr>
-        <w:rPr>
-          <w:rFonts w:asciiTheme="minorHAnsi" w:hAnsiTheme="minorHAnsi"/>
-        </w:rPr>
-      </w:pPr>
-      <w:r>
-        <w:rPr>
-          <w:rFonts w:asciiTheme="minorHAnsi" w:hAnsiTheme="minorHAnsi"/>
-        </w:rPr>
-        <w:t xml:space="preserve">Grazia, operatrice della biblioteca, </w:t>
-      </w:r>
-      <w:r>
-        <w:rPr>
-          <w:rFonts w:asciiTheme="minorHAnsi" w:hAnsiTheme="minorHAnsi"/>
-        </w:rPr>
-        <w:t>accede al sistema e ricerca il lettore tramite codice fiscale. Il sistema presenta a Grazia le informazioni che riguardano il lettore, e se è registrato, mostrerà anche un’opzione che consente di resettare la password dell’account di Alessandro.</w:t>
-      </w:r>
-    </w:p>
-    <w:p>
-      <w:pPr>
-        <w:rPr>
-          <w:rFonts w:asciiTheme="minorHAnsi" w:hAnsiTheme="minorHAnsi"/>
-        </w:rPr>
-      </w:pPr>
-    </w:p>
-    <w:p>
-      <w:pPr>
-        <w:rPr>
-          <w:rFonts w:asciiTheme="minorHAnsi" w:hAnsiTheme="minorHAnsi"/>
-        </w:rPr>
-      </w:pPr>
-      <w:r>
-        <w:rPr>
-          <w:rFonts w:asciiTheme="minorHAnsi" w:hAnsiTheme="minorHAnsi"/>
-        </w:rPr>
-        <w:t xml:space="preserve">Una </w:t>
-      </w:r>
-      <w:r>
-        <w:rPr>
-          <w:rFonts w:asciiTheme="minorHAnsi" w:hAnsiTheme="minorHAnsi"/>
-        </w:rPr>
-        <w:t xml:space="preserve">volta </w:t>
-      </w:r>
-      <w:r>
-        <w:rPr>
-          <w:rFonts w:asciiTheme="minorHAnsi" w:hAnsiTheme="minorHAnsi"/>
-        </w:rPr>
-        <w:t>che Grazia ha richiesto il reset, i</w:t>
-      </w:r>
-      <w:r>
-        <w:rPr>
-          <w:rFonts w:asciiTheme="minorHAnsi" w:hAnsiTheme="minorHAnsi"/>
-        </w:rPr>
-        <w:t>l sistema mostra su schermo la nuova password temporanea che</w:t>
-      </w:r>
-      <w:r>
-        <w:rPr>
-          <w:rFonts w:asciiTheme="minorHAnsi" w:hAnsiTheme="minorHAnsi"/>
-        </w:rPr>
-        <w:t xml:space="preserve"> viene</w:t>
-      </w:r>
-      <w:r>
-        <w:rPr>
-          <w:rFonts w:asciiTheme="minorHAnsi" w:hAnsiTheme="minorHAnsi"/>
-        </w:rPr>
-        <w:t xml:space="preserve"> comunica</w:t>
-      </w:r>
-      <w:r>
-        <w:rPr>
-          <w:rFonts w:asciiTheme="minorHAnsi" w:hAnsiTheme="minorHAnsi"/>
-        </w:rPr>
-        <w:t xml:space="preserve">ta </w:t>
-      </w:r>
-      <w:r>
-        <w:rPr>
-          <w:rFonts w:asciiTheme="minorHAnsi" w:hAnsiTheme="minorHAnsi"/>
-        </w:rPr>
-        <w:t>ad Alessandro.</w:t>
-      </w:r>
-    </w:p>
-    <w:p>
-      <w:pPr>
-        <w:rPr>
-          <w:rFonts w:asciiTheme="minorHAnsi" w:hAnsiTheme="minorHAnsi"/>
-        </w:rPr>
-      </w:pPr>
-    </w:p>
-    <w:p>
-      <w:pPr>
-        <w:jc w:val="both"/>
-        <w:rPr>
-          <w:rFonts w:asciiTheme="minorHAnsi" w:hAnsiTheme="minorHAnsi"/>
-        </w:rPr>
-      </w:pPr>
-      <w:r>
-        <w:rPr>
-          <w:rFonts w:asciiTheme="minorHAnsi" w:hAnsiTheme="minorHAnsi"/>
-        </w:rPr>
-        <w:t>Quando Alessandro accede al sistema tramite e-mail e password temporanea, il sistema gli chiede di scegliere una nuova password.</w:t>
+        <w:t>8</w:t>
+      </w:r>
+      <w:r>
+        <w:rPr>
+          <w:rFonts w:asciiTheme="minorHAnsi" w:hAnsiTheme="minorHAnsi"/>
+        </w:rPr>
+        <w:t xml:space="preserve"> – Registrazione di una sospensione</w:t>
+      </w:r>
+      <w:bookmarkEnd w:id="20"/>
+    </w:p>
+    <w:p>
+      <w:pPr>
+        <w:jc w:val="both"/>
+        <w:rPr>
+          <w:rFonts w:asciiTheme="minorHAnsi" w:hAnsiTheme="minorHAnsi"/>
+        </w:rPr>
+      </w:pPr>
+      <w:r>
+        <w:rPr>
+          <w:rFonts w:asciiTheme="minorHAnsi" w:hAnsiTheme="minorHAnsi"/>
+        </w:rPr>
+        <w:t>Mario, oper</w:t>
+      </w:r>
+      <w:r>
+        <w:rPr>
+          <w:rFonts w:asciiTheme="minorHAnsi" w:hAnsiTheme="minorHAnsi"/>
+        </w:rPr>
+        <w:t>a</w:t>
+      </w:r>
+      <w:r>
+        <w:rPr>
+          <w:rFonts w:asciiTheme="minorHAnsi" w:hAnsiTheme="minorHAnsi"/>
+        </w:rPr>
+        <w:t xml:space="preserve">tore della biblioteca, deve </w:t>
+      </w:r>
+      <w:r>
+        <w:rPr>
+          <w:rFonts w:asciiTheme="minorHAnsi" w:hAnsiTheme="minorHAnsi"/>
+        </w:rPr>
+        <w:t xml:space="preserve">inserire una </w:t>
+      </w:r>
+      <w:r>
+        <w:rPr>
+          <w:rFonts w:asciiTheme="minorHAnsi" w:hAnsiTheme="minorHAnsi"/>
+        </w:rPr>
+        <w:t xml:space="preserve">sospensione </w:t>
+      </w:r>
+      <w:r>
+        <w:rPr>
+          <w:rFonts w:asciiTheme="minorHAnsi" w:hAnsiTheme="minorHAnsi"/>
+        </w:rPr>
+        <w:t>temporanea</w:t>
+      </w:r>
+      <w:r>
+        <w:rPr>
+          <w:rFonts w:asciiTheme="minorHAnsi" w:hAnsiTheme="minorHAnsi"/>
+        </w:rPr>
+        <w:t xml:space="preserve"> a Luca, lettore della biblioteca.</w:t>
+      </w:r>
+    </w:p>
+    <w:p>
+      <w:pPr>
+        <w:jc w:val="both"/>
+        <w:rPr>
+          <w:rFonts w:asciiTheme="minorHAnsi" w:hAnsiTheme="minorHAnsi"/>
+        </w:rPr>
+      </w:pPr>
+    </w:p>
+    <w:p>
+      <w:pPr>
+        <w:jc w:val="both"/>
+        <w:rPr>
+          <w:rFonts w:asciiTheme="minorHAnsi" w:hAnsiTheme="minorHAnsi"/>
+        </w:rPr>
+      </w:pPr>
+      <w:r>
+        <w:rPr>
+          <w:rFonts w:asciiTheme="minorHAnsi" w:hAnsiTheme="minorHAnsi"/>
+        </w:rPr>
+        <w:t>Mario accede al sistema e ricerca il lettore tramite codice fiscale. Il sistema presenta a Mario le informa</w:t>
+      </w:r>
+      <w:r>
+        <w:rPr>
+          <w:rFonts w:asciiTheme="minorHAnsi" w:hAnsiTheme="minorHAnsi"/>
+        </w:rPr>
+        <w:t>z</w:t>
+      </w:r>
+      <w:r>
+        <w:rPr>
+          <w:rFonts w:asciiTheme="minorHAnsi" w:hAnsiTheme="minorHAnsi"/>
+        </w:rPr>
+        <w:t xml:space="preserve">ioni che riguardano </w:t>
+      </w:r>
+      <w:r>
+        <w:rPr>
+          <w:rFonts w:asciiTheme="minorHAnsi" w:hAnsiTheme="minorHAnsi"/>
+        </w:rPr>
+        <w:t>Luca.</w:t>
+      </w:r>
+    </w:p>
+    <w:p>
+      <w:pPr>
+        <w:jc w:val="both"/>
+        <w:rPr>
+          <w:rFonts w:asciiTheme="minorHAnsi" w:hAnsiTheme="minorHAnsi"/>
+        </w:rPr>
+      </w:pPr>
+    </w:p>
+    <w:p>
+      <w:pPr>
+        <w:jc w:val="both"/>
+        <w:rPr>
+          <w:rFonts w:asciiTheme="minorHAnsi" w:hAnsiTheme="minorHAnsi"/>
+        </w:rPr>
+      </w:pPr>
+      <w:r>
+        <w:rPr>
+          <w:rFonts w:asciiTheme="minorHAnsi" w:hAnsiTheme="minorHAnsi"/>
+        </w:rPr>
+        <w:t xml:space="preserve">Mario preme sul pulsante dedicato e </w:t>
+      </w:r>
+      <w:r>
+        <w:rPr>
+          <w:rFonts w:asciiTheme="minorHAnsi" w:hAnsiTheme="minorHAnsi"/>
+        </w:rPr>
+        <w:t>registra una sospensione a Luca</w:t>
+      </w:r>
+      <w:r>
+        <w:rPr>
+          <w:rFonts w:asciiTheme="minorHAnsi" w:hAnsiTheme="minorHAnsi"/>
+        </w:rPr>
+        <w:t>.</w:t>
+      </w:r>
+    </w:p>
+    <w:p>
+      <w:pPr>
+        <w:pStyle w:val="Heading3"/>
+        <w:rPr>
+          <w:rFonts w:asciiTheme="minorHAnsi" w:hAnsiTheme="minorHAnsi"/>
+        </w:rPr>
+      </w:pPr>
+      <w:bookmarkStart w:id="21" w:name="_Toc243652289"/>
+      <w:r>
+        <w:rPr>
+          <w:rFonts w:asciiTheme="minorHAnsi" w:hAnsiTheme="minorHAnsi"/>
+        </w:rPr>
+        <w:lastRenderedPageBreak/>
+        <w:t>Scenario 1</w:t>
+      </w:r>
+      <w:r>
+        <w:rPr>
+          <w:rFonts w:asciiTheme="minorHAnsi" w:hAnsiTheme="minorHAnsi"/>
+        </w:rPr>
+        <w:t>9</w:t>
+      </w:r>
+      <w:r>
+        <w:rPr>
+          <w:rFonts w:asciiTheme="minorHAnsi" w:hAnsiTheme="minorHAnsi"/>
+        </w:rPr>
+        <w:t xml:space="preserve"> – Annullamento di una sospensione in</w:t>
+      </w:r>
+      <w:r>
+        <w:rPr>
+          <w:rFonts w:asciiTheme="minorHAnsi" w:hAnsiTheme="minorHAnsi"/>
+        </w:rPr>
+        <w:t xml:space="preserve"> </w:t>
+      </w:r>
+      <w:r>
+        <w:rPr>
+          <w:rFonts w:asciiTheme="minorHAnsi" w:hAnsiTheme="minorHAnsi"/>
+        </w:rPr>
+        <w:t>anticipo</w:t>
+      </w:r>
+      <w:bookmarkEnd w:id="21"/>
+    </w:p>
+    <w:p>
+      <w:pPr>
+        <w:jc w:val="both"/>
+        <w:rPr>
+          <w:rFonts w:asciiTheme="minorHAnsi" w:hAnsiTheme="minorHAnsi"/>
+        </w:rPr>
+      </w:pPr>
+      <w:r>
+        <w:rPr>
+          <w:rFonts w:asciiTheme="minorHAnsi" w:hAnsiTheme="minorHAnsi"/>
+        </w:rPr>
+        <w:t>Mario, oper</w:t>
+      </w:r>
+      <w:r>
+        <w:rPr>
+          <w:rFonts w:asciiTheme="minorHAnsi" w:hAnsiTheme="minorHAnsi"/>
+        </w:rPr>
+        <w:t>a</w:t>
+      </w:r>
+      <w:r>
+        <w:rPr>
+          <w:rFonts w:asciiTheme="minorHAnsi" w:hAnsiTheme="minorHAnsi"/>
+        </w:rPr>
+        <w:t>tore della biblioteca, deve annullare una sospensione assegnata a Luca, lettore della biblioteca.</w:t>
+      </w:r>
+    </w:p>
+    <w:p>
+      <w:pPr>
+        <w:jc w:val="both"/>
+        <w:rPr>
+          <w:rFonts w:asciiTheme="minorHAnsi" w:hAnsiTheme="minorHAnsi"/>
+        </w:rPr>
+      </w:pPr>
+    </w:p>
+    <w:p>
+      <w:pPr>
+        <w:jc w:val="both"/>
+        <w:rPr>
+          <w:rFonts w:asciiTheme="minorHAnsi" w:hAnsiTheme="minorHAnsi"/>
+        </w:rPr>
+      </w:pPr>
+      <w:r>
+        <w:rPr>
+          <w:rFonts w:asciiTheme="minorHAnsi" w:hAnsiTheme="minorHAnsi"/>
+        </w:rPr>
+        <w:t>Mario accede al sistema e ricerca il lettore tramite codice fiscale. Il sistema presenta a Mario le informazioni che riguardano Luca.</w:t>
+      </w:r>
+    </w:p>
+    <w:p>
+      <w:pPr>
+        <w:jc w:val="both"/>
+        <w:rPr>
+          <w:rFonts w:asciiTheme="minorHAnsi" w:hAnsiTheme="minorHAnsi"/>
+        </w:rPr>
+      </w:pPr>
+    </w:p>
+    <w:p>
+      <w:pPr>
+        <w:jc w:val="both"/>
+        <w:rPr>
+          <w:rFonts w:asciiTheme="minorHAnsi" w:hAnsiTheme="minorHAnsi"/>
+        </w:rPr>
+      </w:pPr>
+      <w:r>
+        <w:rPr>
+          <w:rFonts w:asciiTheme="minorHAnsi" w:hAnsiTheme="minorHAnsi"/>
+        </w:rPr>
+        <w:t>Mario preme sul pulsante dedicato e sospensione di Luca sarà annullata.</w:t>
       </w:r>
     </w:p>
     <w:p>
@@ -7023,7 +7585,7 @@
           <w:iCs w:val="0"/>
         </w:rPr>
       </w:pPr>
-      <w:bookmarkStart w:id="17" w:name="_Toc242888492"/>
+      <w:bookmarkStart w:id="22" w:name="_Toc243652290"/>
       <w:r>
         <w:rPr>
           <w:rFonts w:asciiTheme="minorHAnsi" w:hAnsiTheme="minorHAnsi"/>
@@ -7040,7 +7602,7 @@
         </w:rPr>
         <w:t>funzionali</w:t>
       </w:r>
-      <w:bookmarkEnd w:id="17"/>
+      <w:bookmarkEnd w:id="22"/>
     </w:p>
     <w:p>
       <w:pPr>
@@ -7403,6 +7965,7 @@
         <w:rPr>
           <w:rFonts w:asciiTheme="minorHAnsi" w:hAnsiTheme="minorHAnsi"/>
         </w:rPr>
+        <w:lastRenderedPageBreak/>
         <w:t>In caso di prenotazione online, il sistema deve verificare che la prenotazione sia attiva e associata al lettore e alla copia da consegnare.</w:t>
       </w:r>
     </w:p>
@@ -7558,134 +8121,85 @@
           <w:b/>
           <w:bCs/>
         </w:rPr>
-        <w:t>RF11 – Registrazione della sospensione</w:t>
-      </w:r>
-    </w:p>
-    <w:p>
-      <w:pPr>
-        <w:jc w:val="both"/>
-        <w:rPr>
-          <w:rFonts w:asciiTheme="minorHAnsi" w:hAnsiTheme="minorHAnsi"/>
-        </w:rPr>
-      </w:pPr>
-      <w:r>
-        <w:rPr>
-          <w:rFonts w:asciiTheme="minorHAnsi" w:hAnsiTheme="minorHAnsi"/>
-        </w:rPr>
-        <w:lastRenderedPageBreak/>
-        <w:t>Un operatore deve poter registrare una sospensione a un lettore, indicando data di inizio e durata, aggiungendola allo storico del lettore. Per tutta la durata della sospensione, il sistema deve impedire al lettore di effettuare prenotazioni e ottenere prestiti. Inoltre</w:t>
-      </w:r>
-      <w:r>
-        <w:rPr>
-          <w:rFonts w:asciiTheme="minorHAnsi" w:hAnsiTheme="minorHAnsi"/>
-        </w:rPr>
-        <w:t>, in caso di sospensione,</w:t>
-      </w:r>
-      <w:r>
-        <w:rPr>
-          <w:rFonts w:asciiTheme="minorHAnsi" w:hAnsiTheme="minorHAnsi"/>
-        </w:rPr>
-        <w:t xml:space="preserve"> </w:t>
-      </w:r>
-      <w:r>
-        <w:rPr>
-          <w:rFonts w:asciiTheme="minorHAnsi" w:hAnsiTheme="minorHAnsi"/>
-        </w:rPr>
-        <w:t xml:space="preserve">devono essere </w:t>
-      </w:r>
-      <w:r>
-        <w:rPr>
-          <w:rFonts w:asciiTheme="minorHAnsi" w:hAnsiTheme="minorHAnsi"/>
-        </w:rPr>
-        <w:t>annullate, se ci sono, tutte le prenotazion</w:t>
-      </w:r>
-      <w:r>
-        <w:rPr>
-          <w:rFonts w:asciiTheme="minorHAnsi" w:hAnsiTheme="minorHAnsi"/>
-        </w:rPr>
-        <w:t>i</w:t>
-      </w:r>
-      <w:r>
-        <w:rPr>
-          <w:rFonts w:asciiTheme="minorHAnsi" w:hAnsiTheme="minorHAnsi"/>
-        </w:rPr>
-        <w:t xml:space="preserve"> attive </w:t>
-      </w:r>
-      <w:r>
-        <w:rPr>
-          <w:rFonts w:asciiTheme="minorHAnsi" w:hAnsiTheme="minorHAnsi"/>
-        </w:rPr>
-        <w:t>di</w:t>
-      </w:r>
-      <w:r>
-        <w:rPr>
-          <w:rFonts w:asciiTheme="minorHAnsi" w:hAnsiTheme="minorHAnsi"/>
-        </w:rPr>
-        <w:t xml:space="preserve"> quel lettore.</w:t>
-      </w:r>
-    </w:p>
-    <w:p>
-      <w:pPr>
-        <w:jc w:val="both"/>
-        <w:rPr>
-          <w:rFonts w:asciiTheme="minorHAnsi" w:hAnsiTheme="minorHAnsi"/>
-        </w:rPr>
-      </w:pPr>
-    </w:p>
-    <w:p>
-      <w:pPr>
-        <w:jc w:val="both"/>
+        <w:t>RF11 – Registrazione d</w:t>
+      </w:r>
+      <w:r>
         <w:rPr>
           <w:rFonts w:asciiTheme="minorHAnsi" w:hAnsiTheme="minorHAnsi"/>
           <w:b/>
           <w:bCs/>
         </w:rPr>
-      </w:pPr>
+        <w:t xml:space="preserve">i una </w:t>
+      </w:r>
       <w:r>
         <w:rPr>
           <w:rFonts w:asciiTheme="minorHAnsi" w:hAnsiTheme="minorHAnsi"/>
           <w:b/>
           <w:bCs/>
         </w:rPr>
-        <w:t>RF12 – Modifica informazioni lettore registrato</w:t>
-      </w:r>
-    </w:p>
-    <w:p>
-      <w:pPr>
-        <w:jc w:val="both"/>
-        <w:rPr>
-          <w:rFonts w:asciiTheme="minorHAnsi" w:hAnsiTheme="minorHAnsi"/>
-        </w:rPr>
-      </w:pPr>
-      <w:r>
-        <w:rPr>
-          <w:rFonts w:asciiTheme="minorHAnsi" w:hAnsiTheme="minorHAnsi"/>
-        </w:rPr>
-        <w:t xml:space="preserve">Il sistema deve consentire ad un operatore di modificare </w:t>
-      </w:r>
-      <w:r>
-        <w:rPr>
-          <w:rFonts w:asciiTheme="minorHAnsi" w:hAnsiTheme="minorHAnsi"/>
-        </w:rPr>
-        <w:t>nome, cognome e</w:t>
-      </w:r>
-      <w:r>
-        <w:rPr>
-          <w:rFonts w:asciiTheme="minorHAnsi" w:hAnsiTheme="minorHAnsi"/>
-        </w:rPr>
-        <w:t>d</w:t>
-      </w:r>
-      <w:r>
-        <w:rPr>
-          <w:rFonts w:asciiTheme="minorHAnsi" w:hAnsiTheme="minorHAnsi"/>
-        </w:rPr>
-        <w:t xml:space="preserve"> e-mail</w:t>
-      </w:r>
-      <w:r>
-        <w:rPr>
-          <w:rFonts w:asciiTheme="minorHAnsi" w:hAnsiTheme="minorHAnsi"/>
-        </w:rPr>
-        <w:t xml:space="preserve"> di un lettore registrato.</w:t>
+        <w:t>sospensione</w:t>
+      </w:r>
+    </w:p>
+    <w:p>
+      <w:pPr>
+        <w:jc w:val="both"/>
+        <w:rPr>
+          <w:rFonts w:asciiTheme="minorHAnsi" w:hAnsiTheme="minorHAnsi"/>
+        </w:rPr>
+      </w:pPr>
+      <w:r>
+        <w:rPr>
+          <w:rFonts w:asciiTheme="minorHAnsi" w:hAnsiTheme="minorHAnsi"/>
+        </w:rPr>
+        <w:t>Un operatore deve poter registrare una sospensione a un lettore, indicando data di inizio e durata, aggiungendola allo storico del lettore. Per tutta la durata della sospensione, il sistema deve impedire al lettore di effettuare prenotazioni e ottenere prestiti. Inoltre</w:t>
+      </w:r>
+      <w:r>
+        <w:rPr>
+          <w:rFonts w:asciiTheme="minorHAnsi" w:hAnsiTheme="minorHAnsi"/>
+        </w:rPr>
+        <w:t>, in caso di sospensione,</w:t>
+      </w:r>
+      <w:r>
+        <w:rPr>
+          <w:rFonts w:asciiTheme="minorHAnsi" w:hAnsiTheme="minorHAnsi"/>
+        </w:rPr>
+        <w:t xml:space="preserve"> </w:t>
+      </w:r>
+      <w:r>
+        <w:rPr>
+          <w:rFonts w:asciiTheme="minorHAnsi" w:hAnsiTheme="minorHAnsi"/>
+        </w:rPr>
+        <w:t xml:space="preserve">devono essere </w:t>
+      </w:r>
+      <w:r>
+        <w:rPr>
+          <w:rFonts w:asciiTheme="minorHAnsi" w:hAnsiTheme="minorHAnsi"/>
+        </w:rPr>
+        <w:t>annullate, se ci sono, tutte le prenotazion</w:t>
+      </w:r>
+      <w:r>
+        <w:rPr>
+          <w:rFonts w:asciiTheme="minorHAnsi" w:hAnsiTheme="minorHAnsi"/>
+        </w:rPr>
+        <w:t>i</w:t>
+      </w:r>
+      <w:r>
+        <w:rPr>
+          <w:rFonts w:asciiTheme="minorHAnsi" w:hAnsiTheme="minorHAnsi"/>
+        </w:rPr>
+        <w:t xml:space="preserve"> attive </w:t>
+      </w:r>
+      <w:r>
+        <w:rPr>
+          <w:rFonts w:asciiTheme="minorHAnsi" w:hAnsiTheme="minorHAnsi"/>
+        </w:rPr>
+        <w:t>di</w:t>
+      </w:r>
+      <w:r>
+        <w:rPr>
+          <w:rFonts w:asciiTheme="minorHAnsi" w:hAnsiTheme="minorHAnsi"/>
+        </w:rPr>
+        <w:t xml:space="preserve"> quel lettore.</w:t>
       </w:r>
     </w:p>
     <w:p>
@@ -7711,7 +8225,151 @@
           <w:b/>
           <w:bCs/>
         </w:rPr>
-        <w:t>RF13 – Reset della password</w:t>
+        <w:t>RF12 – Annullamento di una sospensione</w:t>
+      </w:r>
+    </w:p>
+    <w:p>
+      <w:pPr>
+        <w:jc w:val="both"/>
+        <w:rPr>
+          <w:rFonts w:asciiTheme="minorHAnsi" w:hAnsiTheme="minorHAnsi"/>
+        </w:rPr>
+      </w:pPr>
+      <w:r>
+        <w:rPr>
+          <w:rFonts w:asciiTheme="minorHAnsi" w:hAnsiTheme="minorHAnsi"/>
+        </w:rPr>
+        <w:t>Un operatore deve poter annullare</w:t>
+      </w:r>
+      <w:r>
+        <w:rPr>
+          <w:rFonts w:asciiTheme="minorHAnsi" w:hAnsiTheme="minorHAnsi"/>
+        </w:rPr>
+        <w:t xml:space="preserve"> una sospesione a un lettore assegnata in precedenza.</w:t>
+      </w:r>
+    </w:p>
+    <w:p>
+      <w:pPr>
+        <w:jc w:val="both"/>
+        <w:rPr>
+          <w:rFonts w:asciiTheme="minorHAnsi" w:hAnsiTheme="minorHAnsi"/>
+          <w:b/>
+          <w:bCs/>
+        </w:rPr>
+      </w:pPr>
+    </w:p>
+    <w:p>
+      <w:pPr>
+        <w:jc w:val="both"/>
+        <w:rPr>
+          <w:rFonts w:asciiTheme="minorHAnsi" w:hAnsiTheme="minorHAnsi"/>
+          <w:b/>
+          <w:bCs/>
+        </w:rPr>
+      </w:pPr>
+      <w:r>
+        <w:rPr>
+          <w:rFonts w:asciiTheme="minorHAnsi" w:hAnsiTheme="minorHAnsi"/>
+          <w:b/>
+          <w:bCs/>
+        </w:rPr>
+        <w:t>RF1</w:t>
+      </w:r>
+      <w:r>
+        <w:rPr>
+          <w:rFonts w:asciiTheme="minorHAnsi" w:hAnsiTheme="minorHAnsi"/>
+          <w:b/>
+          <w:bCs/>
+        </w:rPr>
+        <w:t>3</w:t>
+      </w:r>
+      <w:r>
+        <w:rPr>
+          <w:rFonts w:asciiTheme="minorHAnsi" w:hAnsiTheme="minorHAnsi"/>
+          <w:b/>
+          <w:bCs/>
+        </w:rPr>
+        <w:t xml:space="preserve"> – Modifica informazioni lettore registrato</w:t>
+      </w:r>
+    </w:p>
+    <w:p>
+      <w:pPr>
+        <w:jc w:val="both"/>
+        <w:rPr>
+          <w:rFonts w:asciiTheme="minorHAnsi" w:hAnsiTheme="minorHAnsi"/>
+        </w:rPr>
+      </w:pPr>
+      <w:r>
+        <w:rPr>
+          <w:rFonts w:asciiTheme="minorHAnsi" w:hAnsiTheme="minorHAnsi"/>
+        </w:rPr>
+        <w:t xml:space="preserve">Il sistema deve consentire ad un operatore di modificare </w:t>
+      </w:r>
+      <w:r>
+        <w:rPr>
+          <w:rFonts w:asciiTheme="minorHAnsi" w:hAnsiTheme="minorHAnsi"/>
+        </w:rPr>
+        <w:t>nome, cognome e</w:t>
+      </w:r>
+      <w:r>
+        <w:rPr>
+          <w:rFonts w:asciiTheme="minorHAnsi" w:hAnsiTheme="minorHAnsi"/>
+        </w:rPr>
+        <w:t>d</w:t>
+      </w:r>
+      <w:r>
+        <w:rPr>
+          <w:rFonts w:asciiTheme="minorHAnsi" w:hAnsiTheme="minorHAnsi"/>
+        </w:rPr>
+        <w:t xml:space="preserve"> e-mail</w:t>
+      </w:r>
+      <w:r>
+        <w:rPr>
+          <w:rFonts w:asciiTheme="minorHAnsi" w:hAnsiTheme="minorHAnsi"/>
+        </w:rPr>
+        <w:t xml:space="preserve"> di un lettore registrato.</w:t>
+      </w:r>
+    </w:p>
+    <w:p>
+      <w:pPr>
+        <w:jc w:val="both"/>
+        <w:rPr>
+          <w:rFonts w:asciiTheme="minorHAnsi" w:hAnsiTheme="minorHAnsi"/>
+        </w:rPr>
+      </w:pPr>
+    </w:p>
+    <w:p>
+      <w:pPr>
+        <w:jc w:val="both"/>
+        <w:rPr>
+          <w:rFonts w:asciiTheme="minorHAnsi" w:hAnsiTheme="minorHAnsi"/>
+          <w:b/>
+          <w:bCs/>
+        </w:rPr>
+      </w:pPr>
+      <w:r>
+        <w:rPr>
+          <w:rFonts w:asciiTheme="minorHAnsi" w:hAnsiTheme="minorHAnsi"/>
+          <w:b/>
+          <w:bCs/>
+        </w:rPr>
+        <w:t>RF1</w:t>
+      </w:r>
+      <w:r>
+        <w:rPr>
+          <w:rFonts w:asciiTheme="minorHAnsi" w:hAnsiTheme="minorHAnsi"/>
+          <w:b/>
+          <w:bCs/>
+        </w:rPr>
+        <w:t xml:space="preserve">4 </w:t>
+      </w:r>
+      <w:r>
+        <w:rPr>
+          <w:rFonts w:asciiTheme="minorHAnsi" w:hAnsiTheme="minorHAnsi"/>
+          <w:b/>
+          <w:bCs/>
+        </w:rPr>
+        <w:t>– Reset della password</w:t>
       </w:r>
     </w:p>
     <w:p>
@@ -7746,7 +8404,7 @@
           <w:iCs w:val="0"/>
         </w:rPr>
       </w:pPr>
-      <w:bookmarkStart w:id="18" w:name="_Toc242888493"/>
+      <w:bookmarkStart w:id="23" w:name="_Toc243652291"/>
       <w:r>
         <w:rPr>
           <w:rFonts w:asciiTheme="minorHAnsi" w:hAnsiTheme="minorHAnsi"/>
@@ -7755,7 +8413,7 @@
         </w:rPr>
         <w:t>Requisiti non funzionali</w:t>
       </w:r>
-      <w:bookmarkEnd w:id="18"/>
+      <w:bookmarkEnd w:id="23"/>
     </w:p>
     <w:p>
       <w:pPr>
@@ -8430,7 +9088,6 @@
           <w:b/>
           <w:bCs/>
         </w:rPr>
-        <w:lastRenderedPageBreak/>
         <w:t>RNF</w:t>
       </w:r>
       <w:r>
@@ -8695,7 +9352,7 @@
           <w:iCs w:val="0"/>
         </w:rPr>
       </w:pPr>
-      <w:bookmarkStart w:id="19" w:name="_Toc242888494"/>
+      <w:bookmarkStart w:id="24" w:name="_Toc243652292"/>
       <w:r>
         <w:rPr>
           <w:rFonts w:asciiTheme="minorHAnsi" w:hAnsiTheme="minorHAnsi"/>
@@ -8704,7 +9361,7 @@
         </w:rPr>
         <w:t>Target Environment</w:t>
       </w:r>
-      <w:bookmarkEnd w:id="19"/>
+      <w:bookmarkEnd w:id="24"/>
     </w:p>
     <w:p>
       <w:pPr>
@@ -8855,7 +9512,7 @@
           <w:iCs w:val="0"/>
         </w:rPr>
       </w:pPr>
-      <w:bookmarkStart w:id="20" w:name="_Toc242888495"/>
+      <w:bookmarkStart w:id="25" w:name="_Toc243652293"/>
       <w:r>
         <w:rPr>
           <w:rFonts w:asciiTheme="minorHAnsi" w:hAnsiTheme="minorHAnsi"/>
@@ -8880,7 +9537,7 @@
         </w:rPr>
         <w:t>eadlines</w:t>
       </w:r>
-      <w:bookmarkEnd w:id="20"/>
+      <w:bookmarkEnd w:id="25"/>
     </w:p>
     <w:p>
       <w:pPr>
@@ -11891,6 +12548,96 @@
     </w:lvlOverride>
   </w:num>
   <w:num w:numId="37" w16cid:durableId="1391685008">
+    <w:abstractNumId w:val="7"/>
+    <w:lvlOverride w:ilvl="0">
+      <w:startOverride w:val="1"/>
+    </w:lvlOverride>
+    <w:lvlOverride w:ilvl="1">
+      <w:startOverride w:val="1"/>
+    </w:lvlOverride>
+    <w:lvlOverride w:ilvl="2">
+      <w:startOverride w:val="1"/>
+    </w:lvlOverride>
+    <w:lvlOverride w:ilvl="3">
+      <w:startOverride w:val="1"/>
+    </w:lvlOverride>
+    <w:lvlOverride w:ilvl="4">
+      <w:startOverride w:val="1"/>
+    </w:lvlOverride>
+    <w:lvlOverride w:ilvl="5">
+      <w:startOverride w:val="1"/>
+    </w:lvlOverride>
+    <w:lvlOverride w:ilvl="6">
+      <w:startOverride w:val="1"/>
+    </w:lvlOverride>
+    <w:lvlOverride w:ilvl="7">
+      <w:startOverride w:val="1"/>
+    </w:lvlOverride>
+    <w:lvlOverride w:ilvl="8">
+      <w:startOverride w:val="1"/>
+    </w:lvlOverride>
+  </w:num>
+  <w:num w:numId="38" w16cid:durableId="1419904528">
+    <w:abstractNumId w:val="7"/>
+    <w:lvlOverride w:ilvl="0">
+      <w:startOverride w:val="1"/>
+    </w:lvlOverride>
+    <w:lvlOverride w:ilvl="1">
+      <w:startOverride w:val="1"/>
+    </w:lvlOverride>
+    <w:lvlOverride w:ilvl="2">
+      <w:startOverride w:val="1"/>
+    </w:lvlOverride>
+    <w:lvlOverride w:ilvl="3">
+      <w:startOverride w:val="1"/>
+    </w:lvlOverride>
+    <w:lvlOverride w:ilvl="4">
+      <w:startOverride w:val="1"/>
+    </w:lvlOverride>
+    <w:lvlOverride w:ilvl="5">
+      <w:startOverride w:val="1"/>
+    </w:lvlOverride>
+    <w:lvlOverride w:ilvl="6">
+      <w:startOverride w:val="1"/>
+    </w:lvlOverride>
+    <w:lvlOverride w:ilvl="7">
+      <w:startOverride w:val="1"/>
+    </w:lvlOverride>
+    <w:lvlOverride w:ilvl="8">
+      <w:startOverride w:val="1"/>
+    </w:lvlOverride>
+  </w:num>
+  <w:num w:numId="39" w16cid:durableId="411464407">
+    <w:abstractNumId w:val="7"/>
+    <w:lvlOverride w:ilvl="0">
+      <w:startOverride w:val="1"/>
+    </w:lvlOverride>
+    <w:lvlOverride w:ilvl="1">
+      <w:startOverride w:val="1"/>
+    </w:lvlOverride>
+    <w:lvlOverride w:ilvl="2">
+      <w:startOverride w:val="1"/>
+    </w:lvlOverride>
+    <w:lvlOverride w:ilvl="3">
+      <w:startOverride w:val="1"/>
+    </w:lvlOverride>
+    <w:lvlOverride w:ilvl="4">
+      <w:startOverride w:val="1"/>
+    </w:lvlOverride>
+    <w:lvlOverride w:ilvl="5">
+      <w:startOverride w:val="1"/>
+    </w:lvlOverride>
+    <w:lvlOverride w:ilvl="6">
+      <w:startOverride w:val="1"/>
+    </w:lvlOverride>
+    <w:lvlOverride w:ilvl="7">
+      <w:startOverride w:val="1"/>
+    </w:lvlOverride>
+    <w:lvlOverride w:ilvl="8">
+      <w:startOverride w:val="1"/>
+    </w:lvlOverride>
+  </w:num>
+  <w:num w:numId="40" w16cid:durableId="1515654663">
     <w:abstractNumId w:val="7"/>
     <w:lvlOverride w:ilvl="0">
       <w:startOverride w:val="1"/>

</xml_diff>

<commit_message>
Aggiornati Casi d'uso, aggiunto README in Documents e aggiunto RAD nei .docx
</commit_message>
<xml_diff>
--- a/Documents/01_NovaBiblioteca_ProblemStatement.docx
+++ b/Documents/01_NovaBiblioteca_ProblemStatement.docx
@@ -2289,7 +2289,7 @@
         <w:rPr>
           <w:noProof/>
         </w:rPr>
-        <w:instrText xml:space="preserve"> PAGEREF _Toc243652268 \h </w:instrText>
+        <w:instrText xml:space="preserve"> PAGEREF _Toc243674695 \h </w:instrText>
       </w:r>
       <w:r>
         <w:rPr>
@@ -2367,7 +2367,7 @@
         <w:rPr>
           <w:noProof/>
         </w:rPr>
-        <w:instrText xml:space="preserve"> PAGEREF _Toc243652269 \h </w:instrText>
+        <w:instrText xml:space="preserve"> PAGEREF _Toc243674696 \h </w:instrText>
       </w:r>
       <w:r>
         <w:rPr>
@@ -2445,7 +2445,7 @@
         <w:rPr>
           <w:noProof/>
         </w:rPr>
-        <w:instrText xml:space="preserve"> PAGEREF _Toc243652270 \h </w:instrText>
+        <w:instrText xml:space="preserve"> PAGEREF _Toc243674697 \h </w:instrText>
       </w:r>
       <w:r>
         <w:rPr>
@@ -2504,7 +2504,7 @@
         <w:rPr>
           <w:noProof/>
         </w:rPr>
-        <w:instrText xml:space="preserve"> PAGEREF _Toc243652271 \h </w:instrText>
+        <w:instrText xml:space="preserve"> PAGEREF _Toc243674698 \h </w:instrText>
       </w:r>
       <w:r>
         <w:rPr>
@@ -2563,7 +2563,7 @@
         <w:rPr>
           <w:noProof/>
         </w:rPr>
-        <w:instrText xml:space="preserve"> PAGEREF _Toc243652272 \h </w:instrText>
+        <w:instrText xml:space="preserve"> PAGEREF _Toc243674699 \h </w:instrText>
       </w:r>
       <w:r>
         <w:rPr>
@@ -2622,7 +2622,7 @@
         <w:rPr>
           <w:noProof/>
         </w:rPr>
-        <w:instrText xml:space="preserve"> PAGEREF _Toc243652273 \h </w:instrText>
+        <w:instrText xml:space="preserve"> PAGEREF _Toc243674700 \h </w:instrText>
       </w:r>
       <w:r>
         <w:rPr>
@@ -2681,7 +2681,7 @@
         <w:rPr>
           <w:noProof/>
         </w:rPr>
-        <w:instrText xml:space="preserve"> PAGEREF _Toc243652274 \h </w:instrText>
+        <w:instrText xml:space="preserve"> PAGEREF _Toc243674701 \h </w:instrText>
       </w:r>
       <w:r>
         <w:rPr>
@@ -2740,7 +2740,7 @@
         <w:rPr>
           <w:noProof/>
         </w:rPr>
-        <w:instrText xml:space="preserve"> PAGEREF _Toc243652275 \h </w:instrText>
+        <w:instrText xml:space="preserve"> PAGEREF _Toc243674702 \h </w:instrText>
       </w:r>
       <w:r>
         <w:rPr>
@@ -2799,7 +2799,7 @@
         <w:rPr>
           <w:noProof/>
         </w:rPr>
-        <w:instrText xml:space="preserve"> PAGEREF _Toc243652276 \h </w:instrText>
+        <w:instrText xml:space="preserve"> PAGEREF _Toc243674703 \h </w:instrText>
       </w:r>
       <w:r>
         <w:rPr>
@@ -2858,7 +2858,7 @@
         <w:rPr>
           <w:noProof/>
         </w:rPr>
-        <w:instrText xml:space="preserve"> PAGEREF _Toc243652277 \h </w:instrText>
+        <w:instrText xml:space="preserve"> PAGEREF _Toc243674704 \h </w:instrText>
       </w:r>
       <w:r>
         <w:rPr>
@@ -2917,7 +2917,7 @@
         <w:rPr>
           <w:noProof/>
         </w:rPr>
-        <w:instrText xml:space="preserve"> PAGEREF _Toc243652278 \h </w:instrText>
+        <w:instrText xml:space="preserve"> PAGEREF _Toc243674705 \h </w:instrText>
       </w:r>
       <w:r>
         <w:rPr>
@@ -2976,7 +2976,7 @@
         <w:rPr>
           <w:noProof/>
         </w:rPr>
-        <w:instrText xml:space="preserve"> PAGEREF _Toc243652279 \h </w:instrText>
+        <w:instrText xml:space="preserve"> PAGEREF _Toc243674706 \h </w:instrText>
       </w:r>
       <w:r>
         <w:rPr>
@@ -3035,7 +3035,7 @@
         <w:rPr>
           <w:noProof/>
         </w:rPr>
-        <w:instrText xml:space="preserve"> PAGEREF _Toc243652280 \h </w:instrText>
+        <w:instrText xml:space="preserve"> PAGEREF _Toc243674707 \h </w:instrText>
       </w:r>
       <w:r>
         <w:rPr>
@@ -3094,7 +3094,7 @@
         <w:rPr>
           <w:noProof/>
         </w:rPr>
-        <w:instrText xml:space="preserve"> PAGEREF _Toc243652281 \h </w:instrText>
+        <w:instrText xml:space="preserve"> PAGEREF _Toc243674708 \h </w:instrText>
       </w:r>
       <w:r>
         <w:rPr>
@@ -3153,7 +3153,7 @@
         <w:rPr>
           <w:noProof/>
         </w:rPr>
-        <w:instrText xml:space="preserve"> PAGEREF _Toc243652282 \h </w:instrText>
+        <w:instrText xml:space="preserve"> PAGEREF _Toc243674709 \h </w:instrText>
       </w:r>
       <w:r>
         <w:rPr>
@@ -3212,7 +3212,7 @@
         <w:rPr>
           <w:noProof/>
         </w:rPr>
-        <w:instrText xml:space="preserve"> PAGEREF _Toc243652283 \h </w:instrText>
+        <w:instrText xml:space="preserve"> PAGEREF _Toc243674710 \h </w:instrText>
       </w:r>
       <w:r>
         <w:rPr>
@@ -3271,7 +3271,7 @@
         <w:rPr>
           <w:noProof/>
         </w:rPr>
-        <w:instrText xml:space="preserve"> PAGEREF _Toc243652284 \h </w:instrText>
+        <w:instrText xml:space="preserve"> PAGEREF _Toc243674711 \h </w:instrText>
       </w:r>
       <w:r>
         <w:rPr>
@@ -3330,7 +3330,7 @@
         <w:rPr>
           <w:noProof/>
         </w:rPr>
-        <w:instrText xml:space="preserve"> PAGEREF _Toc243652285 \h </w:instrText>
+        <w:instrText xml:space="preserve"> PAGEREF _Toc243674712 \h </w:instrText>
       </w:r>
       <w:r>
         <w:rPr>
@@ -3389,7 +3389,7 @@
         <w:rPr>
           <w:noProof/>
         </w:rPr>
-        <w:instrText xml:space="preserve"> PAGEREF _Toc243652286 \h </w:instrText>
+        <w:instrText xml:space="preserve"> PAGEREF _Toc243674713 \h </w:instrText>
       </w:r>
       <w:r>
         <w:rPr>
@@ -3448,7 +3448,7 @@
         <w:rPr>
           <w:noProof/>
         </w:rPr>
-        <w:instrText xml:space="preserve"> PAGEREF _Toc243652287 \h </w:instrText>
+        <w:instrText xml:space="preserve"> PAGEREF _Toc243674714 \h </w:instrText>
       </w:r>
       <w:r>
         <w:rPr>
@@ -3507,7 +3507,7 @@
         <w:rPr>
           <w:noProof/>
         </w:rPr>
-        <w:instrText xml:space="preserve"> PAGEREF _Toc243652288 \h </w:instrText>
+        <w:instrText xml:space="preserve"> PAGEREF _Toc243674715 \h </w:instrText>
       </w:r>
       <w:r>
         <w:rPr>
@@ -3566,7 +3566,7 @@
         <w:rPr>
           <w:noProof/>
         </w:rPr>
-        <w:instrText xml:space="preserve"> PAGEREF _Toc243652289 \h </w:instrText>
+        <w:instrText xml:space="preserve"> PAGEREF _Toc243674716 \h </w:instrText>
       </w:r>
       <w:r>
         <w:rPr>
@@ -3644,7 +3644,7 @@
         <w:rPr>
           <w:noProof/>
         </w:rPr>
-        <w:instrText xml:space="preserve"> PAGEREF _Toc243652290 \h </w:instrText>
+        <w:instrText xml:space="preserve"> PAGEREF _Toc243674717 \h </w:instrText>
       </w:r>
       <w:r>
         <w:rPr>
@@ -3722,7 +3722,7 @@
         <w:rPr>
           <w:noProof/>
         </w:rPr>
-        <w:instrText xml:space="preserve"> PAGEREF _Toc243652291 \h </w:instrText>
+        <w:instrText xml:space="preserve"> PAGEREF _Toc243674718 \h </w:instrText>
       </w:r>
       <w:r>
         <w:rPr>
@@ -3800,7 +3800,7 @@
         <w:rPr>
           <w:noProof/>
         </w:rPr>
-        <w:instrText xml:space="preserve"> PAGEREF _Toc243652292 \h </w:instrText>
+        <w:instrText xml:space="preserve"> PAGEREF _Toc243674719 \h </w:instrText>
       </w:r>
       <w:r>
         <w:rPr>
@@ -3878,7 +3878,7 @@
         <w:rPr>
           <w:noProof/>
         </w:rPr>
-        <w:instrText xml:space="preserve"> PAGEREF _Toc243652293 \h </w:instrText>
+        <w:instrText xml:space="preserve"> PAGEREF _Toc243674720 \h </w:instrText>
       </w:r>
       <w:r>
         <w:rPr>
@@ -3949,7 +3949,7 @@
           <w:rFonts w:asciiTheme="minorHAnsi" w:hAnsiTheme="minorHAnsi"/>
         </w:rPr>
       </w:pPr>
-      <w:bookmarkStart w:id="0" w:name="_Toc243652268"/>
+      <w:bookmarkStart w:id="0" w:name="_Toc243674695"/>
       <w:r>
         <w:rPr>
           <w:rFonts w:asciiTheme="minorHAnsi" w:hAnsiTheme="minorHAnsi"/>
@@ -3969,7 +3969,7 @@
           <w:iCs w:val="0"/>
         </w:rPr>
       </w:pPr>
-      <w:bookmarkStart w:id="1" w:name="_Toc243652269"/>
+      <w:bookmarkStart w:id="1" w:name="_Toc243674696"/>
       <w:r>
         <w:rPr>
           <w:rFonts w:ascii="Aptos" w:hAnsi="Aptos"/>
@@ -4526,7 +4526,7 @@
           <w:iCs w:val="0"/>
         </w:rPr>
       </w:pPr>
-      <w:bookmarkStart w:id="2" w:name="_Toc243652270"/>
+      <w:bookmarkStart w:id="2" w:name="_Toc243674697"/>
       <w:r>
         <w:rPr>
           <w:rFonts w:asciiTheme="minorHAnsi" w:hAnsiTheme="minorHAnsi"/>
@@ -4545,7 +4545,7 @@
           <w:rFonts w:asciiTheme="minorHAnsi" w:hAnsiTheme="minorHAnsi"/>
         </w:rPr>
       </w:pPr>
-      <w:bookmarkStart w:id="3" w:name="_Toc243652271"/>
+      <w:bookmarkStart w:id="3" w:name="_Toc243674698"/>
       <w:r>
         <w:rPr>
           <w:rFonts w:asciiTheme="minorHAnsi" w:hAnsiTheme="minorHAnsi"/>
@@ -4797,7 +4797,7 @@
           <w:rFonts w:asciiTheme="minorHAnsi" w:hAnsiTheme="minorHAnsi"/>
         </w:rPr>
       </w:pPr>
-      <w:bookmarkStart w:id="4" w:name="_Toc243652272"/>
+      <w:bookmarkStart w:id="4" w:name="_Toc243674699"/>
       <w:r>
         <w:rPr>
           <w:rFonts w:asciiTheme="minorHAnsi" w:hAnsiTheme="minorHAnsi"/>
@@ -5066,7 +5066,7 @@
           <w:rFonts w:ascii="Aptos" w:hAnsi="Aptos"/>
         </w:rPr>
       </w:pPr>
-      <w:bookmarkStart w:id="5" w:name="_Toc243652273"/>
+      <w:bookmarkStart w:id="5" w:name="_Toc243674700"/>
       <w:r>
         <w:rPr>
           <w:rFonts w:ascii="Aptos" w:hAnsi="Aptos"/>
@@ -5296,7 +5296,7 @@
           <w:rFonts w:asciiTheme="minorHAnsi" w:hAnsiTheme="minorHAnsi"/>
         </w:rPr>
       </w:pPr>
-      <w:bookmarkStart w:id="6" w:name="_Toc243652274"/>
+      <w:bookmarkStart w:id="6" w:name="_Toc243674701"/>
       <w:r>
         <w:rPr>
           <w:rFonts w:asciiTheme="minorHAnsi" w:hAnsiTheme="minorHAnsi"/>
@@ -5427,7 +5427,7 @@
           <w:rFonts w:ascii="Aptos" w:hAnsi="Aptos"/>
         </w:rPr>
       </w:pPr>
-      <w:bookmarkStart w:id="7" w:name="_Toc243652275"/>
+      <w:bookmarkStart w:id="7" w:name="_Toc243674702"/>
       <w:r>
         <w:rPr>
           <w:rFonts w:ascii="Aptos" w:hAnsi="Aptos"/>
@@ -5627,7 +5627,7 @@
           <w:rFonts w:asciiTheme="minorHAnsi" w:hAnsiTheme="minorHAnsi"/>
         </w:rPr>
       </w:pPr>
-      <w:bookmarkStart w:id="8" w:name="_Toc243652276"/>
+      <w:bookmarkStart w:id="8" w:name="_Toc243674703"/>
       <w:r>
         <w:rPr>
           <w:rFonts w:asciiTheme="minorHAnsi" w:hAnsiTheme="minorHAnsi"/>
@@ -5816,7 +5816,7 @@
           <w:rFonts w:asciiTheme="minorHAnsi" w:hAnsiTheme="minorHAnsi"/>
         </w:rPr>
       </w:pPr>
-      <w:bookmarkStart w:id="9" w:name="_Toc243652277"/>
+      <w:bookmarkStart w:id="9" w:name="_Toc243674704"/>
       <w:r>
         <w:rPr>
           <w:rFonts w:asciiTheme="minorHAnsi" w:hAnsiTheme="minorHAnsi"/>
@@ -5940,7 +5940,7 @@
           <w:rFonts w:asciiTheme="minorHAnsi" w:hAnsiTheme="minorHAnsi"/>
         </w:rPr>
       </w:pPr>
-      <w:bookmarkStart w:id="10" w:name="_Toc243652278"/>
+      <w:bookmarkStart w:id="10" w:name="_Toc243674705"/>
       <w:r>
         <w:rPr>
           <w:rFonts w:asciiTheme="minorHAnsi" w:hAnsiTheme="minorHAnsi"/>
@@ -6083,7 +6083,7 @@
           <w:rFonts w:asciiTheme="minorHAnsi" w:hAnsiTheme="minorHAnsi"/>
         </w:rPr>
       </w:pPr>
-      <w:bookmarkStart w:id="11" w:name="_Toc243652279"/>
+      <w:bookmarkStart w:id="11" w:name="_Toc243674706"/>
       <w:r>
         <w:rPr>
           <w:rFonts w:asciiTheme="minorHAnsi" w:hAnsiTheme="minorHAnsi"/>
@@ -6256,7 +6256,7 @@
           <w:rFonts w:asciiTheme="minorHAnsi" w:hAnsiTheme="minorHAnsi"/>
         </w:rPr>
       </w:pPr>
-      <w:bookmarkStart w:id="12" w:name="_Toc243652280"/>
+      <w:bookmarkStart w:id="12" w:name="_Toc243674707"/>
       <w:r>
         <w:rPr>
           <w:rFonts w:asciiTheme="minorHAnsi" w:hAnsiTheme="minorHAnsi"/>
@@ -6457,7 +6457,7 @@
           <w:rFonts w:asciiTheme="minorHAnsi" w:hAnsiTheme="minorHAnsi"/>
         </w:rPr>
       </w:pPr>
-      <w:bookmarkStart w:id="13" w:name="_Toc243652281"/>
+      <w:bookmarkStart w:id="13" w:name="_Toc243674708"/>
       <w:r>
         <w:rPr>
           <w:rFonts w:asciiTheme="minorHAnsi" w:hAnsiTheme="minorHAnsi"/>
@@ -6624,7 +6624,7 @@
           <w:rFonts w:asciiTheme="minorHAnsi" w:hAnsiTheme="minorHAnsi"/>
         </w:rPr>
       </w:pPr>
-      <w:bookmarkStart w:id="14" w:name="_Toc243652282"/>
+      <w:bookmarkStart w:id="14" w:name="_Toc243674709"/>
       <w:r>
         <w:rPr>
           <w:rFonts w:asciiTheme="minorHAnsi" w:hAnsiTheme="minorHAnsi"/>
@@ -6770,7 +6770,7 @@
           <w:rFonts w:asciiTheme="minorHAnsi" w:hAnsiTheme="minorHAnsi"/>
         </w:rPr>
       </w:pPr>
-      <w:bookmarkStart w:id="15" w:name="_Toc243652283"/>
+      <w:bookmarkStart w:id="15" w:name="_Toc243674710"/>
       <w:r>
         <w:rPr>
           <w:rFonts w:asciiTheme="minorHAnsi" w:hAnsiTheme="minorHAnsi"/>
@@ -6890,7 +6890,7 @@
           <w:rFonts w:asciiTheme="minorHAnsi" w:hAnsiTheme="minorHAnsi"/>
         </w:rPr>
       </w:pPr>
-      <w:bookmarkStart w:id="16" w:name="_Toc243652284"/>
+      <w:bookmarkStart w:id="16" w:name="_Toc243674711"/>
       <w:r>
         <w:rPr>
           <w:rFonts w:asciiTheme="minorHAnsi" w:hAnsiTheme="minorHAnsi"/>
@@ -7021,7 +7021,7 @@
           <w:rFonts w:asciiTheme="minorHAnsi" w:hAnsiTheme="minorHAnsi"/>
         </w:rPr>
       </w:pPr>
-      <w:bookmarkStart w:id="17" w:name="_Toc243652285"/>
+      <w:bookmarkStart w:id="17" w:name="_Toc243674712"/>
       <w:r>
         <w:rPr>
           <w:rFonts w:asciiTheme="minorHAnsi" w:hAnsiTheme="minorHAnsi"/>
@@ -7068,7 +7068,7 @@
           <w:rFonts w:asciiTheme="minorHAnsi" w:hAnsiTheme="minorHAnsi"/>
         </w:rPr>
       </w:pPr>
-      <w:bookmarkStart w:id="18" w:name="_Toc243652286"/>
+      <w:bookmarkStart w:id="18" w:name="_Toc243674713"/>
       <w:r>
         <w:rPr>
           <w:rFonts w:asciiTheme="minorHAnsi" w:hAnsiTheme="minorHAnsi"/>
@@ -7148,7 +7148,7 @@
           <w:rFonts w:asciiTheme="minorHAnsi" w:hAnsiTheme="minorHAnsi"/>
         </w:rPr>
       </w:pPr>
-      <w:bookmarkStart w:id="19" w:name="_Toc243652287"/>
+      <w:bookmarkStart w:id="19" w:name="_Toc243674714"/>
       <w:r>
         <w:rPr>
           <w:rFonts w:asciiTheme="minorHAnsi" w:hAnsiTheme="minorHAnsi"/>
@@ -7310,7 +7310,7 @@
           <w:rFonts w:asciiTheme="minorHAnsi" w:hAnsiTheme="minorHAnsi"/>
         </w:rPr>
       </w:pPr>
-      <w:bookmarkStart w:id="20" w:name="_Toc243652288"/>
+      <w:bookmarkStart w:id="20" w:name="_Toc243674715"/>
       <w:r>
         <w:rPr>
           <w:rFonts w:asciiTheme="minorHAnsi" w:hAnsiTheme="minorHAnsi"/>
@@ -7462,7 +7462,7 @@
           <w:rFonts w:asciiTheme="minorHAnsi" w:hAnsiTheme="minorHAnsi"/>
         </w:rPr>
       </w:pPr>
-      <w:bookmarkStart w:id="21" w:name="_Toc243652289"/>
+      <w:bookmarkStart w:id="21" w:name="_Toc243674716"/>
       <w:r>
         <w:rPr>
           <w:rFonts w:asciiTheme="minorHAnsi" w:hAnsiTheme="minorHAnsi"/>
@@ -7585,7 +7585,7 @@
           <w:iCs w:val="0"/>
         </w:rPr>
       </w:pPr>
-      <w:bookmarkStart w:id="22" w:name="_Toc243652290"/>
+      <w:bookmarkStart w:id="22" w:name="_Toc243674717"/>
       <w:r>
         <w:rPr>
           <w:rFonts w:asciiTheme="minorHAnsi" w:hAnsiTheme="minorHAnsi"/>
@@ -8404,7 +8404,7 @@
           <w:iCs w:val="0"/>
         </w:rPr>
       </w:pPr>
-      <w:bookmarkStart w:id="23" w:name="_Toc243652291"/>
+      <w:bookmarkStart w:id="23" w:name="_Toc243674718"/>
       <w:r>
         <w:rPr>
           <w:rFonts w:asciiTheme="minorHAnsi" w:hAnsiTheme="minorHAnsi"/>
@@ -9352,7 +9352,7 @@
           <w:iCs w:val="0"/>
         </w:rPr>
       </w:pPr>
-      <w:bookmarkStart w:id="24" w:name="_Toc243652292"/>
+      <w:bookmarkStart w:id="24" w:name="_Toc243674719"/>
       <w:r>
         <w:rPr>
           <w:rFonts w:asciiTheme="minorHAnsi" w:hAnsiTheme="minorHAnsi"/>
@@ -9512,7 +9512,7 @@
           <w:iCs w:val="0"/>
         </w:rPr>
       </w:pPr>
-      <w:bookmarkStart w:id="25" w:name="_Toc243652293"/>
+      <w:bookmarkStart w:id="25" w:name="_Toc243674720"/>
       <w:r>
         <w:rPr>
           <w:rFonts w:asciiTheme="minorHAnsi" w:hAnsiTheme="minorHAnsi"/>
@@ -9645,7 +9645,23 @@
           <w:rFonts w:asciiTheme="minorHAnsi" w:hAnsiTheme="minorHAnsi"/>
           <w:lang w:val="en-US"/>
         </w:rPr>
-        <w:t>17/12/2026: Object Design Document e Test finale</w:t>
+        <w:t xml:space="preserve">17/12/2026: Object Design Document </w:t>
+      </w:r>
+      <w:proofErr w:type="gramStart"/>
+      <w:r>
+        <w:rPr>
+          <w:rFonts w:asciiTheme="minorHAnsi" w:hAnsiTheme="minorHAnsi"/>
+          <w:lang w:val="en-US"/>
+        </w:rPr>
+        <w:t>e</w:t>
+      </w:r>
+      <w:proofErr w:type="gramEnd"/>
+      <w:r>
+        <w:rPr>
+          <w:rFonts w:asciiTheme="minorHAnsi" w:hAnsiTheme="minorHAnsi"/>
+          <w:lang w:val="en-US"/>
+        </w:rPr>
+        <w:t xml:space="preserve"> Test finale</w:t>
       </w:r>
       <w:r>
         <w:rPr>

</xml_diff>

<commit_message>
Aggiunta parte dell'introduzione e aggiustati RNF nel RAD
</commit_message>
<xml_diff>
--- a/Documents/01_NovaBiblioteca_ProblemStatement.docx
+++ b/Documents/01_NovaBiblioteca_ProblemStatement.docx
@@ -5924,7 +5924,7 @@
         <w:rPr>
           <w:rFonts w:asciiTheme="minorHAnsi" w:hAnsiTheme="minorHAnsi"/>
         </w:rPr>
-        <w:t>conclusa</w:t>
+        <w:t>eliminata</w:t>
       </w:r>
       <w:r>
         <w:rPr>
@@ -6440,7 +6440,19 @@
         <w:rPr>
           <w:rFonts w:asciiTheme="minorHAnsi" w:hAnsiTheme="minorHAnsi"/>
         </w:rPr>
-        <w:t>Se le regole della biblioteca lo prevedono, Mario avverte Luca e registra una sospensione a suo nome, indicando data di inizio e durata.</w:t>
+        <w:t>Se le regole della biblioteca lo prevedono, Mario avverte Luca e registra una sospensione a suo nome, indicando</w:t>
+      </w:r>
+      <w:r>
+        <w:rPr>
+          <w:rFonts w:asciiTheme="minorHAnsi" w:hAnsiTheme="minorHAnsi"/>
+        </w:rPr>
+        <w:t xml:space="preserve">ne la </w:t>
+      </w:r>
+      <w:r>
+        <w:rPr>
+          <w:rFonts w:asciiTheme="minorHAnsi" w:hAnsiTheme="minorHAnsi"/>
+        </w:rPr>
+        <w:t>durata.</w:t>
       </w:r>
       <w:r>
         <w:rPr>
@@ -8392,6 +8404,54 @@
         <w:t xml:space="preserve"> Assegnando una nuova password temporanea.</w:t>
       </w:r>
     </w:p>
+    <w:p>
+      <w:pPr>
+        <w:jc w:val="both"/>
+        <w:rPr>
+          <w:rFonts w:asciiTheme="minorHAnsi" w:hAnsiTheme="minorHAnsi"/>
+        </w:rPr>
+      </w:pPr>
+    </w:p>
+    <w:p>
+      <w:pPr>
+        <w:jc w:val="both"/>
+        <w:rPr>
+          <w:rFonts w:asciiTheme="minorHAnsi" w:hAnsiTheme="minorHAnsi"/>
+          <w:b/>
+          <w:bCs/>
+        </w:rPr>
+      </w:pPr>
+      <w:r>
+        <w:rPr>
+          <w:rFonts w:asciiTheme="minorHAnsi" w:hAnsiTheme="minorHAnsi"/>
+          <w:b/>
+          <w:bCs/>
+        </w:rPr>
+        <w:t>RF15 – Cancellazione automatica delle prenotazioni</w:t>
+      </w:r>
+      <w:r>
+        <w:rPr>
+          <w:rFonts w:asciiTheme="minorHAnsi" w:hAnsiTheme="minorHAnsi"/>
+          <w:b/>
+          <w:bCs/>
+        </w:rPr>
+        <w:t xml:space="preserve"> scadute</w:t>
+      </w:r>
+    </w:p>
+    <w:p>
+      <w:pPr>
+        <w:jc w:val="both"/>
+        <w:rPr>
+          <w:rFonts w:asciiTheme="minorHAnsi" w:hAnsiTheme="minorHAnsi"/>
+        </w:rPr>
+      </w:pPr>
+      <w:r>
+        <w:rPr>
+          <w:rFonts w:asciiTheme="minorHAnsi" w:hAnsiTheme="minorHAnsi"/>
+        </w:rPr>
+        <w:t>Il sistema deve controllare periodicamente che le prenotazioni non siano scadute. Nel caso in cui lo siano deve eliminarle.</w:t>
+      </w:r>
+    </w:p>
     <w:p/>
     <w:p>
       <w:pPr>
@@ -8566,7 +8626,14 @@
         <w:rPr>
           <w:rFonts w:asciiTheme="minorHAnsi" w:hAnsiTheme="minorHAnsi"/>
         </w:rPr>
-        <w:t>Il sistema mostrerà un messaggio di conferma al completamento delle operazioni principali e un messaggio esplicativo in caso di errore e operazioni non riuscite.</w:t>
+        <w:t xml:space="preserve">Il sistema mostrerà un messaggio di conferma al completamento delle operazioni principali e </w:t>
+      </w:r>
+      <w:r>
+        <w:rPr>
+          <w:rFonts w:asciiTheme="minorHAnsi" w:hAnsiTheme="minorHAnsi"/>
+        </w:rPr>
+        <w:lastRenderedPageBreak/>
+        <w:t>un messaggio esplicativo in caso di errore e operazioni non riuscite.</w:t>
       </w:r>
     </w:p>
     <w:p>
@@ -9645,23 +9712,8 @@
           <w:rFonts w:asciiTheme="minorHAnsi" w:hAnsiTheme="minorHAnsi"/>
           <w:lang w:val="en-US"/>
         </w:rPr>
-        <w:t xml:space="preserve">17/12/2026: Object Design Document </w:t>
-      </w:r>
-      <w:proofErr w:type="gramStart"/>
-      <w:r>
-        <w:rPr>
-          <w:rFonts w:asciiTheme="minorHAnsi" w:hAnsiTheme="minorHAnsi"/>
-          <w:lang w:val="en-US"/>
-        </w:rPr>
-        <w:t>e</w:t>
-      </w:r>
-      <w:proofErr w:type="gramEnd"/>
-      <w:r>
-        <w:rPr>
-          <w:rFonts w:asciiTheme="minorHAnsi" w:hAnsiTheme="minorHAnsi"/>
-          <w:lang w:val="en-US"/>
-        </w:rPr>
-        <w:t xml:space="preserve"> Test finale</w:t>
+        <w:lastRenderedPageBreak/>
+        <w:t>17/12/2026: Object Design Document e Test finale</w:t>
       </w:r>
       <w:r>
         <w:rPr>
@@ -10200,7 +10252,7 @@
         <v:path o:extrusionok="f" gradientshapeok="t" o:connecttype="rect"/>
         <o:lock v:ext="edit" aspectratio="t"/>
       </v:shapetype>
-      <v:shape id="_x0000_i1025" type="#_x0000_t75" style="width:316.5pt;height:252pt" o:bullet="t" filled="t">
+      <v:shape id="_x0000_i1025" type="#_x0000_t75" style="width:316.8pt;height:252pt" o:bullet="t" filled="t">
         <v:fill color2="black"/>
         <v:imagedata r:id="rId1" o:title=""/>
       </v:shape>

</xml_diff>

<commit_message>
Aggiunta ulteriori sezioni RAD, aggiustati UC e PS
</commit_message>
<xml_diff>
--- a/Documents/01_NovaBiblioteca_ProblemStatement.docx
+++ b/Documents/01_NovaBiblioteca_ProblemStatement.docx
@@ -4249,6 +4249,12 @@
         <w:rPr>
           <w:rFonts w:asciiTheme="minorHAnsi" w:hAnsiTheme="minorHAnsi"/>
         </w:rPr>
+        <w:t>, dove ogni prenotazione dura 72 ore</w:t>
+      </w:r>
+      <w:r>
+        <w:rPr>
+          <w:rFonts w:asciiTheme="minorHAnsi" w:hAnsiTheme="minorHAnsi"/>
+        </w:rPr>
         <w:t xml:space="preserve">. </w:t>
       </w:r>
     </w:p>
@@ -5228,7 +5234,19 @@
         <w:rPr>
           <w:rFonts w:asciiTheme="minorHAnsi" w:hAnsiTheme="minorHAnsi"/>
         </w:rPr>
-        <w:t>a entro un periodo di tre giorni, al termine del quale la prenotazione scade, e la copia sarà nuovamente disponibile</w:t>
+        <w:t xml:space="preserve">a entro un periodo di </w:t>
+      </w:r>
+      <w:r>
+        <w:rPr>
+          <w:rFonts w:asciiTheme="minorHAnsi" w:hAnsiTheme="minorHAnsi"/>
+        </w:rPr>
+        <w:t>72 ore</w:t>
+      </w:r>
+      <w:r>
+        <w:rPr>
+          <w:rFonts w:asciiTheme="minorHAnsi" w:hAnsiTheme="minorHAnsi"/>
+        </w:rPr>
+        <w:t>, al termine del quale la prenotazione scade, e la copia sarà nuovamente disponibile</w:t>
       </w:r>
       <w:r>
         <w:rPr>
@@ -6589,7 +6607,19 @@
         <w:rPr>
           <w:rFonts w:asciiTheme="minorHAnsi" w:hAnsiTheme="minorHAnsi"/>
         </w:rPr>
-        <w:t xml:space="preserve"> Mario accede al sistema e inserisce le informazioni del libro, quali titolo, autore, edi</w:t>
+        <w:t xml:space="preserve"> Mario accede al sistema e inserisce le informazioni del libro, quali titolo, autor</w:t>
+      </w:r>
+      <w:r>
+        <w:rPr>
+          <w:rFonts w:asciiTheme="minorHAnsi" w:hAnsiTheme="minorHAnsi"/>
+        </w:rPr>
+        <w:t>i</w:t>
+      </w:r>
+      <w:r>
+        <w:rPr>
+          <w:rFonts w:asciiTheme="minorHAnsi" w:hAnsiTheme="minorHAnsi"/>
+        </w:rPr>
+        <w:t>, edi</w:t>
       </w:r>
       <w:r>
         <w:rPr>
@@ -6601,13 +6631,13 @@
         <w:rPr>
           <w:rFonts w:asciiTheme="minorHAnsi" w:hAnsiTheme="minorHAnsi"/>
         </w:rPr>
-        <w:t xml:space="preserve"> </w:t>
-      </w:r>
-      <w:r>
-        <w:rPr>
-          <w:rFonts w:asciiTheme="minorHAnsi" w:hAnsiTheme="minorHAnsi"/>
-        </w:rPr>
-        <w:t>e ISBN</w:t>
+        <w:t>, categorie</w:t>
+      </w:r>
+      <w:r>
+        <w:rPr>
+          <w:rFonts w:asciiTheme="minorHAnsi" w:hAnsiTheme="minorHAnsi"/>
+        </w:rPr>
+        <w:t>, lingua, data di pubblicazione e ISBN</w:t>
       </w:r>
       <w:r>
         <w:rPr>
@@ -7631,7 +7661,7 @@
           <w:b/>
           <w:bCs/>
         </w:rPr>
-        <w:t>RF1 – Registrazione del lettore</w:t>
+        <w:t>FR</w:t>
       </w:r>
       <w:r>
         <w:rPr>
@@ -7639,101 +7669,77 @@
           <w:b/>
           <w:bCs/>
         </w:rPr>
-        <w:t xml:space="preserve"> al servizio NovaBiblioteca</w:t>
-      </w:r>
-    </w:p>
-    <w:p>
-      <w:pPr>
-        <w:jc w:val="both"/>
-        <w:rPr>
-          <w:rFonts w:asciiTheme="minorHAnsi" w:hAnsiTheme="minorHAnsi"/>
-        </w:rPr>
-      </w:pPr>
-      <w:r>
-        <w:rPr>
-          <w:rFonts w:asciiTheme="minorHAnsi" w:hAnsiTheme="minorHAnsi"/>
-        </w:rPr>
-        <w:t>Un operatore può registrare un lettore inserendo codice fiscale, nome, cognome ed e-mail. Il sistema deve creare l’account del lettore dopo la validazione dei dati, generare una password temporanea e richiedere al primo accesso di impostarne una nuova.</w:t>
-      </w:r>
-    </w:p>
-    <w:p>
-      <w:pPr>
-        <w:jc w:val="both"/>
-        <w:rPr>
-          <w:rFonts w:asciiTheme="minorHAnsi" w:hAnsiTheme="minorHAnsi"/>
-        </w:rPr>
-      </w:pPr>
-    </w:p>
-    <w:p>
-      <w:pPr>
-        <w:jc w:val="both"/>
+        <w:t>1 – Registrazione del lettore</w:t>
+      </w:r>
+      <w:r>
         <w:rPr>
           <w:rFonts w:asciiTheme="minorHAnsi" w:hAnsiTheme="minorHAnsi"/>
           <w:b/>
           <w:bCs/>
         </w:rPr>
-      </w:pPr>
-      <w:r>
+        <w:t xml:space="preserve"> al servizio NovaBiblioteca</w:t>
+      </w:r>
+    </w:p>
+    <w:p>
+      <w:pPr>
+        <w:jc w:val="both"/>
+        <w:rPr>
+          <w:rFonts w:asciiTheme="minorHAnsi" w:hAnsiTheme="minorHAnsi"/>
+        </w:rPr>
+      </w:pPr>
+      <w:r>
+        <w:rPr>
+          <w:rFonts w:asciiTheme="minorHAnsi" w:hAnsiTheme="minorHAnsi"/>
+        </w:rPr>
+        <w:t>Un operatore può registrare un lettore inserendo codice fiscale, nome, cognome ed e-mail. Il sistema deve creare l’account del lettore dopo la validazione dei dati, generare una password temporanea e richiedere al primo accesso di impostarne una nuova.</w:t>
+      </w:r>
+    </w:p>
+    <w:p>
+      <w:pPr>
+        <w:jc w:val="both"/>
+        <w:rPr>
+          <w:rFonts w:asciiTheme="minorHAnsi" w:hAnsiTheme="minorHAnsi"/>
+        </w:rPr>
+      </w:pPr>
+    </w:p>
+    <w:p>
+      <w:pPr>
+        <w:jc w:val="both"/>
         <w:rPr>
           <w:rFonts w:asciiTheme="minorHAnsi" w:hAnsiTheme="minorHAnsi"/>
           <w:b/>
           <w:bCs/>
         </w:rPr>
-        <w:t>RF2 – Autenticazione degli utenti</w:t>
-      </w:r>
-    </w:p>
-    <w:p>
-      <w:pPr>
-        <w:jc w:val="both"/>
-        <w:rPr>
-          <w:rFonts w:asciiTheme="minorHAnsi" w:hAnsiTheme="minorHAnsi"/>
-        </w:rPr>
-      </w:pPr>
-      <w:r>
-        <w:rPr>
-          <w:rFonts w:asciiTheme="minorHAnsi" w:hAnsiTheme="minorHAnsi"/>
-        </w:rPr>
-        <w:t>I lettori registrati e gli operatori devono poter accedere mediante e-mail e password e terminare la propria sessione tramite una funzionalità di logout.</w:t>
-      </w:r>
-    </w:p>
-    <w:p>
-      <w:pPr>
-        <w:jc w:val="both"/>
-        <w:rPr>
-          <w:rFonts w:asciiTheme="minorHAnsi" w:hAnsiTheme="minorHAnsi"/>
-        </w:rPr>
-      </w:pPr>
-    </w:p>
-    <w:p>
-      <w:pPr>
-        <w:jc w:val="both"/>
+      </w:pPr>
+      <w:r>
         <w:rPr>
           <w:rFonts w:asciiTheme="minorHAnsi" w:hAnsiTheme="minorHAnsi"/>
           <w:b/>
           <w:bCs/>
         </w:rPr>
-      </w:pPr>
+        <w:t>FR</w:t>
+      </w:r>
       <w:r>
         <w:rPr>
           <w:rFonts w:asciiTheme="minorHAnsi" w:hAnsiTheme="minorHAnsi"/>
           <w:b/>
           <w:bCs/>
         </w:rPr>
-        <w:t>RF3 – Consultazione del catalogo</w:t>
-      </w:r>
-    </w:p>
-    <w:p>
-      <w:pPr>
-        <w:jc w:val="both"/>
-        <w:rPr>
-          <w:rFonts w:asciiTheme="minorHAnsi" w:hAnsiTheme="minorHAnsi"/>
-        </w:rPr>
-      </w:pPr>
-      <w:r>
-        <w:rPr>
-          <w:rFonts w:asciiTheme="minorHAnsi" w:hAnsiTheme="minorHAnsi"/>
-        </w:rPr>
-        <w:t>Il sistema deve consentire a qualsiasi utente, anche non registrato, di consultare il catalogo e cercare i libri di interesse, anche sulla base di filtri di ricerca, mostrando solo i risultati corrispondenti.</w:t>
+        <w:t>2 – Autenticazione degli utenti</w:t>
+      </w:r>
+    </w:p>
+    <w:p>
+      <w:pPr>
+        <w:jc w:val="both"/>
+        <w:rPr>
+          <w:rFonts w:asciiTheme="minorHAnsi" w:hAnsiTheme="minorHAnsi"/>
+        </w:rPr>
+      </w:pPr>
+      <w:r>
+        <w:rPr>
+          <w:rFonts w:asciiTheme="minorHAnsi" w:hAnsiTheme="minorHAnsi"/>
+        </w:rPr>
+        <w:t>I lettori registrati e gli operatori devono poter accedere mediante e-mail e password e terminare la propria sessione tramite una funzionalità di logout.</w:t>
       </w:r>
     </w:p>
     <w:p>
@@ -7759,119 +7765,77 @@
           <w:b/>
           <w:bCs/>
         </w:rPr>
-        <w:t>RF4 – Visualizzazione dei dettagli dell’edizione</w:t>
-      </w:r>
-    </w:p>
-    <w:p>
-      <w:pPr>
-        <w:jc w:val="both"/>
-        <w:rPr>
-          <w:rFonts w:asciiTheme="minorHAnsi" w:hAnsiTheme="minorHAnsi"/>
-        </w:rPr>
-      </w:pPr>
-      <w:r>
-        <w:rPr>
-          <w:rFonts w:asciiTheme="minorHAnsi" w:hAnsiTheme="minorHAnsi"/>
-        </w:rPr>
-        <w:t>Il sistema deve consentire di selezionare un’edizione e visualizzare le relative informazioni, quali autore, edizione e numero di copie disponibili.</w:t>
-      </w:r>
-    </w:p>
-    <w:p>
-      <w:pPr>
-        <w:jc w:val="both"/>
-        <w:rPr>
-          <w:rFonts w:asciiTheme="minorHAnsi" w:hAnsiTheme="minorHAnsi"/>
-        </w:rPr>
-      </w:pPr>
-    </w:p>
-    <w:p>
-      <w:pPr>
-        <w:jc w:val="both"/>
+        <w:t>FR</w:t>
+      </w:r>
+      <w:r>
         <w:rPr>
           <w:rFonts w:asciiTheme="minorHAnsi" w:hAnsiTheme="minorHAnsi"/>
           <w:b/>
           <w:bCs/>
         </w:rPr>
-      </w:pPr>
-      <w:r>
+        <w:t>3 – Consultazione del catalogo</w:t>
+      </w:r>
+    </w:p>
+    <w:p>
+      <w:pPr>
+        <w:jc w:val="both"/>
+        <w:rPr>
+          <w:rFonts w:asciiTheme="minorHAnsi" w:hAnsiTheme="minorHAnsi"/>
+        </w:rPr>
+      </w:pPr>
+      <w:r>
+        <w:rPr>
+          <w:rFonts w:asciiTheme="minorHAnsi" w:hAnsiTheme="minorHAnsi"/>
+        </w:rPr>
+        <w:t>Il sistema deve consentire a qualsiasi utente, anche non registrato, di consultare il catalogo e cercare i libri di interesse, anche sulla base di filtri di ricerca, mostrando solo i risultati corrispondenti.</w:t>
+      </w:r>
+    </w:p>
+    <w:p>
+      <w:pPr>
+        <w:jc w:val="both"/>
+        <w:rPr>
+          <w:rFonts w:asciiTheme="minorHAnsi" w:hAnsiTheme="minorHAnsi"/>
+        </w:rPr>
+      </w:pPr>
+    </w:p>
+    <w:p>
+      <w:pPr>
+        <w:jc w:val="both"/>
         <w:rPr>
           <w:rFonts w:asciiTheme="minorHAnsi" w:hAnsiTheme="minorHAnsi"/>
           <w:b/>
           <w:bCs/>
         </w:rPr>
-        <w:t>RF5 – Prenotazione di una copia</w:t>
-      </w:r>
-    </w:p>
-    <w:p>
-      <w:pPr>
-        <w:jc w:val="both"/>
-        <w:rPr>
-          <w:rFonts w:asciiTheme="minorHAnsi" w:hAnsiTheme="minorHAnsi"/>
-        </w:rPr>
-      </w:pPr>
-      <w:r>
-        <w:rPr>
-          <w:rFonts w:asciiTheme="minorHAnsi" w:hAnsiTheme="minorHAnsi"/>
-        </w:rPr>
-        <w:t>Un lettore autenticato deve poter richiedere una prenotazione di una copia disponibile di un</w:t>
-      </w:r>
-      <w:r>
-        <w:rPr>
-          <w:rFonts w:asciiTheme="minorHAnsi" w:hAnsiTheme="minorHAnsi"/>
-        </w:rPr>
-        <w:t>’</w:t>
-      </w:r>
-      <w:r>
-        <w:rPr>
-          <w:rFonts w:asciiTheme="minorHAnsi" w:hAnsiTheme="minorHAnsi"/>
-        </w:rPr>
-        <w:t xml:space="preserve">edizione </w:t>
-      </w:r>
-      <w:r>
-        <w:rPr>
-          <w:rFonts w:asciiTheme="minorHAnsi" w:hAnsiTheme="minorHAnsi"/>
-        </w:rPr>
-        <w:t>presente nel catalogo, nel rispetto dei vincoli stabiliti dalla biblioteca come ad esempio assenza di sospensioni, numero massimo di prenotazioni.</w:t>
-      </w:r>
-    </w:p>
-    <w:p>
-      <w:pPr>
-        <w:jc w:val="both"/>
-        <w:rPr>
-          <w:rFonts w:asciiTheme="minorHAnsi" w:hAnsiTheme="minorHAnsi"/>
-        </w:rPr>
-      </w:pPr>
-    </w:p>
-    <w:p>
-      <w:pPr>
-        <w:jc w:val="both"/>
+      </w:pPr>
+      <w:r>
         <w:rPr>
           <w:rFonts w:asciiTheme="minorHAnsi" w:hAnsiTheme="minorHAnsi"/>
           <w:b/>
           <w:bCs/>
         </w:rPr>
-      </w:pPr>
+        <w:t>FR</w:t>
+      </w:r>
       <w:r>
         <w:rPr>
           <w:rFonts w:asciiTheme="minorHAnsi" w:hAnsiTheme="minorHAnsi"/>
           <w:b/>
           <w:bCs/>
         </w:rPr>
-        <w:t>RF6 – Visualizzazione e gestione delle prenotazioni</w:t>
-      </w:r>
-    </w:p>
-    <w:p>
-      <w:pPr>
-        <w:jc w:val="both"/>
-        <w:rPr>
-          <w:rFonts w:asciiTheme="minorHAnsi" w:hAnsiTheme="minorHAnsi"/>
-        </w:rPr>
-      </w:pPr>
-      <w:r>
-        <w:rPr>
-          <w:rFonts w:asciiTheme="minorHAnsi" w:hAnsiTheme="minorHAnsi"/>
-        </w:rPr>
-        <w:t>Un lettore autenticato deve poter visualizzare e annullare le proprie prenotazioni attive, rendendo nuovamente disponibile la copia riservata dopo l’annullamento.</w:t>
+        <w:t>4 – Visualizzazione dei dettagli dell’edizione</w:t>
+      </w:r>
+    </w:p>
+    <w:p>
+      <w:pPr>
+        <w:jc w:val="both"/>
+        <w:rPr>
+          <w:rFonts w:asciiTheme="minorHAnsi" w:hAnsiTheme="minorHAnsi"/>
+        </w:rPr>
+      </w:pPr>
+      <w:r>
+        <w:rPr>
+          <w:rFonts w:asciiTheme="minorHAnsi" w:hAnsiTheme="minorHAnsi"/>
+        </w:rPr>
+        <w:t>Il sistema deve consentire di selezionare un’edizione e visualizzare le relative informazioni, quali autore, edizione e numero di copie disponibili.</w:t>
       </w:r>
     </w:p>
     <w:p>
@@ -7897,47 +7861,171 @@
           <w:b/>
           <w:bCs/>
         </w:rPr>
-        <w:t>RF7 – Ricerca delle informazioni di un lettore</w:t>
-      </w:r>
-    </w:p>
-    <w:p>
-      <w:pPr>
-        <w:jc w:val="both"/>
-        <w:rPr>
-          <w:rFonts w:asciiTheme="minorHAnsi" w:hAnsiTheme="minorHAnsi"/>
-        </w:rPr>
-      </w:pPr>
-      <w:r>
-        <w:rPr>
-          <w:rFonts w:asciiTheme="minorHAnsi" w:hAnsiTheme="minorHAnsi"/>
-        </w:rPr>
-        <w:t>Un operatore deve poter ricercare un lettore tramite codice fiscale e visualizzarne le prenotazioni attive, lo storico dei prestiti e delle restituzioni e lo storico delle sospensioni.</w:t>
-      </w:r>
-    </w:p>
-    <w:p>
-      <w:pPr>
-        <w:jc w:val="both"/>
-        <w:rPr>
-          <w:rFonts w:asciiTheme="minorHAnsi" w:hAnsiTheme="minorHAnsi"/>
-        </w:rPr>
-      </w:pPr>
-    </w:p>
-    <w:p>
-      <w:pPr>
-        <w:jc w:val="both"/>
+        <w:t>FR</w:t>
+      </w:r>
+      <w:r>
         <w:rPr>
           <w:rFonts w:asciiTheme="minorHAnsi" w:hAnsiTheme="minorHAnsi"/>
           <w:b/>
           <w:bCs/>
         </w:rPr>
-      </w:pPr>
-      <w:r>
+        <w:t>5 – Prenotazione di una copia</w:t>
+      </w:r>
+    </w:p>
+    <w:p>
+      <w:pPr>
+        <w:jc w:val="both"/>
+        <w:rPr>
+          <w:rFonts w:asciiTheme="minorHAnsi" w:hAnsiTheme="minorHAnsi"/>
+        </w:rPr>
+      </w:pPr>
+      <w:r>
+        <w:rPr>
+          <w:rFonts w:asciiTheme="minorHAnsi" w:hAnsiTheme="minorHAnsi"/>
+        </w:rPr>
+        <w:t>Un lettore autenticato deve poter richiedere una prenotazione di una copia disponibile di un</w:t>
+      </w:r>
+      <w:r>
+        <w:rPr>
+          <w:rFonts w:asciiTheme="minorHAnsi" w:hAnsiTheme="minorHAnsi"/>
+        </w:rPr>
+        <w:t xml:space="preserve">’edizione </w:t>
+      </w:r>
+      <w:r>
+        <w:rPr>
+          <w:rFonts w:asciiTheme="minorHAnsi" w:hAnsiTheme="minorHAnsi"/>
+        </w:rPr>
+        <w:t>presente nel catalogo, nel rispetto dei vincoli stabiliti dalla biblioteca come ad esempio assenza di sospensioni, numero massimo di prenotazioni.</w:t>
+      </w:r>
+    </w:p>
+    <w:p>
+      <w:pPr>
+        <w:jc w:val="both"/>
+        <w:rPr>
+          <w:rFonts w:asciiTheme="minorHAnsi" w:hAnsiTheme="minorHAnsi"/>
+        </w:rPr>
+      </w:pPr>
+    </w:p>
+    <w:p>
+      <w:pPr>
+        <w:jc w:val="both"/>
         <w:rPr>
           <w:rFonts w:asciiTheme="minorHAnsi" w:hAnsiTheme="minorHAnsi"/>
           <w:b/>
           <w:bCs/>
         </w:rPr>
-        <w:t>RF8 – Registrazione del prestito</w:t>
+      </w:pPr>
+      <w:r>
+        <w:rPr>
+          <w:rFonts w:asciiTheme="minorHAnsi" w:hAnsiTheme="minorHAnsi"/>
+          <w:b/>
+          <w:bCs/>
+        </w:rPr>
+        <w:t>FR</w:t>
+      </w:r>
+      <w:r>
+        <w:rPr>
+          <w:rFonts w:asciiTheme="minorHAnsi" w:hAnsiTheme="minorHAnsi"/>
+          <w:b/>
+          <w:bCs/>
+        </w:rPr>
+        <w:t>6 – Visualizzazione e gestione delle prenotazioni</w:t>
+      </w:r>
+    </w:p>
+    <w:p>
+      <w:pPr>
+        <w:jc w:val="both"/>
+        <w:rPr>
+          <w:rFonts w:asciiTheme="minorHAnsi" w:hAnsiTheme="minorHAnsi"/>
+        </w:rPr>
+      </w:pPr>
+      <w:r>
+        <w:rPr>
+          <w:rFonts w:asciiTheme="minorHAnsi" w:hAnsiTheme="minorHAnsi"/>
+        </w:rPr>
+        <w:t>Un lettore autenticato deve poter visualizzare e annullare le proprie prenotazioni attive, rendendo nuovamente disponibile la copia riservata dopo l’annullamento.</w:t>
+      </w:r>
+    </w:p>
+    <w:p>
+      <w:pPr>
+        <w:jc w:val="both"/>
+        <w:rPr>
+          <w:rFonts w:asciiTheme="minorHAnsi" w:hAnsiTheme="minorHAnsi"/>
+        </w:rPr>
+      </w:pPr>
+    </w:p>
+    <w:p>
+      <w:pPr>
+        <w:jc w:val="both"/>
+        <w:rPr>
+          <w:rFonts w:asciiTheme="minorHAnsi" w:hAnsiTheme="minorHAnsi"/>
+          <w:b/>
+          <w:bCs/>
+        </w:rPr>
+      </w:pPr>
+      <w:r>
+        <w:rPr>
+          <w:rFonts w:asciiTheme="minorHAnsi" w:hAnsiTheme="minorHAnsi"/>
+          <w:b/>
+          <w:bCs/>
+        </w:rPr>
+        <w:t>FR</w:t>
+      </w:r>
+      <w:r>
+        <w:rPr>
+          <w:rFonts w:asciiTheme="minorHAnsi" w:hAnsiTheme="minorHAnsi"/>
+          <w:b/>
+          <w:bCs/>
+        </w:rPr>
+        <w:t>7 – Ricerca delle informazioni di un lettore</w:t>
+      </w:r>
+    </w:p>
+    <w:p>
+      <w:pPr>
+        <w:jc w:val="both"/>
+        <w:rPr>
+          <w:rFonts w:asciiTheme="minorHAnsi" w:hAnsiTheme="minorHAnsi"/>
+        </w:rPr>
+      </w:pPr>
+      <w:r>
+        <w:rPr>
+          <w:rFonts w:asciiTheme="minorHAnsi" w:hAnsiTheme="minorHAnsi"/>
+        </w:rPr>
+        <w:t>Un operatore deve poter ricercare un lettore tramite codice fiscale e visualizzarne le prenotazioni attive, lo storico dei prestiti e delle restituzioni e lo storico delle sospensioni.</w:t>
+      </w:r>
+    </w:p>
+    <w:p>
+      <w:pPr>
+        <w:jc w:val="both"/>
+        <w:rPr>
+          <w:rFonts w:asciiTheme="minorHAnsi" w:hAnsiTheme="minorHAnsi"/>
+        </w:rPr>
+      </w:pPr>
+    </w:p>
+    <w:p>
+      <w:pPr>
+        <w:jc w:val="both"/>
+        <w:rPr>
+          <w:rFonts w:asciiTheme="minorHAnsi" w:hAnsiTheme="minorHAnsi"/>
+          <w:b/>
+          <w:bCs/>
+        </w:rPr>
+      </w:pPr>
+      <w:r>
+        <w:rPr>
+          <w:rFonts w:asciiTheme="minorHAnsi" w:hAnsiTheme="minorHAnsi"/>
+          <w:b/>
+          <w:bCs/>
+        </w:rPr>
+        <w:t>FR</w:t>
+      </w:r>
+      <w:r>
+        <w:rPr>
+          <w:rFonts w:asciiTheme="minorHAnsi" w:hAnsiTheme="minorHAnsi"/>
+          <w:b/>
+          <w:bCs/>
+        </w:rPr>
+        <w:t>8 – Registrazione del prestito</w:t>
       </w:r>
     </w:p>
     <w:p>
@@ -8029,245 +8117,209 @@
           <w:b/>
           <w:bCs/>
         </w:rPr>
-        <w:t>RF9 – Registrazione della restituzione</w:t>
-      </w:r>
-    </w:p>
-    <w:p>
-      <w:pPr>
-        <w:jc w:val="both"/>
-        <w:rPr>
-          <w:rFonts w:asciiTheme="minorHAnsi" w:hAnsiTheme="minorHAnsi"/>
-        </w:rPr>
-      </w:pPr>
-      <w:r>
-        <w:rPr>
-          <w:rFonts w:asciiTheme="minorHAnsi" w:hAnsiTheme="minorHAnsi"/>
-        </w:rPr>
-        <w:t>Un operatore deve poter registrare una restituzione di una copia del libro, verificando l'esistenza di un prestito corrispondente e segnalando eventuali ritardi rispetto alla data di restituzione prevista.</w:t>
-      </w:r>
-    </w:p>
-    <w:p>
-      <w:pPr>
-        <w:jc w:val="both"/>
-        <w:rPr>
-          <w:rFonts w:asciiTheme="minorHAnsi" w:hAnsiTheme="minorHAnsi"/>
-        </w:rPr>
-      </w:pPr>
-    </w:p>
-    <w:p>
-      <w:pPr>
-        <w:jc w:val="both"/>
+        <w:t>FR</w:t>
+      </w:r>
+      <w:r>
         <w:rPr>
           <w:rFonts w:asciiTheme="minorHAnsi" w:hAnsiTheme="minorHAnsi"/>
           <w:b/>
           <w:bCs/>
         </w:rPr>
-      </w:pPr>
-      <w:r>
+        <w:t>9 – Registrazione della restituzione</w:t>
+      </w:r>
+    </w:p>
+    <w:p>
+      <w:pPr>
+        <w:jc w:val="both"/>
+        <w:rPr>
+          <w:rFonts w:asciiTheme="minorHAnsi" w:hAnsiTheme="minorHAnsi"/>
+        </w:rPr>
+      </w:pPr>
+      <w:r>
+        <w:rPr>
+          <w:rFonts w:asciiTheme="minorHAnsi" w:hAnsiTheme="minorHAnsi"/>
+        </w:rPr>
+        <w:t>Un operatore deve poter registrare una restituzione di una copia del libro, verificando l'esistenza di un prestito corrispondente e segnalando eventuali ritardi rispetto alla data di restituzione prevista.</w:t>
+      </w:r>
+    </w:p>
+    <w:p>
+      <w:pPr>
+        <w:jc w:val="both"/>
+        <w:rPr>
+          <w:rFonts w:asciiTheme="minorHAnsi" w:hAnsiTheme="minorHAnsi"/>
+        </w:rPr>
+      </w:pPr>
+    </w:p>
+    <w:p>
+      <w:pPr>
+        <w:jc w:val="both"/>
         <w:rPr>
           <w:rFonts w:asciiTheme="minorHAnsi" w:hAnsiTheme="minorHAnsi"/>
           <w:b/>
           <w:bCs/>
         </w:rPr>
-        <w:t>RF10 – Modifica del catalogo</w:t>
-      </w:r>
-    </w:p>
-    <w:p>
-      <w:pPr>
-        <w:jc w:val="both"/>
-        <w:rPr>
-          <w:rFonts w:asciiTheme="minorHAnsi" w:hAnsiTheme="minorHAnsi"/>
-        </w:rPr>
-      </w:pPr>
-      <w:r>
-        <w:rPr>
-          <w:rFonts w:asciiTheme="minorHAnsi" w:hAnsiTheme="minorHAnsi"/>
-        </w:rPr>
-        <w:t>Un operatore deve poter modificare il catalogo, aggiungendo o rimuovendo copie</w:t>
-      </w:r>
-      <w:r>
-        <w:rPr>
-          <w:rFonts w:asciiTheme="minorHAnsi" w:hAnsiTheme="minorHAnsi"/>
-        </w:rPr>
-        <w:t xml:space="preserve"> e aggiungendo </w:t>
-      </w:r>
-      <w:r>
-        <w:rPr>
-          <w:rFonts w:asciiTheme="minorHAnsi" w:hAnsiTheme="minorHAnsi"/>
-        </w:rPr>
-        <w:t xml:space="preserve">o modificando </w:t>
-      </w:r>
-      <w:r>
-        <w:rPr>
-          <w:rFonts w:asciiTheme="minorHAnsi" w:hAnsiTheme="minorHAnsi"/>
-        </w:rPr>
-        <w:t>edizioni,</w:t>
-      </w:r>
-      <w:r>
-        <w:rPr>
-          <w:rFonts w:asciiTheme="minorHAnsi" w:hAnsiTheme="minorHAnsi"/>
-        </w:rPr>
-        <w:t xml:space="preserve"> mantenendo aggiornate le informazioni consultabili.</w:t>
-      </w:r>
-    </w:p>
-    <w:p>
-      <w:pPr>
-        <w:jc w:val="both"/>
-        <w:rPr>
-          <w:rFonts w:asciiTheme="minorHAnsi" w:hAnsiTheme="minorHAnsi"/>
-        </w:rPr>
-      </w:pPr>
-    </w:p>
-    <w:p>
-      <w:pPr>
-        <w:jc w:val="both"/>
+      </w:pPr>
+      <w:r>
         <w:rPr>
           <w:rFonts w:asciiTheme="minorHAnsi" w:hAnsiTheme="minorHAnsi"/>
           <w:b/>
           <w:bCs/>
         </w:rPr>
-      </w:pPr>
+        <w:t>FR</w:t>
+      </w:r>
       <w:r>
         <w:rPr>
           <w:rFonts w:asciiTheme="minorHAnsi" w:hAnsiTheme="minorHAnsi"/>
           <w:b/>
           <w:bCs/>
         </w:rPr>
-        <w:t>RF11 – Registrazione d</w:t>
-      </w:r>
-      <w:r>
+        <w:t>10 – Modifica del catalogo</w:t>
+      </w:r>
+    </w:p>
+    <w:p>
+      <w:pPr>
+        <w:jc w:val="both"/>
+        <w:rPr>
+          <w:rFonts w:asciiTheme="minorHAnsi" w:hAnsiTheme="minorHAnsi"/>
+        </w:rPr>
+      </w:pPr>
+      <w:r>
+        <w:rPr>
+          <w:rFonts w:asciiTheme="minorHAnsi" w:hAnsiTheme="minorHAnsi"/>
+        </w:rPr>
+        <w:t>Un operatore deve poter modificare il catalogo, aggiungendo o rimuovendo copie</w:t>
+      </w:r>
+      <w:r>
+        <w:rPr>
+          <w:rFonts w:asciiTheme="minorHAnsi" w:hAnsiTheme="minorHAnsi"/>
+        </w:rPr>
+        <w:t xml:space="preserve"> e aggiungendo o modificando edizioni,</w:t>
+      </w:r>
+      <w:r>
+        <w:rPr>
+          <w:rFonts w:asciiTheme="minorHAnsi" w:hAnsiTheme="minorHAnsi"/>
+        </w:rPr>
+        <w:t xml:space="preserve"> mantenendo aggiornate le informazioni consultabili.</w:t>
+      </w:r>
+    </w:p>
+    <w:p>
+      <w:pPr>
+        <w:jc w:val="both"/>
+        <w:rPr>
+          <w:rFonts w:asciiTheme="minorHAnsi" w:hAnsiTheme="minorHAnsi"/>
+        </w:rPr>
+      </w:pPr>
+    </w:p>
+    <w:p>
+      <w:pPr>
+        <w:jc w:val="both"/>
         <w:rPr>
           <w:rFonts w:asciiTheme="minorHAnsi" w:hAnsiTheme="minorHAnsi"/>
           <w:b/>
           <w:bCs/>
         </w:rPr>
-        <w:t xml:space="preserve">i una </w:t>
-      </w:r>
+      </w:pPr>
       <w:r>
         <w:rPr>
           <w:rFonts w:asciiTheme="minorHAnsi" w:hAnsiTheme="minorHAnsi"/>
           <w:b/>
           <w:bCs/>
         </w:rPr>
-        <w:t>sospensione</w:t>
-      </w:r>
-    </w:p>
-    <w:p>
-      <w:pPr>
-        <w:jc w:val="both"/>
-        <w:rPr>
-          <w:rFonts w:asciiTheme="minorHAnsi" w:hAnsiTheme="minorHAnsi"/>
-        </w:rPr>
-      </w:pPr>
-      <w:r>
-        <w:rPr>
-          <w:rFonts w:asciiTheme="minorHAnsi" w:hAnsiTheme="minorHAnsi"/>
-        </w:rPr>
-        <w:t>Un operatore deve poter registrare una sospensione a un lettore, indicando data di inizio e durata, aggiungendola allo storico del lettore. Per tutta la durata della sospensione, il sistema deve impedire al lettore di effettuare prenotazioni e ottenere prestiti. Inoltre</w:t>
-      </w:r>
-      <w:r>
-        <w:rPr>
-          <w:rFonts w:asciiTheme="minorHAnsi" w:hAnsiTheme="minorHAnsi"/>
-        </w:rPr>
-        <w:t>, in caso di sospensione,</w:t>
-      </w:r>
-      <w:r>
-        <w:rPr>
-          <w:rFonts w:asciiTheme="minorHAnsi" w:hAnsiTheme="minorHAnsi"/>
-        </w:rPr>
-        <w:t xml:space="preserve"> </w:t>
-      </w:r>
-      <w:r>
-        <w:rPr>
-          <w:rFonts w:asciiTheme="minorHAnsi" w:hAnsiTheme="minorHAnsi"/>
-        </w:rPr>
-        <w:t xml:space="preserve">devono essere </w:t>
-      </w:r>
-      <w:r>
-        <w:rPr>
-          <w:rFonts w:asciiTheme="minorHAnsi" w:hAnsiTheme="minorHAnsi"/>
-        </w:rPr>
-        <w:t>annullate, se ci sono, tutte le prenotazion</w:t>
-      </w:r>
-      <w:r>
-        <w:rPr>
-          <w:rFonts w:asciiTheme="minorHAnsi" w:hAnsiTheme="minorHAnsi"/>
-        </w:rPr>
-        <w:t>i</w:t>
-      </w:r>
-      <w:r>
-        <w:rPr>
-          <w:rFonts w:asciiTheme="minorHAnsi" w:hAnsiTheme="minorHAnsi"/>
-        </w:rPr>
-        <w:t xml:space="preserve"> attive </w:t>
-      </w:r>
-      <w:r>
-        <w:rPr>
-          <w:rFonts w:asciiTheme="minorHAnsi" w:hAnsiTheme="minorHAnsi"/>
-        </w:rPr>
-        <w:t>di</w:t>
-      </w:r>
-      <w:r>
-        <w:rPr>
-          <w:rFonts w:asciiTheme="minorHAnsi" w:hAnsiTheme="minorHAnsi"/>
-        </w:rPr>
-        <w:t xml:space="preserve"> quel lettore.</w:t>
-      </w:r>
-    </w:p>
-    <w:p>
-      <w:pPr>
-        <w:jc w:val="both"/>
-        <w:rPr>
-          <w:rFonts w:asciiTheme="minorHAnsi" w:hAnsiTheme="minorHAnsi"/>
-        </w:rPr>
-      </w:pPr>
-    </w:p>
-    <w:p>
-      <w:pPr>
-        <w:jc w:val="both"/>
+        <w:t>FR</w:t>
+      </w:r>
+      <w:r>
         <w:rPr>
           <w:rFonts w:asciiTheme="minorHAnsi" w:hAnsiTheme="minorHAnsi"/>
           <w:b/>
           <w:bCs/>
         </w:rPr>
-      </w:pPr>
+        <w:t>11 – Registrazione d</w:t>
+      </w:r>
       <w:r>
         <w:rPr>
           <w:rFonts w:asciiTheme="minorHAnsi" w:hAnsiTheme="minorHAnsi"/>
           <w:b/>
           <w:bCs/>
         </w:rPr>
-        <w:t>RF12 – Annullamento di una sospensione</w:t>
-      </w:r>
-    </w:p>
-    <w:p>
-      <w:pPr>
-        <w:jc w:val="both"/>
-        <w:rPr>
-          <w:rFonts w:asciiTheme="minorHAnsi" w:hAnsiTheme="minorHAnsi"/>
-        </w:rPr>
-      </w:pPr>
-      <w:r>
-        <w:rPr>
-          <w:rFonts w:asciiTheme="minorHAnsi" w:hAnsiTheme="minorHAnsi"/>
-        </w:rPr>
-        <w:t>Un operatore deve poter annullare</w:t>
-      </w:r>
-      <w:r>
-        <w:rPr>
-          <w:rFonts w:asciiTheme="minorHAnsi" w:hAnsiTheme="minorHAnsi"/>
-        </w:rPr>
-        <w:t xml:space="preserve"> una sospesione a un lettore assegnata in precedenza.</w:t>
-      </w:r>
-    </w:p>
-    <w:p>
-      <w:pPr>
-        <w:jc w:val="both"/>
+        <w:t xml:space="preserve">i una </w:t>
+      </w:r>
+      <w:r>
         <w:rPr>
           <w:rFonts w:asciiTheme="minorHAnsi" w:hAnsiTheme="minorHAnsi"/>
           <w:b/>
           <w:bCs/>
         </w:rPr>
+        <w:t>sospensione</w:t>
+      </w:r>
+    </w:p>
+    <w:p>
+      <w:pPr>
+        <w:jc w:val="both"/>
+        <w:rPr>
+          <w:rFonts w:asciiTheme="minorHAnsi" w:hAnsiTheme="minorHAnsi"/>
+        </w:rPr>
+      </w:pPr>
+      <w:r>
+        <w:rPr>
+          <w:rFonts w:asciiTheme="minorHAnsi" w:hAnsiTheme="minorHAnsi"/>
+        </w:rPr>
+        <w:t>Un operatore deve poter registrare una sospensione a un lettore, indicando data di inizio e durata, aggiungendola allo storico del lettore. Per tutta la durata della sospensione, il sistema deve impedire al lettore di effettuare prenotazioni e ottenere prestiti. Inoltre</w:t>
+      </w:r>
+      <w:r>
+        <w:rPr>
+          <w:rFonts w:asciiTheme="minorHAnsi" w:hAnsiTheme="minorHAnsi"/>
+        </w:rPr>
+        <w:t>, in caso di sospensione,</w:t>
+      </w:r>
+      <w:r>
+        <w:rPr>
+          <w:rFonts w:asciiTheme="minorHAnsi" w:hAnsiTheme="minorHAnsi"/>
+        </w:rPr>
+        <w:t xml:space="preserve"> </w:t>
+      </w:r>
+      <w:r>
+        <w:rPr>
+          <w:rFonts w:asciiTheme="minorHAnsi" w:hAnsiTheme="minorHAnsi"/>
+        </w:rPr>
+        <w:t xml:space="preserve">devono essere </w:t>
+      </w:r>
+      <w:r>
+        <w:rPr>
+          <w:rFonts w:asciiTheme="minorHAnsi" w:hAnsiTheme="minorHAnsi"/>
+        </w:rPr>
+        <w:t>annullate, se ci sono, tutte le prenotazion</w:t>
+      </w:r>
+      <w:r>
+        <w:rPr>
+          <w:rFonts w:asciiTheme="minorHAnsi" w:hAnsiTheme="minorHAnsi"/>
+        </w:rPr>
+        <w:t>i</w:t>
+      </w:r>
+      <w:r>
+        <w:rPr>
+          <w:rFonts w:asciiTheme="minorHAnsi" w:hAnsiTheme="minorHAnsi"/>
+        </w:rPr>
+        <w:t xml:space="preserve"> attive </w:t>
+      </w:r>
+      <w:r>
+        <w:rPr>
+          <w:rFonts w:asciiTheme="minorHAnsi" w:hAnsiTheme="minorHAnsi"/>
+        </w:rPr>
+        <w:t>di</w:t>
+      </w:r>
+      <w:r>
+        <w:rPr>
+          <w:rFonts w:asciiTheme="minorHAnsi" w:hAnsiTheme="minorHAnsi"/>
+        </w:rPr>
+        <w:t xml:space="preserve"> quel lettore.</w:t>
+      </w:r>
+    </w:p>
+    <w:p>
+      <w:pPr>
+        <w:jc w:val="both"/>
+        <w:rPr>
+          <w:rFonts w:asciiTheme="minorHAnsi" w:hAnsiTheme="minorHAnsi"/>
+        </w:rPr>
       </w:pPr>
     </w:p>
     <w:p>
@@ -8285,7 +8337,7 @@
           <w:b/>
           <w:bCs/>
         </w:rPr>
-        <w:t>RF1</w:t>
+        <w:t>FR</w:t>
       </w:r>
       <w:r>
         <w:rPr>
@@ -8293,61 +8345,31 @@
           <w:b/>
           <w:bCs/>
         </w:rPr>
-        <w:t>3</w:t>
-      </w:r>
-      <w:r>
+        <w:t>12 – Annullamento di una sospensione</w:t>
+      </w:r>
+    </w:p>
+    <w:p>
+      <w:pPr>
+        <w:jc w:val="both"/>
+        <w:rPr>
+          <w:rFonts w:asciiTheme="minorHAnsi" w:hAnsiTheme="minorHAnsi"/>
+        </w:rPr>
+      </w:pPr>
+      <w:r>
+        <w:rPr>
+          <w:rFonts w:asciiTheme="minorHAnsi" w:hAnsiTheme="minorHAnsi"/>
+        </w:rPr>
+        <w:t>Un operatore deve poter annullare una sospesione a un lettore assegnata in precedenza.</w:t>
+      </w:r>
+    </w:p>
+    <w:p>
+      <w:pPr>
+        <w:jc w:val="both"/>
         <w:rPr>
           <w:rFonts w:asciiTheme="minorHAnsi" w:hAnsiTheme="minorHAnsi"/>
           <w:b/>
           <w:bCs/>
         </w:rPr>
-        <w:t xml:space="preserve"> – Modifica informazioni lettore registrato</w:t>
-      </w:r>
-    </w:p>
-    <w:p>
-      <w:pPr>
-        <w:jc w:val="both"/>
-        <w:rPr>
-          <w:rFonts w:asciiTheme="minorHAnsi" w:hAnsiTheme="minorHAnsi"/>
-        </w:rPr>
-      </w:pPr>
-      <w:r>
-        <w:rPr>
-          <w:rFonts w:asciiTheme="minorHAnsi" w:hAnsiTheme="minorHAnsi"/>
-        </w:rPr>
-        <w:t xml:space="preserve">Il sistema deve consentire ad un operatore di modificare </w:t>
-      </w:r>
-      <w:r>
-        <w:rPr>
-          <w:rFonts w:asciiTheme="minorHAnsi" w:hAnsiTheme="minorHAnsi"/>
-        </w:rPr>
-        <w:t>nome, cognome e</w:t>
-      </w:r>
-      <w:r>
-        <w:rPr>
-          <w:rFonts w:asciiTheme="minorHAnsi" w:hAnsiTheme="minorHAnsi"/>
-        </w:rPr>
-        <w:t>d</w:t>
-      </w:r>
-      <w:r>
-        <w:rPr>
-          <w:rFonts w:asciiTheme="minorHAnsi" w:hAnsiTheme="minorHAnsi"/>
-        </w:rPr>
-        <w:t xml:space="preserve"> e-mail</w:t>
-      </w:r>
-      <w:r>
-        <w:rPr>
-          <w:rFonts w:asciiTheme="minorHAnsi" w:hAnsiTheme="minorHAnsi"/>
-        </w:rPr>
-        <w:t xml:space="preserve"> di un lettore registrato.</w:t>
-      </w:r>
-    </w:p>
-    <w:p>
-      <w:pPr>
-        <w:jc w:val="both"/>
-        <w:rPr>
-          <w:rFonts w:asciiTheme="minorHAnsi" w:hAnsiTheme="minorHAnsi"/>
-        </w:rPr>
       </w:pPr>
     </w:p>
     <w:p>
@@ -8365,7 +8387,7 @@
           <w:b/>
           <w:bCs/>
         </w:rPr>
-        <w:t>RF1</w:t>
+        <w:t>FR</w:t>
       </w:r>
       <w:r>
         <w:rPr>
@@ -8373,7 +8395,7 @@
           <w:b/>
           <w:bCs/>
         </w:rPr>
-        <w:t xml:space="preserve">4 </w:t>
+        <w:t>1</w:t>
       </w:r>
       <w:r>
         <w:rPr>
@@ -8381,60 +8403,134 @@
           <w:b/>
           <w:bCs/>
         </w:rPr>
-        <w:t>– Reset della password</w:t>
-      </w:r>
-    </w:p>
-    <w:p>
-      <w:pPr>
-        <w:jc w:val="both"/>
-        <w:rPr>
-          <w:rFonts w:asciiTheme="minorHAnsi" w:hAnsiTheme="minorHAnsi"/>
-        </w:rPr>
-      </w:pPr>
-      <w:r>
-        <w:rPr>
-          <w:rFonts w:asciiTheme="minorHAnsi" w:hAnsiTheme="minorHAnsi"/>
-        </w:rPr>
-        <w:t>Il sistema deve consentire ad un operatore di resettare la password dell’account di un lettore registrato.</w:t>
-      </w:r>
-      <w:r>
-        <w:rPr>
-          <w:rFonts w:asciiTheme="minorHAnsi" w:hAnsiTheme="minorHAnsi"/>
-        </w:rPr>
-        <w:t xml:space="preserve"> Assegnando una nuova password temporanea.</w:t>
-      </w:r>
-    </w:p>
-    <w:p>
-      <w:pPr>
-        <w:jc w:val="both"/>
-        <w:rPr>
-          <w:rFonts w:asciiTheme="minorHAnsi" w:hAnsiTheme="minorHAnsi"/>
-        </w:rPr>
-      </w:pPr>
-    </w:p>
-    <w:p>
-      <w:pPr>
-        <w:jc w:val="both"/>
+        <w:t>3</w:t>
+      </w:r>
+      <w:r>
         <w:rPr>
           <w:rFonts w:asciiTheme="minorHAnsi" w:hAnsiTheme="minorHAnsi"/>
           <w:b/>
           <w:bCs/>
         </w:rPr>
-      </w:pPr>
-      <w:r>
+        <w:t xml:space="preserve"> – Modifica informazioni lettore registrato</w:t>
+      </w:r>
+    </w:p>
+    <w:p>
+      <w:pPr>
+        <w:jc w:val="both"/>
+        <w:rPr>
+          <w:rFonts w:asciiTheme="minorHAnsi" w:hAnsiTheme="minorHAnsi"/>
+        </w:rPr>
+      </w:pPr>
+      <w:r>
+        <w:rPr>
+          <w:rFonts w:asciiTheme="minorHAnsi" w:hAnsiTheme="minorHAnsi"/>
+        </w:rPr>
+        <w:t>Il sistema deve consentire ad un operatore di modificare nome, cognome ed e-mail di un lettore registrato.</w:t>
+      </w:r>
+    </w:p>
+    <w:p>
+      <w:pPr>
+        <w:jc w:val="both"/>
+        <w:rPr>
+          <w:rFonts w:asciiTheme="minorHAnsi" w:hAnsiTheme="minorHAnsi"/>
+        </w:rPr>
+      </w:pPr>
+    </w:p>
+    <w:p>
+      <w:pPr>
+        <w:jc w:val="both"/>
         <w:rPr>
           <w:rFonts w:asciiTheme="minorHAnsi" w:hAnsiTheme="minorHAnsi"/>
           <w:b/>
           <w:bCs/>
         </w:rPr>
-        <w:t>RF15 – Cancellazione automatica delle prenotazioni</w:t>
-      </w:r>
+      </w:pPr>
       <w:r>
         <w:rPr>
           <w:rFonts w:asciiTheme="minorHAnsi" w:hAnsiTheme="minorHAnsi"/>
           <w:b/>
           <w:bCs/>
         </w:rPr>
+        <w:t>FR</w:t>
+      </w:r>
+      <w:r>
+        <w:rPr>
+          <w:rFonts w:asciiTheme="minorHAnsi" w:hAnsiTheme="minorHAnsi"/>
+          <w:b/>
+          <w:bCs/>
+        </w:rPr>
+        <w:t>1</w:t>
+      </w:r>
+      <w:r>
+        <w:rPr>
+          <w:rFonts w:asciiTheme="minorHAnsi" w:hAnsiTheme="minorHAnsi"/>
+          <w:b/>
+          <w:bCs/>
+        </w:rPr>
+        <w:t xml:space="preserve">4 </w:t>
+      </w:r>
+      <w:r>
+        <w:rPr>
+          <w:rFonts w:asciiTheme="minorHAnsi" w:hAnsiTheme="minorHAnsi"/>
+          <w:b/>
+          <w:bCs/>
+        </w:rPr>
+        <w:t>– Reset della password</w:t>
+      </w:r>
+    </w:p>
+    <w:p>
+      <w:pPr>
+        <w:jc w:val="both"/>
+        <w:rPr>
+          <w:rFonts w:asciiTheme="minorHAnsi" w:hAnsiTheme="minorHAnsi"/>
+        </w:rPr>
+      </w:pPr>
+      <w:r>
+        <w:rPr>
+          <w:rFonts w:asciiTheme="minorHAnsi" w:hAnsiTheme="minorHAnsi"/>
+        </w:rPr>
+        <w:t>Il sistema deve consentire ad un operatore di resettare la password dell’account di un lettore registrato. Assegnando una nuova password temporanea.</w:t>
+      </w:r>
+    </w:p>
+    <w:p>
+      <w:pPr>
+        <w:jc w:val="both"/>
+        <w:rPr>
+          <w:rFonts w:asciiTheme="minorHAnsi" w:hAnsiTheme="minorHAnsi"/>
+        </w:rPr>
+      </w:pPr>
+    </w:p>
+    <w:p>
+      <w:pPr>
+        <w:jc w:val="both"/>
+        <w:rPr>
+          <w:rFonts w:asciiTheme="minorHAnsi" w:hAnsiTheme="minorHAnsi"/>
+          <w:b/>
+          <w:bCs/>
+        </w:rPr>
+      </w:pPr>
+      <w:r>
+        <w:rPr>
+          <w:rFonts w:asciiTheme="minorHAnsi" w:hAnsiTheme="minorHAnsi"/>
+          <w:b/>
+          <w:bCs/>
+        </w:rPr>
+        <w:t>FR</w:t>
+      </w:r>
+      <w:r>
+        <w:rPr>
+          <w:rFonts w:asciiTheme="minorHAnsi" w:hAnsiTheme="minorHAnsi"/>
+          <w:b/>
+          <w:bCs/>
+        </w:rPr>
+        <w:t>15 – Cancellazione automatica delle prenotazioni</w:t>
+      </w:r>
+      <w:r>
+        <w:rPr>
+          <w:rFonts w:asciiTheme="minorHAnsi" w:hAnsiTheme="minorHAnsi"/>
+          <w:b/>
+          <w:bCs/>
+        </w:rPr>
         <w:t xml:space="preserve"> scadute</w:t>
       </w:r>
     </w:p>
@@ -8477,118 +8573,371 @@
     </w:p>
     <w:p>
       <w:pPr>
-        <w:jc w:val="both"/>
-        <w:rPr>
-          <w:rFonts w:asciiTheme="minorHAnsi" w:hAnsiTheme="minorHAnsi"/>
+        <w:pStyle w:val="Heading3"/>
+        <w:jc w:val="both"/>
+        <w:rPr>
+          <w:rFonts w:asciiTheme="minorHAnsi" w:hAnsiTheme="minorHAnsi"/>
+          <w:sz w:val="28"/>
+          <w:szCs w:val="28"/>
+        </w:rPr>
+      </w:pPr>
+      <w:bookmarkStart w:id="24" w:name="_Toc243845541"/>
+      <w:r>
+        <w:rPr>
+          <w:rFonts w:asciiTheme="minorHAnsi" w:hAnsiTheme="minorHAnsi"/>
+          <w:sz w:val="28"/>
+          <w:szCs w:val="28"/>
+        </w:rPr>
+        <w:t>Usability</w:t>
+      </w:r>
+      <w:bookmarkEnd w:id="24"/>
+    </w:p>
+    <w:p>
+      <w:pPr>
+        <w:pStyle w:val="ListParagraph"/>
+        <w:numPr>
+          <w:ilvl w:val="0"/>
+          <w:numId w:val="44"/>
+        </w:numPr>
+        <w:jc w:val="both"/>
+        <w:rPr>
+          <w:rFonts w:asciiTheme="minorHAnsi" w:eastAsia="Times New Roman" w:hAnsiTheme="minorHAnsi"/>
+        </w:rPr>
+      </w:pPr>
+      <w:r>
+        <w:rPr>
+          <w:rFonts w:asciiTheme="minorHAnsi" w:eastAsia="Times New Roman" w:hAnsiTheme="minorHAnsi"/>
           <w:b/>
           <w:bCs/>
         </w:rPr>
-      </w:pPr>
-      <w:r>
-        <w:rPr>
-          <w:rFonts w:asciiTheme="minorHAnsi" w:hAnsiTheme="minorHAnsi"/>
+        <w:t xml:space="preserve">NFR1 - </w:t>
+      </w:r>
+      <w:r>
+        <w:rPr>
+          <w:rFonts w:asciiTheme="minorHAnsi" w:eastAsia="Times New Roman" w:hAnsiTheme="minorHAnsi"/>
           <w:b/>
           <w:bCs/>
         </w:rPr>
-        <w:t>USABILITÀ</w:t>
-      </w:r>
-    </w:p>
-    <w:p>
-      <w:pPr>
-        <w:jc w:val="both"/>
-        <w:rPr>
-          <w:rFonts w:asciiTheme="minorHAnsi" w:hAnsiTheme="minorHAnsi"/>
+        <w:t>Interfaccia intuitiva</w:t>
+      </w:r>
+      <w:r>
+        <w:rPr>
+          <w:rFonts w:asciiTheme="minorHAnsi" w:eastAsia="Times New Roman" w:hAnsiTheme="minorHAnsi"/>
+        </w:rPr>
+        <w:t xml:space="preserve">: </w:t>
+      </w:r>
+      <w:r>
+        <w:rPr>
+          <w:rFonts w:asciiTheme="minorHAnsi" w:eastAsia="Times New Roman" w:hAnsiTheme="minorHAnsi"/>
+        </w:rPr>
+        <w:t>l</w:t>
+      </w:r>
+      <w:r>
+        <w:rPr>
+          <w:rFonts w:asciiTheme="minorHAnsi" w:eastAsia="Times New Roman" w:hAnsiTheme="minorHAnsi"/>
+        </w:rPr>
+        <w:t>'Interfaccia Utente deve essere progettata con una preferenza all'uso dell'inglese e italiano rispetto all’uso di simboli ambigui (come "[date] until [date]" invece di "[date</w:t>
+      </w:r>
+      <w:r>
+        <w:rPr>
+          <w:rFonts w:asciiTheme="minorHAnsi" w:eastAsia="Times New Roman" w:hAnsiTheme="minorHAnsi"/>
+          <w:sz w:val="28"/>
+          <w:szCs w:val="28"/>
+        </w:rPr>
+        <w:t>]</w:t>
+      </w:r>
+      <w:r>
+        <w:rPr>
+          <w:rFonts w:asciiTheme="minorHAnsi" w:eastAsia="Times New Roman" w:hAnsiTheme="minorHAnsi"/>
+        </w:rPr>
+        <w:t xml:space="preserve"> -&gt; [date]").</w:t>
+      </w:r>
+    </w:p>
+    <w:p>
+      <w:pPr>
+        <w:pStyle w:val="ListParagraph"/>
+        <w:numPr>
+          <w:ilvl w:val="0"/>
+          <w:numId w:val="44"/>
+        </w:numPr>
+        <w:jc w:val="both"/>
+        <w:rPr>
+          <w:rFonts w:asciiTheme="minorHAnsi" w:eastAsia="Times New Roman" w:hAnsiTheme="minorHAnsi"/>
+        </w:rPr>
+      </w:pPr>
+      <w:r>
+        <w:rPr>
+          <w:rFonts w:asciiTheme="minorHAnsi" w:eastAsia="Times New Roman" w:hAnsiTheme="minorHAnsi"/>
           <w:b/>
           <w:bCs/>
         </w:rPr>
-      </w:pPr>
-    </w:p>
-    <w:p>
-      <w:pPr>
-        <w:jc w:val="both"/>
-        <w:rPr>
-          <w:rFonts w:asciiTheme="minorHAnsi" w:hAnsiTheme="minorHAnsi"/>
+        <w:t>NFR2 - Feedback delle operazioni</w:t>
+      </w:r>
+      <w:r>
+        <w:rPr>
+          <w:rFonts w:asciiTheme="minorHAnsi" w:eastAsia="Times New Roman" w:hAnsiTheme="minorHAnsi"/>
+        </w:rPr>
+        <w:t>:</w:t>
+      </w:r>
+      <w:r>
+        <w:rPr>
+          <w:rFonts w:asciiTheme="minorHAnsi" w:eastAsia="Times New Roman" w:hAnsiTheme="minorHAnsi"/>
+        </w:rPr>
+        <w:t xml:space="preserve"> il sistema deve mostrare un messaggio di conferma al completamento delle operazioni principali e un messaggio esplicativo in caso di </w:t>
+      </w:r>
+      <w:r>
+        <w:rPr>
+          <w:rFonts w:asciiTheme="minorHAnsi" w:eastAsia="Times New Roman" w:hAnsiTheme="minorHAnsi"/>
+        </w:rPr>
+        <w:lastRenderedPageBreak/>
+        <w:t>errore e operazioni non riuscite.</w:t>
+      </w:r>
+    </w:p>
+    <w:p>
+      <w:pPr>
+        <w:pStyle w:val="ListParagraph"/>
+        <w:numPr>
+          <w:ilvl w:val="0"/>
+          <w:numId w:val="44"/>
+        </w:numPr>
+        <w:jc w:val="both"/>
+        <w:rPr>
+          <w:rFonts w:asciiTheme="minorHAnsi" w:eastAsia="Times New Roman" w:hAnsiTheme="minorHAnsi"/>
+        </w:rPr>
+      </w:pPr>
+      <w:r>
+        <w:rPr>
+          <w:rFonts w:asciiTheme="minorHAnsi" w:eastAsia="Times New Roman" w:hAnsiTheme="minorHAnsi"/>
           <w:b/>
           <w:bCs/>
         </w:rPr>
-      </w:pPr>
-      <w:r>
-        <w:rPr>
-          <w:rFonts w:asciiTheme="minorHAnsi" w:hAnsiTheme="minorHAnsi"/>
+        <w:t>NFR3 - Interfaccia responsive</w:t>
+      </w:r>
+      <w:r>
+        <w:rPr>
+          <w:rFonts w:asciiTheme="minorHAnsi" w:eastAsia="Times New Roman" w:hAnsiTheme="minorHAnsi"/>
+        </w:rPr>
+        <w:t>:</w:t>
+      </w:r>
+      <w:r>
+        <w:rPr>
+          <w:rFonts w:asciiTheme="minorHAnsi" w:eastAsia="Times New Roman" w:hAnsiTheme="minorHAnsi"/>
+        </w:rPr>
+        <w:t xml:space="preserve"> il sistema deve avere un’interfaccia responsive.</w:t>
+      </w:r>
+    </w:p>
+    <w:p>
+      <w:pPr>
+        <w:jc w:val="both"/>
+        <w:rPr>
+          <w:rFonts w:asciiTheme="minorHAnsi" w:eastAsia="Times New Roman" w:hAnsiTheme="minorHAnsi"/>
+        </w:rPr>
+      </w:pPr>
+    </w:p>
+    <w:p>
+      <w:pPr>
+        <w:pStyle w:val="Heading3"/>
+        <w:spacing w:before="0" w:after="281"/>
+        <w:jc w:val="both"/>
+        <w:rPr>
+          <w:rFonts w:asciiTheme="minorHAnsi" w:hAnsiTheme="minorHAnsi"/>
+          <w:sz w:val="28"/>
+          <w:szCs w:val="28"/>
+        </w:rPr>
+      </w:pPr>
+      <w:bookmarkStart w:id="25" w:name="_Toc243845542"/>
+      <w:r>
+        <w:rPr>
+          <w:rFonts w:asciiTheme="minorHAnsi" w:hAnsiTheme="minorHAnsi"/>
+          <w:sz w:val="28"/>
+          <w:szCs w:val="28"/>
+        </w:rPr>
+        <w:t>Reliability</w:t>
+      </w:r>
+      <w:bookmarkEnd w:id="25"/>
+    </w:p>
+    <w:p>
+      <w:pPr>
+        <w:pStyle w:val="ListParagraph"/>
+        <w:numPr>
+          <w:ilvl w:val="0"/>
+          <w:numId w:val="44"/>
+        </w:numPr>
+        <w:jc w:val="both"/>
+        <w:rPr>
+          <w:rFonts w:asciiTheme="minorHAnsi" w:eastAsia="Times New Roman" w:hAnsiTheme="minorHAnsi"/>
+        </w:rPr>
+      </w:pPr>
+      <w:r>
+        <w:rPr>
+          <w:rFonts w:asciiTheme="minorHAnsi" w:eastAsia="Times New Roman" w:hAnsiTheme="minorHAnsi"/>
           <w:b/>
           <w:bCs/>
         </w:rPr>
-        <w:t>RNF1</w:t>
-      </w:r>
-      <w:r>
-        <w:rPr>
-          <w:rFonts w:asciiTheme="minorHAnsi" w:hAnsiTheme="minorHAnsi"/>
+        <w:t xml:space="preserve">NFR4 - </w:t>
+      </w:r>
+      <w:r>
+        <w:rPr>
+          <w:rFonts w:asciiTheme="minorHAnsi" w:eastAsia="Times New Roman" w:hAnsiTheme="minorHAnsi"/>
           <w:b/>
           <w:bCs/>
         </w:rPr>
-        <w:t xml:space="preserve"> –</w:t>
-      </w:r>
-      <w:r>
-        <w:rPr>
-          <w:rFonts w:asciiTheme="minorHAnsi" w:hAnsiTheme="minorHAnsi"/>
+        <w:t>Disponibilità</w:t>
+      </w:r>
+      <w:r>
+        <w:rPr>
+          <w:rFonts w:asciiTheme="minorHAnsi" w:eastAsia="Times New Roman" w:hAnsiTheme="minorHAnsi"/>
+        </w:rPr>
+        <w:t xml:space="preserve">: </w:t>
+      </w:r>
+      <w:r>
+        <w:rPr>
+          <w:rFonts w:asciiTheme="minorHAnsi" w:eastAsia="Times New Roman" w:hAnsiTheme="minorHAnsi"/>
+        </w:rPr>
+        <w:t>i</w:t>
+      </w:r>
+      <w:r>
+        <w:rPr>
+          <w:rFonts w:asciiTheme="minorHAnsi" w:eastAsia="Times New Roman" w:hAnsiTheme="minorHAnsi"/>
+        </w:rPr>
+        <w:t>l sito lato lettore deve essere disponibile 24 ore su 24 per permettere la prenotazione di un libro in qualsiasi momento.</w:t>
+      </w:r>
+    </w:p>
+    <w:p>
+      <w:pPr>
+        <w:pStyle w:val="ListParagraph"/>
+        <w:numPr>
+          <w:ilvl w:val="0"/>
+          <w:numId w:val="44"/>
+        </w:numPr>
+        <w:jc w:val="both"/>
+        <w:rPr>
+          <w:rFonts w:asciiTheme="minorHAnsi" w:eastAsia="Times New Roman" w:hAnsiTheme="minorHAnsi"/>
+        </w:rPr>
+      </w:pPr>
+      <w:r>
+        <w:rPr>
+          <w:rFonts w:asciiTheme="minorHAnsi" w:eastAsia="Times New Roman" w:hAnsiTheme="minorHAnsi"/>
           <w:b/>
           <w:bCs/>
         </w:rPr>
-        <w:t xml:space="preserve"> </w:t>
-      </w:r>
-      <w:r>
-        <w:rPr>
-          <w:rFonts w:asciiTheme="minorHAnsi" w:hAnsiTheme="minorHAnsi"/>
+        <w:t>NFR5 - Coerenza</w:t>
+      </w:r>
+      <w:r>
+        <w:rPr>
+          <w:rFonts w:asciiTheme="minorHAnsi" w:eastAsia="Times New Roman" w:hAnsiTheme="minorHAnsi"/>
+        </w:rPr>
+        <w:t>:</w:t>
+      </w:r>
+      <w:r>
+        <w:rPr>
+          <w:rFonts w:asciiTheme="minorHAnsi" w:eastAsia="Times New Roman" w:hAnsiTheme="minorHAnsi"/>
+        </w:rPr>
+        <w:t xml:space="preserve"> lo stato delle copie deve restare coerente dopo ogni operazione e nessuna copia può essere prestata o prenotata da due lettori contemporaneamente.</w:t>
+      </w:r>
+    </w:p>
+    <w:p>
+      <w:pPr>
+        <w:jc w:val="both"/>
+        <w:rPr>
+          <w:rFonts w:asciiTheme="minorHAnsi" w:eastAsia="Times New Roman" w:hAnsiTheme="minorHAnsi"/>
+        </w:rPr>
+      </w:pPr>
+    </w:p>
+    <w:p>
+      <w:pPr>
+        <w:pStyle w:val="Heading3"/>
+        <w:spacing w:before="0" w:after="281"/>
+        <w:jc w:val="both"/>
+        <w:rPr>
+          <w:rFonts w:asciiTheme="minorHAnsi" w:hAnsiTheme="minorHAnsi"/>
+          <w:sz w:val="28"/>
+          <w:szCs w:val="28"/>
+        </w:rPr>
+      </w:pPr>
+      <w:bookmarkStart w:id="26" w:name="_Toc243845543"/>
+      <w:r>
+        <w:rPr>
+          <w:rFonts w:asciiTheme="minorHAnsi" w:hAnsiTheme="minorHAnsi"/>
+          <w:sz w:val="28"/>
+          <w:szCs w:val="28"/>
+        </w:rPr>
+        <w:t>Performance</w:t>
+      </w:r>
+      <w:bookmarkEnd w:id="26"/>
+    </w:p>
+    <w:p>
+      <w:pPr>
+        <w:pStyle w:val="ListParagraph"/>
+        <w:numPr>
+          <w:ilvl w:val="0"/>
+          <w:numId w:val="44"/>
+        </w:numPr>
+        <w:rPr>
+          <w:rFonts w:asciiTheme="minorHAnsi" w:eastAsia="Times New Roman" w:hAnsiTheme="minorHAnsi"/>
+        </w:rPr>
+      </w:pPr>
+      <w:r>
+        <w:rPr>
+          <w:rFonts w:asciiTheme="minorHAnsi" w:eastAsia="Times New Roman" w:hAnsiTheme="minorHAnsi"/>
           <w:b/>
           <w:bCs/>
         </w:rPr>
-        <w:t>Navigazione</w:t>
-      </w:r>
-    </w:p>
-    <w:p>
-      <w:pPr>
-        <w:jc w:val="both"/>
-        <w:rPr>
-          <w:rFonts w:asciiTheme="minorHAnsi" w:hAnsiTheme="minorHAnsi"/>
-        </w:rPr>
-      </w:pPr>
-      <w:r>
-        <w:rPr>
-          <w:rFonts w:asciiTheme="minorHAnsi" w:hAnsiTheme="minorHAnsi"/>
-        </w:rPr>
-        <w:t>Il sistema renderà accessibili le funzionalità previste per ciascun ruolo tramite una struttura di navigazione coerente e comprensibile</w:t>
-      </w:r>
-      <w:r>
-        <w:rPr>
-          <w:rFonts w:asciiTheme="minorHAnsi" w:hAnsiTheme="minorHAnsi"/>
-        </w:rPr>
-        <w:t>.</w:t>
-      </w:r>
-    </w:p>
-    <w:p>
-      <w:pPr>
-        <w:jc w:val="both"/>
-        <w:rPr>
-          <w:rFonts w:asciiTheme="minorHAnsi" w:hAnsiTheme="minorHAnsi"/>
-        </w:rPr>
-      </w:pPr>
-    </w:p>
-    <w:p>
-      <w:pPr>
-        <w:jc w:val="both"/>
-        <w:rPr>
-          <w:rFonts w:asciiTheme="minorHAnsi" w:hAnsiTheme="minorHAnsi"/>
+        <w:t xml:space="preserve">NFR6 - </w:t>
+      </w:r>
+      <w:r>
+        <w:rPr>
+          <w:rFonts w:asciiTheme="minorHAnsi" w:eastAsia="Times New Roman" w:hAnsiTheme="minorHAnsi"/>
           <w:b/>
           <w:bCs/>
         </w:rPr>
-      </w:pPr>
-      <w:r>
-        <w:rPr>
-          <w:rFonts w:asciiTheme="minorHAnsi" w:hAnsiTheme="minorHAnsi"/>
+        <w:t>Tempi di risposta</w:t>
+      </w:r>
+      <w:r>
+        <w:rPr>
+          <w:rFonts w:asciiTheme="minorHAnsi" w:eastAsia="Times New Roman" w:hAnsiTheme="minorHAnsi"/>
+        </w:rPr>
+        <w:t xml:space="preserve">: i </w:t>
+      </w:r>
+      <w:r>
+        <w:rPr>
+          <w:rFonts w:asciiTheme="minorHAnsi" w:eastAsia="Times New Roman" w:hAnsiTheme="minorHAnsi"/>
+        </w:rPr>
+        <w:t xml:space="preserve">tempi di risposta del sistema </w:t>
+      </w:r>
+      <w:r>
+        <w:rPr>
+          <w:rFonts w:asciiTheme="minorHAnsi" w:eastAsia="Times New Roman" w:hAnsiTheme="minorHAnsi"/>
+        </w:rPr>
+        <w:t>devono essere</w:t>
+      </w:r>
+      <w:r>
+        <w:rPr>
+          <w:rFonts w:asciiTheme="minorHAnsi" w:eastAsia="Times New Roman" w:hAnsiTheme="minorHAnsi"/>
+        </w:rPr>
+        <w:t xml:space="preserve"> al massimo di due secondi per almeno il 90% delle operazioni, così da garantire un’esperienza fluida.</w:t>
+      </w:r>
+    </w:p>
+    <w:p>
+      <w:pPr>
+        <w:pStyle w:val="ListParagraph"/>
+        <w:numPr>
+          <w:ilvl w:val="0"/>
+          <w:numId w:val="44"/>
+        </w:numPr>
+        <w:jc w:val="both"/>
+        <w:rPr>
+          <w:rFonts w:asciiTheme="minorHAnsi" w:hAnsiTheme="minorHAnsi"/>
+          <w:kern w:val="2"/>
+        </w:rPr>
+      </w:pPr>
+      <w:r>
+        <w:rPr>
+          <w:rFonts w:asciiTheme="minorHAnsi" w:eastAsia="Times New Roman" w:hAnsiTheme="minorHAnsi"/>
           <w:b/>
           <w:bCs/>
         </w:rPr>
-        <w:t>RNF</w:t>
+        <w:t xml:space="preserve">NFR7 - </w:t>
       </w:r>
       <w:r>
         <w:rPr>
@@ -8596,15 +8945,83 @@
           <w:b/>
           <w:bCs/>
         </w:rPr>
-        <w:t>2</w:t>
-      </w:r>
-      <w:r>
-        <w:rPr>
-          <w:rFonts w:asciiTheme="minorHAnsi" w:hAnsiTheme="minorHAnsi"/>
+        <w:t>Utenti concorrenti</w:t>
+      </w:r>
+      <w:r>
+        <w:rPr>
+          <w:rFonts w:asciiTheme="minorHAnsi" w:hAnsiTheme="minorHAnsi"/>
+        </w:rPr>
+        <w:t>: i</w:t>
+      </w:r>
+      <w:r>
+        <w:rPr>
+          <w:rFonts w:asciiTheme="minorHAnsi" w:hAnsiTheme="minorHAnsi"/>
+        </w:rPr>
+        <w:t xml:space="preserve">l sistema garantirà il corretto funzionamento supportando un carico minimo di </w:t>
+      </w:r>
+      <w:r>
+        <w:rPr>
+          <w:rFonts w:asciiTheme="minorHAnsi" w:hAnsiTheme="minorHAnsi"/>
+        </w:rPr>
+        <w:t>10</w:t>
+      </w:r>
+      <w:r>
+        <w:rPr>
+          <w:rFonts w:asciiTheme="minorHAnsi" w:hAnsiTheme="minorHAnsi"/>
+        </w:rPr>
+        <w:t xml:space="preserve"> utenti contemporaneamente connessi senza degrado delle funzionalità.</w:t>
+      </w:r>
+    </w:p>
+    <w:p>
+      <w:pPr>
+        <w:ind w:left="360"/>
+        <w:jc w:val="both"/>
+        <w:rPr>
+          <w:rFonts w:asciiTheme="minorHAnsi" w:eastAsia="Times New Roman" w:hAnsiTheme="minorHAnsi"/>
+        </w:rPr>
+      </w:pPr>
+    </w:p>
+    <w:p>
+      <w:pPr>
+        <w:pStyle w:val="Heading3"/>
+        <w:spacing w:before="0" w:after="281"/>
+        <w:jc w:val="both"/>
+        <w:rPr>
+          <w:rFonts w:asciiTheme="minorHAnsi" w:hAnsiTheme="minorHAnsi"/>
+          <w:sz w:val="28"/>
+          <w:szCs w:val="28"/>
+        </w:rPr>
+      </w:pPr>
+      <w:bookmarkStart w:id="27" w:name="_Toc243845544"/>
+      <w:r>
+        <w:rPr>
+          <w:rFonts w:asciiTheme="minorHAnsi" w:hAnsiTheme="minorHAnsi"/>
+          <w:sz w:val="28"/>
+          <w:szCs w:val="28"/>
+        </w:rPr>
+        <w:t>Supportability</w:t>
+      </w:r>
+      <w:bookmarkEnd w:id="27"/>
+    </w:p>
+    <w:p>
+      <w:pPr>
+        <w:pStyle w:val="ListParagraph"/>
+        <w:numPr>
+          <w:ilvl w:val="0"/>
+          <w:numId w:val="43"/>
+        </w:numPr>
+        <w:jc w:val="both"/>
+        <w:rPr>
+          <w:rFonts w:asciiTheme="minorHAnsi" w:hAnsiTheme="minorHAnsi"/>
+        </w:rPr>
+      </w:pPr>
+      <w:r>
+        <w:rPr>
+          <w:rFonts w:asciiTheme="minorHAnsi" w:eastAsia="Times New Roman" w:hAnsiTheme="minorHAnsi"/>
           <w:b/>
           <w:bCs/>
         </w:rPr>
-        <w:t xml:space="preserve"> –</w:t>
+        <w:t xml:space="preserve">NFR8 - </w:t>
       </w:r>
       <w:r>
         <w:rPr>
@@ -8612,72 +9029,158 @@
           <w:b/>
           <w:bCs/>
         </w:rPr>
-        <w:t xml:space="preserve"> Feedback delle operazioni</w:t>
-      </w:r>
-    </w:p>
-    <w:p>
-      <w:pPr>
-        <w:jc w:val="both"/>
-        <w:rPr>
-          <w:rFonts w:asciiTheme="minorHAnsi" w:hAnsiTheme="minorHAnsi"/>
-        </w:rPr>
-      </w:pPr>
-      <w:r>
-        <w:rPr>
-          <w:rFonts w:asciiTheme="minorHAnsi" w:hAnsiTheme="minorHAnsi"/>
-        </w:rPr>
-        <w:t xml:space="preserve">Il sistema mostrerà un messaggio di conferma al completamento delle operazioni principali e </w:t>
-      </w:r>
-      <w:r>
-        <w:rPr>
-          <w:rFonts w:asciiTheme="minorHAnsi" w:hAnsiTheme="minorHAnsi"/>
-        </w:rPr>
-        <w:lastRenderedPageBreak/>
-        <w:t>un messaggio esplicativo in caso di errore e operazioni non riuscite.</w:t>
-      </w:r>
-    </w:p>
-    <w:p>
-      <w:pPr>
-        <w:jc w:val="both"/>
-        <w:rPr>
-          <w:rFonts w:asciiTheme="minorHAnsi" w:hAnsiTheme="minorHAnsi"/>
+        <w:t>Malleabilità</w:t>
+      </w:r>
+      <w:r>
+        <w:rPr>
+          <w:rFonts w:asciiTheme="minorHAnsi" w:hAnsiTheme="minorHAnsi"/>
+        </w:rPr>
+        <w:t xml:space="preserve">: le tabelle del database devono rispettare le </w:t>
+      </w:r>
+      <w:r>
+        <w:rPr>
+          <w:rFonts w:asciiTheme="minorHAnsi" w:hAnsiTheme="minorHAnsi"/>
+        </w:rPr>
+        <w:t>tre</w:t>
+      </w:r>
+      <w:r>
+        <w:rPr>
+          <w:rFonts w:asciiTheme="minorHAnsi" w:hAnsiTheme="minorHAnsi"/>
+        </w:rPr>
+        <w:t xml:space="preserve"> forme normali.</w:t>
+      </w:r>
+    </w:p>
+    <w:p>
+      <w:pPr>
+        <w:pStyle w:val="ListParagraph"/>
+        <w:numPr>
+          <w:ilvl w:val="0"/>
+          <w:numId w:val="43"/>
+        </w:numPr>
+        <w:jc w:val="both"/>
+        <w:rPr>
+          <w:rFonts w:asciiTheme="minorHAnsi" w:hAnsiTheme="minorHAnsi"/>
+        </w:rPr>
+      </w:pPr>
+      <w:r>
+        <w:rPr>
+          <w:rFonts w:asciiTheme="minorHAnsi" w:eastAsia="Times New Roman" w:hAnsiTheme="minorHAnsi"/>
           <w:b/>
           <w:bCs/>
         </w:rPr>
-      </w:pPr>
-    </w:p>
-    <w:p>
-      <w:pPr>
-        <w:jc w:val="both"/>
+        <w:t xml:space="preserve">NFR9 - </w:t>
+      </w:r>
+      <w:r>
         <w:rPr>
           <w:rFonts w:asciiTheme="minorHAnsi" w:hAnsiTheme="minorHAnsi"/>
           <w:b/>
           <w:bCs/>
         </w:rPr>
-      </w:pPr>
-      <w:r>
-        <w:rPr>
-          <w:rFonts w:asciiTheme="minorHAnsi" w:hAnsiTheme="minorHAnsi"/>
+        <w:t>Manutenibilità</w:t>
+      </w:r>
+      <w:r>
+        <w:rPr>
+          <w:rFonts w:asciiTheme="minorHAnsi" w:hAnsiTheme="minorHAnsi"/>
+        </w:rPr>
+        <w:t>: Il codice sorgente del sistema deve rispettare il pattern di strutture MVC (Model-View-Control</w:t>
+      </w:r>
+      <w:r>
+        <w:rPr>
+          <w:rFonts w:asciiTheme="minorHAnsi" w:hAnsiTheme="minorHAnsi"/>
+        </w:rPr>
+        <w:t>ler</w:t>
+      </w:r>
+      <w:r>
+        <w:rPr>
+          <w:rFonts w:asciiTheme="minorHAnsi" w:hAnsiTheme="minorHAnsi"/>
+        </w:rPr>
+        <w:t>).</w:t>
+      </w:r>
+    </w:p>
+    <w:p>
+      <w:pPr>
+        <w:jc w:val="both"/>
+        <w:rPr>
+          <w:rFonts w:asciiTheme="minorHAnsi" w:hAnsiTheme="minorHAnsi"/>
+        </w:rPr>
+      </w:pPr>
+    </w:p>
+    <w:p>
+      <w:pPr>
+        <w:pStyle w:val="Heading3"/>
+        <w:spacing w:before="0" w:after="281"/>
+        <w:jc w:val="both"/>
+        <w:rPr>
+          <w:rFonts w:asciiTheme="minorHAnsi" w:hAnsiTheme="minorHAnsi"/>
+          <w:sz w:val="28"/>
+          <w:szCs w:val="28"/>
+        </w:rPr>
+      </w:pPr>
+      <w:bookmarkStart w:id="28" w:name="_Toc243845545"/>
+      <w:r>
+        <w:rPr>
+          <w:rFonts w:asciiTheme="minorHAnsi" w:hAnsiTheme="minorHAnsi"/>
+          <w:sz w:val="28"/>
+          <w:szCs w:val="28"/>
+        </w:rPr>
+        <w:t>Implementation</w:t>
+      </w:r>
+      <w:bookmarkEnd w:id="28"/>
+    </w:p>
+    <w:p>
+      <w:pPr>
+        <w:pStyle w:val="ListParagraph"/>
+        <w:numPr>
+          <w:ilvl w:val="0"/>
+          <w:numId w:val="44"/>
+        </w:numPr>
+        <w:rPr>
+          <w:rFonts w:asciiTheme="minorHAnsi" w:eastAsia="Times New Roman" w:hAnsiTheme="minorHAnsi"/>
+        </w:rPr>
+      </w:pPr>
+      <w:r>
+        <w:rPr>
+          <w:rFonts w:asciiTheme="minorHAnsi" w:eastAsia="Times New Roman" w:hAnsiTheme="minorHAnsi"/>
           <w:b/>
           <w:bCs/>
         </w:rPr>
-        <w:t>RNF</w:t>
-      </w:r>
-      <w:r>
+        <w:t>NFR10 - Comunicazioni sicure</w:t>
+      </w:r>
+      <w:r>
+        <w:rPr>
+          <w:rFonts w:asciiTheme="minorHAnsi" w:eastAsia="Times New Roman" w:hAnsiTheme="minorHAnsi"/>
+        </w:rPr>
+        <w:t xml:space="preserve">: </w:t>
+      </w:r>
+      <w:r>
+        <w:rPr>
+          <w:rFonts w:asciiTheme="minorHAnsi" w:eastAsia="Times New Roman" w:hAnsiTheme="minorHAnsi"/>
+        </w:rPr>
+        <w:t>Tutto il traffico dati tra client e server deve avvenire tramite protocollo crittografato HTTPS.</w:t>
+      </w:r>
+    </w:p>
+    <w:p>
+      <w:pPr>
+        <w:pStyle w:val="ListParagraph"/>
+        <w:numPr>
+          <w:ilvl w:val="0"/>
+          <w:numId w:val="44"/>
+        </w:numPr>
+        <w:jc w:val="both"/>
         <w:rPr>
           <w:rFonts w:asciiTheme="minorHAnsi" w:hAnsiTheme="minorHAnsi"/>
           <w:b/>
           <w:bCs/>
-        </w:rPr>
-        <w:t>3</w:t>
-      </w:r>
-      <w:r>
-        <w:rPr>
-          <w:rFonts w:asciiTheme="minorHAnsi" w:hAnsiTheme="minorHAnsi"/>
+          <w:kern w:val="2"/>
+        </w:rPr>
+      </w:pPr>
+      <w:r>
+        <w:rPr>
+          <w:rFonts w:asciiTheme="minorHAnsi" w:eastAsia="Times New Roman" w:hAnsiTheme="minorHAnsi"/>
           <w:b/>
           <w:bCs/>
         </w:rPr>
-        <w:t xml:space="preserve"> –</w:t>
+        <w:t xml:space="preserve">NFR11 - </w:t>
       </w:r>
       <w:r>
         <w:rPr>
@@ -8685,125 +9188,159 @@
           <w:b/>
           <w:bCs/>
         </w:rPr>
-        <w:t xml:space="preserve"> Interfaccia responsive</w:t>
-      </w:r>
-    </w:p>
-    <w:p>
-      <w:pPr>
-        <w:jc w:val="both"/>
-        <w:rPr>
-          <w:rFonts w:asciiTheme="minorHAnsi" w:hAnsiTheme="minorHAnsi"/>
-        </w:rPr>
-      </w:pPr>
-      <w:r>
-        <w:rPr>
-          <w:rFonts w:asciiTheme="minorHAnsi" w:hAnsiTheme="minorHAnsi"/>
-        </w:rPr>
-        <w:t>Il sistema</w:t>
-      </w:r>
-      <w:r>
-        <w:rPr>
-          <w:rFonts w:asciiTheme="minorHAnsi" w:hAnsiTheme="minorHAnsi"/>
-        </w:rPr>
-        <w:t xml:space="preserve"> avrà un’interfaccia</w:t>
-      </w:r>
-      <w:r>
-        <w:rPr>
-          <w:rFonts w:asciiTheme="minorHAnsi" w:hAnsiTheme="minorHAnsi"/>
-        </w:rPr>
-        <w:t xml:space="preserve"> responsive</w:t>
-      </w:r>
-      <w:r>
-        <w:rPr>
-          <w:rFonts w:asciiTheme="minorHAnsi" w:hAnsiTheme="minorHAnsi"/>
-        </w:rPr>
-        <w:t>, utilizzabile</w:t>
-      </w:r>
-      <w:r>
-        <w:rPr>
-          <w:rFonts w:asciiTheme="minorHAnsi" w:hAnsiTheme="minorHAnsi"/>
-        </w:rPr>
-        <w:t xml:space="preserve"> da</w:t>
-      </w:r>
-      <w:r>
-        <w:rPr>
-          <w:rFonts w:asciiTheme="minorHAnsi" w:hAnsiTheme="minorHAnsi"/>
-        </w:rPr>
-        <w:t xml:space="preserve"> </w:t>
-      </w:r>
-      <w:r>
-        <w:rPr>
-          <w:rFonts w:asciiTheme="minorHAnsi" w:hAnsiTheme="minorHAnsi"/>
-        </w:rPr>
-        <w:t>browser modern</w:t>
-      </w:r>
-      <w:r>
-        <w:rPr>
-          <w:rFonts w:asciiTheme="minorHAnsi" w:hAnsiTheme="minorHAnsi"/>
-        </w:rPr>
-        <w:t>i</w:t>
-      </w:r>
-      <w:r>
-        <w:rPr>
-          <w:rFonts w:asciiTheme="minorHAnsi" w:hAnsiTheme="minorHAnsi"/>
-        </w:rPr>
-        <w:t xml:space="preserve"> su desktop e mobile.</w:t>
-      </w:r>
-    </w:p>
-    <w:p>
-      <w:pPr>
-        <w:jc w:val="both"/>
+        <w:t>Protezione delle passwor</w:t>
+      </w:r>
+      <w:r>
         <w:rPr>
           <w:rFonts w:asciiTheme="minorHAnsi" w:hAnsiTheme="minorHAnsi"/>
           <w:b/>
           <w:bCs/>
         </w:rPr>
-      </w:pPr>
-    </w:p>
-    <w:p>
-      <w:pPr>
-        <w:jc w:val="both"/>
-        <w:rPr>
-          <w:rFonts w:asciiTheme="minorHAnsi" w:hAnsiTheme="minorHAnsi"/>
+        <w:t xml:space="preserve">d: </w:t>
+      </w:r>
+      <w:r>
+        <w:rPr>
+          <w:rFonts w:asciiTheme="minorHAnsi" w:hAnsiTheme="minorHAnsi"/>
+        </w:rPr>
+        <w:t>le password saranno sottoposte ad hash e salvate nel database.</w:t>
+      </w:r>
+    </w:p>
+    <w:p>
+      <w:pPr>
+        <w:pStyle w:val="ListParagraph"/>
+        <w:numPr>
+          <w:ilvl w:val="0"/>
+          <w:numId w:val="44"/>
+        </w:numPr>
+        <w:rPr>
+          <w:rFonts w:asciiTheme="minorHAnsi" w:hAnsiTheme="minorHAnsi"/>
+        </w:rPr>
+      </w:pPr>
+      <w:r>
+        <w:rPr>
+          <w:rFonts w:asciiTheme="minorHAnsi" w:eastAsia="Times New Roman" w:hAnsiTheme="minorHAnsi"/>
           <w:b/>
           <w:bCs/>
         </w:rPr>
-      </w:pPr>
+        <w:t xml:space="preserve">NFR12 - </w:t>
+      </w:r>
       <w:r>
         <w:rPr>
           <w:rFonts w:asciiTheme="minorHAnsi" w:hAnsiTheme="minorHAnsi"/>
           <w:b/>
           <w:bCs/>
         </w:rPr>
-        <w:t>PRESTAZIONI</w:t>
-      </w:r>
-    </w:p>
-    <w:p>
-      <w:pPr>
-        <w:jc w:val="both"/>
-        <w:rPr>
-          <w:rFonts w:asciiTheme="minorHAnsi" w:hAnsiTheme="minorHAnsi"/>
+        <w:t>Controllo degli accessi</w:t>
+      </w:r>
+      <w:r>
+        <w:rPr>
+          <w:rFonts w:asciiTheme="minorHAnsi" w:hAnsiTheme="minorHAnsi"/>
+        </w:rPr>
+        <w:t xml:space="preserve">: </w:t>
+      </w:r>
+      <w:r>
+        <w:rPr>
+          <w:rFonts w:asciiTheme="minorHAnsi" w:hAnsiTheme="minorHAnsi"/>
+        </w:rPr>
+        <w:t xml:space="preserve">Il sistema </w:t>
+      </w:r>
+      <w:r>
+        <w:rPr>
+          <w:rFonts w:asciiTheme="minorHAnsi" w:hAnsiTheme="minorHAnsi"/>
+        </w:rPr>
+        <w:t>deve impedire</w:t>
+      </w:r>
+      <w:r>
+        <w:rPr>
+          <w:rFonts w:asciiTheme="minorHAnsi" w:hAnsiTheme="minorHAnsi"/>
+        </w:rPr>
+        <w:t xml:space="preserve"> l’accesso diretto via URL alle pagine riservate solo a chi ha il permesso di accedere ad esse.</w:t>
+      </w:r>
+    </w:p>
+    <w:p>
+      <w:pPr>
+        <w:pStyle w:val="Heading3"/>
+        <w:spacing w:before="281" w:after="281"/>
+        <w:jc w:val="both"/>
+        <w:rPr>
+          <w:rFonts w:asciiTheme="minorHAnsi" w:hAnsiTheme="minorHAnsi"/>
+          <w:sz w:val="28"/>
+          <w:szCs w:val="28"/>
+        </w:rPr>
+      </w:pPr>
+      <w:bookmarkStart w:id="29" w:name="_Toc243845546"/>
+      <w:r>
+        <w:rPr>
+          <w:rFonts w:asciiTheme="minorHAnsi" w:hAnsiTheme="minorHAnsi"/>
+          <w:sz w:val="28"/>
+          <w:szCs w:val="28"/>
+        </w:rPr>
+        <w:t>I</w:t>
+      </w:r>
+      <w:r>
+        <w:rPr>
+          <w:rFonts w:asciiTheme="minorHAnsi" w:hAnsiTheme="minorHAnsi"/>
+          <w:sz w:val="28"/>
+          <w:szCs w:val="28"/>
+        </w:rPr>
+        <w:t>nterface</w:t>
+      </w:r>
+      <w:bookmarkEnd w:id="29"/>
+    </w:p>
+    <w:p>
+      <w:pPr>
+        <w:pStyle w:val="ListParagraph"/>
+        <w:numPr>
+          <w:ilvl w:val="0"/>
+          <w:numId w:val="42"/>
+        </w:numPr>
+        <w:jc w:val="both"/>
+        <w:rPr>
+          <w:rFonts w:asciiTheme="minorHAnsi" w:hAnsiTheme="minorHAnsi"/>
+        </w:rPr>
+      </w:pPr>
+      <w:r>
+        <w:rPr>
+          <w:rFonts w:asciiTheme="minorHAnsi" w:eastAsia="Times New Roman" w:hAnsiTheme="minorHAnsi"/>
           <w:b/>
           <w:bCs/>
         </w:rPr>
-      </w:pPr>
-    </w:p>
-    <w:p>
-      <w:pPr>
-        <w:jc w:val="both"/>
+        <w:t xml:space="preserve">NFR13 - </w:t>
+      </w:r>
+      <w:r>
         <w:rPr>
           <w:rFonts w:asciiTheme="minorHAnsi" w:hAnsiTheme="minorHAnsi"/>
           <w:b/>
           <w:bCs/>
         </w:rPr>
-      </w:pPr>
-      <w:r>
-        <w:rPr>
-          <w:rFonts w:asciiTheme="minorHAnsi" w:hAnsiTheme="minorHAnsi"/>
+        <w:t>Interfacce</w:t>
+      </w:r>
+      <w:r>
+        <w:rPr>
+          <w:rFonts w:asciiTheme="minorHAnsi" w:hAnsiTheme="minorHAnsi"/>
+        </w:rPr>
+        <w:t>: Il lettore e l'operatore devono avere delle interfacce web a cui affacciarsi per svolgere ciò di loro interesse.</w:t>
+      </w:r>
+    </w:p>
+    <w:p>
+      <w:pPr>
+        <w:pStyle w:val="ListParagraph"/>
+        <w:numPr>
+          <w:ilvl w:val="0"/>
+          <w:numId w:val="42"/>
+        </w:numPr>
+        <w:jc w:val="both"/>
+        <w:rPr>
+          <w:rFonts w:asciiTheme="minorHAnsi" w:hAnsiTheme="minorHAnsi"/>
+        </w:rPr>
+      </w:pPr>
+      <w:r>
+        <w:rPr>
+          <w:rFonts w:asciiTheme="minorHAnsi" w:eastAsia="Times New Roman" w:hAnsiTheme="minorHAnsi"/>
           <w:b/>
           <w:bCs/>
         </w:rPr>
-        <w:t>RNF</w:t>
+        <w:t xml:space="preserve">NFR14 - </w:t>
       </w:r>
       <w:r>
         <w:rPr>
@@ -8811,15 +9348,62 @@
           <w:b/>
           <w:bCs/>
         </w:rPr>
-        <w:t>4</w:t>
-      </w:r>
-      <w:r>
-        <w:rPr>
-          <w:rFonts w:asciiTheme="minorHAnsi" w:hAnsiTheme="minorHAnsi"/>
+        <w:t>Requisiti di installazione</w:t>
+      </w:r>
+      <w:r>
+        <w:rPr>
+          <w:rFonts w:asciiTheme="minorHAnsi" w:hAnsiTheme="minorHAnsi"/>
+        </w:rPr>
+        <w:t>: Il livello client deve essere accessibile tramite i più comuni browser web (Chrome, Safari, Firefox, Edge) senza richiedere alcun download o installazione di software di terze parti sui dispositivi degli utenti finali</w:t>
+      </w:r>
+      <w:r>
+        <w:rPr>
+          <w:rFonts w:asciiTheme="minorHAnsi" w:hAnsiTheme="minorHAnsi"/>
+        </w:rPr>
+        <w:t>.</w:t>
+      </w:r>
+    </w:p>
+    <w:p>
+      <w:pPr>
+        <w:pStyle w:val="Heading3"/>
+        <w:spacing w:before="281" w:after="281"/>
+        <w:jc w:val="both"/>
+        <w:rPr>
+          <w:rFonts w:asciiTheme="minorHAnsi" w:hAnsiTheme="minorHAnsi"/>
+          <w:sz w:val="28"/>
+          <w:szCs w:val="28"/>
+        </w:rPr>
+      </w:pPr>
+      <w:bookmarkStart w:id="30" w:name="_Toc243845547"/>
+      <w:r>
+        <w:rPr>
+          <w:rFonts w:asciiTheme="minorHAnsi" w:hAnsiTheme="minorHAnsi"/>
+          <w:sz w:val="28"/>
+          <w:szCs w:val="28"/>
+        </w:rPr>
+        <w:t>Packaging</w:t>
+      </w:r>
+      <w:bookmarkEnd w:id="30"/>
+    </w:p>
+    <w:p>
+      <w:pPr>
+        <w:pStyle w:val="ListParagraph"/>
+        <w:numPr>
+          <w:ilvl w:val="0"/>
+          <w:numId w:val="42"/>
+        </w:numPr>
+        <w:jc w:val="both"/>
+        <w:rPr>
+          <w:rFonts w:asciiTheme="minorHAnsi" w:hAnsiTheme="minorHAnsi"/>
+        </w:rPr>
+      </w:pPr>
+      <w:r>
+        <w:rPr>
+          <w:rFonts w:asciiTheme="minorHAnsi" w:eastAsia="Times New Roman" w:hAnsiTheme="minorHAnsi"/>
           <w:b/>
           <w:bCs/>
         </w:rPr>
-        <w:t xml:space="preserve"> –</w:t>
+        <w:t xml:space="preserve">NFR15 - </w:t>
       </w:r>
       <w:r>
         <w:rPr>
@@ -8827,83 +9411,158 @@
           <w:b/>
           <w:bCs/>
         </w:rPr>
-        <w:t xml:space="preserve"> Utenti concorrenti</w:t>
-      </w:r>
-      <w:r>
-        <w:rPr>
-          <w:rFonts w:asciiTheme="minorHAnsi" w:hAnsiTheme="minorHAnsi"/>
+        <w:t>Consegna</w:t>
+      </w:r>
+      <w:r>
+        <w:rPr>
+          <w:rFonts w:asciiTheme="minorHAnsi" w:hAnsiTheme="minorHAnsi"/>
+        </w:rPr>
+        <w:t xml:space="preserve">: il codice sorgente sarà consegnato in un repository Git, insieme alle </w:t>
+      </w:r>
+      <w:r>
+        <w:rPr>
+          <w:rFonts w:asciiTheme="minorHAnsi" w:hAnsiTheme="minorHAnsi"/>
+        </w:rPr>
+        <w:lastRenderedPageBreak/>
+        <w:t>istruzioni per l’installazione e l’avvio del sistema.</w:t>
+      </w:r>
+    </w:p>
+    <w:p>
+      <w:pPr>
+        <w:pStyle w:val="Heading3"/>
+        <w:spacing w:before="281" w:after="281"/>
+        <w:jc w:val="both"/>
+        <w:rPr>
+          <w:rFonts w:asciiTheme="minorHAnsi" w:hAnsiTheme="minorHAnsi"/>
+          <w:sz w:val="28"/>
+          <w:szCs w:val="28"/>
+        </w:rPr>
+      </w:pPr>
+      <w:bookmarkStart w:id="31" w:name="_Toc243845548"/>
+      <w:r>
+        <w:rPr>
+          <w:rFonts w:asciiTheme="minorHAnsi" w:hAnsiTheme="minorHAnsi"/>
+          <w:sz w:val="28"/>
+          <w:szCs w:val="28"/>
+        </w:rPr>
+        <w:t>Legal</w:t>
+      </w:r>
+      <w:bookmarkEnd w:id="31"/>
+    </w:p>
+    <w:p>
+      <w:pPr>
+        <w:pStyle w:val="ListParagraph"/>
+        <w:numPr>
+          <w:ilvl w:val="0"/>
+          <w:numId w:val="41"/>
+        </w:numPr>
+        <w:ind w:left="714" w:hanging="357"/>
+        <w:jc w:val="both"/>
+        <w:rPr>
+          <w:rFonts w:asciiTheme="minorHAnsi" w:hAnsiTheme="minorHAnsi"/>
+        </w:rPr>
+      </w:pPr>
+      <w:r>
+        <w:rPr>
+          <w:rFonts w:asciiTheme="minorHAnsi" w:eastAsia="Times New Roman" w:hAnsiTheme="minorHAnsi"/>
           <w:b/>
           <w:bCs/>
         </w:rPr>
-        <w:t xml:space="preserve"> </w:t>
-      </w:r>
-    </w:p>
-    <w:p>
-      <w:pPr>
-        <w:jc w:val="both"/>
-        <w:rPr>
-          <w:rFonts w:asciiTheme="minorHAnsi" w:hAnsiTheme="minorHAnsi"/>
-        </w:rPr>
-      </w:pPr>
-      <w:r>
-        <w:rPr>
-          <w:rFonts w:asciiTheme="minorHAnsi" w:hAnsiTheme="minorHAnsi"/>
-        </w:rPr>
-        <w:t xml:space="preserve">Il sistema </w:t>
-      </w:r>
-      <w:r>
-        <w:rPr>
-          <w:rFonts w:asciiTheme="minorHAnsi" w:hAnsiTheme="minorHAnsi"/>
-        </w:rPr>
-        <w:t>garantirà</w:t>
-      </w:r>
-      <w:r>
-        <w:rPr>
-          <w:rFonts w:asciiTheme="minorHAnsi" w:hAnsiTheme="minorHAnsi"/>
-        </w:rPr>
-        <w:t xml:space="preserve"> il corretto funzionamento supportando un carico minimo di 50 utenti contemporaneamente connessi senza degrado delle funzionalità</w:t>
-      </w:r>
-      <w:r>
-        <w:rPr>
-          <w:rFonts w:asciiTheme="minorHAnsi" w:hAnsiTheme="minorHAnsi"/>
-        </w:rPr>
-        <w:t>.</w:t>
-      </w:r>
-    </w:p>
-    <w:p>
-      <w:pPr>
-        <w:jc w:val="both"/>
+        <w:t xml:space="preserve">NFR16 - </w:t>
+      </w:r>
+      <w:r>
         <w:rPr>
           <w:rFonts w:asciiTheme="minorHAnsi" w:hAnsiTheme="minorHAnsi"/>
           <w:b/>
           <w:bCs/>
         </w:rPr>
-      </w:pPr>
-    </w:p>
-    <w:p>
-      <w:pPr>
-        <w:jc w:val="both"/>
-        <w:rPr>
-          <w:rFonts w:asciiTheme="minorHAnsi" w:hAnsiTheme="minorHAnsi"/>
+        <w:t>Informativa e base giuridica</w:t>
+      </w:r>
+      <w:r>
+        <w:rPr>
+          <w:rFonts w:asciiTheme="minorHAnsi" w:hAnsiTheme="minorHAnsi"/>
+        </w:rPr>
+        <w:t>: durante l'iscrizione il lettore riceve un'informativa fisica che dice quali dati vengono raccolti, perché, per quanto tempo e chi è il titolare del trattamento. L'operatore deve assicurarsi che il lettore firmi il documento prima di completare la registrazione.</w:t>
+      </w:r>
+      <w:r>
+        <w:rPr>
+          <w:rFonts w:asciiTheme="minorHAnsi" w:hAnsiTheme="minorHAnsi"/>
+        </w:rPr>
+        <w:t xml:space="preserve"> [1]</w:t>
+      </w:r>
+    </w:p>
+    <w:p>
+      <w:pPr>
+        <w:pStyle w:val="ListParagraph"/>
+        <w:numPr>
+          <w:ilvl w:val="0"/>
+          <w:numId w:val="41"/>
+        </w:numPr>
+        <w:jc w:val="both"/>
+        <w:rPr>
+          <w:rFonts w:asciiTheme="minorHAnsi" w:hAnsiTheme="minorHAnsi"/>
+        </w:rPr>
+      </w:pPr>
+      <w:r>
+        <w:rPr>
+          <w:rFonts w:asciiTheme="minorHAnsi" w:eastAsia="Times New Roman" w:hAnsiTheme="minorHAnsi"/>
           <w:b/>
           <w:bCs/>
         </w:rPr>
-      </w:pPr>
+        <w:t xml:space="preserve">NFR17 - </w:t>
+      </w:r>
       <w:r>
         <w:rPr>
           <w:rFonts w:asciiTheme="minorHAnsi" w:hAnsiTheme="minorHAnsi"/>
           <w:b/>
           <w:bCs/>
         </w:rPr>
-        <w:t>RNF</w:t>
-      </w:r>
-      <w:r>
-        <w:rPr>
-          <w:rFonts w:asciiTheme="minorHAnsi" w:hAnsiTheme="minorHAnsi"/>
+        <w:t>Minimizzazione</w:t>
+      </w:r>
+      <w:r>
+        <w:rPr>
+          <w:rFonts w:asciiTheme="minorHAnsi" w:hAnsiTheme="minorHAnsi"/>
+        </w:rPr>
+        <w:t>: il sistema</w:t>
+      </w:r>
+      <w:r>
+        <w:rPr>
+          <w:rFonts w:asciiTheme="minorHAnsi" w:hAnsiTheme="minorHAnsi"/>
+        </w:rPr>
+        <w:t xml:space="preserve"> raccoglie</w:t>
+      </w:r>
+      <w:r>
+        <w:rPr>
+          <w:rFonts w:asciiTheme="minorHAnsi" w:hAnsiTheme="minorHAnsi"/>
+        </w:rPr>
+        <w:t xml:space="preserve"> solo i dati necessari al servizio.</w:t>
+      </w:r>
+      <w:r>
+        <w:rPr>
+          <w:rFonts w:asciiTheme="minorHAnsi" w:hAnsiTheme="minorHAnsi"/>
+        </w:rPr>
+        <w:t xml:space="preserve"> [1]</w:t>
+      </w:r>
+    </w:p>
+    <w:p>
+      <w:pPr>
+        <w:pStyle w:val="ListParagraph"/>
+        <w:numPr>
+          <w:ilvl w:val="0"/>
+          <w:numId w:val="41"/>
+        </w:numPr>
+        <w:jc w:val="both"/>
+        <w:rPr>
+          <w:rFonts w:asciiTheme="minorHAnsi" w:hAnsiTheme="minorHAnsi"/>
+        </w:rPr>
+      </w:pPr>
+      <w:r>
+        <w:rPr>
+          <w:rFonts w:asciiTheme="minorHAnsi" w:eastAsia="Times New Roman" w:hAnsiTheme="minorHAnsi"/>
           <w:b/>
           <w:bCs/>
         </w:rPr>
-        <w:t>5</w:t>
+        <w:t xml:space="preserve">NFR18 - </w:t>
       </w:r>
       <w:r>
         <w:rPr>
@@ -8911,493 +9570,84 @@
           <w:b/>
           <w:bCs/>
         </w:rPr>
-        <w:t xml:space="preserve"> –</w:t>
-      </w:r>
-      <w:r>
-        <w:rPr>
-          <w:rFonts w:asciiTheme="minorHAnsi" w:hAnsiTheme="minorHAnsi"/>
+        <w:t>Data Breach</w:t>
+      </w:r>
+      <w:r>
+        <w:rPr>
+          <w:rFonts w:asciiTheme="minorHAnsi" w:hAnsiTheme="minorHAnsi"/>
+        </w:rPr>
+        <w:t>: in caso di violazione dei dati il titolare deve notificare il Garante entro 72 ore.</w:t>
+      </w:r>
+      <w:r>
+        <w:rPr>
+          <w:rFonts w:asciiTheme="minorHAnsi" w:hAnsiTheme="minorHAnsi"/>
+        </w:rPr>
+        <w:t xml:space="preserve"> [1]</w:t>
+      </w:r>
+    </w:p>
+    <w:p>
+      <w:pPr>
+        <w:pStyle w:val="ListParagraph"/>
+        <w:numPr>
+          <w:ilvl w:val="0"/>
+          <w:numId w:val="41"/>
+        </w:numPr>
+        <w:jc w:val="both"/>
+        <w:rPr>
+          <w:rFonts w:asciiTheme="minorHAnsi" w:eastAsia="Times New Roman" w:hAnsiTheme="minorHAnsi"/>
+        </w:rPr>
+      </w:pPr>
+      <w:r>
+        <w:rPr>
+          <w:rFonts w:asciiTheme="minorHAnsi" w:eastAsia="Times New Roman" w:hAnsiTheme="minorHAnsi"/>
           <w:b/>
           <w:bCs/>
         </w:rPr>
-        <w:t xml:space="preserve"> Tempi di risposta</w:t>
-      </w:r>
-      <w:r>
-        <w:rPr>
-          <w:rFonts w:asciiTheme="minorHAnsi" w:hAnsiTheme="minorHAnsi"/>
+        <w:t xml:space="preserve">NFR19 - </w:t>
+      </w:r>
+      <w:r>
+        <w:rPr>
+          <w:rFonts w:asciiTheme="minorHAnsi" w:eastAsia="Times New Roman" w:hAnsiTheme="minorHAnsi"/>
           <w:b/>
           <w:bCs/>
         </w:rPr>
-        <w:t xml:space="preserve"> </w:t>
-      </w:r>
-    </w:p>
-    <w:p>
-      <w:pPr>
-        <w:jc w:val="both"/>
-        <w:rPr>
-          <w:rFonts w:asciiTheme="minorHAnsi" w:hAnsiTheme="minorHAnsi"/>
-        </w:rPr>
-      </w:pPr>
-      <w:r>
-        <w:rPr>
-          <w:rFonts w:asciiTheme="minorHAnsi" w:hAnsiTheme="minorHAnsi"/>
-        </w:rPr>
-        <w:t xml:space="preserve">I tempi di risposta del sistema </w:t>
-      </w:r>
-      <w:r>
-        <w:rPr>
-          <w:rFonts w:asciiTheme="minorHAnsi" w:hAnsiTheme="minorHAnsi"/>
-        </w:rPr>
-        <w:t>saranno al massimo di due secondi</w:t>
-      </w:r>
-      <w:r>
-        <w:rPr>
-          <w:rFonts w:asciiTheme="minorHAnsi" w:hAnsiTheme="minorHAnsi"/>
-        </w:rPr>
-        <w:t xml:space="preserve"> per almeno il 90% delle operazioni</w:t>
-      </w:r>
-      <w:r>
-        <w:rPr>
-          <w:rFonts w:asciiTheme="minorHAnsi" w:hAnsiTheme="minorHAnsi"/>
-        </w:rPr>
-        <w:t xml:space="preserve">, </w:t>
-      </w:r>
-      <w:r>
-        <w:rPr>
-          <w:rFonts w:asciiTheme="minorHAnsi" w:hAnsiTheme="minorHAnsi"/>
-        </w:rPr>
-        <w:t>così da garantire u</w:t>
-      </w:r>
-      <w:r>
-        <w:rPr>
-          <w:rFonts w:asciiTheme="minorHAnsi" w:hAnsiTheme="minorHAnsi"/>
-        </w:rPr>
-        <w:t>n’esperienza fluida</w:t>
-      </w:r>
-      <w:r>
-        <w:rPr>
-          <w:rFonts w:asciiTheme="minorHAnsi" w:hAnsiTheme="minorHAnsi"/>
-        </w:rPr>
-        <w:t>.</w:t>
-      </w:r>
-    </w:p>
-    <w:p>
-      <w:pPr>
-        <w:jc w:val="both"/>
-        <w:rPr>
-          <w:rFonts w:asciiTheme="minorHAnsi" w:hAnsiTheme="minorHAnsi"/>
-        </w:rPr>
-      </w:pPr>
-    </w:p>
-    <w:p>
-      <w:pPr>
-        <w:jc w:val="both"/>
-        <w:rPr>
-          <w:rFonts w:asciiTheme="minorHAnsi" w:hAnsiTheme="minorHAnsi"/>
-          <w:b/>
-          <w:bCs/>
-        </w:rPr>
-      </w:pPr>
-      <w:r>
-        <w:rPr>
-          <w:rFonts w:asciiTheme="minorHAnsi" w:hAnsiTheme="minorHAnsi"/>
-          <w:b/>
-          <w:bCs/>
-        </w:rPr>
-        <w:t>SUPPORTABILITÀ</w:t>
-      </w:r>
-    </w:p>
-    <w:p>
-      <w:pPr>
-        <w:jc w:val="both"/>
-        <w:rPr>
-          <w:rFonts w:asciiTheme="minorHAnsi" w:hAnsiTheme="minorHAnsi"/>
-          <w:b/>
-          <w:bCs/>
-        </w:rPr>
-      </w:pPr>
-    </w:p>
-    <w:p>
-      <w:pPr>
-        <w:jc w:val="both"/>
-        <w:rPr>
-          <w:rFonts w:asciiTheme="minorHAnsi" w:hAnsiTheme="minorHAnsi"/>
-          <w:b/>
-          <w:bCs/>
-        </w:rPr>
-      </w:pPr>
-      <w:r>
-        <w:rPr>
-          <w:rFonts w:asciiTheme="minorHAnsi" w:hAnsiTheme="minorHAnsi"/>
-          <w:b/>
-          <w:bCs/>
-        </w:rPr>
-        <w:t>RNF</w:t>
-      </w:r>
-      <w:r>
-        <w:rPr>
-          <w:rFonts w:asciiTheme="minorHAnsi" w:hAnsiTheme="minorHAnsi"/>
-          <w:b/>
-          <w:bCs/>
-        </w:rPr>
-        <w:t>6</w:t>
-      </w:r>
-      <w:r>
-        <w:rPr>
-          <w:rFonts w:asciiTheme="minorHAnsi" w:hAnsiTheme="minorHAnsi"/>
-          <w:b/>
-          <w:bCs/>
-        </w:rPr>
-        <w:t xml:space="preserve"> – </w:t>
-      </w:r>
-      <w:r>
-        <w:rPr>
-          <w:rFonts w:asciiTheme="minorHAnsi" w:hAnsiTheme="minorHAnsi"/>
-          <w:b/>
-          <w:bCs/>
-        </w:rPr>
-        <w:t>Architettura software</w:t>
-      </w:r>
-    </w:p>
-    <w:p>
-      <w:pPr>
-        <w:jc w:val="both"/>
-        <w:rPr>
-          <w:rFonts w:asciiTheme="minorHAnsi" w:hAnsiTheme="minorHAnsi"/>
-        </w:rPr>
-      </w:pPr>
-      <w:r>
-        <w:rPr>
-          <w:rFonts w:asciiTheme="minorHAnsi" w:hAnsiTheme="minorHAnsi"/>
-        </w:rPr>
-        <w:t xml:space="preserve">Il sistema sarà progettato sul modello MVC </w:t>
-      </w:r>
-      <w:r>
-        <w:rPr>
-          <w:rFonts w:asciiTheme="minorHAnsi" w:hAnsiTheme="minorHAnsi"/>
-        </w:rPr>
-        <w:t xml:space="preserve">così </w:t>
-      </w:r>
-      <w:r>
-        <w:rPr>
-          <w:rFonts w:asciiTheme="minorHAnsi" w:hAnsiTheme="minorHAnsi"/>
-        </w:rPr>
-        <w:t>da garantire la separazione tra il modello, la vista</w:t>
-      </w:r>
-      <w:r>
-        <w:rPr>
-          <w:rFonts w:asciiTheme="minorHAnsi" w:hAnsiTheme="minorHAnsi"/>
-        </w:rPr>
-        <w:t xml:space="preserve"> </w:t>
-      </w:r>
-      <w:r>
-        <w:rPr>
-          <w:rFonts w:asciiTheme="minorHAnsi" w:hAnsiTheme="minorHAnsi"/>
-        </w:rPr>
-        <w:t xml:space="preserve">e il controllo, </w:t>
-      </w:r>
-      <w:r>
-        <w:rPr>
-          <w:rFonts w:asciiTheme="minorHAnsi" w:hAnsiTheme="minorHAnsi"/>
-        </w:rPr>
-        <w:t>al fine di favorire la manutenibilità del software.</w:t>
-      </w:r>
-    </w:p>
-    <w:p>
-      <w:pPr>
-        <w:jc w:val="both"/>
-        <w:rPr>
-          <w:rFonts w:asciiTheme="minorHAnsi" w:hAnsiTheme="minorHAnsi"/>
-          <w:b/>
-          <w:bCs/>
-        </w:rPr>
-      </w:pPr>
-    </w:p>
-    <w:p>
-      <w:pPr>
-        <w:jc w:val="both"/>
-        <w:rPr>
-          <w:rFonts w:asciiTheme="minorHAnsi" w:hAnsiTheme="minorHAnsi"/>
-          <w:b/>
-          <w:bCs/>
-        </w:rPr>
-      </w:pPr>
-      <w:r>
-        <w:rPr>
-          <w:rFonts w:asciiTheme="minorHAnsi" w:hAnsiTheme="minorHAnsi"/>
-          <w:b/>
-          <w:bCs/>
-        </w:rPr>
-        <w:t>SICUREZZA</w:t>
-      </w:r>
-    </w:p>
-    <w:p>
-      <w:pPr>
-        <w:jc w:val="both"/>
-        <w:rPr>
-          <w:rFonts w:asciiTheme="minorHAnsi" w:hAnsiTheme="minorHAnsi"/>
-          <w:b/>
-          <w:bCs/>
-        </w:rPr>
-      </w:pPr>
-    </w:p>
-    <w:p>
-      <w:pPr>
-        <w:jc w:val="both"/>
-        <w:rPr>
-          <w:rFonts w:asciiTheme="minorHAnsi" w:hAnsiTheme="minorHAnsi"/>
-          <w:b/>
-          <w:bCs/>
-        </w:rPr>
-      </w:pPr>
-      <w:r>
-        <w:rPr>
-          <w:rFonts w:asciiTheme="minorHAnsi" w:hAnsiTheme="minorHAnsi"/>
-          <w:b/>
-          <w:bCs/>
-        </w:rPr>
-        <w:t>RNF</w:t>
-      </w:r>
-      <w:r>
-        <w:rPr>
-          <w:rFonts w:asciiTheme="minorHAnsi" w:hAnsiTheme="minorHAnsi"/>
-          <w:b/>
-          <w:bCs/>
-        </w:rPr>
-        <w:t>7</w:t>
-      </w:r>
-      <w:r>
-        <w:rPr>
-          <w:rFonts w:asciiTheme="minorHAnsi" w:hAnsiTheme="minorHAnsi"/>
-          <w:b/>
-          <w:bCs/>
-        </w:rPr>
-        <w:t xml:space="preserve"> –</w:t>
-      </w:r>
-      <w:r>
-        <w:rPr>
-          <w:rFonts w:asciiTheme="minorHAnsi" w:hAnsiTheme="minorHAnsi"/>
-          <w:b/>
-          <w:bCs/>
-        </w:rPr>
-        <w:t xml:space="preserve"> Controllo degli accessi</w:t>
-      </w:r>
-      <w:r>
-        <w:rPr>
-          <w:rFonts w:asciiTheme="minorHAnsi" w:hAnsiTheme="minorHAnsi"/>
-          <w:b/>
-          <w:bCs/>
-        </w:rPr>
-        <w:t xml:space="preserve"> </w:t>
-      </w:r>
-    </w:p>
-    <w:p>
-      <w:pPr>
-        <w:jc w:val="both"/>
-        <w:rPr>
-          <w:rFonts w:asciiTheme="minorHAnsi" w:hAnsiTheme="minorHAnsi"/>
-        </w:rPr>
-      </w:pPr>
-      <w:r>
-        <w:rPr>
-          <w:rFonts w:asciiTheme="minorHAnsi" w:hAnsiTheme="minorHAnsi"/>
-        </w:rPr>
-        <w:t>Il sistema</w:t>
-      </w:r>
-      <w:r>
-        <w:rPr>
-          <w:rFonts w:asciiTheme="minorHAnsi" w:hAnsiTheme="minorHAnsi"/>
-        </w:rPr>
-        <w:t xml:space="preserve"> impedirà</w:t>
-      </w:r>
-      <w:r>
-        <w:rPr>
-          <w:rFonts w:asciiTheme="minorHAnsi" w:hAnsiTheme="minorHAnsi"/>
-        </w:rPr>
-        <w:t xml:space="preserve"> l’accesso diretto via URL alle pagine riservate </w:t>
-      </w:r>
-      <w:r>
-        <w:rPr>
-          <w:rFonts w:asciiTheme="minorHAnsi" w:hAnsiTheme="minorHAnsi"/>
-        </w:rPr>
-        <w:t>solo a chi ha il permesso di accedere ad esse.</w:t>
-      </w:r>
-    </w:p>
-    <w:p>
-      <w:pPr>
-        <w:jc w:val="both"/>
-        <w:rPr>
-          <w:rFonts w:asciiTheme="minorHAnsi" w:hAnsiTheme="minorHAnsi"/>
-        </w:rPr>
-      </w:pPr>
-    </w:p>
-    <w:p>
-      <w:pPr>
-        <w:jc w:val="both"/>
-        <w:rPr>
-          <w:rFonts w:asciiTheme="minorHAnsi" w:hAnsiTheme="minorHAnsi"/>
-          <w:b/>
-          <w:bCs/>
-        </w:rPr>
-      </w:pPr>
-      <w:r>
-        <w:rPr>
-          <w:rFonts w:asciiTheme="minorHAnsi" w:hAnsiTheme="minorHAnsi"/>
-          <w:b/>
-          <w:bCs/>
-        </w:rPr>
-        <w:t>RNF</w:t>
-      </w:r>
-      <w:r>
-        <w:rPr>
-          <w:rFonts w:asciiTheme="minorHAnsi" w:hAnsiTheme="minorHAnsi"/>
-          <w:b/>
-          <w:bCs/>
-        </w:rPr>
-        <w:t>8</w:t>
-      </w:r>
-      <w:r>
-        <w:rPr>
-          <w:rFonts w:asciiTheme="minorHAnsi" w:hAnsiTheme="minorHAnsi"/>
-          <w:b/>
-          <w:bCs/>
-        </w:rPr>
-        <w:t xml:space="preserve"> </w:t>
-      </w:r>
-      <w:r>
-        <w:rPr>
-          <w:rFonts w:asciiTheme="minorHAnsi" w:hAnsiTheme="minorHAnsi"/>
-          <w:b/>
-          <w:bCs/>
-        </w:rPr>
-        <w:t>–</w:t>
-      </w:r>
-      <w:r>
-        <w:rPr>
-          <w:rFonts w:asciiTheme="minorHAnsi" w:hAnsiTheme="minorHAnsi"/>
-          <w:b/>
-          <w:bCs/>
-        </w:rPr>
-        <w:t xml:space="preserve"> Protezione delle password</w:t>
-      </w:r>
-    </w:p>
-    <w:p>
-      <w:pPr>
-        <w:jc w:val="both"/>
-        <w:rPr>
-          <w:rFonts w:asciiTheme="minorHAnsi" w:hAnsiTheme="minorHAnsi"/>
-        </w:rPr>
-      </w:pPr>
-      <w:r>
-        <w:rPr>
-          <w:rFonts w:asciiTheme="minorHAnsi" w:hAnsiTheme="minorHAnsi"/>
-        </w:rPr>
-        <w:t>L</w:t>
-      </w:r>
-      <w:r>
-        <w:rPr>
-          <w:rFonts w:asciiTheme="minorHAnsi" w:hAnsiTheme="minorHAnsi"/>
-        </w:rPr>
-        <w:t xml:space="preserve">e password </w:t>
-      </w:r>
-      <w:r>
-        <w:rPr>
-          <w:rFonts w:asciiTheme="minorHAnsi" w:hAnsiTheme="minorHAnsi"/>
-        </w:rPr>
-        <w:t>saranno sottoposte ad hash</w:t>
-      </w:r>
-      <w:r>
-        <w:rPr>
-          <w:rFonts w:asciiTheme="minorHAnsi" w:hAnsiTheme="minorHAnsi"/>
-        </w:rPr>
-        <w:t xml:space="preserve"> e salvate nel database</w:t>
-      </w:r>
-      <w:r>
-        <w:rPr>
-          <w:rFonts w:asciiTheme="minorHAnsi" w:hAnsiTheme="minorHAnsi"/>
-        </w:rPr>
-        <w:t>.</w:t>
-      </w:r>
-    </w:p>
-    <w:p>
-      <w:pPr>
-        <w:jc w:val="both"/>
-        <w:rPr>
-          <w:rFonts w:asciiTheme="minorHAnsi" w:hAnsiTheme="minorHAnsi"/>
-          <w:b/>
-          <w:bCs/>
-        </w:rPr>
-      </w:pPr>
-    </w:p>
-    <w:p>
-      <w:pPr>
-        <w:jc w:val="both"/>
-        <w:rPr>
-          <w:rFonts w:asciiTheme="minorHAnsi" w:hAnsiTheme="minorHAnsi"/>
-          <w:b/>
-          <w:bCs/>
-        </w:rPr>
-      </w:pPr>
-      <w:r>
-        <w:rPr>
-          <w:rFonts w:asciiTheme="minorHAnsi" w:hAnsiTheme="minorHAnsi"/>
-          <w:b/>
-          <w:bCs/>
-        </w:rPr>
-        <w:t>RNF</w:t>
-      </w:r>
-      <w:r>
-        <w:rPr>
-          <w:rFonts w:asciiTheme="minorHAnsi" w:hAnsiTheme="minorHAnsi"/>
-          <w:b/>
-          <w:bCs/>
-        </w:rPr>
-        <w:t>9</w:t>
-      </w:r>
-      <w:r>
-        <w:rPr>
-          <w:rFonts w:asciiTheme="minorHAnsi" w:hAnsiTheme="minorHAnsi"/>
-          <w:b/>
-          <w:bCs/>
-        </w:rPr>
-        <w:t xml:space="preserve"> </w:t>
-      </w:r>
-      <w:r>
-        <w:rPr>
-          <w:rFonts w:asciiTheme="minorHAnsi" w:hAnsiTheme="minorHAnsi"/>
-          <w:b/>
-          <w:bCs/>
-        </w:rPr>
-        <w:t>–</w:t>
-      </w:r>
-      <w:r>
-        <w:rPr>
-          <w:rFonts w:asciiTheme="minorHAnsi" w:hAnsiTheme="minorHAnsi"/>
-          <w:b/>
-          <w:bCs/>
-        </w:rPr>
-        <w:t xml:space="preserve"> </w:t>
-      </w:r>
-      <w:r>
-        <w:rPr>
-          <w:rFonts w:asciiTheme="minorHAnsi" w:hAnsiTheme="minorHAnsi"/>
-          <w:b/>
-          <w:bCs/>
-        </w:rPr>
-        <w:t>Comunicazioni sicure</w:t>
-      </w:r>
-    </w:p>
-    <w:p>
-      <w:pPr>
-        <w:jc w:val="both"/>
-        <w:rPr>
-          <w:rFonts w:asciiTheme="minorHAnsi" w:hAnsiTheme="minorHAnsi"/>
-        </w:rPr>
-      </w:pPr>
-      <w:r>
-        <w:rPr>
-          <w:rFonts w:asciiTheme="minorHAnsi" w:hAnsiTheme="minorHAnsi"/>
-        </w:rPr>
-        <w:t>Tutto il traffico dati tra client e server deve avvenire tramite protocollo crittografato HTTPS.</w:t>
+        <w:t>Sicurezza</w:t>
+      </w:r>
+      <w:r>
+        <w:rPr>
+          <w:rFonts w:asciiTheme="minorHAnsi" w:eastAsia="Times New Roman" w:hAnsiTheme="minorHAnsi"/>
+        </w:rPr>
+        <w:t xml:space="preserve">: </w:t>
+      </w:r>
+      <w:r>
+        <w:rPr>
+          <w:rFonts w:asciiTheme="minorHAnsi" w:eastAsia="Times New Roman" w:hAnsiTheme="minorHAnsi"/>
+        </w:rPr>
+        <w:t>i</w:t>
+      </w:r>
+      <w:r>
+        <w:rPr>
+          <w:rFonts w:asciiTheme="minorHAnsi" w:eastAsia="Times New Roman" w:hAnsiTheme="minorHAnsi"/>
+        </w:rPr>
+        <w:t>l sistema non deve mai chiedere dati di pagamento al cliente ed i codici fiscali e</w:t>
+      </w:r>
+      <w:r>
+        <w:rPr>
+          <w:rFonts w:asciiTheme="minorHAnsi" w:eastAsia="Times New Roman" w:hAnsiTheme="minorHAnsi"/>
+        </w:rPr>
+        <w:t xml:space="preserve"> le iscrizioni</w:t>
+      </w:r>
+      <w:r>
+        <w:rPr>
+          <w:rFonts w:asciiTheme="minorHAnsi" w:eastAsia="Times New Roman" w:hAnsiTheme="minorHAnsi"/>
+        </w:rPr>
+        <w:t xml:space="preserve"> devono essere fatti di persona insieme all'operatore.</w:t>
+      </w:r>
+      <w:r>
+        <w:rPr>
+          <w:rFonts w:asciiTheme="minorHAnsi" w:eastAsia="Times New Roman" w:hAnsiTheme="minorHAnsi"/>
+        </w:rPr>
+        <w:t xml:space="preserve"> Inoltre solo gli operatori autenticati sono autorizzati a vedere i dati dei lettori.</w:t>
       </w:r>
     </w:p>
     <w:p>
@@ -9419,7 +9669,7 @@
           <w:iCs w:val="0"/>
         </w:rPr>
       </w:pPr>
-      <w:bookmarkStart w:id="24" w:name="_Toc243674719"/>
+      <w:bookmarkStart w:id="32" w:name="_Toc243674719"/>
       <w:r>
         <w:rPr>
           <w:rFonts w:asciiTheme="minorHAnsi" w:hAnsiTheme="minorHAnsi"/>
@@ -9428,7 +9678,7 @@
         </w:rPr>
         <w:t>Target Environment</w:t>
       </w:r>
-      <w:bookmarkEnd w:id="24"/>
+      <w:bookmarkEnd w:id="32"/>
     </w:p>
     <w:p>
       <w:pPr>
@@ -9579,7 +9829,7 @@
           <w:iCs w:val="0"/>
         </w:rPr>
       </w:pPr>
-      <w:bookmarkStart w:id="25" w:name="_Toc243674720"/>
+      <w:bookmarkStart w:id="33" w:name="_Toc243674720"/>
       <w:r>
         <w:rPr>
           <w:rFonts w:asciiTheme="minorHAnsi" w:hAnsiTheme="minorHAnsi"/>
@@ -9604,7 +9854,7 @@
         </w:rPr>
         <w:t>eadlines</w:t>
       </w:r>
-      <w:bookmarkEnd w:id="25"/>
+      <w:bookmarkEnd w:id="33"/>
     </w:p>
     <w:p>
       <w:pPr>
@@ -9712,8 +9962,23 @@
           <w:rFonts w:asciiTheme="minorHAnsi" w:hAnsiTheme="minorHAnsi"/>
           <w:lang w:val="en-US"/>
         </w:rPr>
-        <w:lastRenderedPageBreak/>
-        <w:t>17/12/2026: Object Design Document e Test finale</w:t>
+        <w:t xml:space="preserve">17/12/2026: Object Design Document </w:t>
+      </w:r>
+      <w:proofErr w:type="gramStart"/>
+      <w:r>
+        <w:rPr>
+          <w:rFonts w:asciiTheme="minorHAnsi" w:hAnsiTheme="minorHAnsi"/>
+          <w:lang w:val="en-US"/>
+        </w:rPr>
+        <w:t>e</w:t>
+      </w:r>
+      <w:proofErr w:type="gramEnd"/>
+      <w:r>
+        <w:rPr>
+          <w:rFonts w:asciiTheme="minorHAnsi" w:hAnsiTheme="minorHAnsi"/>
+          <w:lang w:val="en-US"/>
+        </w:rPr>
+        <w:t xml:space="preserve"> Test finale</w:t>
       </w:r>
       <w:r>
         <w:rPr>
@@ -10252,7 +10517,7 @@
         <v:path o:extrusionok="f" gradientshapeok="t" o:connecttype="rect"/>
         <o:lock v:ext="edit" aspectratio="t"/>
       </v:shapetype>
-      <v:shape id="_x0000_i1025" type="#_x0000_t75" style="width:316.8pt;height:252pt" o:bullet="t" filled="t">
+      <v:shape id="_x0000_i1025" type="#_x0000_t75" style="width:316.5pt;height:252pt" o:bullet="t" filled="t">
         <v:fill color2="black"/>
         <v:imagedata r:id="rId1" o:title=""/>
       </v:shape>
@@ -10653,6 +10918,232 @@
     </w:lvl>
   </w:abstractNum>
   <w:abstractNum w:abstractNumId="7" w15:restartNumberingAfterBreak="0">
+    <w:nsid w:val="1A2FD67D"/>
+    <w:multiLevelType w:val="hybridMultilevel"/>
+    <w:tmpl w:val="B9BE572A"/>
+    <w:lvl w:ilvl="0" w:tplc="3D044CB8">
+      <w:start w:val="1"/>
+      <w:numFmt w:val="bullet"/>
+      <w:lvlText w:val=""/>
+      <w:lvlJc w:val="left"/>
+      <w:pPr>
+        <w:ind w:left="720" w:hanging="360"/>
+      </w:pPr>
+      <w:rPr>
+        <w:rFonts w:ascii="Symbol" w:hAnsi="Symbol" w:hint="default"/>
+      </w:rPr>
+    </w:lvl>
+    <w:lvl w:ilvl="1" w:tplc="BFC6C54C">
+      <w:start w:val="1"/>
+      <w:numFmt w:val="bullet"/>
+      <w:lvlText w:val="o"/>
+      <w:lvlJc w:val="left"/>
+      <w:pPr>
+        <w:ind w:left="1440" w:hanging="360"/>
+      </w:pPr>
+      <w:rPr>
+        <w:rFonts w:ascii="Courier New" w:hAnsi="Courier New" w:hint="default"/>
+      </w:rPr>
+    </w:lvl>
+    <w:lvl w:ilvl="2" w:tplc="854C458A">
+      <w:start w:val="1"/>
+      <w:numFmt w:val="bullet"/>
+      <w:lvlText w:val=""/>
+      <w:lvlJc w:val="left"/>
+      <w:pPr>
+        <w:ind w:left="2160" w:hanging="360"/>
+      </w:pPr>
+      <w:rPr>
+        <w:rFonts w:ascii="Wingdings" w:hAnsi="Wingdings" w:hint="default"/>
+      </w:rPr>
+    </w:lvl>
+    <w:lvl w:ilvl="3" w:tplc="0AA2423C">
+      <w:start w:val="1"/>
+      <w:numFmt w:val="bullet"/>
+      <w:lvlText w:val=""/>
+      <w:lvlJc w:val="left"/>
+      <w:pPr>
+        <w:ind w:left="2880" w:hanging="360"/>
+      </w:pPr>
+      <w:rPr>
+        <w:rFonts w:ascii="Symbol" w:hAnsi="Symbol" w:hint="default"/>
+      </w:rPr>
+    </w:lvl>
+    <w:lvl w:ilvl="4" w:tplc="630EAB9E">
+      <w:start w:val="1"/>
+      <w:numFmt w:val="bullet"/>
+      <w:lvlText w:val="o"/>
+      <w:lvlJc w:val="left"/>
+      <w:pPr>
+        <w:ind w:left="3600" w:hanging="360"/>
+      </w:pPr>
+      <w:rPr>
+        <w:rFonts w:ascii="Courier New" w:hAnsi="Courier New" w:hint="default"/>
+      </w:rPr>
+    </w:lvl>
+    <w:lvl w:ilvl="5" w:tplc="3EA495B2">
+      <w:start w:val="1"/>
+      <w:numFmt w:val="bullet"/>
+      <w:lvlText w:val=""/>
+      <w:lvlJc w:val="left"/>
+      <w:pPr>
+        <w:ind w:left="4320" w:hanging="360"/>
+      </w:pPr>
+      <w:rPr>
+        <w:rFonts w:ascii="Wingdings" w:hAnsi="Wingdings" w:hint="default"/>
+      </w:rPr>
+    </w:lvl>
+    <w:lvl w:ilvl="6" w:tplc="5FE2F100">
+      <w:start w:val="1"/>
+      <w:numFmt w:val="bullet"/>
+      <w:lvlText w:val=""/>
+      <w:lvlJc w:val="left"/>
+      <w:pPr>
+        <w:ind w:left="5040" w:hanging="360"/>
+      </w:pPr>
+      <w:rPr>
+        <w:rFonts w:ascii="Symbol" w:hAnsi="Symbol" w:hint="default"/>
+      </w:rPr>
+    </w:lvl>
+    <w:lvl w:ilvl="7" w:tplc="105AD22E">
+      <w:start w:val="1"/>
+      <w:numFmt w:val="bullet"/>
+      <w:lvlText w:val="o"/>
+      <w:lvlJc w:val="left"/>
+      <w:pPr>
+        <w:ind w:left="5760" w:hanging="360"/>
+      </w:pPr>
+      <w:rPr>
+        <w:rFonts w:ascii="Courier New" w:hAnsi="Courier New" w:hint="default"/>
+      </w:rPr>
+    </w:lvl>
+    <w:lvl w:ilvl="8" w:tplc="DC8216AC">
+      <w:start w:val="1"/>
+      <w:numFmt w:val="bullet"/>
+      <w:lvlText w:val=""/>
+      <w:lvlJc w:val="left"/>
+      <w:pPr>
+        <w:ind w:left="6480" w:hanging="360"/>
+      </w:pPr>
+      <w:rPr>
+        <w:rFonts w:ascii="Wingdings" w:hAnsi="Wingdings" w:hint="default"/>
+      </w:rPr>
+    </w:lvl>
+  </w:abstractNum>
+  <w:abstractNum w:abstractNumId="8" w15:restartNumberingAfterBreak="0">
+    <w:nsid w:val="1EB636BE"/>
+    <w:multiLevelType w:val="hybridMultilevel"/>
+    <w:tmpl w:val="708C4F1E"/>
+    <w:lvl w:ilvl="0" w:tplc="CBBEAE30">
+      <w:start w:val="1"/>
+      <w:numFmt w:val="bullet"/>
+      <w:lvlText w:val=""/>
+      <w:lvlJc w:val="left"/>
+      <w:pPr>
+        <w:ind w:left="720" w:hanging="360"/>
+      </w:pPr>
+      <w:rPr>
+        <w:rFonts w:ascii="Symbol" w:hAnsi="Symbol" w:hint="default"/>
+      </w:rPr>
+    </w:lvl>
+    <w:lvl w:ilvl="1" w:tplc="EB5CCDCE">
+      <w:start w:val="1"/>
+      <w:numFmt w:val="bullet"/>
+      <w:lvlText w:val="o"/>
+      <w:lvlJc w:val="left"/>
+      <w:pPr>
+        <w:ind w:left="1440" w:hanging="360"/>
+      </w:pPr>
+      <w:rPr>
+        <w:rFonts w:ascii="Courier New" w:hAnsi="Courier New" w:hint="default"/>
+      </w:rPr>
+    </w:lvl>
+    <w:lvl w:ilvl="2" w:tplc="CEC4E450">
+      <w:start w:val="1"/>
+      <w:numFmt w:val="bullet"/>
+      <w:lvlText w:val=""/>
+      <w:lvlJc w:val="left"/>
+      <w:pPr>
+        <w:ind w:left="2160" w:hanging="360"/>
+      </w:pPr>
+      <w:rPr>
+        <w:rFonts w:ascii="Wingdings" w:hAnsi="Wingdings" w:hint="default"/>
+      </w:rPr>
+    </w:lvl>
+    <w:lvl w:ilvl="3" w:tplc="807EC35E">
+      <w:start w:val="1"/>
+      <w:numFmt w:val="bullet"/>
+      <w:lvlText w:val=""/>
+      <w:lvlJc w:val="left"/>
+      <w:pPr>
+        <w:ind w:left="2880" w:hanging="360"/>
+      </w:pPr>
+      <w:rPr>
+        <w:rFonts w:ascii="Symbol" w:hAnsi="Symbol" w:hint="default"/>
+      </w:rPr>
+    </w:lvl>
+    <w:lvl w:ilvl="4" w:tplc="A3EE7F4A">
+      <w:start w:val="1"/>
+      <w:numFmt w:val="bullet"/>
+      <w:lvlText w:val="o"/>
+      <w:lvlJc w:val="left"/>
+      <w:pPr>
+        <w:ind w:left="3600" w:hanging="360"/>
+      </w:pPr>
+      <w:rPr>
+        <w:rFonts w:ascii="Courier New" w:hAnsi="Courier New" w:hint="default"/>
+      </w:rPr>
+    </w:lvl>
+    <w:lvl w:ilvl="5" w:tplc="D29AFBF4">
+      <w:start w:val="1"/>
+      <w:numFmt w:val="bullet"/>
+      <w:lvlText w:val=""/>
+      <w:lvlJc w:val="left"/>
+      <w:pPr>
+        <w:ind w:left="4320" w:hanging="360"/>
+      </w:pPr>
+      <w:rPr>
+        <w:rFonts w:ascii="Wingdings" w:hAnsi="Wingdings" w:hint="default"/>
+      </w:rPr>
+    </w:lvl>
+    <w:lvl w:ilvl="6" w:tplc="7534BC20">
+      <w:start w:val="1"/>
+      <w:numFmt w:val="bullet"/>
+      <w:lvlText w:val=""/>
+      <w:lvlJc w:val="left"/>
+      <w:pPr>
+        <w:ind w:left="5040" w:hanging="360"/>
+      </w:pPr>
+      <w:rPr>
+        <w:rFonts w:ascii="Symbol" w:hAnsi="Symbol" w:hint="default"/>
+      </w:rPr>
+    </w:lvl>
+    <w:lvl w:ilvl="7" w:tplc="9F8AFEC8">
+      <w:start w:val="1"/>
+      <w:numFmt w:val="bullet"/>
+      <w:lvlText w:val="o"/>
+      <w:lvlJc w:val="left"/>
+      <w:pPr>
+        <w:ind w:left="5760" w:hanging="360"/>
+      </w:pPr>
+      <w:rPr>
+        <w:rFonts w:ascii="Courier New" w:hAnsi="Courier New" w:hint="default"/>
+      </w:rPr>
+    </w:lvl>
+    <w:lvl w:ilvl="8" w:tplc="CCA0B64C">
+      <w:start w:val="1"/>
+      <w:numFmt w:val="bullet"/>
+      <w:lvlText w:val=""/>
+      <w:lvlJc w:val="left"/>
+      <w:pPr>
+        <w:ind w:left="6480" w:hanging="360"/>
+      </w:pPr>
+      <w:rPr>
+        <w:rFonts w:ascii="Wingdings" w:hAnsi="Wingdings" w:hint="default"/>
+      </w:rPr>
+    </w:lvl>
+  </w:abstractNum>
+  <w:abstractNum w:abstractNumId="9" w15:restartNumberingAfterBreak="0">
     <w:nsid w:val="1F8433D7"/>
     <w:multiLevelType w:val="multilevel"/>
     <w:tmpl w:val="03B49136"/>
@@ -10770,7 +11261,7 @@
       </w:rPr>
     </w:lvl>
   </w:abstractNum>
-  <w:abstractNum w:abstractNumId="8" w15:restartNumberingAfterBreak="0">
+  <w:abstractNum w:abstractNumId="10" w15:restartNumberingAfterBreak="0">
     <w:nsid w:val="28A44A3C"/>
     <w:multiLevelType w:val="hybridMultilevel"/>
     <w:tmpl w:val="3E60387A"/>
@@ -10883,7 +11374,7 @@
       </w:rPr>
     </w:lvl>
   </w:abstractNum>
-  <w:abstractNum w:abstractNumId="9" w15:restartNumberingAfterBreak="0">
+  <w:abstractNum w:abstractNumId="11" w15:restartNumberingAfterBreak="0">
     <w:nsid w:val="31F12CBF"/>
     <w:multiLevelType w:val="hybridMultilevel"/>
     <w:tmpl w:val="986048AA"/>
@@ -10996,7 +11487,7 @@
       </w:rPr>
     </w:lvl>
   </w:abstractNum>
-  <w:abstractNum w:abstractNumId="10" w15:restartNumberingAfterBreak="0">
+  <w:abstractNum w:abstractNumId="12" w15:restartNumberingAfterBreak="0">
     <w:nsid w:val="3E68634A"/>
     <w:multiLevelType w:val="hybridMultilevel"/>
     <w:tmpl w:val="6D92EA5E"/>
@@ -11109,7 +11600,120 @@
       </w:rPr>
     </w:lvl>
   </w:abstractNum>
-  <w:abstractNum w:abstractNumId="11" w15:restartNumberingAfterBreak="0">
+  <w:abstractNum w:abstractNumId="13" w15:restartNumberingAfterBreak="0">
+    <w:nsid w:val="4134CF1A"/>
+    <w:multiLevelType w:val="hybridMultilevel"/>
+    <w:tmpl w:val="66DEBF48"/>
+    <w:lvl w:ilvl="0" w:tplc="E61C5D9A">
+      <w:start w:val="1"/>
+      <w:numFmt w:val="bullet"/>
+      <w:lvlText w:val=""/>
+      <w:lvlJc w:val="left"/>
+      <w:pPr>
+        <w:ind w:left="720" w:hanging="360"/>
+      </w:pPr>
+      <w:rPr>
+        <w:rFonts w:ascii="Symbol" w:hAnsi="Symbol" w:hint="default"/>
+      </w:rPr>
+    </w:lvl>
+    <w:lvl w:ilvl="1" w:tplc="53B4A4AE">
+      <w:start w:val="1"/>
+      <w:numFmt w:val="bullet"/>
+      <w:lvlText w:val="o"/>
+      <w:lvlJc w:val="left"/>
+      <w:pPr>
+        <w:ind w:left="1440" w:hanging="360"/>
+      </w:pPr>
+      <w:rPr>
+        <w:rFonts w:ascii="Courier New" w:hAnsi="Courier New" w:hint="default"/>
+      </w:rPr>
+    </w:lvl>
+    <w:lvl w:ilvl="2" w:tplc="51AA5EC8">
+      <w:start w:val="1"/>
+      <w:numFmt w:val="bullet"/>
+      <w:lvlText w:val=""/>
+      <w:lvlJc w:val="left"/>
+      <w:pPr>
+        <w:ind w:left="2160" w:hanging="360"/>
+      </w:pPr>
+      <w:rPr>
+        <w:rFonts w:ascii="Wingdings" w:hAnsi="Wingdings" w:hint="default"/>
+      </w:rPr>
+    </w:lvl>
+    <w:lvl w:ilvl="3" w:tplc="8536E78A">
+      <w:start w:val="1"/>
+      <w:numFmt w:val="bullet"/>
+      <w:lvlText w:val=""/>
+      <w:lvlJc w:val="left"/>
+      <w:pPr>
+        <w:ind w:left="2880" w:hanging="360"/>
+      </w:pPr>
+      <w:rPr>
+        <w:rFonts w:ascii="Symbol" w:hAnsi="Symbol" w:hint="default"/>
+      </w:rPr>
+    </w:lvl>
+    <w:lvl w:ilvl="4" w:tplc="5D4A3F66">
+      <w:start w:val="1"/>
+      <w:numFmt w:val="bullet"/>
+      <w:lvlText w:val="o"/>
+      <w:lvlJc w:val="left"/>
+      <w:pPr>
+        <w:ind w:left="3600" w:hanging="360"/>
+      </w:pPr>
+      <w:rPr>
+        <w:rFonts w:ascii="Courier New" w:hAnsi="Courier New" w:hint="default"/>
+      </w:rPr>
+    </w:lvl>
+    <w:lvl w:ilvl="5" w:tplc="BB0AE6DE">
+      <w:start w:val="1"/>
+      <w:numFmt w:val="bullet"/>
+      <w:lvlText w:val=""/>
+      <w:lvlJc w:val="left"/>
+      <w:pPr>
+        <w:ind w:left="4320" w:hanging="360"/>
+      </w:pPr>
+      <w:rPr>
+        <w:rFonts w:ascii="Wingdings" w:hAnsi="Wingdings" w:hint="default"/>
+      </w:rPr>
+    </w:lvl>
+    <w:lvl w:ilvl="6" w:tplc="96C6C8F0">
+      <w:start w:val="1"/>
+      <w:numFmt w:val="bullet"/>
+      <w:lvlText w:val=""/>
+      <w:lvlJc w:val="left"/>
+      <w:pPr>
+        <w:ind w:left="5040" w:hanging="360"/>
+      </w:pPr>
+      <w:rPr>
+        <w:rFonts w:ascii="Symbol" w:hAnsi="Symbol" w:hint="default"/>
+      </w:rPr>
+    </w:lvl>
+    <w:lvl w:ilvl="7" w:tplc="491ABAD0">
+      <w:start w:val="1"/>
+      <w:numFmt w:val="bullet"/>
+      <w:lvlText w:val="o"/>
+      <w:lvlJc w:val="left"/>
+      <w:pPr>
+        <w:ind w:left="5760" w:hanging="360"/>
+      </w:pPr>
+      <w:rPr>
+        <w:rFonts w:ascii="Courier New" w:hAnsi="Courier New" w:hint="default"/>
+      </w:rPr>
+    </w:lvl>
+    <w:lvl w:ilvl="8" w:tplc="662641F2">
+      <w:start w:val="1"/>
+      <w:numFmt w:val="bullet"/>
+      <w:lvlText w:val=""/>
+      <w:lvlJc w:val="left"/>
+      <w:pPr>
+        <w:ind w:left="6480" w:hanging="360"/>
+      </w:pPr>
+      <w:rPr>
+        <w:rFonts w:ascii="Wingdings" w:hAnsi="Wingdings" w:hint="default"/>
+      </w:rPr>
+    </w:lvl>
+  </w:abstractNum>
+  <w:abstractNum w:abstractNumId="14" w15:restartNumberingAfterBreak="0">
     <w:nsid w:val="42F31A3D"/>
     <w:multiLevelType w:val="hybridMultilevel"/>
     <w:tmpl w:val="E5E62C26"/>
@@ -11198,7 +11802,7 @@
       </w:pPr>
     </w:lvl>
   </w:abstractNum>
-  <w:abstractNum w:abstractNumId="12" w15:restartNumberingAfterBreak="0">
+  <w:abstractNum w:abstractNumId="15" w15:restartNumberingAfterBreak="0">
     <w:nsid w:val="4326538A"/>
     <w:multiLevelType w:val="hybridMultilevel"/>
     <w:tmpl w:val="F61882BA"/>
@@ -11311,7 +11915,7 @@
       </w:rPr>
     </w:lvl>
   </w:abstractNum>
-  <w:abstractNum w:abstractNumId="13" w15:restartNumberingAfterBreak="0">
+  <w:abstractNum w:abstractNumId="16" w15:restartNumberingAfterBreak="0">
     <w:nsid w:val="43777B04"/>
     <w:multiLevelType w:val="hybridMultilevel"/>
     <w:tmpl w:val="4BF0BC1C"/>
@@ -11424,7 +12028,7 @@
       </w:rPr>
     </w:lvl>
   </w:abstractNum>
-  <w:abstractNum w:abstractNumId="14" w15:restartNumberingAfterBreak="0">
+  <w:abstractNum w:abstractNumId="17" w15:restartNumberingAfterBreak="0">
     <w:nsid w:val="51CF4A1D"/>
     <w:multiLevelType w:val="hybridMultilevel"/>
     <w:tmpl w:val="FE328B08"/>
@@ -11537,7 +12141,119 @@
       </w:rPr>
     </w:lvl>
   </w:abstractNum>
-  <w:abstractNum w:abstractNumId="15" w15:restartNumberingAfterBreak="0">
+  <w:abstractNum w:abstractNumId="18" w15:restartNumberingAfterBreak="0">
+    <w:nsid w:val="622F7E77"/>
+    <w:multiLevelType w:val="hybridMultilevel"/>
+    <w:tmpl w:val="E35845CA"/>
+    <w:lvl w:ilvl="0" w:tplc="667AEFB0">
+      <w:numFmt w:val="bullet"/>
+      <w:lvlText w:val="-"/>
+      <w:lvlJc w:val="left"/>
+      <w:pPr>
+        <w:ind w:left="720" w:hanging="360"/>
+      </w:pPr>
+      <w:rPr>
+        <w:rFonts w:ascii="Aptos" w:eastAsia="Lucida Sans Unicode" w:hAnsi="Aptos" w:cs="Times New Roman" w:hint="default"/>
+      </w:rPr>
+    </w:lvl>
+    <w:lvl w:ilvl="1" w:tplc="04100003">
+      <w:start w:val="1"/>
+      <w:numFmt w:val="bullet"/>
+      <w:lvlText w:val="o"/>
+      <w:lvlJc w:val="left"/>
+      <w:pPr>
+        <w:ind w:left="1440" w:hanging="360"/>
+      </w:pPr>
+      <w:rPr>
+        <w:rFonts w:ascii="Courier New" w:hAnsi="Courier New" w:cs="Courier New" w:hint="default"/>
+      </w:rPr>
+    </w:lvl>
+    <w:lvl w:ilvl="2" w:tplc="04100005" w:tentative="1">
+      <w:start w:val="1"/>
+      <w:numFmt w:val="bullet"/>
+      <w:lvlText w:val=""/>
+      <w:lvlJc w:val="left"/>
+      <w:pPr>
+        <w:ind w:left="2160" w:hanging="360"/>
+      </w:pPr>
+      <w:rPr>
+        <w:rFonts w:ascii="Wingdings" w:hAnsi="Wingdings" w:hint="default"/>
+      </w:rPr>
+    </w:lvl>
+    <w:lvl w:ilvl="3" w:tplc="04100001" w:tentative="1">
+      <w:start w:val="1"/>
+      <w:numFmt w:val="bullet"/>
+      <w:lvlText w:val=""/>
+      <w:lvlJc w:val="left"/>
+      <w:pPr>
+        <w:ind w:left="2880" w:hanging="360"/>
+      </w:pPr>
+      <w:rPr>
+        <w:rFonts w:ascii="Symbol" w:hAnsi="Symbol" w:hint="default"/>
+      </w:rPr>
+    </w:lvl>
+    <w:lvl w:ilvl="4" w:tplc="04100003" w:tentative="1">
+      <w:start w:val="1"/>
+      <w:numFmt w:val="bullet"/>
+      <w:lvlText w:val="o"/>
+      <w:lvlJc w:val="left"/>
+      <w:pPr>
+        <w:ind w:left="3600" w:hanging="360"/>
+      </w:pPr>
+      <w:rPr>
+        <w:rFonts w:ascii="Courier New" w:hAnsi="Courier New" w:cs="Courier New" w:hint="default"/>
+      </w:rPr>
+    </w:lvl>
+    <w:lvl w:ilvl="5" w:tplc="04100005" w:tentative="1">
+      <w:start w:val="1"/>
+      <w:numFmt w:val="bullet"/>
+      <w:lvlText w:val=""/>
+      <w:lvlJc w:val="left"/>
+      <w:pPr>
+        <w:ind w:left="4320" w:hanging="360"/>
+      </w:pPr>
+      <w:rPr>
+        <w:rFonts w:ascii="Wingdings" w:hAnsi="Wingdings" w:hint="default"/>
+      </w:rPr>
+    </w:lvl>
+    <w:lvl w:ilvl="6" w:tplc="04100001" w:tentative="1">
+      <w:start w:val="1"/>
+      <w:numFmt w:val="bullet"/>
+      <w:lvlText w:val=""/>
+      <w:lvlJc w:val="left"/>
+      <w:pPr>
+        <w:ind w:left="5040" w:hanging="360"/>
+      </w:pPr>
+      <w:rPr>
+        <w:rFonts w:ascii="Symbol" w:hAnsi="Symbol" w:hint="default"/>
+      </w:rPr>
+    </w:lvl>
+    <w:lvl w:ilvl="7" w:tplc="04100003" w:tentative="1">
+      <w:start w:val="1"/>
+      <w:numFmt w:val="bullet"/>
+      <w:lvlText w:val="o"/>
+      <w:lvlJc w:val="left"/>
+      <w:pPr>
+        <w:ind w:left="5760" w:hanging="360"/>
+      </w:pPr>
+      <w:rPr>
+        <w:rFonts w:ascii="Courier New" w:hAnsi="Courier New" w:cs="Courier New" w:hint="default"/>
+      </w:rPr>
+    </w:lvl>
+    <w:lvl w:ilvl="8" w:tplc="04100005" w:tentative="1">
+      <w:start w:val="1"/>
+      <w:numFmt w:val="bullet"/>
+      <w:lvlText w:val=""/>
+      <w:lvlJc w:val="left"/>
+      <w:pPr>
+        <w:ind w:left="6480" w:hanging="360"/>
+      </w:pPr>
+      <w:rPr>
+        <w:rFonts w:ascii="Wingdings" w:hAnsi="Wingdings" w:hint="default"/>
+      </w:rPr>
+    </w:lvl>
+  </w:abstractNum>
+  <w:abstractNum w:abstractNumId="19" w15:restartNumberingAfterBreak="0">
     <w:nsid w:val="687E0260"/>
     <w:multiLevelType w:val="multilevel"/>
     <w:tmpl w:val="00000001"/>
@@ -11650,7 +12366,120 @@
       </w:pPr>
     </w:lvl>
   </w:abstractNum>
-  <w:abstractNum w:abstractNumId="16" w15:restartNumberingAfterBreak="0">
+  <w:abstractNum w:abstractNumId="20" w15:restartNumberingAfterBreak="0">
+    <w:nsid w:val="6F092528"/>
+    <w:multiLevelType w:val="hybridMultilevel"/>
+    <w:tmpl w:val="7438017E"/>
+    <w:lvl w:ilvl="0" w:tplc="7A8A6F46">
+      <w:start w:val="1"/>
+      <w:numFmt w:val="bullet"/>
+      <w:lvlText w:val=""/>
+      <w:lvlJc w:val="left"/>
+      <w:pPr>
+        <w:ind w:left="720" w:hanging="360"/>
+      </w:pPr>
+      <w:rPr>
+        <w:rFonts w:ascii="Symbol" w:hAnsi="Symbol" w:hint="default"/>
+      </w:rPr>
+    </w:lvl>
+    <w:lvl w:ilvl="1" w:tplc="6EB6D7A6">
+      <w:start w:val="1"/>
+      <w:numFmt w:val="bullet"/>
+      <w:lvlText w:val="o"/>
+      <w:lvlJc w:val="left"/>
+      <w:pPr>
+        <w:ind w:left="1440" w:hanging="360"/>
+      </w:pPr>
+      <w:rPr>
+        <w:rFonts w:ascii="Courier New" w:hAnsi="Courier New" w:hint="default"/>
+      </w:rPr>
+    </w:lvl>
+    <w:lvl w:ilvl="2" w:tplc="8C340AE0">
+      <w:start w:val="1"/>
+      <w:numFmt w:val="bullet"/>
+      <w:lvlText w:val=""/>
+      <w:lvlJc w:val="left"/>
+      <w:pPr>
+        <w:ind w:left="2160" w:hanging="360"/>
+      </w:pPr>
+      <w:rPr>
+        <w:rFonts w:ascii="Wingdings" w:hAnsi="Wingdings" w:hint="default"/>
+      </w:rPr>
+    </w:lvl>
+    <w:lvl w:ilvl="3" w:tplc="A7E0A74E">
+      <w:start w:val="1"/>
+      <w:numFmt w:val="bullet"/>
+      <w:lvlText w:val=""/>
+      <w:lvlJc w:val="left"/>
+      <w:pPr>
+        <w:ind w:left="2880" w:hanging="360"/>
+      </w:pPr>
+      <w:rPr>
+        <w:rFonts w:ascii="Symbol" w:hAnsi="Symbol" w:hint="default"/>
+      </w:rPr>
+    </w:lvl>
+    <w:lvl w:ilvl="4" w:tplc="CCE03782">
+      <w:start w:val="1"/>
+      <w:numFmt w:val="bullet"/>
+      <w:lvlText w:val="o"/>
+      <w:lvlJc w:val="left"/>
+      <w:pPr>
+        <w:ind w:left="3600" w:hanging="360"/>
+      </w:pPr>
+      <w:rPr>
+        <w:rFonts w:ascii="Courier New" w:hAnsi="Courier New" w:hint="default"/>
+      </w:rPr>
+    </w:lvl>
+    <w:lvl w:ilvl="5" w:tplc="F7204C88">
+      <w:start w:val="1"/>
+      <w:numFmt w:val="bullet"/>
+      <w:lvlText w:val=""/>
+      <w:lvlJc w:val="left"/>
+      <w:pPr>
+        <w:ind w:left="4320" w:hanging="360"/>
+      </w:pPr>
+      <w:rPr>
+        <w:rFonts w:ascii="Wingdings" w:hAnsi="Wingdings" w:hint="default"/>
+      </w:rPr>
+    </w:lvl>
+    <w:lvl w:ilvl="6" w:tplc="85E05ACA">
+      <w:start w:val="1"/>
+      <w:numFmt w:val="bullet"/>
+      <w:lvlText w:val=""/>
+      <w:lvlJc w:val="left"/>
+      <w:pPr>
+        <w:ind w:left="5040" w:hanging="360"/>
+      </w:pPr>
+      <w:rPr>
+        <w:rFonts w:ascii="Symbol" w:hAnsi="Symbol" w:hint="default"/>
+      </w:rPr>
+    </w:lvl>
+    <w:lvl w:ilvl="7" w:tplc="768C7638">
+      <w:start w:val="1"/>
+      <w:numFmt w:val="bullet"/>
+      <w:lvlText w:val="o"/>
+      <w:lvlJc w:val="left"/>
+      <w:pPr>
+        <w:ind w:left="5760" w:hanging="360"/>
+      </w:pPr>
+      <w:rPr>
+        <w:rFonts w:ascii="Courier New" w:hAnsi="Courier New" w:hint="default"/>
+      </w:rPr>
+    </w:lvl>
+    <w:lvl w:ilvl="8" w:tplc="A13C2AE2">
+      <w:start w:val="1"/>
+      <w:numFmt w:val="bullet"/>
+      <w:lvlText w:val=""/>
+      <w:lvlJc w:val="left"/>
+      <w:pPr>
+        <w:ind w:left="6480" w:hanging="360"/>
+      </w:pPr>
+      <w:rPr>
+        <w:rFonts w:ascii="Wingdings" w:hAnsi="Wingdings" w:hint="default"/>
+      </w:rPr>
+    </w:lvl>
+  </w:abstractNum>
+  <w:abstractNum w:abstractNumId="21" w15:restartNumberingAfterBreak="0">
     <w:nsid w:val="713D7D7D"/>
     <w:multiLevelType w:val="multilevel"/>
     <w:tmpl w:val="F7CA9550"/>
@@ -11763,7 +12592,7 @@
       </w:rPr>
     </w:lvl>
   </w:abstractNum>
-  <w:abstractNum w:abstractNumId="17" w15:restartNumberingAfterBreak="0">
+  <w:abstractNum w:abstractNumId="22" w15:restartNumberingAfterBreak="0">
     <w:nsid w:val="71441995"/>
     <w:multiLevelType w:val="hybridMultilevel"/>
     <w:tmpl w:val="405ECE3C"/>
@@ -11876,7 +12705,7 @@
       </w:rPr>
     </w:lvl>
   </w:abstractNum>
-  <w:abstractNum w:abstractNumId="18" w15:restartNumberingAfterBreak="0">
+  <w:abstractNum w:abstractNumId="23" w15:restartNumberingAfterBreak="0">
     <w:nsid w:val="72B730B0"/>
     <w:multiLevelType w:val="hybridMultilevel"/>
     <w:tmpl w:val="37FAF5E2"/>
@@ -11989,7 +12818,7 @@
       </w:rPr>
     </w:lvl>
   </w:abstractNum>
-  <w:abstractNum w:abstractNumId="19" w15:restartNumberingAfterBreak="0">
+  <w:abstractNum w:abstractNumId="24" w15:restartNumberingAfterBreak="0">
     <w:nsid w:val="74EB3573"/>
     <w:multiLevelType w:val="hybridMultilevel"/>
     <w:tmpl w:val="98FEEC68"/>
@@ -12118,19 +12947,19 @@
     <w:abstractNumId w:val="4"/>
   </w:num>
   <w:num w:numId="6" w16cid:durableId="644049740">
-    <w:abstractNumId w:val="11"/>
+    <w:abstractNumId w:val="14"/>
   </w:num>
   <w:num w:numId="7" w16cid:durableId="450395602">
-    <w:abstractNumId w:val="15"/>
+    <w:abstractNumId w:val="19"/>
   </w:num>
   <w:num w:numId="8" w16cid:durableId="1000691270">
-    <w:abstractNumId w:val="7"/>
+    <w:abstractNumId w:val="9"/>
   </w:num>
   <w:num w:numId="9" w16cid:durableId="2053074979">
-    <w:abstractNumId w:val="7"/>
+    <w:abstractNumId w:val="9"/>
   </w:num>
   <w:num w:numId="10" w16cid:durableId="86117276">
-    <w:abstractNumId w:val="7"/>
+    <w:abstractNumId w:val="9"/>
     <w:lvlOverride w:ilvl="0">
       <w:startOverride w:val="1"/>
     </w:lvlOverride>
@@ -12160,7 +12989,7 @@
     </w:lvlOverride>
   </w:num>
   <w:num w:numId="11" w16cid:durableId="1149709085">
-    <w:abstractNumId w:val="7"/>
+    <w:abstractNumId w:val="9"/>
     <w:lvlOverride w:ilvl="0">
       <w:startOverride w:val="1"/>
     </w:lvlOverride>
@@ -12190,7 +13019,7 @@
     </w:lvlOverride>
   </w:num>
   <w:num w:numId="12" w16cid:durableId="1987397777">
-    <w:abstractNumId w:val="7"/>
+    <w:abstractNumId w:val="9"/>
     <w:lvlOverride w:ilvl="0">
       <w:startOverride w:val="1"/>
     </w:lvlOverride>
@@ -12220,7 +13049,7 @@
     </w:lvlOverride>
   </w:num>
   <w:num w:numId="13" w16cid:durableId="318927073">
-    <w:abstractNumId w:val="7"/>
+    <w:abstractNumId w:val="9"/>
     <w:lvlOverride w:ilvl="0">
       <w:startOverride w:val="1"/>
     </w:lvlOverride>
@@ -12250,490 +13079,505 @@
     </w:lvlOverride>
   </w:num>
   <w:num w:numId="14" w16cid:durableId="1885092400">
-    <w:abstractNumId w:val="16"/>
+    <w:abstractNumId w:val="21"/>
   </w:num>
   <w:num w:numId="15" w16cid:durableId="397754505">
     <w:abstractNumId w:val="5"/>
   </w:num>
   <w:num w:numId="16" w16cid:durableId="3366956">
-    <w:abstractNumId w:val="12"/>
+    <w:abstractNumId w:val="15"/>
   </w:num>
   <w:num w:numId="17" w16cid:durableId="1025404040">
-    <w:abstractNumId w:val="18"/>
+    <w:abstractNumId w:val="23"/>
   </w:num>
   <w:num w:numId="18" w16cid:durableId="1925920229">
-    <w:abstractNumId w:val="14"/>
+    <w:abstractNumId w:val="17"/>
   </w:num>
   <w:num w:numId="19" w16cid:durableId="1861357117">
-    <w:abstractNumId w:val="19"/>
+    <w:abstractNumId w:val="24"/>
   </w:num>
   <w:num w:numId="20" w16cid:durableId="1690836257">
-    <w:abstractNumId w:val="9"/>
+    <w:abstractNumId w:val="11"/>
   </w:num>
   <w:num w:numId="21" w16cid:durableId="1675643415">
-    <w:abstractNumId w:val="8"/>
+    <w:abstractNumId w:val="10"/>
   </w:num>
   <w:num w:numId="22" w16cid:durableId="1180005907">
     <w:abstractNumId w:val="6"/>
   </w:num>
   <w:num w:numId="23" w16cid:durableId="315652025">
+    <w:abstractNumId w:val="16"/>
+  </w:num>
+  <w:num w:numId="24" w16cid:durableId="1210150553">
+    <w:abstractNumId w:val="9"/>
+    <w:lvlOverride w:ilvl="0">
+      <w:startOverride w:val="1"/>
+    </w:lvlOverride>
+    <w:lvlOverride w:ilvl="1">
+      <w:startOverride w:val="1"/>
+    </w:lvlOverride>
+    <w:lvlOverride w:ilvl="2">
+      <w:startOverride w:val="1"/>
+    </w:lvlOverride>
+    <w:lvlOverride w:ilvl="3">
+      <w:startOverride w:val="1"/>
+    </w:lvlOverride>
+    <w:lvlOverride w:ilvl="4">
+      <w:startOverride w:val="1"/>
+    </w:lvlOverride>
+    <w:lvlOverride w:ilvl="5">
+      <w:startOverride w:val="1"/>
+    </w:lvlOverride>
+    <w:lvlOverride w:ilvl="6">
+      <w:startOverride w:val="1"/>
+    </w:lvlOverride>
+    <w:lvlOverride w:ilvl="7">
+      <w:startOverride w:val="1"/>
+    </w:lvlOverride>
+    <w:lvlOverride w:ilvl="8">
+      <w:startOverride w:val="1"/>
+    </w:lvlOverride>
+  </w:num>
+  <w:num w:numId="25" w16cid:durableId="1680236930">
+    <w:abstractNumId w:val="22"/>
+  </w:num>
+  <w:num w:numId="26" w16cid:durableId="1546260881">
+    <w:abstractNumId w:val="9"/>
+    <w:lvlOverride w:ilvl="0">
+      <w:startOverride w:val="1"/>
+    </w:lvlOverride>
+    <w:lvlOverride w:ilvl="1">
+      <w:startOverride w:val="1"/>
+    </w:lvlOverride>
+    <w:lvlOverride w:ilvl="2">
+      <w:startOverride w:val="1"/>
+    </w:lvlOverride>
+    <w:lvlOverride w:ilvl="3">
+      <w:startOverride w:val="1"/>
+    </w:lvlOverride>
+    <w:lvlOverride w:ilvl="4">
+      <w:startOverride w:val="1"/>
+    </w:lvlOverride>
+    <w:lvlOverride w:ilvl="5">
+      <w:startOverride w:val="1"/>
+    </w:lvlOverride>
+    <w:lvlOverride w:ilvl="6">
+      <w:startOverride w:val="1"/>
+    </w:lvlOverride>
+    <w:lvlOverride w:ilvl="7">
+      <w:startOverride w:val="1"/>
+    </w:lvlOverride>
+    <w:lvlOverride w:ilvl="8">
+      <w:startOverride w:val="1"/>
+    </w:lvlOverride>
+  </w:num>
+  <w:num w:numId="27" w16cid:durableId="1045256068">
+    <w:abstractNumId w:val="9"/>
+    <w:lvlOverride w:ilvl="0">
+      <w:startOverride w:val="1"/>
+    </w:lvlOverride>
+    <w:lvlOverride w:ilvl="1">
+      <w:startOverride w:val="1"/>
+    </w:lvlOverride>
+    <w:lvlOverride w:ilvl="2">
+      <w:startOverride w:val="1"/>
+    </w:lvlOverride>
+    <w:lvlOverride w:ilvl="3">
+      <w:startOverride w:val="1"/>
+    </w:lvlOverride>
+    <w:lvlOverride w:ilvl="4">
+      <w:startOverride w:val="1"/>
+    </w:lvlOverride>
+    <w:lvlOverride w:ilvl="5">
+      <w:startOverride w:val="1"/>
+    </w:lvlOverride>
+    <w:lvlOverride w:ilvl="6">
+      <w:startOverride w:val="1"/>
+    </w:lvlOverride>
+    <w:lvlOverride w:ilvl="7">
+      <w:startOverride w:val="1"/>
+    </w:lvlOverride>
+    <w:lvlOverride w:ilvl="8">
+      <w:startOverride w:val="1"/>
+    </w:lvlOverride>
+  </w:num>
+  <w:num w:numId="28" w16cid:durableId="202596421">
+    <w:abstractNumId w:val="9"/>
+    <w:lvlOverride w:ilvl="0">
+      <w:startOverride w:val="1"/>
+    </w:lvlOverride>
+    <w:lvlOverride w:ilvl="1">
+      <w:startOverride w:val="1"/>
+    </w:lvlOverride>
+    <w:lvlOverride w:ilvl="2">
+      <w:startOverride w:val="1"/>
+    </w:lvlOverride>
+    <w:lvlOverride w:ilvl="3">
+      <w:startOverride w:val="1"/>
+    </w:lvlOverride>
+    <w:lvlOverride w:ilvl="4">
+      <w:startOverride w:val="1"/>
+    </w:lvlOverride>
+    <w:lvlOverride w:ilvl="5">
+      <w:startOverride w:val="1"/>
+    </w:lvlOverride>
+    <w:lvlOverride w:ilvl="6">
+      <w:startOverride w:val="1"/>
+    </w:lvlOverride>
+    <w:lvlOverride w:ilvl="7">
+      <w:startOverride w:val="1"/>
+    </w:lvlOverride>
+    <w:lvlOverride w:ilvl="8">
+      <w:startOverride w:val="1"/>
+    </w:lvlOverride>
+  </w:num>
+  <w:num w:numId="29" w16cid:durableId="255676987">
+    <w:abstractNumId w:val="9"/>
+    <w:lvlOverride w:ilvl="0">
+      <w:startOverride w:val="1"/>
+    </w:lvlOverride>
+    <w:lvlOverride w:ilvl="1">
+      <w:startOverride w:val="1"/>
+    </w:lvlOverride>
+    <w:lvlOverride w:ilvl="2">
+      <w:startOverride w:val="1"/>
+    </w:lvlOverride>
+    <w:lvlOverride w:ilvl="3">
+      <w:startOverride w:val="1"/>
+    </w:lvlOverride>
+    <w:lvlOverride w:ilvl="4">
+      <w:startOverride w:val="1"/>
+    </w:lvlOverride>
+    <w:lvlOverride w:ilvl="5">
+      <w:startOverride w:val="1"/>
+    </w:lvlOverride>
+    <w:lvlOverride w:ilvl="6">
+      <w:startOverride w:val="1"/>
+    </w:lvlOverride>
+    <w:lvlOverride w:ilvl="7">
+      <w:startOverride w:val="1"/>
+    </w:lvlOverride>
+    <w:lvlOverride w:ilvl="8">
+      <w:startOverride w:val="1"/>
+    </w:lvlOverride>
+  </w:num>
+  <w:num w:numId="30" w16cid:durableId="1867939323">
+    <w:abstractNumId w:val="9"/>
+    <w:lvlOverride w:ilvl="0">
+      <w:startOverride w:val="1"/>
+    </w:lvlOverride>
+    <w:lvlOverride w:ilvl="1">
+      <w:startOverride w:val="1"/>
+    </w:lvlOverride>
+    <w:lvlOverride w:ilvl="2">
+      <w:startOverride w:val="1"/>
+    </w:lvlOverride>
+    <w:lvlOverride w:ilvl="3">
+      <w:startOverride w:val="1"/>
+    </w:lvlOverride>
+    <w:lvlOverride w:ilvl="4">
+      <w:startOverride w:val="1"/>
+    </w:lvlOverride>
+    <w:lvlOverride w:ilvl="5">
+      <w:startOverride w:val="1"/>
+    </w:lvlOverride>
+    <w:lvlOverride w:ilvl="6">
+      <w:startOverride w:val="1"/>
+    </w:lvlOverride>
+    <w:lvlOverride w:ilvl="7">
+      <w:startOverride w:val="1"/>
+    </w:lvlOverride>
+    <w:lvlOverride w:ilvl="8">
+      <w:startOverride w:val="1"/>
+    </w:lvlOverride>
+  </w:num>
+  <w:num w:numId="31" w16cid:durableId="1857304302">
+    <w:abstractNumId w:val="9"/>
+    <w:lvlOverride w:ilvl="0">
+      <w:startOverride w:val="1"/>
+    </w:lvlOverride>
+    <w:lvlOverride w:ilvl="1">
+      <w:startOverride w:val="1"/>
+    </w:lvlOverride>
+    <w:lvlOverride w:ilvl="2">
+      <w:startOverride w:val="1"/>
+    </w:lvlOverride>
+    <w:lvlOverride w:ilvl="3">
+      <w:startOverride w:val="1"/>
+    </w:lvlOverride>
+    <w:lvlOverride w:ilvl="4">
+      <w:startOverride w:val="1"/>
+    </w:lvlOverride>
+    <w:lvlOverride w:ilvl="5">
+      <w:startOverride w:val="1"/>
+    </w:lvlOverride>
+    <w:lvlOverride w:ilvl="6">
+      <w:startOverride w:val="1"/>
+    </w:lvlOverride>
+    <w:lvlOverride w:ilvl="7">
+      <w:startOverride w:val="1"/>
+    </w:lvlOverride>
+    <w:lvlOverride w:ilvl="8">
+      <w:startOverride w:val="1"/>
+    </w:lvlOverride>
+  </w:num>
+  <w:num w:numId="32" w16cid:durableId="900870276">
+    <w:abstractNumId w:val="9"/>
+    <w:lvlOverride w:ilvl="0">
+      <w:startOverride w:val="1"/>
+    </w:lvlOverride>
+    <w:lvlOverride w:ilvl="1">
+      <w:startOverride w:val="1"/>
+    </w:lvlOverride>
+    <w:lvlOverride w:ilvl="2">
+      <w:startOverride w:val="1"/>
+    </w:lvlOverride>
+    <w:lvlOverride w:ilvl="3">
+      <w:startOverride w:val="1"/>
+    </w:lvlOverride>
+    <w:lvlOverride w:ilvl="4">
+      <w:startOverride w:val="1"/>
+    </w:lvlOverride>
+    <w:lvlOverride w:ilvl="5">
+      <w:startOverride w:val="1"/>
+    </w:lvlOverride>
+    <w:lvlOverride w:ilvl="6">
+      <w:startOverride w:val="1"/>
+    </w:lvlOverride>
+    <w:lvlOverride w:ilvl="7">
+      <w:startOverride w:val="1"/>
+    </w:lvlOverride>
+    <w:lvlOverride w:ilvl="8">
+      <w:startOverride w:val="1"/>
+    </w:lvlOverride>
+  </w:num>
+  <w:num w:numId="33" w16cid:durableId="1786119725">
+    <w:abstractNumId w:val="12"/>
+  </w:num>
+  <w:num w:numId="34" w16cid:durableId="1984967045">
+    <w:abstractNumId w:val="9"/>
+    <w:lvlOverride w:ilvl="0">
+      <w:startOverride w:val="1"/>
+    </w:lvlOverride>
+    <w:lvlOverride w:ilvl="1">
+      <w:startOverride w:val="1"/>
+    </w:lvlOverride>
+    <w:lvlOverride w:ilvl="2">
+      <w:startOverride w:val="1"/>
+    </w:lvlOverride>
+    <w:lvlOverride w:ilvl="3">
+      <w:startOverride w:val="1"/>
+    </w:lvlOverride>
+    <w:lvlOverride w:ilvl="4">
+      <w:startOverride w:val="1"/>
+    </w:lvlOverride>
+    <w:lvlOverride w:ilvl="5">
+      <w:startOverride w:val="1"/>
+    </w:lvlOverride>
+    <w:lvlOverride w:ilvl="6">
+      <w:startOverride w:val="1"/>
+    </w:lvlOverride>
+    <w:lvlOverride w:ilvl="7">
+      <w:startOverride w:val="1"/>
+    </w:lvlOverride>
+    <w:lvlOverride w:ilvl="8">
+      <w:startOverride w:val="1"/>
+    </w:lvlOverride>
+  </w:num>
+  <w:num w:numId="35" w16cid:durableId="1095322771">
+    <w:abstractNumId w:val="9"/>
+    <w:lvlOverride w:ilvl="0">
+      <w:startOverride w:val="1"/>
+    </w:lvlOverride>
+    <w:lvlOverride w:ilvl="1">
+      <w:startOverride w:val="1"/>
+    </w:lvlOverride>
+    <w:lvlOverride w:ilvl="2">
+      <w:startOverride w:val="1"/>
+    </w:lvlOverride>
+    <w:lvlOverride w:ilvl="3">
+      <w:startOverride w:val="1"/>
+    </w:lvlOverride>
+    <w:lvlOverride w:ilvl="4">
+      <w:startOverride w:val="1"/>
+    </w:lvlOverride>
+    <w:lvlOverride w:ilvl="5">
+      <w:startOverride w:val="1"/>
+    </w:lvlOverride>
+    <w:lvlOverride w:ilvl="6">
+      <w:startOverride w:val="1"/>
+    </w:lvlOverride>
+    <w:lvlOverride w:ilvl="7">
+      <w:startOverride w:val="1"/>
+    </w:lvlOverride>
+    <w:lvlOverride w:ilvl="8">
+      <w:startOverride w:val="1"/>
+    </w:lvlOverride>
+  </w:num>
+  <w:num w:numId="36" w16cid:durableId="1844852213">
+    <w:abstractNumId w:val="9"/>
+    <w:lvlOverride w:ilvl="0">
+      <w:startOverride w:val="1"/>
+    </w:lvlOverride>
+    <w:lvlOverride w:ilvl="1">
+      <w:startOverride w:val="1"/>
+    </w:lvlOverride>
+    <w:lvlOverride w:ilvl="2">
+      <w:startOverride w:val="1"/>
+    </w:lvlOverride>
+    <w:lvlOverride w:ilvl="3">
+      <w:startOverride w:val="1"/>
+    </w:lvlOverride>
+    <w:lvlOverride w:ilvl="4">
+      <w:startOverride w:val="1"/>
+    </w:lvlOverride>
+    <w:lvlOverride w:ilvl="5">
+      <w:startOverride w:val="1"/>
+    </w:lvlOverride>
+    <w:lvlOverride w:ilvl="6">
+      <w:startOverride w:val="1"/>
+    </w:lvlOverride>
+    <w:lvlOverride w:ilvl="7">
+      <w:startOverride w:val="1"/>
+    </w:lvlOverride>
+    <w:lvlOverride w:ilvl="8">
+      <w:startOverride w:val="1"/>
+    </w:lvlOverride>
+  </w:num>
+  <w:num w:numId="37" w16cid:durableId="1391685008">
+    <w:abstractNumId w:val="9"/>
+    <w:lvlOverride w:ilvl="0">
+      <w:startOverride w:val="1"/>
+    </w:lvlOverride>
+    <w:lvlOverride w:ilvl="1">
+      <w:startOverride w:val="1"/>
+    </w:lvlOverride>
+    <w:lvlOverride w:ilvl="2">
+      <w:startOverride w:val="1"/>
+    </w:lvlOverride>
+    <w:lvlOverride w:ilvl="3">
+      <w:startOverride w:val="1"/>
+    </w:lvlOverride>
+    <w:lvlOverride w:ilvl="4">
+      <w:startOverride w:val="1"/>
+    </w:lvlOverride>
+    <w:lvlOverride w:ilvl="5">
+      <w:startOverride w:val="1"/>
+    </w:lvlOverride>
+    <w:lvlOverride w:ilvl="6">
+      <w:startOverride w:val="1"/>
+    </w:lvlOverride>
+    <w:lvlOverride w:ilvl="7">
+      <w:startOverride w:val="1"/>
+    </w:lvlOverride>
+    <w:lvlOverride w:ilvl="8">
+      <w:startOverride w:val="1"/>
+    </w:lvlOverride>
+  </w:num>
+  <w:num w:numId="38" w16cid:durableId="1419904528">
+    <w:abstractNumId w:val="9"/>
+    <w:lvlOverride w:ilvl="0">
+      <w:startOverride w:val="1"/>
+    </w:lvlOverride>
+    <w:lvlOverride w:ilvl="1">
+      <w:startOverride w:val="1"/>
+    </w:lvlOverride>
+    <w:lvlOverride w:ilvl="2">
+      <w:startOverride w:val="1"/>
+    </w:lvlOverride>
+    <w:lvlOverride w:ilvl="3">
+      <w:startOverride w:val="1"/>
+    </w:lvlOverride>
+    <w:lvlOverride w:ilvl="4">
+      <w:startOverride w:val="1"/>
+    </w:lvlOverride>
+    <w:lvlOverride w:ilvl="5">
+      <w:startOverride w:val="1"/>
+    </w:lvlOverride>
+    <w:lvlOverride w:ilvl="6">
+      <w:startOverride w:val="1"/>
+    </w:lvlOverride>
+    <w:lvlOverride w:ilvl="7">
+      <w:startOverride w:val="1"/>
+    </w:lvlOverride>
+    <w:lvlOverride w:ilvl="8">
+      <w:startOverride w:val="1"/>
+    </w:lvlOverride>
+  </w:num>
+  <w:num w:numId="39" w16cid:durableId="411464407">
+    <w:abstractNumId w:val="9"/>
+    <w:lvlOverride w:ilvl="0">
+      <w:startOverride w:val="1"/>
+    </w:lvlOverride>
+    <w:lvlOverride w:ilvl="1">
+      <w:startOverride w:val="1"/>
+    </w:lvlOverride>
+    <w:lvlOverride w:ilvl="2">
+      <w:startOverride w:val="1"/>
+    </w:lvlOverride>
+    <w:lvlOverride w:ilvl="3">
+      <w:startOverride w:val="1"/>
+    </w:lvlOverride>
+    <w:lvlOverride w:ilvl="4">
+      <w:startOverride w:val="1"/>
+    </w:lvlOverride>
+    <w:lvlOverride w:ilvl="5">
+      <w:startOverride w:val="1"/>
+    </w:lvlOverride>
+    <w:lvlOverride w:ilvl="6">
+      <w:startOverride w:val="1"/>
+    </w:lvlOverride>
+    <w:lvlOverride w:ilvl="7">
+      <w:startOverride w:val="1"/>
+    </w:lvlOverride>
+    <w:lvlOverride w:ilvl="8">
+      <w:startOverride w:val="1"/>
+    </w:lvlOverride>
+  </w:num>
+  <w:num w:numId="40" w16cid:durableId="1515654663">
+    <w:abstractNumId w:val="9"/>
+    <w:lvlOverride w:ilvl="0">
+      <w:startOverride w:val="1"/>
+    </w:lvlOverride>
+    <w:lvlOverride w:ilvl="1">
+      <w:startOverride w:val="1"/>
+    </w:lvlOverride>
+    <w:lvlOverride w:ilvl="2">
+      <w:startOverride w:val="1"/>
+    </w:lvlOverride>
+    <w:lvlOverride w:ilvl="3">
+      <w:startOverride w:val="1"/>
+    </w:lvlOverride>
+    <w:lvlOverride w:ilvl="4">
+      <w:startOverride w:val="1"/>
+    </w:lvlOverride>
+    <w:lvlOverride w:ilvl="5">
+      <w:startOverride w:val="1"/>
+    </w:lvlOverride>
+    <w:lvlOverride w:ilvl="6">
+      <w:startOverride w:val="1"/>
+    </w:lvlOverride>
+    <w:lvlOverride w:ilvl="7">
+      <w:startOverride w:val="1"/>
+    </w:lvlOverride>
+    <w:lvlOverride w:ilvl="8">
+      <w:startOverride w:val="1"/>
+    </w:lvlOverride>
+  </w:num>
+  <w:num w:numId="41" w16cid:durableId="1735929182">
+    <w:abstractNumId w:val="7"/>
+  </w:num>
+  <w:num w:numId="42" w16cid:durableId="941641874">
     <w:abstractNumId w:val="13"/>
   </w:num>
-  <w:num w:numId="24" w16cid:durableId="1210150553">
-    <w:abstractNumId w:val="7"/>
-    <w:lvlOverride w:ilvl="0">
-      <w:startOverride w:val="1"/>
-    </w:lvlOverride>
-    <w:lvlOverride w:ilvl="1">
-      <w:startOverride w:val="1"/>
-    </w:lvlOverride>
-    <w:lvlOverride w:ilvl="2">
-      <w:startOverride w:val="1"/>
-    </w:lvlOverride>
-    <w:lvlOverride w:ilvl="3">
-      <w:startOverride w:val="1"/>
-    </w:lvlOverride>
-    <w:lvlOverride w:ilvl="4">
-      <w:startOverride w:val="1"/>
-    </w:lvlOverride>
-    <w:lvlOverride w:ilvl="5">
-      <w:startOverride w:val="1"/>
-    </w:lvlOverride>
-    <w:lvlOverride w:ilvl="6">
-      <w:startOverride w:val="1"/>
-    </w:lvlOverride>
-    <w:lvlOverride w:ilvl="7">
-      <w:startOverride w:val="1"/>
-    </w:lvlOverride>
-    <w:lvlOverride w:ilvl="8">
-      <w:startOverride w:val="1"/>
-    </w:lvlOverride>
+  <w:num w:numId="43" w16cid:durableId="1327005597">
+    <w:abstractNumId w:val="8"/>
   </w:num>
-  <w:num w:numId="25" w16cid:durableId="1680236930">
-    <w:abstractNumId w:val="17"/>
+  <w:num w:numId="44" w16cid:durableId="1176534514">
+    <w:abstractNumId w:val="20"/>
   </w:num>
-  <w:num w:numId="26" w16cid:durableId="1546260881">
-    <w:abstractNumId w:val="7"/>
-    <w:lvlOverride w:ilvl="0">
-      <w:startOverride w:val="1"/>
-    </w:lvlOverride>
-    <w:lvlOverride w:ilvl="1">
-      <w:startOverride w:val="1"/>
-    </w:lvlOverride>
-    <w:lvlOverride w:ilvl="2">
-      <w:startOverride w:val="1"/>
-    </w:lvlOverride>
-    <w:lvlOverride w:ilvl="3">
-      <w:startOverride w:val="1"/>
-    </w:lvlOverride>
-    <w:lvlOverride w:ilvl="4">
-      <w:startOverride w:val="1"/>
-    </w:lvlOverride>
-    <w:lvlOverride w:ilvl="5">
-      <w:startOverride w:val="1"/>
-    </w:lvlOverride>
-    <w:lvlOverride w:ilvl="6">
-      <w:startOverride w:val="1"/>
-    </w:lvlOverride>
-    <w:lvlOverride w:ilvl="7">
-      <w:startOverride w:val="1"/>
-    </w:lvlOverride>
-    <w:lvlOverride w:ilvl="8">
-      <w:startOverride w:val="1"/>
-    </w:lvlOverride>
-  </w:num>
-  <w:num w:numId="27" w16cid:durableId="1045256068">
-    <w:abstractNumId w:val="7"/>
-    <w:lvlOverride w:ilvl="0">
-      <w:startOverride w:val="1"/>
-    </w:lvlOverride>
-    <w:lvlOverride w:ilvl="1">
-      <w:startOverride w:val="1"/>
-    </w:lvlOverride>
-    <w:lvlOverride w:ilvl="2">
-      <w:startOverride w:val="1"/>
-    </w:lvlOverride>
-    <w:lvlOverride w:ilvl="3">
-      <w:startOverride w:val="1"/>
-    </w:lvlOverride>
-    <w:lvlOverride w:ilvl="4">
-      <w:startOverride w:val="1"/>
-    </w:lvlOverride>
-    <w:lvlOverride w:ilvl="5">
-      <w:startOverride w:val="1"/>
-    </w:lvlOverride>
-    <w:lvlOverride w:ilvl="6">
-      <w:startOverride w:val="1"/>
-    </w:lvlOverride>
-    <w:lvlOverride w:ilvl="7">
-      <w:startOverride w:val="1"/>
-    </w:lvlOverride>
-    <w:lvlOverride w:ilvl="8">
-      <w:startOverride w:val="1"/>
-    </w:lvlOverride>
-  </w:num>
-  <w:num w:numId="28" w16cid:durableId="202596421">
-    <w:abstractNumId w:val="7"/>
-    <w:lvlOverride w:ilvl="0">
-      <w:startOverride w:val="1"/>
-    </w:lvlOverride>
-    <w:lvlOverride w:ilvl="1">
-      <w:startOverride w:val="1"/>
-    </w:lvlOverride>
-    <w:lvlOverride w:ilvl="2">
-      <w:startOverride w:val="1"/>
-    </w:lvlOverride>
-    <w:lvlOverride w:ilvl="3">
-      <w:startOverride w:val="1"/>
-    </w:lvlOverride>
-    <w:lvlOverride w:ilvl="4">
-      <w:startOverride w:val="1"/>
-    </w:lvlOverride>
-    <w:lvlOverride w:ilvl="5">
-      <w:startOverride w:val="1"/>
-    </w:lvlOverride>
-    <w:lvlOverride w:ilvl="6">
-      <w:startOverride w:val="1"/>
-    </w:lvlOverride>
-    <w:lvlOverride w:ilvl="7">
-      <w:startOverride w:val="1"/>
-    </w:lvlOverride>
-    <w:lvlOverride w:ilvl="8">
-      <w:startOverride w:val="1"/>
-    </w:lvlOverride>
-  </w:num>
-  <w:num w:numId="29" w16cid:durableId="255676987">
-    <w:abstractNumId w:val="7"/>
-    <w:lvlOverride w:ilvl="0">
-      <w:startOverride w:val="1"/>
-    </w:lvlOverride>
-    <w:lvlOverride w:ilvl="1">
-      <w:startOverride w:val="1"/>
-    </w:lvlOverride>
-    <w:lvlOverride w:ilvl="2">
-      <w:startOverride w:val="1"/>
-    </w:lvlOverride>
-    <w:lvlOverride w:ilvl="3">
-      <w:startOverride w:val="1"/>
-    </w:lvlOverride>
-    <w:lvlOverride w:ilvl="4">
-      <w:startOverride w:val="1"/>
-    </w:lvlOverride>
-    <w:lvlOverride w:ilvl="5">
-      <w:startOverride w:val="1"/>
-    </w:lvlOverride>
-    <w:lvlOverride w:ilvl="6">
-      <w:startOverride w:val="1"/>
-    </w:lvlOverride>
-    <w:lvlOverride w:ilvl="7">
-      <w:startOverride w:val="1"/>
-    </w:lvlOverride>
-    <w:lvlOverride w:ilvl="8">
-      <w:startOverride w:val="1"/>
-    </w:lvlOverride>
-  </w:num>
-  <w:num w:numId="30" w16cid:durableId="1867939323">
-    <w:abstractNumId w:val="7"/>
-    <w:lvlOverride w:ilvl="0">
-      <w:startOverride w:val="1"/>
-    </w:lvlOverride>
-    <w:lvlOverride w:ilvl="1">
-      <w:startOverride w:val="1"/>
-    </w:lvlOverride>
-    <w:lvlOverride w:ilvl="2">
-      <w:startOverride w:val="1"/>
-    </w:lvlOverride>
-    <w:lvlOverride w:ilvl="3">
-      <w:startOverride w:val="1"/>
-    </w:lvlOverride>
-    <w:lvlOverride w:ilvl="4">
-      <w:startOverride w:val="1"/>
-    </w:lvlOverride>
-    <w:lvlOverride w:ilvl="5">
-      <w:startOverride w:val="1"/>
-    </w:lvlOverride>
-    <w:lvlOverride w:ilvl="6">
-      <w:startOverride w:val="1"/>
-    </w:lvlOverride>
-    <w:lvlOverride w:ilvl="7">
-      <w:startOverride w:val="1"/>
-    </w:lvlOverride>
-    <w:lvlOverride w:ilvl="8">
-      <w:startOverride w:val="1"/>
-    </w:lvlOverride>
-  </w:num>
-  <w:num w:numId="31" w16cid:durableId="1857304302">
-    <w:abstractNumId w:val="7"/>
-    <w:lvlOverride w:ilvl="0">
-      <w:startOverride w:val="1"/>
-    </w:lvlOverride>
-    <w:lvlOverride w:ilvl="1">
-      <w:startOverride w:val="1"/>
-    </w:lvlOverride>
-    <w:lvlOverride w:ilvl="2">
-      <w:startOverride w:val="1"/>
-    </w:lvlOverride>
-    <w:lvlOverride w:ilvl="3">
-      <w:startOverride w:val="1"/>
-    </w:lvlOverride>
-    <w:lvlOverride w:ilvl="4">
-      <w:startOverride w:val="1"/>
-    </w:lvlOverride>
-    <w:lvlOverride w:ilvl="5">
-      <w:startOverride w:val="1"/>
-    </w:lvlOverride>
-    <w:lvlOverride w:ilvl="6">
-      <w:startOverride w:val="1"/>
-    </w:lvlOverride>
-    <w:lvlOverride w:ilvl="7">
-      <w:startOverride w:val="1"/>
-    </w:lvlOverride>
-    <w:lvlOverride w:ilvl="8">
-      <w:startOverride w:val="1"/>
-    </w:lvlOverride>
-  </w:num>
-  <w:num w:numId="32" w16cid:durableId="900870276">
-    <w:abstractNumId w:val="7"/>
-    <w:lvlOverride w:ilvl="0">
-      <w:startOverride w:val="1"/>
-    </w:lvlOverride>
-    <w:lvlOverride w:ilvl="1">
-      <w:startOverride w:val="1"/>
-    </w:lvlOverride>
-    <w:lvlOverride w:ilvl="2">
-      <w:startOverride w:val="1"/>
-    </w:lvlOverride>
-    <w:lvlOverride w:ilvl="3">
-      <w:startOverride w:val="1"/>
-    </w:lvlOverride>
-    <w:lvlOverride w:ilvl="4">
-      <w:startOverride w:val="1"/>
-    </w:lvlOverride>
-    <w:lvlOverride w:ilvl="5">
-      <w:startOverride w:val="1"/>
-    </w:lvlOverride>
-    <w:lvlOverride w:ilvl="6">
-      <w:startOverride w:val="1"/>
-    </w:lvlOverride>
-    <w:lvlOverride w:ilvl="7">
-      <w:startOverride w:val="1"/>
-    </w:lvlOverride>
-    <w:lvlOverride w:ilvl="8">
-      <w:startOverride w:val="1"/>
-    </w:lvlOverride>
-  </w:num>
-  <w:num w:numId="33" w16cid:durableId="1786119725">
-    <w:abstractNumId w:val="10"/>
-  </w:num>
-  <w:num w:numId="34" w16cid:durableId="1984967045">
-    <w:abstractNumId w:val="7"/>
-    <w:lvlOverride w:ilvl="0">
-      <w:startOverride w:val="1"/>
-    </w:lvlOverride>
-    <w:lvlOverride w:ilvl="1">
-      <w:startOverride w:val="1"/>
-    </w:lvlOverride>
-    <w:lvlOverride w:ilvl="2">
-      <w:startOverride w:val="1"/>
-    </w:lvlOverride>
-    <w:lvlOverride w:ilvl="3">
-      <w:startOverride w:val="1"/>
-    </w:lvlOverride>
-    <w:lvlOverride w:ilvl="4">
-      <w:startOverride w:val="1"/>
-    </w:lvlOverride>
-    <w:lvlOverride w:ilvl="5">
-      <w:startOverride w:val="1"/>
-    </w:lvlOverride>
-    <w:lvlOverride w:ilvl="6">
-      <w:startOverride w:val="1"/>
-    </w:lvlOverride>
-    <w:lvlOverride w:ilvl="7">
-      <w:startOverride w:val="1"/>
-    </w:lvlOverride>
-    <w:lvlOverride w:ilvl="8">
-      <w:startOverride w:val="1"/>
-    </w:lvlOverride>
-  </w:num>
-  <w:num w:numId="35" w16cid:durableId="1095322771">
-    <w:abstractNumId w:val="7"/>
-    <w:lvlOverride w:ilvl="0">
-      <w:startOverride w:val="1"/>
-    </w:lvlOverride>
-    <w:lvlOverride w:ilvl="1">
-      <w:startOverride w:val="1"/>
-    </w:lvlOverride>
-    <w:lvlOverride w:ilvl="2">
-      <w:startOverride w:val="1"/>
-    </w:lvlOverride>
-    <w:lvlOverride w:ilvl="3">
-      <w:startOverride w:val="1"/>
-    </w:lvlOverride>
-    <w:lvlOverride w:ilvl="4">
-      <w:startOverride w:val="1"/>
-    </w:lvlOverride>
-    <w:lvlOverride w:ilvl="5">
-      <w:startOverride w:val="1"/>
-    </w:lvlOverride>
-    <w:lvlOverride w:ilvl="6">
-      <w:startOverride w:val="1"/>
-    </w:lvlOverride>
-    <w:lvlOverride w:ilvl="7">
-      <w:startOverride w:val="1"/>
-    </w:lvlOverride>
-    <w:lvlOverride w:ilvl="8">
-      <w:startOverride w:val="1"/>
-    </w:lvlOverride>
-  </w:num>
-  <w:num w:numId="36" w16cid:durableId="1844852213">
-    <w:abstractNumId w:val="7"/>
-    <w:lvlOverride w:ilvl="0">
-      <w:startOverride w:val="1"/>
-    </w:lvlOverride>
-    <w:lvlOverride w:ilvl="1">
-      <w:startOverride w:val="1"/>
-    </w:lvlOverride>
-    <w:lvlOverride w:ilvl="2">
-      <w:startOverride w:val="1"/>
-    </w:lvlOverride>
-    <w:lvlOverride w:ilvl="3">
-      <w:startOverride w:val="1"/>
-    </w:lvlOverride>
-    <w:lvlOverride w:ilvl="4">
-      <w:startOverride w:val="1"/>
-    </w:lvlOverride>
-    <w:lvlOverride w:ilvl="5">
-      <w:startOverride w:val="1"/>
-    </w:lvlOverride>
-    <w:lvlOverride w:ilvl="6">
-      <w:startOverride w:val="1"/>
-    </w:lvlOverride>
-    <w:lvlOverride w:ilvl="7">
-      <w:startOverride w:val="1"/>
-    </w:lvlOverride>
-    <w:lvlOverride w:ilvl="8">
-      <w:startOverride w:val="1"/>
-    </w:lvlOverride>
-  </w:num>
-  <w:num w:numId="37" w16cid:durableId="1391685008">
-    <w:abstractNumId w:val="7"/>
-    <w:lvlOverride w:ilvl="0">
-      <w:startOverride w:val="1"/>
-    </w:lvlOverride>
-    <w:lvlOverride w:ilvl="1">
-      <w:startOverride w:val="1"/>
-    </w:lvlOverride>
-    <w:lvlOverride w:ilvl="2">
-      <w:startOverride w:val="1"/>
-    </w:lvlOverride>
-    <w:lvlOverride w:ilvl="3">
-      <w:startOverride w:val="1"/>
-    </w:lvlOverride>
-    <w:lvlOverride w:ilvl="4">
-      <w:startOverride w:val="1"/>
-    </w:lvlOverride>
-    <w:lvlOverride w:ilvl="5">
-      <w:startOverride w:val="1"/>
-    </w:lvlOverride>
-    <w:lvlOverride w:ilvl="6">
-      <w:startOverride w:val="1"/>
-    </w:lvlOverride>
-    <w:lvlOverride w:ilvl="7">
-      <w:startOverride w:val="1"/>
-    </w:lvlOverride>
-    <w:lvlOverride w:ilvl="8">
-      <w:startOverride w:val="1"/>
-    </w:lvlOverride>
-  </w:num>
-  <w:num w:numId="38" w16cid:durableId="1419904528">
-    <w:abstractNumId w:val="7"/>
-    <w:lvlOverride w:ilvl="0">
-      <w:startOverride w:val="1"/>
-    </w:lvlOverride>
-    <w:lvlOverride w:ilvl="1">
-      <w:startOverride w:val="1"/>
-    </w:lvlOverride>
-    <w:lvlOverride w:ilvl="2">
-      <w:startOverride w:val="1"/>
-    </w:lvlOverride>
-    <w:lvlOverride w:ilvl="3">
-      <w:startOverride w:val="1"/>
-    </w:lvlOverride>
-    <w:lvlOverride w:ilvl="4">
-      <w:startOverride w:val="1"/>
-    </w:lvlOverride>
-    <w:lvlOverride w:ilvl="5">
-      <w:startOverride w:val="1"/>
-    </w:lvlOverride>
-    <w:lvlOverride w:ilvl="6">
-      <w:startOverride w:val="1"/>
-    </w:lvlOverride>
-    <w:lvlOverride w:ilvl="7">
-      <w:startOverride w:val="1"/>
-    </w:lvlOverride>
-    <w:lvlOverride w:ilvl="8">
-      <w:startOverride w:val="1"/>
-    </w:lvlOverride>
-  </w:num>
-  <w:num w:numId="39" w16cid:durableId="411464407">
-    <w:abstractNumId w:val="7"/>
-    <w:lvlOverride w:ilvl="0">
-      <w:startOverride w:val="1"/>
-    </w:lvlOverride>
-    <w:lvlOverride w:ilvl="1">
-      <w:startOverride w:val="1"/>
-    </w:lvlOverride>
-    <w:lvlOverride w:ilvl="2">
-      <w:startOverride w:val="1"/>
-    </w:lvlOverride>
-    <w:lvlOverride w:ilvl="3">
-      <w:startOverride w:val="1"/>
-    </w:lvlOverride>
-    <w:lvlOverride w:ilvl="4">
-      <w:startOverride w:val="1"/>
-    </w:lvlOverride>
-    <w:lvlOverride w:ilvl="5">
-      <w:startOverride w:val="1"/>
-    </w:lvlOverride>
-    <w:lvlOverride w:ilvl="6">
-      <w:startOverride w:val="1"/>
-    </w:lvlOverride>
-    <w:lvlOverride w:ilvl="7">
-      <w:startOverride w:val="1"/>
-    </w:lvlOverride>
-    <w:lvlOverride w:ilvl="8">
-      <w:startOverride w:val="1"/>
-    </w:lvlOverride>
-  </w:num>
-  <w:num w:numId="40" w16cid:durableId="1515654663">
-    <w:abstractNumId w:val="7"/>
-    <w:lvlOverride w:ilvl="0">
-      <w:startOverride w:val="1"/>
-    </w:lvlOverride>
-    <w:lvlOverride w:ilvl="1">
-      <w:startOverride w:val="1"/>
-    </w:lvlOverride>
-    <w:lvlOverride w:ilvl="2">
-      <w:startOverride w:val="1"/>
-    </w:lvlOverride>
-    <w:lvlOverride w:ilvl="3">
-      <w:startOverride w:val="1"/>
-    </w:lvlOverride>
-    <w:lvlOverride w:ilvl="4">
-      <w:startOverride w:val="1"/>
-    </w:lvlOverride>
-    <w:lvlOverride w:ilvl="5">
-      <w:startOverride w:val="1"/>
-    </w:lvlOverride>
-    <w:lvlOverride w:ilvl="6">
-      <w:startOverride w:val="1"/>
-    </w:lvlOverride>
-    <w:lvlOverride w:ilvl="7">
-      <w:startOverride w:val="1"/>
-    </w:lvlOverride>
-    <w:lvlOverride w:ilvl="8">
-      <w:startOverride w:val="1"/>
-    </w:lvlOverride>
+  <w:num w:numId="45" w16cid:durableId="1748529093">
+    <w:abstractNumId w:val="18"/>
   </w:num>
 </w:numbering>
 </file>

</xml_diff>

<commit_message>
Consegna prima sezione RAD (Casi d'uso e Requisiti)
</commit_message>
<xml_diff>
--- a/Documents/01_NovaBiblioteca_ProblemStatement.docx
+++ b/Documents/01_NovaBiblioteca_ProblemStatement.docx
@@ -402,7 +402,7 @@
         <w:rPr>
           <w:sz w:val="32"/>
         </w:rPr>
-        <w:t>3</w:t>
+        <w:t>7</w:t>
       </w:r>
       <w:r>
         <w:rPr>
@@ -1785,7 +1785,21 @@
                 <w:rFonts w:asciiTheme="minorHAnsi" w:hAnsiTheme="minorHAnsi"/>
                 <w:sz w:val="20"/>
               </w:rPr>
-              <w:t>23/10/2026</w:t>
+              <w:t>2</w:t>
+            </w:r>
+            <w:r>
+              <w:rPr>
+                <w:rFonts w:asciiTheme="minorHAnsi" w:hAnsiTheme="minorHAnsi"/>
+                <w:sz w:val="20"/>
+              </w:rPr>
+              <w:t>7</w:t>
+            </w:r>
+            <w:r>
+              <w:rPr>
+                <w:rFonts w:asciiTheme="minorHAnsi" w:hAnsiTheme="minorHAnsi"/>
+                <w:sz w:val="20"/>
+              </w:rPr>
+              <w:t>/10/2026</w:t>
             </w:r>
           </w:p>
         </w:tc>
@@ -2289,7 +2303,7 @@
         <w:rPr>
           <w:noProof/>
         </w:rPr>
-        <w:instrText xml:space="preserve"> PAGEREF _Toc243674695 \h </w:instrText>
+        <w:instrText xml:space="preserve"> PAGEREF _Toc244027829 \h </w:instrText>
       </w:r>
       <w:r>
         <w:rPr>
@@ -2367,7 +2381,7 @@
         <w:rPr>
           <w:noProof/>
         </w:rPr>
-        <w:instrText xml:space="preserve"> PAGEREF _Toc243674696 \h </w:instrText>
+        <w:instrText xml:space="preserve"> PAGEREF _Toc244027830 \h </w:instrText>
       </w:r>
       <w:r>
         <w:rPr>
@@ -2445,7 +2459,7 @@
         <w:rPr>
           <w:noProof/>
         </w:rPr>
-        <w:instrText xml:space="preserve"> PAGEREF _Toc243674697 \h </w:instrText>
+        <w:instrText xml:space="preserve"> PAGEREF _Toc244027831 \h </w:instrText>
       </w:r>
       <w:r>
         <w:rPr>
@@ -2504,7 +2518,7 @@
         <w:rPr>
           <w:noProof/>
         </w:rPr>
-        <w:instrText xml:space="preserve"> PAGEREF _Toc243674698 \h </w:instrText>
+        <w:instrText xml:space="preserve"> PAGEREF _Toc244027832 \h </w:instrText>
       </w:r>
       <w:r>
         <w:rPr>
@@ -2563,7 +2577,7 @@
         <w:rPr>
           <w:noProof/>
         </w:rPr>
-        <w:instrText xml:space="preserve"> PAGEREF _Toc243674699 \h </w:instrText>
+        <w:instrText xml:space="preserve"> PAGEREF _Toc244027833 \h </w:instrText>
       </w:r>
       <w:r>
         <w:rPr>
@@ -2622,7 +2636,7 @@
         <w:rPr>
           <w:noProof/>
         </w:rPr>
-        <w:instrText xml:space="preserve"> PAGEREF _Toc243674700 \h </w:instrText>
+        <w:instrText xml:space="preserve"> PAGEREF _Toc244027834 \h </w:instrText>
       </w:r>
       <w:r>
         <w:rPr>
@@ -2681,7 +2695,7 @@
         <w:rPr>
           <w:noProof/>
         </w:rPr>
-        <w:instrText xml:space="preserve"> PAGEREF _Toc243674701 \h </w:instrText>
+        <w:instrText xml:space="preserve"> PAGEREF _Toc244027835 \h </w:instrText>
       </w:r>
       <w:r>
         <w:rPr>
@@ -2740,7 +2754,7 @@
         <w:rPr>
           <w:noProof/>
         </w:rPr>
-        <w:instrText xml:space="preserve"> PAGEREF _Toc243674702 \h </w:instrText>
+        <w:instrText xml:space="preserve"> PAGEREF _Toc244027836 \h </w:instrText>
       </w:r>
       <w:r>
         <w:rPr>
@@ -2799,7 +2813,7 @@
         <w:rPr>
           <w:noProof/>
         </w:rPr>
-        <w:instrText xml:space="preserve"> PAGEREF _Toc243674703 \h </w:instrText>
+        <w:instrText xml:space="preserve"> PAGEREF _Toc244027837 \h </w:instrText>
       </w:r>
       <w:r>
         <w:rPr>
@@ -2858,7 +2872,7 @@
         <w:rPr>
           <w:noProof/>
         </w:rPr>
-        <w:instrText xml:space="preserve"> PAGEREF _Toc243674704 \h </w:instrText>
+        <w:instrText xml:space="preserve"> PAGEREF _Toc244027838 \h </w:instrText>
       </w:r>
       <w:r>
         <w:rPr>
@@ -2917,7 +2931,7 @@
         <w:rPr>
           <w:noProof/>
         </w:rPr>
-        <w:instrText xml:space="preserve"> PAGEREF _Toc243674705 \h </w:instrText>
+        <w:instrText xml:space="preserve"> PAGEREF _Toc244027839 \h </w:instrText>
       </w:r>
       <w:r>
         <w:rPr>
@@ -2976,7 +2990,7 @@
         <w:rPr>
           <w:noProof/>
         </w:rPr>
-        <w:instrText xml:space="preserve"> PAGEREF _Toc243674706 \h </w:instrText>
+        <w:instrText xml:space="preserve"> PAGEREF _Toc244027840 \h </w:instrText>
       </w:r>
       <w:r>
         <w:rPr>
@@ -3035,7 +3049,7 @@
         <w:rPr>
           <w:noProof/>
         </w:rPr>
-        <w:instrText xml:space="preserve"> PAGEREF _Toc243674707 \h </w:instrText>
+        <w:instrText xml:space="preserve"> PAGEREF _Toc244027841 \h </w:instrText>
       </w:r>
       <w:r>
         <w:rPr>
@@ -3094,7 +3108,7 @@
         <w:rPr>
           <w:noProof/>
         </w:rPr>
-        <w:instrText xml:space="preserve"> PAGEREF _Toc243674708 \h </w:instrText>
+        <w:instrText xml:space="preserve"> PAGEREF _Toc244027842 \h </w:instrText>
       </w:r>
       <w:r>
         <w:rPr>
@@ -3153,7 +3167,7 @@
         <w:rPr>
           <w:noProof/>
         </w:rPr>
-        <w:instrText xml:space="preserve"> PAGEREF _Toc243674709 \h </w:instrText>
+        <w:instrText xml:space="preserve"> PAGEREF _Toc244027843 \h </w:instrText>
       </w:r>
       <w:r>
         <w:rPr>
@@ -3212,7 +3226,7 @@
         <w:rPr>
           <w:noProof/>
         </w:rPr>
-        <w:instrText xml:space="preserve"> PAGEREF _Toc243674710 \h </w:instrText>
+        <w:instrText xml:space="preserve"> PAGEREF _Toc244027844 \h </w:instrText>
       </w:r>
       <w:r>
         <w:rPr>
@@ -3271,7 +3285,7 @@
         <w:rPr>
           <w:noProof/>
         </w:rPr>
-        <w:instrText xml:space="preserve"> PAGEREF _Toc243674711 \h </w:instrText>
+        <w:instrText xml:space="preserve"> PAGEREF _Toc244027845 \h </w:instrText>
       </w:r>
       <w:r>
         <w:rPr>
@@ -3330,7 +3344,7 @@
         <w:rPr>
           <w:noProof/>
         </w:rPr>
-        <w:instrText xml:space="preserve"> PAGEREF _Toc243674712 \h </w:instrText>
+        <w:instrText xml:space="preserve"> PAGEREF _Toc244027846 \h </w:instrText>
       </w:r>
       <w:r>
         <w:rPr>
@@ -3389,7 +3403,7 @@
         <w:rPr>
           <w:noProof/>
         </w:rPr>
-        <w:instrText xml:space="preserve"> PAGEREF _Toc243674713 \h </w:instrText>
+        <w:instrText xml:space="preserve"> PAGEREF _Toc244027847 \h </w:instrText>
       </w:r>
       <w:r>
         <w:rPr>
@@ -3448,7 +3462,7 @@
         <w:rPr>
           <w:noProof/>
         </w:rPr>
-        <w:instrText xml:space="preserve"> PAGEREF _Toc243674714 \h </w:instrText>
+        <w:instrText xml:space="preserve"> PAGEREF _Toc244027848 \h </w:instrText>
       </w:r>
       <w:r>
         <w:rPr>
@@ -3507,7 +3521,7 @@
         <w:rPr>
           <w:noProof/>
         </w:rPr>
-        <w:instrText xml:space="preserve"> PAGEREF _Toc243674715 \h </w:instrText>
+        <w:instrText xml:space="preserve"> PAGEREF _Toc244027849 \h </w:instrText>
       </w:r>
       <w:r>
         <w:rPr>
@@ -3566,7 +3580,7 @@
         <w:rPr>
           <w:noProof/>
         </w:rPr>
-        <w:instrText xml:space="preserve"> PAGEREF _Toc243674716 \h </w:instrText>
+        <w:instrText xml:space="preserve"> PAGEREF _Toc244027850 \h </w:instrText>
       </w:r>
       <w:r>
         <w:rPr>
@@ -3644,7 +3658,7 @@
         <w:rPr>
           <w:noProof/>
         </w:rPr>
-        <w:instrText xml:space="preserve"> PAGEREF _Toc243674717 \h </w:instrText>
+        <w:instrText xml:space="preserve"> PAGEREF _Toc244027851 \h </w:instrText>
       </w:r>
       <w:r>
         <w:rPr>
@@ -3722,7 +3736,7 @@
         <w:rPr>
           <w:noProof/>
         </w:rPr>
-        <w:instrText xml:space="preserve"> PAGEREF _Toc243674718 \h </w:instrText>
+        <w:instrText xml:space="preserve"> PAGEREF _Toc244027852 \h </w:instrText>
       </w:r>
       <w:r>
         <w:rPr>
@@ -3739,7 +3753,519 @@
         <w:rPr>
           <w:noProof/>
         </w:rPr>
-        <w:t>10</w:t>
+        <w:t>11</w:t>
+      </w:r>
+      <w:r>
+        <w:rPr>
+          <w:noProof/>
+        </w:rPr>
+        <w:fldChar w:fldCharType="end"/>
+      </w:r>
+    </w:p>
+    <w:p>
+      <w:pPr>
+        <w:pStyle w:val="TOC3"/>
+        <w:rPr>
+          <w:rFonts w:asciiTheme="minorHAnsi" w:eastAsiaTheme="minorEastAsia" w:hAnsiTheme="minorHAnsi" w:cstheme="minorBidi"/>
+          <w:noProof/>
+          <w:kern w:val="2"/>
+          <w:lang w:val="en-US"/>
+          <w14:ligatures w14:val="standardContextual"/>
+        </w:rPr>
+      </w:pPr>
+      <w:r>
+        <w:rPr>
+          <w:rFonts w:asciiTheme="minorHAnsi" w:hAnsiTheme="minorHAnsi"/>
+          <w:noProof/>
+          <w:lang w:val="en-US"/>
+        </w:rPr>
+        <w:t>1.4.1. Usability</w:t>
+      </w:r>
+      <w:r>
+        <w:rPr>
+          <w:noProof/>
+          <w:lang w:val="en-US"/>
+        </w:rPr>
+        <w:tab/>
+      </w:r>
+      <w:r>
+        <w:rPr>
+          <w:noProof/>
+        </w:rPr>
+        <w:fldChar w:fldCharType="begin"/>
+      </w:r>
+      <w:r>
+        <w:rPr>
+          <w:noProof/>
+          <w:lang w:val="en-US"/>
+        </w:rPr>
+        <w:instrText xml:space="preserve"> PAGEREF _Toc244027853 \h </w:instrText>
+      </w:r>
+      <w:r>
+        <w:rPr>
+          <w:noProof/>
+        </w:rPr>
+      </w:r>
+      <w:r>
+        <w:rPr>
+          <w:noProof/>
+        </w:rPr>
+        <w:fldChar w:fldCharType="separate"/>
+      </w:r>
+      <w:r>
+        <w:rPr>
+          <w:noProof/>
+          <w:lang w:val="en-US"/>
+        </w:rPr>
+        <w:t>11</w:t>
+      </w:r>
+      <w:r>
+        <w:rPr>
+          <w:noProof/>
+        </w:rPr>
+        <w:fldChar w:fldCharType="end"/>
+      </w:r>
+    </w:p>
+    <w:p>
+      <w:pPr>
+        <w:pStyle w:val="TOC3"/>
+        <w:rPr>
+          <w:rFonts w:asciiTheme="minorHAnsi" w:eastAsiaTheme="minorEastAsia" w:hAnsiTheme="minorHAnsi" w:cstheme="minorBidi"/>
+          <w:noProof/>
+          <w:kern w:val="2"/>
+          <w:lang w:val="en-US"/>
+          <w14:ligatures w14:val="standardContextual"/>
+        </w:rPr>
+      </w:pPr>
+      <w:r>
+        <w:rPr>
+          <w:rFonts w:asciiTheme="minorHAnsi" w:hAnsiTheme="minorHAnsi"/>
+          <w:noProof/>
+          <w:lang w:val="en-US"/>
+        </w:rPr>
+        <w:t>1.4.2. Reliability</w:t>
+      </w:r>
+      <w:r>
+        <w:rPr>
+          <w:noProof/>
+          <w:lang w:val="en-US"/>
+        </w:rPr>
+        <w:tab/>
+      </w:r>
+      <w:r>
+        <w:rPr>
+          <w:noProof/>
+        </w:rPr>
+        <w:fldChar w:fldCharType="begin"/>
+      </w:r>
+      <w:r>
+        <w:rPr>
+          <w:noProof/>
+          <w:lang w:val="en-US"/>
+        </w:rPr>
+        <w:instrText xml:space="preserve"> PAGEREF _Toc244027854 \h </w:instrText>
+      </w:r>
+      <w:r>
+        <w:rPr>
+          <w:noProof/>
+        </w:rPr>
+      </w:r>
+      <w:r>
+        <w:rPr>
+          <w:noProof/>
+        </w:rPr>
+        <w:fldChar w:fldCharType="separate"/>
+      </w:r>
+      <w:r>
+        <w:rPr>
+          <w:noProof/>
+          <w:lang w:val="en-US"/>
+        </w:rPr>
+        <w:t>11</w:t>
+      </w:r>
+      <w:r>
+        <w:rPr>
+          <w:noProof/>
+        </w:rPr>
+        <w:fldChar w:fldCharType="end"/>
+      </w:r>
+    </w:p>
+    <w:p>
+      <w:pPr>
+        <w:pStyle w:val="TOC3"/>
+        <w:rPr>
+          <w:rFonts w:asciiTheme="minorHAnsi" w:eastAsiaTheme="minorEastAsia" w:hAnsiTheme="minorHAnsi" w:cstheme="minorBidi"/>
+          <w:noProof/>
+          <w:kern w:val="2"/>
+          <w:lang w:val="en-US"/>
+          <w14:ligatures w14:val="standardContextual"/>
+        </w:rPr>
+      </w:pPr>
+      <w:r>
+        <w:rPr>
+          <w:rFonts w:asciiTheme="minorHAnsi" w:hAnsiTheme="minorHAnsi"/>
+          <w:noProof/>
+          <w:lang w:val="en-US"/>
+        </w:rPr>
+        <w:t>1.4.3. Performance</w:t>
+      </w:r>
+      <w:r>
+        <w:rPr>
+          <w:noProof/>
+          <w:lang w:val="en-US"/>
+        </w:rPr>
+        <w:tab/>
+      </w:r>
+      <w:r>
+        <w:rPr>
+          <w:noProof/>
+        </w:rPr>
+        <w:fldChar w:fldCharType="begin"/>
+      </w:r>
+      <w:r>
+        <w:rPr>
+          <w:noProof/>
+          <w:lang w:val="en-US"/>
+        </w:rPr>
+        <w:instrText xml:space="preserve"> PAGEREF _Toc244027855 \h </w:instrText>
+      </w:r>
+      <w:r>
+        <w:rPr>
+          <w:noProof/>
+        </w:rPr>
+      </w:r>
+      <w:r>
+        <w:rPr>
+          <w:noProof/>
+        </w:rPr>
+        <w:fldChar w:fldCharType="separate"/>
+      </w:r>
+      <w:r>
+        <w:rPr>
+          <w:noProof/>
+          <w:lang w:val="en-US"/>
+        </w:rPr>
+        <w:t>11</w:t>
+      </w:r>
+      <w:r>
+        <w:rPr>
+          <w:noProof/>
+        </w:rPr>
+        <w:fldChar w:fldCharType="end"/>
+      </w:r>
+    </w:p>
+    <w:p>
+      <w:pPr>
+        <w:pStyle w:val="TOC3"/>
+        <w:rPr>
+          <w:rFonts w:asciiTheme="minorHAnsi" w:eastAsiaTheme="minorEastAsia" w:hAnsiTheme="minorHAnsi" w:cstheme="minorBidi"/>
+          <w:noProof/>
+          <w:kern w:val="2"/>
+          <w:lang w:val="en-US"/>
+          <w14:ligatures w14:val="standardContextual"/>
+        </w:rPr>
+      </w:pPr>
+      <w:r>
+        <w:rPr>
+          <w:rFonts w:asciiTheme="minorHAnsi" w:hAnsiTheme="minorHAnsi"/>
+          <w:noProof/>
+          <w:lang w:val="en-US"/>
+        </w:rPr>
+        <w:t>1.4.4. Supportability</w:t>
+      </w:r>
+      <w:r>
+        <w:rPr>
+          <w:noProof/>
+          <w:lang w:val="en-US"/>
+        </w:rPr>
+        <w:tab/>
+      </w:r>
+      <w:r>
+        <w:rPr>
+          <w:noProof/>
+        </w:rPr>
+        <w:fldChar w:fldCharType="begin"/>
+      </w:r>
+      <w:r>
+        <w:rPr>
+          <w:noProof/>
+          <w:lang w:val="en-US"/>
+        </w:rPr>
+        <w:instrText xml:space="preserve"> PAGEREF _Toc244027856 \h </w:instrText>
+      </w:r>
+      <w:r>
+        <w:rPr>
+          <w:noProof/>
+        </w:rPr>
+      </w:r>
+      <w:r>
+        <w:rPr>
+          <w:noProof/>
+        </w:rPr>
+        <w:fldChar w:fldCharType="separate"/>
+      </w:r>
+      <w:r>
+        <w:rPr>
+          <w:noProof/>
+          <w:lang w:val="en-US"/>
+        </w:rPr>
+        <w:t>11</w:t>
+      </w:r>
+      <w:r>
+        <w:rPr>
+          <w:noProof/>
+        </w:rPr>
+        <w:fldChar w:fldCharType="end"/>
+      </w:r>
+    </w:p>
+    <w:p>
+      <w:pPr>
+        <w:pStyle w:val="TOC3"/>
+        <w:rPr>
+          <w:rFonts w:asciiTheme="minorHAnsi" w:eastAsiaTheme="minorEastAsia" w:hAnsiTheme="minorHAnsi" w:cstheme="minorBidi"/>
+          <w:noProof/>
+          <w:kern w:val="2"/>
+          <w:lang w:val="en-US"/>
+          <w14:ligatures w14:val="standardContextual"/>
+        </w:rPr>
+      </w:pPr>
+      <w:r>
+        <w:rPr>
+          <w:rFonts w:asciiTheme="minorHAnsi" w:hAnsiTheme="minorHAnsi"/>
+          <w:noProof/>
+          <w:lang w:val="en-US"/>
+        </w:rPr>
+        <w:t>1.4.5. Implementation</w:t>
+      </w:r>
+      <w:r>
+        <w:rPr>
+          <w:noProof/>
+          <w:lang w:val="en-US"/>
+        </w:rPr>
+        <w:tab/>
+      </w:r>
+      <w:r>
+        <w:rPr>
+          <w:noProof/>
+        </w:rPr>
+        <w:fldChar w:fldCharType="begin"/>
+      </w:r>
+      <w:r>
+        <w:rPr>
+          <w:noProof/>
+          <w:lang w:val="en-US"/>
+        </w:rPr>
+        <w:instrText xml:space="preserve"> PAGEREF _Toc244027857 \h </w:instrText>
+      </w:r>
+      <w:r>
+        <w:rPr>
+          <w:noProof/>
+        </w:rPr>
+      </w:r>
+      <w:r>
+        <w:rPr>
+          <w:noProof/>
+        </w:rPr>
+        <w:fldChar w:fldCharType="separate"/>
+      </w:r>
+      <w:r>
+        <w:rPr>
+          <w:noProof/>
+          <w:lang w:val="en-US"/>
+        </w:rPr>
+        <w:t>11</w:t>
+      </w:r>
+      <w:r>
+        <w:rPr>
+          <w:noProof/>
+        </w:rPr>
+        <w:fldChar w:fldCharType="end"/>
+      </w:r>
+    </w:p>
+    <w:p>
+      <w:pPr>
+        <w:pStyle w:val="TOC3"/>
+        <w:rPr>
+          <w:rFonts w:asciiTheme="minorHAnsi" w:eastAsiaTheme="minorEastAsia" w:hAnsiTheme="minorHAnsi" w:cstheme="minorBidi"/>
+          <w:noProof/>
+          <w:kern w:val="2"/>
+          <w:lang w:val="en-US"/>
+          <w14:ligatures w14:val="standardContextual"/>
+        </w:rPr>
+      </w:pPr>
+      <w:r>
+        <w:rPr>
+          <w:rFonts w:asciiTheme="minorHAnsi" w:hAnsiTheme="minorHAnsi"/>
+          <w:noProof/>
+          <w:lang w:val="en-US"/>
+        </w:rPr>
+        <w:t>1.4.6. Interface</w:t>
+      </w:r>
+      <w:r>
+        <w:rPr>
+          <w:noProof/>
+          <w:lang w:val="en-US"/>
+        </w:rPr>
+        <w:tab/>
+      </w:r>
+      <w:r>
+        <w:rPr>
+          <w:noProof/>
+        </w:rPr>
+        <w:fldChar w:fldCharType="begin"/>
+      </w:r>
+      <w:r>
+        <w:rPr>
+          <w:noProof/>
+          <w:lang w:val="en-US"/>
+        </w:rPr>
+        <w:instrText xml:space="preserve"> PAGEREF _Toc244027858 \h </w:instrText>
+      </w:r>
+      <w:r>
+        <w:rPr>
+          <w:noProof/>
+        </w:rPr>
+      </w:r>
+      <w:r>
+        <w:rPr>
+          <w:noProof/>
+        </w:rPr>
+        <w:fldChar w:fldCharType="separate"/>
+      </w:r>
+      <w:r>
+        <w:rPr>
+          <w:noProof/>
+          <w:lang w:val="en-US"/>
+        </w:rPr>
+        <w:t>12</w:t>
+      </w:r>
+      <w:r>
+        <w:rPr>
+          <w:noProof/>
+        </w:rPr>
+        <w:fldChar w:fldCharType="end"/>
+      </w:r>
+    </w:p>
+    <w:p>
+      <w:pPr>
+        <w:pStyle w:val="TOC3"/>
+        <w:rPr>
+          <w:rFonts w:asciiTheme="minorHAnsi" w:eastAsiaTheme="minorEastAsia" w:hAnsiTheme="minorHAnsi" w:cstheme="minorBidi"/>
+          <w:noProof/>
+          <w:kern w:val="2"/>
+          <w:lang w:val="en-US"/>
+          <w14:ligatures w14:val="standardContextual"/>
+        </w:rPr>
+      </w:pPr>
+      <w:r>
+        <w:rPr>
+          <w:rFonts w:asciiTheme="minorHAnsi" w:hAnsiTheme="minorHAnsi"/>
+          <w:noProof/>
+          <w:lang w:val="en-US"/>
+        </w:rPr>
+        <w:t>1.4.7. Packaging</w:t>
+      </w:r>
+      <w:r>
+        <w:rPr>
+          <w:noProof/>
+          <w:lang w:val="en-US"/>
+        </w:rPr>
+        <w:tab/>
+      </w:r>
+      <w:r>
+        <w:rPr>
+          <w:noProof/>
+        </w:rPr>
+        <w:fldChar w:fldCharType="begin"/>
+      </w:r>
+      <w:r>
+        <w:rPr>
+          <w:noProof/>
+          <w:lang w:val="en-US"/>
+        </w:rPr>
+        <w:instrText xml:space="preserve"> PAGEREF _Toc244027859 \h </w:instrText>
+      </w:r>
+      <w:r>
+        <w:rPr>
+          <w:noProof/>
+        </w:rPr>
+      </w:r>
+      <w:r>
+        <w:rPr>
+          <w:noProof/>
+        </w:rPr>
+        <w:fldChar w:fldCharType="separate"/>
+      </w:r>
+      <w:r>
+        <w:rPr>
+          <w:noProof/>
+          <w:lang w:val="en-US"/>
+        </w:rPr>
+        <w:t>12</w:t>
+      </w:r>
+      <w:r>
+        <w:rPr>
+          <w:noProof/>
+        </w:rPr>
+        <w:fldChar w:fldCharType="end"/>
+      </w:r>
+    </w:p>
+    <w:p>
+      <w:pPr>
+        <w:pStyle w:val="TOC3"/>
+        <w:rPr>
+          <w:rFonts w:asciiTheme="minorHAnsi" w:eastAsiaTheme="minorEastAsia" w:hAnsiTheme="minorHAnsi" w:cstheme="minorBidi"/>
+          <w:noProof/>
+          <w:kern w:val="2"/>
+          <w:lang w:val="en-US"/>
+          <w14:ligatures w14:val="standardContextual"/>
+        </w:rPr>
+      </w:pPr>
+      <w:r>
+        <w:rPr>
+          <w:rFonts w:asciiTheme="minorHAnsi" w:hAnsiTheme="minorHAnsi"/>
+          <w:noProof/>
+          <w:lang w:val="en-US"/>
+        </w:rPr>
+        <w:t>1.4.8. Legal</w:t>
+      </w:r>
+      <w:r>
+        <w:rPr>
+          <w:noProof/>
+          <w:lang w:val="en-US"/>
+        </w:rPr>
+        <w:tab/>
+      </w:r>
+      <w:r>
+        <w:rPr>
+          <w:noProof/>
+        </w:rPr>
+        <w:fldChar w:fldCharType="begin"/>
+      </w:r>
+      <w:r>
+        <w:rPr>
+          <w:noProof/>
+          <w:lang w:val="en-US"/>
+        </w:rPr>
+        <w:instrText xml:space="preserve"> PAGEREF _Toc244027860 \h </w:instrText>
+      </w:r>
+      <w:r>
+        <w:rPr>
+          <w:noProof/>
+        </w:rPr>
+      </w:r>
+      <w:r>
+        <w:rPr>
+          <w:noProof/>
+        </w:rPr>
+        <w:fldChar w:fldCharType="separate"/>
+      </w:r>
+      <w:r>
+        <w:rPr>
+          <w:noProof/>
+          <w:lang w:val="en-US"/>
+        </w:rPr>
+        <w:t>12</w:t>
       </w:r>
       <w:r>
         <w:rPr>
@@ -3758,6 +4284,7 @@
           <w:rFonts w:asciiTheme="minorHAnsi" w:eastAsiaTheme="minorEastAsia" w:hAnsiTheme="minorHAnsi" w:cstheme="minorBidi"/>
           <w:noProof/>
           <w:kern w:val="2"/>
+          <w:lang w:val="en-US"/>
           <w14:ligatures w14:val="standardContextual"/>
         </w:rPr>
       </w:pPr>
@@ -3765,6 +4292,7 @@
         <w:rPr>
           <w:rFonts w:asciiTheme="minorHAnsi" w:hAnsiTheme="minorHAnsi"/>
           <w:noProof/>
+          <w:lang w:val="en-US"/>
         </w:rPr>
         <w:t>1.5.</w:t>
       </w:r>
@@ -3773,6 +4301,7 @@
           <w:rFonts w:asciiTheme="minorHAnsi" w:eastAsiaTheme="minorEastAsia" w:hAnsiTheme="minorHAnsi" w:cstheme="minorBidi"/>
           <w:noProof/>
           <w:kern w:val="2"/>
+          <w:lang w:val="en-US"/>
           <w14:ligatures w14:val="standardContextual"/>
         </w:rPr>
         <w:tab/>
@@ -3781,12 +4310,14 @@
         <w:rPr>
           <w:rFonts w:asciiTheme="minorHAnsi" w:hAnsiTheme="minorHAnsi"/>
           <w:noProof/>
+          <w:lang w:val="en-US"/>
         </w:rPr>
         <w:t>Target Environment</w:t>
       </w:r>
       <w:r>
         <w:rPr>
           <w:noProof/>
+          <w:lang w:val="en-US"/>
         </w:rPr>
         <w:tab/>
       </w:r>
@@ -3799,8 +4330,9 @@
       <w:r>
         <w:rPr>
           <w:noProof/>
-        </w:rPr>
-        <w:instrText xml:space="preserve"> PAGEREF _Toc243674719 \h </w:instrText>
+          <w:lang w:val="en-US"/>
+        </w:rPr>
+        <w:instrText xml:space="preserve"> PAGEREF _Toc244027861 \h </w:instrText>
       </w:r>
       <w:r>
         <w:rPr>
@@ -3816,8 +4348,9 @@
       <w:r>
         <w:rPr>
           <w:noProof/>
-        </w:rPr>
-        <w:t>11</w:t>
+          <w:lang w:val="en-US"/>
+        </w:rPr>
+        <w:t>12</w:t>
       </w:r>
       <w:r>
         <w:rPr>
@@ -3878,7 +4411,7 @@
         <w:rPr>
           <w:noProof/>
         </w:rPr>
-        <w:instrText xml:space="preserve"> PAGEREF _Toc243674720 \h </w:instrText>
+        <w:instrText xml:space="preserve"> PAGEREF _Toc244027862 \h </w:instrText>
       </w:r>
       <w:r>
         <w:rPr>
@@ -3895,7 +4428,7 @@
         <w:rPr>
           <w:noProof/>
         </w:rPr>
-        <w:t>11</w:t>
+        <w:t>12</w:t>
       </w:r>
       <w:r>
         <w:rPr>
@@ -3949,7 +4482,7 @@
           <w:rFonts w:asciiTheme="minorHAnsi" w:hAnsiTheme="minorHAnsi"/>
         </w:rPr>
       </w:pPr>
-      <w:bookmarkStart w:id="0" w:name="_Toc243674695"/>
+      <w:bookmarkStart w:id="0" w:name="_Toc244027829"/>
       <w:r>
         <w:rPr>
           <w:rFonts w:asciiTheme="minorHAnsi" w:hAnsiTheme="minorHAnsi"/>
@@ -3969,7 +4502,7 @@
           <w:iCs w:val="0"/>
         </w:rPr>
       </w:pPr>
-      <w:bookmarkStart w:id="1" w:name="_Toc243674696"/>
+      <w:bookmarkStart w:id="1" w:name="_Toc244027830"/>
       <w:r>
         <w:rPr>
           <w:rFonts w:ascii="Aptos" w:hAnsi="Aptos"/>
@@ -4532,7 +5065,7 @@
           <w:iCs w:val="0"/>
         </w:rPr>
       </w:pPr>
-      <w:bookmarkStart w:id="2" w:name="_Toc243674697"/>
+      <w:bookmarkStart w:id="2" w:name="_Toc244027831"/>
       <w:r>
         <w:rPr>
           <w:rFonts w:asciiTheme="minorHAnsi" w:hAnsiTheme="minorHAnsi"/>
@@ -4551,7 +5084,7 @@
           <w:rFonts w:asciiTheme="minorHAnsi" w:hAnsiTheme="minorHAnsi"/>
         </w:rPr>
       </w:pPr>
-      <w:bookmarkStart w:id="3" w:name="_Toc243674698"/>
+      <w:bookmarkStart w:id="3" w:name="_Toc244027832"/>
       <w:r>
         <w:rPr>
           <w:rFonts w:asciiTheme="minorHAnsi" w:hAnsiTheme="minorHAnsi"/>
@@ -4803,7 +5336,7 @@
           <w:rFonts w:asciiTheme="minorHAnsi" w:hAnsiTheme="minorHAnsi"/>
         </w:rPr>
       </w:pPr>
-      <w:bookmarkStart w:id="4" w:name="_Toc243674699"/>
+      <w:bookmarkStart w:id="4" w:name="_Toc244027833"/>
       <w:r>
         <w:rPr>
           <w:rFonts w:asciiTheme="minorHAnsi" w:hAnsiTheme="minorHAnsi"/>
@@ -5072,7 +5605,7 @@
           <w:rFonts w:ascii="Aptos" w:hAnsi="Aptos"/>
         </w:rPr>
       </w:pPr>
-      <w:bookmarkStart w:id="5" w:name="_Toc243674700"/>
+      <w:bookmarkStart w:id="5" w:name="_Toc244027834"/>
       <w:r>
         <w:rPr>
           <w:rFonts w:ascii="Aptos" w:hAnsi="Aptos"/>
@@ -5314,7 +5847,7 @@
           <w:rFonts w:asciiTheme="minorHAnsi" w:hAnsiTheme="minorHAnsi"/>
         </w:rPr>
       </w:pPr>
-      <w:bookmarkStart w:id="6" w:name="_Toc243674701"/>
+      <w:bookmarkStart w:id="6" w:name="_Toc244027835"/>
       <w:r>
         <w:rPr>
           <w:rFonts w:asciiTheme="minorHAnsi" w:hAnsiTheme="minorHAnsi"/>
@@ -5445,7 +5978,7 @@
           <w:rFonts w:ascii="Aptos" w:hAnsi="Aptos"/>
         </w:rPr>
       </w:pPr>
-      <w:bookmarkStart w:id="7" w:name="_Toc243674702"/>
+      <w:bookmarkStart w:id="7" w:name="_Toc244027836"/>
       <w:r>
         <w:rPr>
           <w:rFonts w:ascii="Aptos" w:hAnsi="Aptos"/>
@@ -5645,7 +6178,7 @@
           <w:rFonts w:asciiTheme="minorHAnsi" w:hAnsiTheme="minorHAnsi"/>
         </w:rPr>
       </w:pPr>
-      <w:bookmarkStart w:id="8" w:name="_Toc243674703"/>
+      <w:bookmarkStart w:id="8" w:name="_Toc244027837"/>
       <w:r>
         <w:rPr>
           <w:rFonts w:asciiTheme="minorHAnsi" w:hAnsiTheme="minorHAnsi"/>
@@ -5834,7 +6367,7 @@
           <w:rFonts w:asciiTheme="minorHAnsi" w:hAnsiTheme="minorHAnsi"/>
         </w:rPr>
       </w:pPr>
-      <w:bookmarkStart w:id="9" w:name="_Toc243674704"/>
+      <w:bookmarkStart w:id="9" w:name="_Toc244027838"/>
       <w:r>
         <w:rPr>
           <w:rFonts w:asciiTheme="minorHAnsi" w:hAnsiTheme="minorHAnsi"/>
@@ -5958,7 +6491,7 @@
           <w:rFonts w:asciiTheme="minorHAnsi" w:hAnsiTheme="minorHAnsi"/>
         </w:rPr>
       </w:pPr>
-      <w:bookmarkStart w:id="10" w:name="_Toc243674705"/>
+      <w:bookmarkStart w:id="10" w:name="_Toc244027839"/>
       <w:r>
         <w:rPr>
           <w:rFonts w:asciiTheme="minorHAnsi" w:hAnsiTheme="minorHAnsi"/>
@@ -6101,7 +6634,7 @@
           <w:rFonts w:asciiTheme="minorHAnsi" w:hAnsiTheme="minorHAnsi"/>
         </w:rPr>
       </w:pPr>
-      <w:bookmarkStart w:id="11" w:name="_Toc243674706"/>
+      <w:bookmarkStart w:id="11" w:name="_Toc244027840"/>
       <w:r>
         <w:rPr>
           <w:rFonts w:asciiTheme="minorHAnsi" w:hAnsiTheme="minorHAnsi"/>
@@ -6274,7 +6807,7 @@
           <w:rFonts w:asciiTheme="minorHAnsi" w:hAnsiTheme="minorHAnsi"/>
         </w:rPr>
       </w:pPr>
-      <w:bookmarkStart w:id="12" w:name="_Toc243674707"/>
+      <w:bookmarkStart w:id="12" w:name="_Toc244027841"/>
       <w:r>
         <w:rPr>
           <w:rFonts w:asciiTheme="minorHAnsi" w:hAnsiTheme="minorHAnsi"/>
@@ -6487,7 +7020,7 @@
           <w:rFonts w:asciiTheme="minorHAnsi" w:hAnsiTheme="minorHAnsi"/>
         </w:rPr>
       </w:pPr>
-      <w:bookmarkStart w:id="13" w:name="_Toc243674708"/>
+      <w:bookmarkStart w:id="13" w:name="_Toc244027842"/>
       <w:r>
         <w:rPr>
           <w:rFonts w:asciiTheme="minorHAnsi" w:hAnsiTheme="minorHAnsi"/>
@@ -6666,7 +7199,7 @@
           <w:rFonts w:asciiTheme="minorHAnsi" w:hAnsiTheme="minorHAnsi"/>
         </w:rPr>
       </w:pPr>
-      <w:bookmarkStart w:id="14" w:name="_Toc243674709"/>
+      <w:bookmarkStart w:id="14" w:name="_Toc244027843"/>
       <w:r>
         <w:rPr>
           <w:rFonts w:asciiTheme="minorHAnsi" w:hAnsiTheme="minorHAnsi"/>
@@ -6812,7 +7345,7 @@
           <w:rFonts w:asciiTheme="minorHAnsi" w:hAnsiTheme="minorHAnsi"/>
         </w:rPr>
       </w:pPr>
-      <w:bookmarkStart w:id="15" w:name="_Toc243674710"/>
+      <w:bookmarkStart w:id="15" w:name="_Toc244027844"/>
       <w:r>
         <w:rPr>
           <w:rFonts w:asciiTheme="minorHAnsi" w:hAnsiTheme="minorHAnsi"/>
@@ -6932,7 +7465,7 @@
           <w:rFonts w:asciiTheme="minorHAnsi" w:hAnsiTheme="minorHAnsi"/>
         </w:rPr>
       </w:pPr>
-      <w:bookmarkStart w:id="16" w:name="_Toc243674711"/>
+      <w:bookmarkStart w:id="16" w:name="_Toc244027845"/>
       <w:r>
         <w:rPr>
           <w:rFonts w:asciiTheme="minorHAnsi" w:hAnsiTheme="minorHAnsi"/>
@@ -7063,7 +7596,7 @@
           <w:rFonts w:asciiTheme="minorHAnsi" w:hAnsiTheme="minorHAnsi"/>
         </w:rPr>
       </w:pPr>
-      <w:bookmarkStart w:id="17" w:name="_Toc243674712"/>
+      <w:bookmarkStart w:id="17" w:name="_Toc244027846"/>
       <w:r>
         <w:rPr>
           <w:rFonts w:asciiTheme="minorHAnsi" w:hAnsiTheme="minorHAnsi"/>
@@ -7110,7 +7643,7 @@
           <w:rFonts w:asciiTheme="minorHAnsi" w:hAnsiTheme="minorHAnsi"/>
         </w:rPr>
       </w:pPr>
-      <w:bookmarkStart w:id="18" w:name="_Toc243674713"/>
+      <w:bookmarkStart w:id="18" w:name="_Toc244027847"/>
       <w:r>
         <w:rPr>
           <w:rFonts w:asciiTheme="minorHAnsi" w:hAnsiTheme="minorHAnsi"/>
@@ -7190,7 +7723,7 @@
           <w:rFonts w:asciiTheme="minorHAnsi" w:hAnsiTheme="minorHAnsi"/>
         </w:rPr>
       </w:pPr>
-      <w:bookmarkStart w:id="19" w:name="_Toc243674714"/>
+      <w:bookmarkStart w:id="19" w:name="_Toc244027848"/>
       <w:r>
         <w:rPr>
           <w:rFonts w:asciiTheme="minorHAnsi" w:hAnsiTheme="minorHAnsi"/>
@@ -7352,7 +7885,7 @@
           <w:rFonts w:asciiTheme="minorHAnsi" w:hAnsiTheme="minorHAnsi"/>
         </w:rPr>
       </w:pPr>
-      <w:bookmarkStart w:id="20" w:name="_Toc243674715"/>
+      <w:bookmarkStart w:id="20" w:name="_Toc244027849"/>
       <w:r>
         <w:rPr>
           <w:rFonts w:asciiTheme="minorHAnsi" w:hAnsiTheme="minorHAnsi"/>
@@ -7504,7 +8037,7 @@
           <w:rFonts w:asciiTheme="minorHAnsi" w:hAnsiTheme="minorHAnsi"/>
         </w:rPr>
       </w:pPr>
-      <w:bookmarkStart w:id="21" w:name="_Toc243674716"/>
+      <w:bookmarkStart w:id="21" w:name="_Toc244027850"/>
       <w:r>
         <w:rPr>
           <w:rFonts w:asciiTheme="minorHAnsi" w:hAnsiTheme="minorHAnsi"/>
@@ -7627,7 +8160,7 @@
           <w:iCs w:val="0"/>
         </w:rPr>
       </w:pPr>
-      <w:bookmarkStart w:id="22" w:name="_Toc243674717"/>
+      <w:bookmarkStart w:id="22" w:name="_Toc244027851"/>
       <w:r>
         <w:rPr>
           <w:rFonts w:asciiTheme="minorHAnsi" w:hAnsiTheme="minorHAnsi"/>
@@ -7691,7 +8224,7 @@
         <w:rPr>
           <w:rFonts w:asciiTheme="minorHAnsi" w:hAnsiTheme="minorHAnsi"/>
         </w:rPr>
-        <w:t>Un operatore può registrare un lettore inserendo codice fiscale, nome, cognome ed e-mail. Il sistema deve creare l’account del lettore dopo la validazione dei dati, generare una password temporanea e richiedere al primo accesso di impostarne una nuova.</w:t>
+        <w:t>Un operatore può registrare un lettore inserendo codice fiscale, nome, cognome ed e-mail. Il sistema deve creare l’account del lettore dopo la validazione dei dati, generare una password temporanea.</w:t>
       </w:r>
     </w:p>
     <w:p>
@@ -7739,7 +8272,13 @@
         <w:rPr>
           <w:rFonts w:asciiTheme="minorHAnsi" w:hAnsiTheme="minorHAnsi"/>
         </w:rPr>
-        <w:t>I lettori registrati e gli operatori devono poter accedere mediante e-mail e password e terminare la propria sessione tramite una funzionalità di logout.</w:t>
+        <w:t>I lettori registrati e gli operatori devono poter accedere mediante e-mail e password.</w:t>
+      </w:r>
+      <w:r>
+        <w:rPr>
+          <w:rFonts w:asciiTheme="minorHAnsi" w:hAnsiTheme="minorHAnsi"/>
+        </w:rPr>
+        <w:t xml:space="preserve"> Al primo accesso, o in seguito ad una richiesta di reset della password, sarà richiesto a lettore di inserire una nuova password.</w:t>
       </w:r>
     </w:p>
     <w:p>
@@ -7765,467 +8304,473 @@
           <w:b/>
           <w:bCs/>
         </w:rPr>
-        <w:t>FR</w:t>
-      </w:r>
-      <w:r>
+        <w:t>FR3 – Logout</w:t>
+      </w:r>
+    </w:p>
+    <w:p>
+      <w:pPr>
+        <w:jc w:val="both"/>
+        <w:rPr>
+          <w:rFonts w:asciiTheme="minorHAnsi" w:hAnsiTheme="minorHAnsi"/>
+        </w:rPr>
+      </w:pPr>
+      <w:r>
+        <w:rPr>
+          <w:rFonts w:asciiTheme="minorHAnsi" w:hAnsiTheme="minorHAnsi"/>
+        </w:rPr>
+        <w:t>I lettori registrati e gli operatori devono poter</w:t>
+      </w:r>
+      <w:r>
+        <w:rPr>
+          <w:rFonts w:asciiTheme="minorHAnsi" w:hAnsiTheme="minorHAnsi"/>
+        </w:rPr>
+        <w:t xml:space="preserve"> terminare la propria sessione tramite una funzionalità di logout</w:t>
+      </w:r>
+      <w:r>
+        <w:rPr>
+          <w:rFonts w:asciiTheme="minorHAnsi" w:hAnsiTheme="minorHAnsi"/>
+        </w:rPr>
+        <w:t>.</w:t>
+      </w:r>
+    </w:p>
+    <w:p>
+      <w:pPr>
+        <w:jc w:val="both"/>
+        <w:rPr>
+          <w:rFonts w:asciiTheme="minorHAnsi" w:hAnsiTheme="minorHAnsi"/>
+        </w:rPr>
+      </w:pPr>
+    </w:p>
+    <w:p>
+      <w:pPr>
+        <w:jc w:val="both"/>
         <w:rPr>
           <w:rFonts w:asciiTheme="minorHAnsi" w:hAnsiTheme="minorHAnsi"/>
           <w:b/>
           <w:bCs/>
         </w:rPr>
-        <w:t>3 – Consultazione del catalogo</w:t>
-      </w:r>
-    </w:p>
-    <w:p>
-      <w:pPr>
-        <w:jc w:val="both"/>
-        <w:rPr>
-          <w:rFonts w:asciiTheme="minorHAnsi" w:hAnsiTheme="minorHAnsi"/>
-        </w:rPr>
-      </w:pPr>
-      <w:r>
-        <w:rPr>
-          <w:rFonts w:asciiTheme="minorHAnsi" w:hAnsiTheme="minorHAnsi"/>
-        </w:rPr>
-        <w:t>Il sistema deve consentire a qualsiasi utente, anche non registrato, di consultare il catalogo e cercare i libri di interesse, anche sulla base di filtri di ricerca, mostrando solo i risultati corrispondenti.</w:t>
-      </w:r>
-    </w:p>
-    <w:p>
-      <w:pPr>
-        <w:jc w:val="both"/>
-        <w:rPr>
-          <w:rFonts w:asciiTheme="minorHAnsi" w:hAnsiTheme="minorHAnsi"/>
-        </w:rPr>
-      </w:pPr>
-    </w:p>
-    <w:p>
-      <w:pPr>
-        <w:jc w:val="both"/>
+      </w:pPr>
+      <w:r>
         <w:rPr>
           <w:rFonts w:asciiTheme="minorHAnsi" w:hAnsiTheme="minorHAnsi"/>
           <w:b/>
           <w:bCs/>
         </w:rPr>
-      </w:pPr>
+        <w:t>FR4</w:t>
+      </w:r>
       <w:r>
         <w:rPr>
           <w:rFonts w:asciiTheme="minorHAnsi" w:hAnsiTheme="minorHAnsi"/>
           <w:b/>
           <w:bCs/>
         </w:rPr>
-        <w:t>FR</w:t>
-      </w:r>
-      <w:r>
+        <w:t xml:space="preserve"> – Consultazione del catalogo</w:t>
+      </w:r>
+    </w:p>
+    <w:p>
+      <w:pPr>
+        <w:jc w:val="both"/>
+        <w:rPr>
+          <w:rFonts w:asciiTheme="minorHAnsi" w:hAnsiTheme="minorHAnsi"/>
+        </w:rPr>
+      </w:pPr>
+      <w:r>
+        <w:rPr>
+          <w:rFonts w:asciiTheme="minorHAnsi" w:hAnsiTheme="minorHAnsi"/>
+        </w:rPr>
+        <w:t>Il sistema deve consentire a qualsiasi utente, anche non registrato, di consultare il catalogo e cercare i libri di interesse, anche sulla base di filtri di ricerca, mostrando solo i risultati corrispondenti.</w:t>
+      </w:r>
+    </w:p>
+    <w:p>
+      <w:pPr>
+        <w:jc w:val="both"/>
+        <w:rPr>
+          <w:rFonts w:asciiTheme="minorHAnsi" w:hAnsiTheme="minorHAnsi"/>
+        </w:rPr>
+      </w:pPr>
+    </w:p>
+    <w:p>
+      <w:pPr>
+        <w:jc w:val="both"/>
         <w:rPr>
           <w:rFonts w:asciiTheme="minorHAnsi" w:hAnsiTheme="minorHAnsi"/>
           <w:b/>
           <w:bCs/>
         </w:rPr>
-        <w:t>4 – Visualizzazione dei dettagli dell’edizione</w:t>
-      </w:r>
-    </w:p>
-    <w:p>
-      <w:pPr>
-        <w:jc w:val="both"/>
-        <w:rPr>
-          <w:rFonts w:asciiTheme="minorHAnsi" w:hAnsiTheme="minorHAnsi"/>
-        </w:rPr>
-      </w:pPr>
-      <w:r>
-        <w:rPr>
-          <w:rFonts w:asciiTheme="minorHAnsi" w:hAnsiTheme="minorHAnsi"/>
-        </w:rPr>
-        <w:t>Il sistema deve consentire di selezionare un’edizione e visualizzare le relative informazioni, quali autore, edizione e numero di copie disponibili.</w:t>
-      </w:r>
-    </w:p>
-    <w:p>
-      <w:pPr>
-        <w:jc w:val="both"/>
-        <w:rPr>
-          <w:rFonts w:asciiTheme="minorHAnsi" w:hAnsiTheme="minorHAnsi"/>
-        </w:rPr>
-      </w:pPr>
-    </w:p>
-    <w:p>
-      <w:pPr>
-        <w:jc w:val="both"/>
+      </w:pPr>
+      <w:r>
         <w:rPr>
           <w:rFonts w:asciiTheme="minorHAnsi" w:hAnsiTheme="minorHAnsi"/>
           <w:b/>
           <w:bCs/>
         </w:rPr>
-      </w:pPr>
+        <w:t>FR5</w:t>
+      </w:r>
       <w:r>
         <w:rPr>
           <w:rFonts w:asciiTheme="minorHAnsi" w:hAnsiTheme="minorHAnsi"/>
           <w:b/>
           <w:bCs/>
         </w:rPr>
-        <w:t>FR</w:t>
-      </w:r>
-      <w:r>
+        <w:t xml:space="preserve"> – Visualizzazione dei dettagli dell’edizione</w:t>
+      </w:r>
+    </w:p>
+    <w:p>
+      <w:pPr>
+        <w:jc w:val="both"/>
+        <w:rPr>
+          <w:rFonts w:asciiTheme="minorHAnsi" w:hAnsiTheme="minorHAnsi"/>
+        </w:rPr>
+      </w:pPr>
+      <w:r>
+        <w:rPr>
+          <w:rFonts w:asciiTheme="minorHAnsi" w:hAnsiTheme="minorHAnsi"/>
+        </w:rPr>
+        <w:t>Il sistema deve consentire di selezionare un’edizione e visualizzare le relative informazioni, quali autore, edizione e numero di copie disponibili.</w:t>
+      </w:r>
+    </w:p>
+    <w:p>
+      <w:pPr>
+        <w:jc w:val="both"/>
+        <w:rPr>
+          <w:rFonts w:asciiTheme="minorHAnsi" w:hAnsiTheme="minorHAnsi"/>
+        </w:rPr>
+      </w:pPr>
+    </w:p>
+    <w:p>
+      <w:pPr>
+        <w:jc w:val="both"/>
         <w:rPr>
           <w:rFonts w:asciiTheme="minorHAnsi" w:hAnsiTheme="minorHAnsi"/>
           <w:b/>
           <w:bCs/>
         </w:rPr>
-        <w:t>5 – Prenotazione di una copia</w:t>
-      </w:r>
-    </w:p>
-    <w:p>
-      <w:pPr>
-        <w:jc w:val="both"/>
-        <w:rPr>
-          <w:rFonts w:asciiTheme="minorHAnsi" w:hAnsiTheme="minorHAnsi"/>
-        </w:rPr>
-      </w:pPr>
-      <w:r>
-        <w:rPr>
-          <w:rFonts w:asciiTheme="minorHAnsi" w:hAnsiTheme="minorHAnsi"/>
-        </w:rPr>
-        <w:t>Un lettore autenticato deve poter richiedere una prenotazione di una copia disponibile di un</w:t>
-      </w:r>
-      <w:r>
-        <w:rPr>
-          <w:rFonts w:asciiTheme="minorHAnsi" w:hAnsiTheme="minorHAnsi"/>
-        </w:rPr>
-        <w:t xml:space="preserve">’edizione </w:t>
-      </w:r>
-      <w:r>
-        <w:rPr>
-          <w:rFonts w:asciiTheme="minorHAnsi" w:hAnsiTheme="minorHAnsi"/>
-        </w:rPr>
-        <w:t>presente nel catalogo, nel rispetto dei vincoli stabiliti dalla biblioteca come ad esempio assenza di sospensioni, numero massimo di prenotazioni.</w:t>
-      </w:r>
-    </w:p>
-    <w:p>
-      <w:pPr>
-        <w:jc w:val="both"/>
-        <w:rPr>
-          <w:rFonts w:asciiTheme="minorHAnsi" w:hAnsiTheme="minorHAnsi"/>
-        </w:rPr>
-      </w:pPr>
-    </w:p>
-    <w:p>
-      <w:pPr>
-        <w:jc w:val="both"/>
+      </w:pPr>
+      <w:r>
         <w:rPr>
           <w:rFonts w:asciiTheme="minorHAnsi" w:hAnsiTheme="minorHAnsi"/>
           <w:b/>
           <w:bCs/>
         </w:rPr>
-      </w:pPr>
+        <w:t>FR6</w:t>
+      </w:r>
       <w:r>
         <w:rPr>
           <w:rFonts w:asciiTheme="minorHAnsi" w:hAnsiTheme="minorHAnsi"/>
           <w:b/>
           <w:bCs/>
         </w:rPr>
-        <w:t>FR</w:t>
-      </w:r>
-      <w:r>
+        <w:t xml:space="preserve"> – Prenotazione di una copia</w:t>
+      </w:r>
+    </w:p>
+    <w:p>
+      <w:pPr>
+        <w:jc w:val="both"/>
+        <w:rPr>
+          <w:rFonts w:asciiTheme="minorHAnsi" w:hAnsiTheme="minorHAnsi"/>
+        </w:rPr>
+      </w:pPr>
+      <w:r>
+        <w:rPr>
+          <w:rFonts w:asciiTheme="minorHAnsi" w:hAnsiTheme="minorHAnsi"/>
+        </w:rPr>
+        <w:t>Un lettore autenticato deve poter richiedere una prenotazione di una copia disponibile di un</w:t>
+      </w:r>
+      <w:r>
+        <w:rPr>
+          <w:rFonts w:asciiTheme="minorHAnsi" w:hAnsiTheme="minorHAnsi"/>
+        </w:rPr>
+        <w:t xml:space="preserve">’edizione </w:t>
+      </w:r>
+      <w:r>
+        <w:rPr>
+          <w:rFonts w:asciiTheme="minorHAnsi" w:hAnsiTheme="minorHAnsi"/>
+        </w:rPr>
+        <w:t>presente nel catalogo, nel rispetto dei vincoli stabiliti dalla biblioteca come ad esempio assenza di sospensioni, numero massimo di prenotazioni.</w:t>
+      </w:r>
+    </w:p>
+    <w:p>
+      <w:pPr>
+        <w:jc w:val="both"/>
+        <w:rPr>
+          <w:rFonts w:asciiTheme="minorHAnsi" w:hAnsiTheme="minorHAnsi"/>
+        </w:rPr>
+      </w:pPr>
+    </w:p>
+    <w:p>
+      <w:pPr>
+        <w:jc w:val="both"/>
         <w:rPr>
           <w:rFonts w:asciiTheme="minorHAnsi" w:hAnsiTheme="minorHAnsi"/>
           <w:b/>
           <w:bCs/>
         </w:rPr>
-        <w:t>6 – Visualizzazione e gestione delle prenotazioni</w:t>
-      </w:r>
-    </w:p>
-    <w:p>
-      <w:pPr>
-        <w:jc w:val="both"/>
-        <w:rPr>
-          <w:rFonts w:asciiTheme="minorHAnsi" w:hAnsiTheme="minorHAnsi"/>
-        </w:rPr>
-      </w:pPr>
-      <w:r>
-        <w:rPr>
-          <w:rFonts w:asciiTheme="minorHAnsi" w:hAnsiTheme="minorHAnsi"/>
-        </w:rPr>
-        <w:t>Un lettore autenticato deve poter visualizzare e annullare le proprie prenotazioni attive, rendendo nuovamente disponibile la copia riservata dopo l’annullamento.</w:t>
-      </w:r>
-    </w:p>
-    <w:p>
-      <w:pPr>
-        <w:jc w:val="both"/>
-        <w:rPr>
-          <w:rFonts w:asciiTheme="minorHAnsi" w:hAnsiTheme="minorHAnsi"/>
-        </w:rPr>
-      </w:pPr>
-    </w:p>
-    <w:p>
-      <w:pPr>
-        <w:jc w:val="both"/>
+      </w:pPr>
+      <w:r>
         <w:rPr>
           <w:rFonts w:asciiTheme="minorHAnsi" w:hAnsiTheme="minorHAnsi"/>
           <w:b/>
           <w:bCs/>
         </w:rPr>
-      </w:pPr>
+        <w:t>FR7</w:t>
+      </w:r>
       <w:r>
         <w:rPr>
           <w:rFonts w:asciiTheme="minorHAnsi" w:hAnsiTheme="minorHAnsi"/>
           <w:b/>
           <w:bCs/>
         </w:rPr>
-        <w:t>FR</w:t>
-      </w:r>
-      <w:r>
+        <w:t xml:space="preserve"> – Visualizzazione e gestione delle prenotazioni</w:t>
+      </w:r>
+    </w:p>
+    <w:p>
+      <w:pPr>
+        <w:jc w:val="both"/>
+        <w:rPr>
+          <w:rFonts w:asciiTheme="minorHAnsi" w:hAnsiTheme="minorHAnsi"/>
+        </w:rPr>
+      </w:pPr>
+      <w:r>
+        <w:rPr>
+          <w:rFonts w:asciiTheme="minorHAnsi" w:hAnsiTheme="minorHAnsi"/>
+        </w:rPr>
+        <w:t>Un lettore autenticato deve poter visualizzare e annullare le proprie prenotazioni attive, rendendo nuovamente disponibile la copia riservata dopo l’annullamento.</w:t>
+      </w:r>
+    </w:p>
+    <w:p>
+      <w:pPr>
+        <w:jc w:val="both"/>
+        <w:rPr>
+          <w:rFonts w:asciiTheme="minorHAnsi" w:hAnsiTheme="minorHAnsi"/>
+        </w:rPr>
+      </w:pPr>
+    </w:p>
+    <w:p>
+      <w:pPr>
+        <w:jc w:val="both"/>
         <w:rPr>
           <w:rFonts w:asciiTheme="minorHAnsi" w:hAnsiTheme="minorHAnsi"/>
           <w:b/>
           <w:bCs/>
         </w:rPr>
-        <w:t>7 – Ricerca delle informazioni di un lettore</w:t>
-      </w:r>
-    </w:p>
-    <w:p>
-      <w:pPr>
-        <w:jc w:val="both"/>
-        <w:rPr>
-          <w:rFonts w:asciiTheme="minorHAnsi" w:hAnsiTheme="minorHAnsi"/>
-        </w:rPr>
-      </w:pPr>
-      <w:r>
-        <w:rPr>
-          <w:rFonts w:asciiTheme="minorHAnsi" w:hAnsiTheme="minorHAnsi"/>
-        </w:rPr>
-        <w:t>Un operatore deve poter ricercare un lettore tramite codice fiscale e visualizzarne le prenotazioni attive, lo storico dei prestiti e delle restituzioni e lo storico delle sospensioni.</w:t>
-      </w:r>
-    </w:p>
-    <w:p>
-      <w:pPr>
-        <w:jc w:val="both"/>
-        <w:rPr>
-          <w:rFonts w:asciiTheme="minorHAnsi" w:hAnsiTheme="minorHAnsi"/>
-        </w:rPr>
-      </w:pPr>
-    </w:p>
-    <w:p>
-      <w:pPr>
-        <w:jc w:val="both"/>
+      </w:pPr>
+      <w:r>
         <w:rPr>
           <w:rFonts w:asciiTheme="minorHAnsi" w:hAnsiTheme="minorHAnsi"/>
           <w:b/>
           <w:bCs/>
         </w:rPr>
-      </w:pPr>
+        <w:t>FR8</w:t>
+      </w:r>
       <w:r>
         <w:rPr>
           <w:rFonts w:asciiTheme="minorHAnsi" w:hAnsiTheme="minorHAnsi"/>
           <w:b/>
           <w:bCs/>
         </w:rPr>
-        <w:t>FR</w:t>
-      </w:r>
-      <w:r>
+        <w:t xml:space="preserve"> – Ricerca delle informazioni di un lettore</w:t>
+      </w:r>
+    </w:p>
+    <w:p>
+      <w:pPr>
+        <w:jc w:val="both"/>
+        <w:rPr>
+          <w:rFonts w:asciiTheme="minorHAnsi" w:hAnsiTheme="minorHAnsi"/>
+        </w:rPr>
+      </w:pPr>
+      <w:r>
+        <w:rPr>
+          <w:rFonts w:asciiTheme="minorHAnsi" w:hAnsiTheme="minorHAnsi"/>
+        </w:rPr>
+        <w:t xml:space="preserve">Un operatore deve poter ricercare un lettore tramite codice fiscale e visualizzarne le </w:t>
+      </w:r>
+      <w:r>
+        <w:rPr>
+          <w:rFonts w:asciiTheme="minorHAnsi" w:hAnsiTheme="minorHAnsi"/>
+        </w:rPr>
+        <w:lastRenderedPageBreak/>
+        <w:t>prenotazioni attive, lo storico dei prestiti e delle restituzioni e lo storico delle sospensioni.</w:t>
+      </w:r>
+    </w:p>
+    <w:p>
+      <w:pPr>
+        <w:jc w:val="both"/>
+        <w:rPr>
+          <w:rFonts w:asciiTheme="minorHAnsi" w:hAnsiTheme="minorHAnsi"/>
+        </w:rPr>
+      </w:pPr>
+    </w:p>
+    <w:p>
+      <w:pPr>
+        <w:jc w:val="both"/>
         <w:rPr>
           <w:rFonts w:asciiTheme="minorHAnsi" w:hAnsiTheme="minorHAnsi"/>
           <w:b/>
           <w:bCs/>
         </w:rPr>
-        <w:t>8 – Registrazione del prestito</w:t>
-      </w:r>
-    </w:p>
-    <w:p>
-      <w:pPr>
-        <w:jc w:val="both"/>
-        <w:rPr>
-          <w:rFonts w:asciiTheme="minorHAnsi" w:hAnsiTheme="minorHAnsi"/>
-        </w:rPr>
-      </w:pPr>
-      <w:r>
-        <w:rPr>
-          <w:rFonts w:asciiTheme="minorHAnsi" w:hAnsiTheme="minorHAnsi"/>
-        </w:rPr>
-        <w:t>Un operatore deve poter registrare il prestito di una copia a un lettore verificando la</w:t>
-      </w:r>
-      <w:r>
-        <w:rPr>
-          <w:rFonts w:asciiTheme="minorHAnsi" w:hAnsiTheme="minorHAnsi"/>
-        </w:rPr>
-        <w:t xml:space="preserve"> </w:t>
-      </w:r>
-      <w:r>
-        <w:rPr>
-          <w:rFonts w:asciiTheme="minorHAnsi" w:hAnsiTheme="minorHAnsi"/>
-        </w:rPr>
-        <w:t>disponibilità della copia e l'assenza di sospensioni.</w:t>
-      </w:r>
-    </w:p>
-    <w:p>
-      <w:pPr>
-        <w:jc w:val="both"/>
-        <w:rPr>
-          <w:rFonts w:asciiTheme="minorHAnsi" w:hAnsiTheme="minorHAnsi"/>
-        </w:rPr>
-      </w:pPr>
-      <w:r>
-        <w:rPr>
-          <w:rFonts w:asciiTheme="minorHAnsi" w:hAnsiTheme="minorHAnsi"/>
-        </w:rPr>
-        <w:lastRenderedPageBreak/>
-        <w:t>In caso di prenotazione online, il sistema deve verificare che la prenotazione sia attiva e associata al lettore e alla copia da consegnare.</w:t>
-      </w:r>
-    </w:p>
-    <w:p>
-      <w:pPr>
-        <w:jc w:val="both"/>
-        <w:rPr>
-          <w:rFonts w:asciiTheme="minorHAnsi" w:hAnsiTheme="minorHAnsi"/>
-        </w:rPr>
-      </w:pPr>
-      <w:r>
-        <w:rPr>
-          <w:rFonts w:asciiTheme="minorHAnsi" w:hAnsiTheme="minorHAnsi"/>
-        </w:rPr>
-        <w:t>Se le condizioni sono soddisfatte, il sistema deve registrare il prestito, aggiornare il catalogo e registrare la data di restituzione</w:t>
-      </w:r>
-      <w:r>
-        <w:rPr>
-          <w:rFonts w:asciiTheme="minorHAnsi" w:hAnsiTheme="minorHAnsi"/>
-        </w:rPr>
-        <w:t xml:space="preserve"> prevista</w:t>
-      </w:r>
-      <w:r>
-        <w:rPr>
-          <w:rFonts w:asciiTheme="minorHAnsi" w:hAnsiTheme="minorHAnsi"/>
-        </w:rPr>
-        <w:t>, scelta dall’operatore sulla base delle regole della biblioteca.</w:t>
-      </w:r>
-    </w:p>
-    <w:p>
-      <w:pPr>
-        <w:rPr>
-          <w:rFonts w:asciiTheme="minorHAnsi" w:hAnsiTheme="minorHAnsi"/>
-        </w:rPr>
-      </w:pPr>
-    </w:p>
-    <w:p>
-      <w:pPr>
-        <w:jc w:val="both"/>
+      </w:pPr>
+      <w:r>
         <w:rPr>
           <w:rFonts w:asciiTheme="minorHAnsi" w:hAnsiTheme="minorHAnsi"/>
           <w:b/>
           <w:bCs/>
         </w:rPr>
-      </w:pPr>
+        <w:t>FR9</w:t>
+      </w:r>
       <w:r>
         <w:rPr>
           <w:rFonts w:asciiTheme="minorHAnsi" w:hAnsiTheme="minorHAnsi"/>
           <w:b/>
           <w:bCs/>
         </w:rPr>
-        <w:t>FR</w:t>
-      </w:r>
-      <w:r>
+        <w:t xml:space="preserve"> – Registrazione del prestito</w:t>
+      </w:r>
+    </w:p>
+    <w:p>
+      <w:pPr>
+        <w:jc w:val="both"/>
+        <w:rPr>
+          <w:rFonts w:asciiTheme="minorHAnsi" w:hAnsiTheme="minorHAnsi"/>
+        </w:rPr>
+      </w:pPr>
+      <w:r>
+        <w:rPr>
+          <w:rFonts w:asciiTheme="minorHAnsi" w:hAnsiTheme="minorHAnsi"/>
+        </w:rPr>
+        <w:t>Un operatore deve poter registrare il prestito di una copia a un lettore verificando la</w:t>
+      </w:r>
+      <w:r>
+        <w:rPr>
+          <w:rFonts w:asciiTheme="minorHAnsi" w:hAnsiTheme="minorHAnsi"/>
+        </w:rPr>
+        <w:t xml:space="preserve"> </w:t>
+      </w:r>
+      <w:r>
+        <w:rPr>
+          <w:rFonts w:asciiTheme="minorHAnsi" w:hAnsiTheme="minorHAnsi"/>
+        </w:rPr>
+        <w:t>disponibilità della copia e l'assenza di sospensioni.</w:t>
+      </w:r>
+    </w:p>
+    <w:p>
+      <w:pPr>
+        <w:jc w:val="both"/>
+        <w:rPr>
+          <w:rFonts w:asciiTheme="minorHAnsi" w:hAnsiTheme="minorHAnsi"/>
+        </w:rPr>
+      </w:pPr>
+      <w:r>
+        <w:rPr>
+          <w:rFonts w:asciiTheme="minorHAnsi" w:hAnsiTheme="minorHAnsi"/>
+        </w:rPr>
+        <w:t>In caso di prenotazione online, il sistema deve verificare che la prenotazione sia attiva e associata al lettore e alla copia da consegnare.</w:t>
+      </w:r>
+    </w:p>
+    <w:p>
+      <w:pPr>
+        <w:jc w:val="both"/>
+        <w:rPr>
+          <w:rFonts w:asciiTheme="minorHAnsi" w:hAnsiTheme="minorHAnsi"/>
+        </w:rPr>
+      </w:pPr>
+      <w:r>
+        <w:rPr>
+          <w:rFonts w:asciiTheme="minorHAnsi" w:hAnsiTheme="minorHAnsi"/>
+        </w:rPr>
+        <w:t>Se le condizioni sono soddisfatte, il sistema deve registrare il prestito, aggiornare il catalogo e registrare la data di restituzione</w:t>
+      </w:r>
+      <w:r>
+        <w:rPr>
+          <w:rFonts w:asciiTheme="minorHAnsi" w:hAnsiTheme="minorHAnsi"/>
+        </w:rPr>
+        <w:t xml:space="preserve"> prevista</w:t>
+      </w:r>
+      <w:r>
+        <w:rPr>
+          <w:rFonts w:asciiTheme="minorHAnsi" w:hAnsiTheme="minorHAnsi"/>
+        </w:rPr>
+        <w:t>, scelta dall’operatore sulla base delle regole della biblioteca.</w:t>
+      </w:r>
+    </w:p>
+    <w:p>
+      <w:pPr>
+        <w:rPr>
+          <w:rFonts w:asciiTheme="minorHAnsi" w:hAnsiTheme="minorHAnsi"/>
+        </w:rPr>
+      </w:pPr>
+    </w:p>
+    <w:p>
+      <w:pPr>
+        <w:jc w:val="both"/>
         <w:rPr>
           <w:rFonts w:asciiTheme="minorHAnsi" w:hAnsiTheme="minorHAnsi"/>
           <w:b/>
           <w:bCs/>
         </w:rPr>
-        <w:t>9 – Registrazione della restituzione</w:t>
-      </w:r>
-    </w:p>
-    <w:p>
-      <w:pPr>
-        <w:jc w:val="both"/>
-        <w:rPr>
-          <w:rFonts w:asciiTheme="minorHAnsi" w:hAnsiTheme="minorHAnsi"/>
-        </w:rPr>
-      </w:pPr>
-      <w:r>
-        <w:rPr>
-          <w:rFonts w:asciiTheme="minorHAnsi" w:hAnsiTheme="minorHAnsi"/>
-        </w:rPr>
-        <w:t>Un operatore deve poter registrare una restituzione di una copia del libro, verificando l'esistenza di un prestito corrispondente e segnalando eventuali ritardi rispetto alla data di restituzione prevista.</w:t>
-      </w:r>
-    </w:p>
-    <w:p>
-      <w:pPr>
-        <w:jc w:val="both"/>
-        <w:rPr>
-          <w:rFonts w:asciiTheme="minorHAnsi" w:hAnsiTheme="minorHAnsi"/>
-        </w:rPr>
-      </w:pPr>
-    </w:p>
-    <w:p>
-      <w:pPr>
-        <w:jc w:val="both"/>
+      </w:pPr>
+      <w:r>
         <w:rPr>
           <w:rFonts w:asciiTheme="minorHAnsi" w:hAnsiTheme="minorHAnsi"/>
           <w:b/>
           <w:bCs/>
         </w:rPr>
-      </w:pPr>
+        <w:t>FR10</w:t>
+      </w:r>
       <w:r>
         <w:rPr>
           <w:rFonts w:asciiTheme="minorHAnsi" w:hAnsiTheme="minorHAnsi"/>
           <w:b/>
           <w:bCs/>
         </w:rPr>
-        <w:t>FR</w:t>
-      </w:r>
-      <w:r>
+        <w:t xml:space="preserve"> – Registrazione della restituzione</w:t>
+      </w:r>
+    </w:p>
+    <w:p>
+      <w:pPr>
+        <w:jc w:val="both"/>
+        <w:rPr>
+          <w:rFonts w:asciiTheme="minorHAnsi" w:hAnsiTheme="minorHAnsi"/>
+        </w:rPr>
+      </w:pPr>
+      <w:r>
+        <w:rPr>
+          <w:rFonts w:asciiTheme="minorHAnsi" w:hAnsiTheme="minorHAnsi"/>
+        </w:rPr>
+        <w:t>Un operatore deve poter registrare una restituzione di una copia del libro, verificando l'esistenza di un prestito corrispondente e segnalando eventuali ritardi rispetto alla data di restituzione prevista.</w:t>
+      </w:r>
+    </w:p>
+    <w:p>
+      <w:pPr>
+        <w:jc w:val="both"/>
+        <w:rPr>
+          <w:rFonts w:asciiTheme="minorHAnsi" w:hAnsiTheme="minorHAnsi"/>
+        </w:rPr>
+      </w:pPr>
+    </w:p>
+    <w:p>
+      <w:pPr>
+        <w:jc w:val="both"/>
         <w:rPr>
           <w:rFonts w:asciiTheme="minorHAnsi" w:hAnsiTheme="minorHAnsi"/>
           <w:b/>
           <w:bCs/>
         </w:rPr>
-        <w:t>10 – Modifica del catalogo</w:t>
-      </w:r>
-    </w:p>
-    <w:p>
-      <w:pPr>
-        <w:jc w:val="both"/>
-        <w:rPr>
-          <w:rFonts w:asciiTheme="minorHAnsi" w:hAnsiTheme="minorHAnsi"/>
-        </w:rPr>
-      </w:pPr>
-      <w:r>
-        <w:rPr>
-          <w:rFonts w:asciiTheme="minorHAnsi" w:hAnsiTheme="minorHAnsi"/>
-        </w:rPr>
-        <w:t>Un operatore deve poter modificare il catalogo, aggiungendo o rimuovendo copie</w:t>
-      </w:r>
-      <w:r>
-        <w:rPr>
-          <w:rFonts w:asciiTheme="minorHAnsi" w:hAnsiTheme="minorHAnsi"/>
-        </w:rPr>
-        <w:t xml:space="preserve"> e aggiungendo o modificando edizioni,</w:t>
-      </w:r>
-      <w:r>
-        <w:rPr>
-          <w:rFonts w:asciiTheme="minorHAnsi" w:hAnsiTheme="minorHAnsi"/>
-        </w:rPr>
-        <w:t xml:space="preserve"> mantenendo aggiornate le informazioni consultabili.</w:t>
-      </w:r>
-    </w:p>
-    <w:p>
-      <w:pPr>
-        <w:jc w:val="both"/>
-        <w:rPr>
-          <w:rFonts w:asciiTheme="minorHAnsi" w:hAnsiTheme="minorHAnsi"/>
-        </w:rPr>
-      </w:pPr>
-    </w:p>
-    <w:p>
-      <w:pPr>
-        <w:jc w:val="both"/>
+      </w:pPr>
+      <w:r>
         <w:rPr>
           <w:rFonts w:asciiTheme="minorHAnsi" w:hAnsiTheme="minorHAnsi"/>
           <w:b/>
           <w:bCs/>
         </w:rPr>
-      </w:pPr>
+        <w:t>FR</w:t>
+      </w:r>
       <w:r>
         <w:rPr>
           <w:rFonts w:asciiTheme="minorHAnsi" w:hAnsiTheme="minorHAnsi"/>
           <w:b/>
           <w:bCs/>
         </w:rPr>
-        <w:t>FR</w:t>
+        <w:t>1</w:t>
       </w:r>
       <w:r>
         <w:rPr>
@@ -8233,7 +8778,7 @@
           <w:b/>
           <w:bCs/>
         </w:rPr>
-        <w:t>11 – Registrazione d</w:t>
+        <w:t>1</w:t>
       </w:r>
       <w:r>
         <w:rPr>
@@ -8241,7 +8786,7 @@
           <w:b/>
           <w:bCs/>
         </w:rPr>
-        <w:t xml:space="preserve">i una </w:t>
+        <w:t xml:space="preserve"> – </w:t>
       </w:r>
       <w:r>
         <w:rPr>
@@ -8249,69 +8794,27 @@
           <w:b/>
           <w:bCs/>
         </w:rPr>
-        <w:t>sospensione</w:t>
-      </w:r>
-    </w:p>
-    <w:p>
-      <w:pPr>
-        <w:jc w:val="both"/>
-        <w:rPr>
-          <w:rFonts w:asciiTheme="minorHAnsi" w:hAnsiTheme="minorHAnsi"/>
-        </w:rPr>
-      </w:pPr>
-      <w:r>
-        <w:rPr>
-          <w:rFonts w:asciiTheme="minorHAnsi" w:hAnsiTheme="minorHAnsi"/>
-        </w:rPr>
-        <w:t>Un operatore deve poter registrare una sospensione a un lettore, indicando data di inizio e durata, aggiungendola allo storico del lettore. Per tutta la durata della sospensione, il sistema deve impedire al lettore di effettuare prenotazioni e ottenere prestiti. Inoltre</w:t>
-      </w:r>
-      <w:r>
-        <w:rPr>
-          <w:rFonts w:asciiTheme="minorHAnsi" w:hAnsiTheme="minorHAnsi"/>
-        </w:rPr>
-        <w:t>, in caso di sospensione,</w:t>
-      </w:r>
-      <w:r>
-        <w:rPr>
-          <w:rFonts w:asciiTheme="minorHAnsi" w:hAnsiTheme="minorHAnsi"/>
-        </w:rPr>
-        <w:t xml:space="preserve"> </w:t>
-      </w:r>
-      <w:r>
-        <w:rPr>
-          <w:rFonts w:asciiTheme="minorHAnsi" w:hAnsiTheme="minorHAnsi"/>
-        </w:rPr>
-        <w:t xml:space="preserve">devono essere </w:t>
-      </w:r>
-      <w:r>
-        <w:rPr>
-          <w:rFonts w:asciiTheme="minorHAnsi" w:hAnsiTheme="minorHAnsi"/>
-        </w:rPr>
-        <w:t>annullate, se ci sono, tutte le prenotazion</w:t>
-      </w:r>
-      <w:r>
-        <w:rPr>
-          <w:rFonts w:asciiTheme="minorHAnsi" w:hAnsiTheme="minorHAnsi"/>
-        </w:rPr>
-        <w:t>i</w:t>
-      </w:r>
-      <w:r>
-        <w:rPr>
-          <w:rFonts w:asciiTheme="minorHAnsi" w:hAnsiTheme="minorHAnsi"/>
-        </w:rPr>
-        <w:t xml:space="preserve"> attive </w:t>
-      </w:r>
-      <w:r>
-        <w:rPr>
-          <w:rFonts w:asciiTheme="minorHAnsi" w:hAnsiTheme="minorHAnsi"/>
-        </w:rPr>
-        <w:t>di</w:t>
-      </w:r>
-      <w:r>
-        <w:rPr>
-          <w:rFonts w:asciiTheme="minorHAnsi" w:hAnsiTheme="minorHAnsi"/>
-        </w:rPr>
-        <w:t xml:space="preserve"> quel lettore.</w:t>
+        <w:t>Aggiunta e rimozione edizioni</w:t>
+      </w:r>
+    </w:p>
+    <w:p>
+      <w:pPr>
+        <w:jc w:val="both"/>
+        <w:rPr>
+          <w:rFonts w:asciiTheme="minorHAnsi" w:hAnsiTheme="minorHAnsi"/>
+        </w:rPr>
+      </w:pPr>
+      <w:r>
+        <w:rPr>
+          <w:rFonts w:asciiTheme="minorHAnsi" w:hAnsiTheme="minorHAnsi"/>
+        </w:rPr>
+        <w:t xml:space="preserve">Un operatore deve poter </w:t>
+      </w:r>
+      <w:r>
+        <w:rPr>
+          <w:rFonts w:asciiTheme="minorHAnsi" w:hAnsiTheme="minorHAnsi"/>
+        </w:rPr>
+        <w:t>aggiungere e rimuovere edizioni, mantenendo aggiornate le informazioni consultabili dal catalogo.</w:t>
       </w:r>
     </w:p>
     <w:p>
@@ -8337,7 +8840,7 @@
           <w:b/>
           <w:bCs/>
         </w:rPr>
-        <w:t>FR</w:t>
+        <w:t>FR1</w:t>
       </w:r>
       <w:r>
         <w:rPr>
@@ -8345,31 +8848,43 @@
           <w:b/>
           <w:bCs/>
         </w:rPr>
-        <w:t>12 – Annullamento di una sospensione</w:t>
-      </w:r>
-    </w:p>
-    <w:p>
-      <w:pPr>
-        <w:jc w:val="both"/>
-        <w:rPr>
-          <w:rFonts w:asciiTheme="minorHAnsi" w:hAnsiTheme="minorHAnsi"/>
-        </w:rPr>
-      </w:pPr>
-      <w:r>
-        <w:rPr>
-          <w:rFonts w:asciiTheme="minorHAnsi" w:hAnsiTheme="minorHAnsi"/>
-        </w:rPr>
-        <w:t>Un operatore deve poter annullare una sospesione a un lettore assegnata in precedenza.</w:t>
-      </w:r>
-    </w:p>
-    <w:p>
-      <w:pPr>
-        <w:jc w:val="both"/>
+        <w:t>2</w:t>
+      </w:r>
+      <w:r>
         <w:rPr>
           <w:rFonts w:asciiTheme="minorHAnsi" w:hAnsiTheme="minorHAnsi"/>
           <w:b/>
           <w:bCs/>
         </w:rPr>
+        <w:t xml:space="preserve"> – Aggiunta e resa inattiva delle copie</w:t>
+      </w:r>
+    </w:p>
+    <w:p>
+      <w:pPr>
+        <w:jc w:val="both"/>
+        <w:rPr>
+          <w:rFonts w:asciiTheme="minorHAnsi" w:hAnsiTheme="minorHAnsi"/>
+        </w:rPr>
+      </w:pPr>
+      <w:r>
+        <w:rPr>
+          <w:rFonts w:asciiTheme="minorHAnsi" w:hAnsiTheme="minorHAnsi"/>
+        </w:rPr>
+        <w:t xml:space="preserve">Un operatore deve poter </w:t>
+      </w:r>
+      <w:r>
+        <w:rPr>
+          <w:rFonts w:asciiTheme="minorHAnsi" w:hAnsiTheme="minorHAnsi"/>
+        </w:rPr>
+        <w:t>aggiungere e rendere inattive copie, mantenendo aggiornate le informazioni per ciascuna edizione.</w:t>
+      </w:r>
+    </w:p>
+    <w:p>
+      <w:pPr>
+        <w:jc w:val="both"/>
+        <w:rPr>
+          <w:rFonts w:asciiTheme="minorHAnsi" w:hAnsiTheme="minorHAnsi"/>
+        </w:rPr>
       </w:pPr>
     </w:p>
     <w:p>
@@ -8411,63 +8926,111 @@
           <w:b/>
           <w:bCs/>
         </w:rPr>
-        <w:t xml:space="preserve"> – Modifica informazioni lettore registrato</w:t>
-      </w:r>
-    </w:p>
-    <w:p>
-      <w:pPr>
-        <w:jc w:val="both"/>
-        <w:rPr>
-          <w:rFonts w:asciiTheme="minorHAnsi" w:hAnsiTheme="minorHAnsi"/>
-        </w:rPr>
-      </w:pPr>
-      <w:r>
-        <w:rPr>
-          <w:rFonts w:asciiTheme="minorHAnsi" w:hAnsiTheme="minorHAnsi"/>
-        </w:rPr>
-        <w:t>Il sistema deve consentire ad un operatore di modificare nome, cognome ed e-mail di un lettore registrato.</w:t>
-      </w:r>
-    </w:p>
-    <w:p>
-      <w:pPr>
-        <w:jc w:val="both"/>
-        <w:rPr>
-          <w:rFonts w:asciiTheme="minorHAnsi" w:hAnsiTheme="minorHAnsi"/>
-        </w:rPr>
-      </w:pPr>
-    </w:p>
-    <w:p>
-      <w:pPr>
-        <w:jc w:val="both"/>
+        <w:t xml:space="preserve"> – Registrazione d</w:t>
+      </w:r>
+      <w:r>
         <w:rPr>
           <w:rFonts w:asciiTheme="minorHAnsi" w:hAnsiTheme="minorHAnsi"/>
           <w:b/>
           <w:bCs/>
         </w:rPr>
-      </w:pPr>
+        <w:t xml:space="preserve">i una </w:t>
+      </w:r>
       <w:r>
         <w:rPr>
           <w:rFonts w:asciiTheme="minorHAnsi" w:hAnsiTheme="minorHAnsi"/>
           <w:b/>
           <w:bCs/>
         </w:rPr>
-        <w:t>FR</w:t>
-      </w:r>
-      <w:r>
+        <w:t>sospensione</w:t>
+      </w:r>
+    </w:p>
+    <w:p>
+      <w:pPr>
+        <w:jc w:val="both"/>
+        <w:rPr>
+          <w:rFonts w:asciiTheme="minorHAnsi" w:hAnsiTheme="minorHAnsi"/>
+        </w:rPr>
+      </w:pPr>
+      <w:r>
+        <w:rPr>
+          <w:rFonts w:asciiTheme="minorHAnsi" w:hAnsiTheme="minorHAnsi"/>
+        </w:rPr>
+        <w:t>Un operatore deve poter registrare una sospensione a un lettore, indicando data di inizio e durata, aggiungendola allo storico del lettore. Per tutta la durata della sospensione, il sistema deve impedire al lettore di effettuare prenotazioni e ottenere prestiti. Inoltre</w:t>
+      </w:r>
+      <w:r>
+        <w:rPr>
+          <w:rFonts w:asciiTheme="minorHAnsi" w:hAnsiTheme="minorHAnsi"/>
+        </w:rPr>
+        <w:t>, in caso di sospensione,</w:t>
+      </w:r>
+      <w:r>
+        <w:rPr>
+          <w:rFonts w:asciiTheme="minorHAnsi" w:hAnsiTheme="minorHAnsi"/>
+        </w:rPr>
+        <w:t xml:space="preserve"> </w:t>
+      </w:r>
+      <w:r>
+        <w:rPr>
+          <w:rFonts w:asciiTheme="minorHAnsi" w:hAnsiTheme="minorHAnsi"/>
+        </w:rPr>
+        <w:t xml:space="preserve">devono essere </w:t>
+      </w:r>
+      <w:r>
+        <w:rPr>
+          <w:rFonts w:asciiTheme="minorHAnsi" w:hAnsiTheme="minorHAnsi"/>
+        </w:rPr>
+        <w:t>annullate, se ci sono, tutte le prenotazion</w:t>
+      </w:r>
+      <w:r>
+        <w:rPr>
+          <w:rFonts w:asciiTheme="minorHAnsi" w:hAnsiTheme="minorHAnsi"/>
+        </w:rPr>
+        <w:t>i</w:t>
+      </w:r>
+      <w:r>
+        <w:rPr>
+          <w:rFonts w:asciiTheme="minorHAnsi" w:hAnsiTheme="minorHAnsi"/>
+        </w:rPr>
+        <w:t xml:space="preserve"> attive </w:t>
+      </w:r>
+      <w:r>
+        <w:rPr>
+          <w:rFonts w:asciiTheme="minorHAnsi" w:hAnsiTheme="minorHAnsi"/>
+        </w:rPr>
+        <w:t>di</w:t>
+      </w:r>
+      <w:r>
+        <w:rPr>
+          <w:rFonts w:asciiTheme="minorHAnsi" w:hAnsiTheme="minorHAnsi"/>
+        </w:rPr>
+        <w:t xml:space="preserve"> quel lettore.</w:t>
+      </w:r>
+    </w:p>
+    <w:p>
+      <w:pPr>
+        <w:jc w:val="both"/>
+        <w:rPr>
+          <w:rFonts w:asciiTheme="minorHAnsi" w:hAnsiTheme="minorHAnsi"/>
+        </w:rPr>
+      </w:pPr>
+    </w:p>
+    <w:p>
+      <w:pPr>
+        <w:jc w:val="both"/>
         <w:rPr>
           <w:rFonts w:asciiTheme="minorHAnsi" w:hAnsiTheme="minorHAnsi"/>
           <w:b/>
           <w:bCs/>
         </w:rPr>
-        <w:t>1</w:t>
-      </w:r>
+      </w:pPr>
       <w:r>
         <w:rPr>
           <w:rFonts w:asciiTheme="minorHAnsi" w:hAnsiTheme="minorHAnsi"/>
           <w:b/>
           <w:bCs/>
         </w:rPr>
-        <w:t xml:space="preserve">4 </w:t>
+        <w:t>FR</w:t>
       </w:r>
       <w:r>
         <w:rPr>
@@ -8475,62 +9038,224 @@
           <w:b/>
           <w:bCs/>
         </w:rPr>
-        <w:t>– Reset della password</w:t>
-      </w:r>
-    </w:p>
-    <w:p>
-      <w:pPr>
-        <w:jc w:val="both"/>
-        <w:rPr>
-          <w:rFonts w:asciiTheme="minorHAnsi" w:hAnsiTheme="minorHAnsi"/>
-        </w:rPr>
-      </w:pPr>
-      <w:r>
-        <w:rPr>
-          <w:rFonts w:asciiTheme="minorHAnsi" w:hAnsiTheme="minorHAnsi"/>
-        </w:rPr>
-        <w:t>Il sistema deve consentire ad un operatore di resettare la password dell’account di un lettore registrato. Assegnando una nuova password temporanea.</w:t>
-      </w:r>
-    </w:p>
-    <w:p>
-      <w:pPr>
-        <w:jc w:val="both"/>
-        <w:rPr>
-          <w:rFonts w:asciiTheme="minorHAnsi" w:hAnsiTheme="minorHAnsi"/>
-        </w:rPr>
-      </w:pPr>
-    </w:p>
-    <w:p>
-      <w:pPr>
-        <w:jc w:val="both"/>
+        <w:t>1</w:t>
+      </w:r>
+      <w:r>
         <w:rPr>
           <w:rFonts w:asciiTheme="minorHAnsi" w:hAnsiTheme="minorHAnsi"/>
           <w:b/>
           <w:bCs/>
         </w:rPr>
-      </w:pPr>
+        <w:t>4</w:t>
+      </w:r>
       <w:r>
         <w:rPr>
           <w:rFonts w:asciiTheme="minorHAnsi" w:hAnsiTheme="minorHAnsi"/>
           <w:b/>
           <w:bCs/>
         </w:rPr>
-        <w:t>FR</w:t>
-      </w:r>
-      <w:r>
+        <w:t xml:space="preserve"> – Annullamento di una sospensione</w:t>
+      </w:r>
+    </w:p>
+    <w:p>
+      <w:pPr>
+        <w:jc w:val="both"/>
+        <w:rPr>
+          <w:rFonts w:asciiTheme="minorHAnsi" w:hAnsiTheme="minorHAnsi"/>
+        </w:rPr>
+      </w:pPr>
+      <w:r>
+        <w:rPr>
+          <w:rFonts w:asciiTheme="minorHAnsi" w:hAnsiTheme="minorHAnsi"/>
+        </w:rPr>
+        <w:t>Un operatore deve poter annullare una sospensione a un lettore assegnata in precedenza.</w:t>
+      </w:r>
+    </w:p>
+    <w:p>
+      <w:pPr>
+        <w:jc w:val="both"/>
         <w:rPr>
           <w:rFonts w:asciiTheme="minorHAnsi" w:hAnsiTheme="minorHAnsi"/>
           <w:b/>
           <w:bCs/>
         </w:rPr>
-        <w:t>15 – Cancellazione automatica delle prenotazioni</w:t>
-      </w:r>
-      <w:r>
+      </w:pPr>
+    </w:p>
+    <w:p>
+      <w:pPr>
+        <w:jc w:val="both"/>
         <w:rPr>
           <w:rFonts w:asciiTheme="minorHAnsi" w:hAnsiTheme="minorHAnsi"/>
           <w:b/>
           <w:bCs/>
         </w:rPr>
+      </w:pPr>
+      <w:r>
+        <w:rPr>
+          <w:rFonts w:asciiTheme="minorHAnsi" w:hAnsiTheme="minorHAnsi"/>
+          <w:b/>
+          <w:bCs/>
+        </w:rPr>
+        <w:t>FR</w:t>
+      </w:r>
+      <w:r>
+        <w:rPr>
+          <w:rFonts w:asciiTheme="minorHAnsi" w:hAnsiTheme="minorHAnsi"/>
+          <w:b/>
+          <w:bCs/>
+        </w:rPr>
+        <w:t>1</w:t>
+      </w:r>
+      <w:r>
+        <w:rPr>
+          <w:rFonts w:asciiTheme="minorHAnsi" w:hAnsiTheme="minorHAnsi"/>
+          <w:b/>
+          <w:bCs/>
+        </w:rPr>
+        <w:t>5</w:t>
+      </w:r>
+      <w:r>
+        <w:rPr>
+          <w:rFonts w:asciiTheme="minorHAnsi" w:hAnsiTheme="minorHAnsi"/>
+          <w:b/>
+          <w:bCs/>
+        </w:rPr>
+        <w:t xml:space="preserve"> – Modifica informazioni lettore registrato</w:t>
+      </w:r>
+    </w:p>
+    <w:p>
+      <w:pPr>
+        <w:jc w:val="both"/>
+        <w:rPr>
+          <w:rFonts w:asciiTheme="minorHAnsi" w:hAnsiTheme="minorHAnsi"/>
+        </w:rPr>
+      </w:pPr>
+      <w:r>
+        <w:rPr>
+          <w:rFonts w:asciiTheme="minorHAnsi" w:hAnsiTheme="minorHAnsi"/>
+        </w:rPr>
+        <w:t>Il sistema deve consentire ad un operatore di modificare nome, cognome ed e-mail di un lettore registrato.</w:t>
+      </w:r>
+    </w:p>
+    <w:p>
+      <w:pPr>
+        <w:jc w:val="both"/>
+        <w:rPr>
+          <w:rFonts w:asciiTheme="minorHAnsi" w:hAnsiTheme="minorHAnsi"/>
+        </w:rPr>
+      </w:pPr>
+    </w:p>
+    <w:p>
+      <w:pPr>
+        <w:jc w:val="both"/>
+        <w:rPr>
+          <w:rFonts w:asciiTheme="minorHAnsi" w:hAnsiTheme="minorHAnsi"/>
+          <w:b/>
+          <w:bCs/>
+        </w:rPr>
+      </w:pPr>
+      <w:r>
+        <w:rPr>
+          <w:rFonts w:asciiTheme="minorHAnsi" w:hAnsiTheme="minorHAnsi"/>
+          <w:b/>
+          <w:bCs/>
+        </w:rPr>
+        <w:t>FR</w:t>
+      </w:r>
+      <w:r>
+        <w:rPr>
+          <w:rFonts w:asciiTheme="minorHAnsi" w:hAnsiTheme="minorHAnsi"/>
+          <w:b/>
+          <w:bCs/>
+        </w:rPr>
+        <w:t>1</w:t>
+      </w:r>
+      <w:r>
+        <w:rPr>
+          <w:rFonts w:asciiTheme="minorHAnsi" w:hAnsiTheme="minorHAnsi"/>
+          <w:b/>
+          <w:bCs/>
+        </w:rPr>
+        <w:t xml:space="preserve">6 </w:t>
+      </w:r>
+      <w:r>
+        <w:rPr>
+          <w:rFonts w:asciiTheme="minorHAnsi" w:hAnsiTheme="minorHAnsi"/>
+          <w:b/>
+          <w:bCs/>
+        </w:rPr>
+        <w:t>– Reset della password</w:t>
+      </w:r>
+    </w:p>
+    <w:p>
+      <w:pPr>
+        <w:jc w:val="both"/>
+        <w:rPr>
+          <w:rFonts w:asciiTheme="minorHAnsi" w:hAnsiTheme="minorHAnsi"/>
+        </w:rPr>
+      </w:pPr>
+      <w:r>
+        <w:rPr>
+          <w:rFonts w:asciiTheme="minorHAnsi" w:hAnsiTheme="minorHAnsi"/>
+        </w:rPr>
+        <w:t>Il sistema deve consentire ad un operatore di resettare la password dell’account di un lettore registrato, assegnando una nuova password temporanea.</w:t>
+      </w:r>
+    </w:p>
+    <w:p>
+      <w:pPr>
+        <w:jc w:val="both"/>
+        <w:rPr>
+          <w:rFonts w:asciiTheme="minorHAnsi" w:hAnsiTheme="minorHAnsi"/>
+        </w:rPr>
+      </w:pPr>
+    </w:p>
+    <w:p>
+      <w:pPr>
+        <w:jc w:val="both"/>
+        <w:rPr>
+          <w:rFonts w:asciiTheme="minorHAnsi" w:hAnsiTheme="minorHAnsi"/>
+          <w:b/>
+          <w:bCs/>
+        </w:rPr>
+      </w:pPr>
+      <w:r>
+        <w:rPr>
+          <w:rFonts w:asciiTheme="minorHAnsi" w:hAnsiTheme="minorHAnsi"/>
+          <w:b/>
+          <w:bCs/>
+        </w:rPr>
+        <w:t>FR</w:t>
+      </w:r>
+      <w:r>
+        <w:rPr>
+          <w:rFonts w:asciiTheme="minorHAnsi" w:hAnsiTheme="minorHAnsi"/>
+          <w:b/>
+          <w:bCs/>
+        </w:rPr>
+        <w:t>1</w:t>
+      </w:r>
+      <w:r>
+        <w:rPr>
+          <w:rFonts w:asciiTheme="minorHAnsi" w:hAnsiTheme="minorHAnsi"/>
+          <w:b/>
+          <w:bCs/>
+        </w:rPr>
+        <w:t>7</w:t>
+      </w:r>
+      <w:r>
+        <w:rPr>
+          <w:rFonts w:asciiTheme="minorHAnsi" w:hAnsiTheme="minorHAnsi"/>
+          <w:b/>
+          <w:bCs/>
+        </w:rPr>
+        <w:t xml:space="preserve"> – Cancellazione automatica delle prenotazioni</w:t>
+      </w:r>
+      <w:r>
+        <w:rPr>
+          <w:rFonts w:asciiTheme="minorHAnsi" w:hAnsiTheme="minorHAnsi"/>
+          <w:b/>
+          <w:bCs/>
+        </w:rPr>
         <w:t xml:space="preserve"> scadute</w:t>
       </w:r>
     </w:p>
@@ -8546,6 +9271,63 @@
           <w:rFonts w:asciiTheme="minorHAnsi" w:hAnsiTheme="minorHAnsi"/>
         </w:rPr>
         <w:t>Il sistema deve controllare periodicamente che le prenotazioni non siano scadute. Nel caso in cui lo siano deve eliminarle.</w:t>
+      </w:r>
+    </w:p>
+    <w:p>
+      <w:pPr>
+        <w:jc w:val="both"/>
+        <w:rPr>
+          <w:rFonts w:asciiTheme="minorHAnsi" w:hAnsiTheme="minorHAnsi"/>
+        </w:rPr>
+      </w:pPr>
+    </w:p>
+    <w:p>
+      <w:pPr>
+        <w:jc w:val="both"/>
+        <w:rPr>
+          <w:rFonts w:asciiTheme="minorHAnsi" w:hAnsiTheme="minorHAnsi"/>
+          <w:b/>
+          <w:bCs/>
+        </w:rPr>
+      </w:pPr>
+      <w:r>
+        <w:rPr>
+          <w:rFonts w:asciiTheme="minorHAnsi" w:hAnsiTheme="minorHAnsi"/>
+          <w:b/>
+          <w:bCs/>
+        </w:rPr>
+        <w:t>FR1</w:t>
+      </w:r>
+      <w:r>
+        <w:rPr>
+          <w:rFonts w:asciiTheme="minorHAnsi" w:hAnsiTheme="minorHAnsi"/>
+          <w:b/>
+          <w:bCs/>
+        </w:rPr>
+        <w:t>8</w:t>
+      </w:r>
+      <w:r>
+        <w:rPr>
+          <w:rFonts w:asciiTheme="minorHAnsi" w:hAnsiTheme="minorHAnsi"/>
+          <w:b/>
+          <w:bCs/>
+        </w:rPr>
+        <w:t xml:space="preserve"> – Specializzazione delle pagine</w:t>
+      </w:r>
+    </w:p>
+    <w:p>
+      <w:pPr>
+        <w:jc w:val="both"/>
+        <w:rPr>
+          <w:rFonts w:asciiTheme="minorHAnsi" w:hAnsiTheme="minorHAnsi"/>
+        </w:rPr>
+      </w:pPr>
+      <w:r>
+        <w:rPr>
+          <w:rFonts w:asciiTheme="minorHAnsi" w:hAnsiTheme="minorHAnsi"/>
+        </w:rPr>
+        <w:lastRenderedPageBreak/>
+        <w:t>Pagine come l’home page devono mostrare contenuti diversi in base al ruolo dell’utente che accede ad esse.</w:t>
       </w:r>
     </w:p>
     <w:p/>
@@ -8560,7 +9342,7 @@
           <w:iCs w:val="0"/>
         </w:rPr>
       </w:pPr>
-      <w:bookmarkStart w:id="23" w:name="_Toc243674718"/>
+      <w:bookmarkStart w:id="23" w:name="_Toc244027852"/>
       <w:r>
         <w:rPr>
           <w:rFonts w:asciiTheme="minorHAnsi" w:hAnsiTheme="minorHAnsi"/>
@@ -8581,7 +9363,8 @@
           <w:szCs w:val="28"/>
         </w:rPr>
       </w:pPr>
-      <w:bookmarkStart w:id="24" w:name="_Toc243845541"/>
+      <w:bookmarkStart w:id="24" w:name="_Toc243846658"/>
+      <w:bookmarkStart w:id="25" w:name="_Toc244027853"/>
       <w:r>
         <w:rPr>
           <w:rFonts w:asciiTheme="minorHAnsi" w:hAnsiTheme="minorHAnsi"/>
@@ -8591,6 +9374,7 @@
         <w:t>Usability</w:t>
       </w:r>
       <w:bookmarkEnd w:id="24"/>
+      <w:bookmarkEnd w:id="25"/>
     </w:p>
     <w:p>
       <w:pPr>
@@ -8683,14 +9467,7 @@
         <w:rPr>
           <w:rFonts w:asciiTheme="minorHAnsi" w:eastAsia="Times New Roman" w:hAnsiTheme="minorHAnsi"/>
         </w:rPr>
-        <w:t xml:space="preserve"> il sistema deve mostrare un messaggio di conferma al completamento delle operazioni principali e un messaggio esplicativo in caso di </w:t>
-      </w:r>
-      <w:r>
-        <w:rPr>
-          <w:rFonts w:asciiTheme="minorHAnsi" w:eastAsia="Times New Roman" w:hAnsiTheme="minorHAnsi"/>
-        </w:rPr>
-        <w:lastRenderedPageBreak/>
-        <w:t>errore e operazioni non riuscite.</w:t>
+        <w:t xml:space="preserve"> il sistema deve mostrare un messaggio di conferma al completamento delle operazioni principali e un messaggio esplicativo in caso di errore e operazioni non riuscite.</w:t>
       </w:r>
     </w:p>
     <w:p>
@@ -8745,7 +9522,8 @@
           <w:szCs w:val="28"/>
         </w:rPr>
       </w:pPr>
-      <w:bookmarkStart w:id="25" w:name="_Toc243845542"/>
+      <w:bookmarkStart w:id="26" w:name="_Toc243846659"/>
+      <w:bookmarkStart w:id="27" w:name="_Toc244027854"/>
       <w:r>
         <w:rPr>
           <w:rFonts w:asciiTheme="minorHAnsi" w:hAnsiTheme="minorHAnsi"/>
@@ -8754,7 +9532,8 @@
         </w:rPr>
         <w:t>Reliability</w:t>
       </w:r>
-      <w:bookmarkEnd w:id="25"/>
+      <w:bookmarkEnd w:id="26"/>
+      <w:bookmarkEnd w:id="27"/>
     </w:p>
     <w:p>
       <w:pPr>
@@ -8855,7 +9634,8 @@
           <w:szCs w:val="28"/>
         </w:rPr>
       </w:pPr>
-      <w:bookmarkStart w:id="26" w:name="_Toc243845543"/>
+      <w:bookmarkStart w:id="28" w:name="_Toc243846660"/>
+      <w:bookmarkStart w:id="29" w:name="_Toc244027855"/>
       <w:r>
         <w:rPr>
           <w:rFonts w:asciiTheme="minorHAnsi" w:hAnsiTheme="minorHAnsi"/>
@@ -8864,7 +9644,8 @@
         </w:rPr>
         <w:t>Performance</w:t>
       </w:r>
-      <w:bookmarkEnd w:id="26"/>
+      <w:bookmarkEnd w:id="28"/>
+      <w:bookmarkEnd w:id="29"/>
     </w:p>
     <w:p>
       <w:pPr>
@@ -8992,7 +9773,8 @@
           <w:szCs w:val="28"/>
         </w:rPr>
       </w:pPr>
-      <w:bookmarkStart w:id="27" w:name="_Toc243845544"/>
+      <w:bookmarkStart w:id="30" w:name="_Toc243846661"/>
+      <w:bookmarkStart w:id="31" w:name="_Toc244027856"/>
       <w:r>
         <w:rPr>
           <w:rFonts w:asciiTheme="minorHAnsi" w:hAnsiTheme="minorHAnsi"/>
@@ -9001,7 +9783,8 @@
         </w:rPr>
         <w:t>Supportability</w:t>
       </w:r>
-      <w:bookmarkEnd w:id="27"/>
+      <w:bookmarkEnd w:id="30"/>
+      <w:bookmarkEnd w:id="31"/>
     </w:p>
     <w:p>
       <w:pPr>
@@ -9116,7 +9899,8 @@
           <w:szCs w:val="28"/>
         </w:rPr>
       </w:pPr>
-      <w:bookmarkStart w:id="28" w:name="_Toc243845545"/>
+      <w:bookmarkStart w:id="32" w:name="_Toc243846662"/>
+      <w:bookmarkStart w:id="33" w:name="_Toc244027857"/>
       <w:r>
         <w:rPr>
           <w:rFonts w:asciiTheme="minorHAnsi" w:hAnsiTheme="minorHAnsi"/>
@@ -9125,7 +9909,8 @@
         </w:rPr>
         <w:t>Implementation</w:t>
       </w:r>
-      <w:bookmarkEnd w:id="28"/>
+      <w:bookmarkEnd w:id="32"/>
+      <w:bookmarkEnd w:id="33"/>
     </w:p>
     <w:p>
       <w:pPr>
@@ -9268,13 +10053,15 @@
           <w:szCs w:val="28"/>
         </w:rPr>
       </w:pPr>
-      <w:bookmarkStart w:id="29" w:name="_Toc243845546"/>
+      <w:bookmarkStart w:id="34" w:name="_Toc243846663"/>
+      <w:bookmarkStart w:id="35" w:name="_Toc244027858"/>
       <w:r>
         <w:rPr>
           <w:rFonts w:asciiTheme="minorHAnsi" w:hAnsiTheme="minorHAnsi"/>
           <w:sz w:val="28"/>
           <w:szCs w:val="28"/>
         </w:rPr>
+        <w:lastRenderedPageBreak/>
         <w:t>I</w:t>
       </w:r>
       <w:r>
@@ -9285,7 +10072,8 @@
         </w:rPr>
         <w:t>nterface</w:t>
       </w:r>
-      <w:bookmarkEnd w:id="29"/>
+      <w:bookmarkEnd w:id="34"/>
+      <w:bookmarkEnd w:id="35"/>
     </w:p>
     <w:p>
       <w:pPr>
@@ -9374,7 +10162,8 @@
           <w:szCs w:val="28"/>
         </w:rPr>
       </w:pPr>
-      <w:bookmarkStart w:id="30" w:name="_Toc243845547"/>
+      <w:bookmarkStart w:id="36" w:name="_Toc243846664"/>
+      <w:bookmarkStart w:id="37" w:name="_Toc244027859"/>
       <w:r>
         <w:rPr>
           <w:rFonts w:asciiTheme="minorHAnsi" w:hAnsiTheme="minorHAnsi"/>
@@ -9383,7 +10172,8 @@
         </w:rPr>
         <w:t>Packaging</w:t>
       </w:r>
-      <w:bookmarkEnd w:id="30"/>
+      <w:bookmarkEnd w:id="36"/>
+      <w:bookmarkEnd w:id="37"/>
     </w:p>
     <w:p>
       <w:pPr>
@@ -9417,14 +10207,7 @@
         <w:rPr>
           <w:rFonts w:asciiTheme="minorHAnsi" w:hAnsiTheme="minorHAnsi"/>
         </w:rPr>
-        <w:t xml:space="preserve">: il codice sorgente sarà consegnato in un repository Git, insieme alle </w:t>
-      </w:r>
-      <w:r>
-        <w:rPr>
-          <w:rFonts w:asciiTheme="minorHAnsi" w:hAnsiTheme="minorHAnsi"/>
-        </w:rPr>
-        <w:lastRenderedPageBreak/>
-        <w:t>istruzioni per l’installazione e l’avvio del sistema.</w:t>
+        <w:t>: il codice sorgente sarà consegnato in un repository Git, insieme alle istruzioni per l’installazione e l’avvio del sistema.</w:t>
       </w:r>
     </w:p>
     <w:p>
@@ -9438,7 +10221,8 @@
           <w:szCs w:val="28"/>
         </w:rPr>
       </w:pPr>
-      <w:bookmarkStart w:id="31" w:name="_Toc243845548"/>
+      <w:bookmarkStart w:id="38" w:name="_Toc243846665"/>
+      <w:bookmarkStart w:id="39" w:name="_Toc244027860"/>
       <w:r>
         <w:rPr>
           <w:rFonts w:asciiTheme="minorHAnsi" w:hAnsiTheme="minorHAnsi"/>
@@ -9447,7 +10231,8 @@
         </w:rPr>
         <w:t>Legal</w:t>
       </w:r>
-      <w:bookmarkEnd w:id="31"/>
+      <w:bookmarkEnd w:id="38"/>
+      <w:bookmarkEnd w:id="39"/>
     </w:p>
     <w:p>
       <w:pPr>
@@ -9488,7 +10273,7 @@
         <w:rPr>
           <w:rFonts w:asciiTheme="minorHAnsi" w:hAnsiTheme="minorHAnsi"/>
         </w:rPr>
-        <w:t xml:space="preserve"> [1]</w:t>
+        <w:t xml:space="preserve"> </w:t>
       </w:r>
     </w:p>
     <w:p>
@@ -9541,7 +10326,7 @@
         <w:rPr>
           <w:rFonts w:asciiTheme="minorHAnsi" w:hAnsiTheme="minorHAnsi"/>
         </w:rPr>
-        <w:t xml:space="preserve"> [1]</w:t>
+        <w:t xml:space="preserve"> </w:t>
       </w:r>
     </w:p>
     <w:p>
@@ -9576,13 +10361,13 @@
         <w:rPr>
           <w:rFonts w:asciiTheme="minorHAnsi" w:hAnsiTheme="minorHAnsi"/>
         </w:rPr>
-        <w:t>: in caso di violazione dei dati il titolare deve notificare il Garante entro 72 ore.</w:t>
-      </w:r>
-      <w:r>
-        <w:rPr>
-          <w:rFonts w:asciiTheme="minorHAnsi" w:hAnsiTheme="minorHAnsi"/>
-        </w:rPr>
-        <w:t xml:space="preserve"> [1]</w:t>
+        <w:t>: in caso di violazione dei dati il titolare deve notificare il Garante entro 72 ore</w:t>
+      </w:r>
+      <w:r>
+        <w:rPr>
+          <w:rFonts w:asciiTheme="minorHAnsi" w:hAnsiTheme="minorHAnsi"/>
+        </w:rPr>
+        <w:t>.</w:t>
       </w:r>
     </w:p>
     <w:p>
@@ -9669,7 +10454,7 @@
           <w:iCs w:val="0"/>
         </w:rPr>
       </w:pPr>
-      <w:bookmarkStart w:id="32" w:name="_Toc243674719"/>
+      <w:bookmarkStart w:id="40" w:name="_Toc244027861"/>
       <w:r>
         <w:rPr>
           <w:rFonts w:asciiTheme="minorHAnsi" w:hAnsiTheme="minorHAnsi"/>
@@ -9678,7 +10463,7 @@
         </w:rPr>
         <w:t>Target Environment</w:t>
       </w:r>
-      <w:bookmarkEnd w:id="32"/>
+      <w:bookmarkEnd w:id="40"/>
     </w:p>
     <w:p>
       <w:pPr>
@@ -9829,7 +10614,7 @@
           <w:iCs w:val="0"/>
         </w:rPr>
       </w:pPr>
-      <w:bookmarkStart w:id="33" w:name="_Toc243674720"/>
+      <w:bookmarkStart w:id="41" w:name="_Toc244027862"/>
       <w:r>
         <w:rPr>
           <w:rFonts w:asciiTheme="minorHAnsi" w:hAnsiTheme="minorHAnsi"/>
@@ -9854,7 +10639,7 @@
         </w:rPr>
         <w:t>eadlines</w:t>
       </w:r>
-      <w:bookmarkEnd w:id="33"/>
+      <w:bookmarkEnd w:id="41"/>
     </w:p>
     <w:p>
       <w:pPr>
@@ -10428,7 +11213,14 @@
               <w:rFonts w:asciiTheme="minorHAnsi" w:hAnsiTheme="minorHAnsi"/>
               <w:sz w:val="20"/>
             </w:rPr>
-            <w:t>21</w:t>
+            <w:t>2</w:t>
+          </w:r>
+          <w:r>
+            <w:rPr>
+              <w:rFonts w:asciiTheme="minorHAnsi" w:hAnsiTheme="minorHAnsi"/>
+              <w:sz w:val="20"/>
+            </w:rPr>
+            <w:t>7</w:t>
           </w:r>
           <w:r>
             <w:rPr>
@@ -13773,7 +14565,7 @@
     <w:lsdException w:name="Medium Shading 2 Accent 1" w:uiPriority="69"/>
     <w:lsdException w:name="Medium List 1 Accent 1" w:uiPriority="70"/>
     <w:lsdException w:name="Revision" w:uiPriority="71"/>
-    <w:lsdException w:name="List Paragraph" w:uiPriority="72" w:qFormat="1"/>
+    <w:lsdException w:name="List Paragraph" w:uiPriority="34" w:qFormat="1"/>
     <w:lsdException w:name="Quote" w:uiPriority="73" w:qFormat="1"/>
     <w:lsdException w:name="Intense Quote" w:uiPriority="60" w:qFormat="1"/>
     <w:lsdException w:name="Medium List 2 Accent 1" w:uiPriority="61"/>
@@ -15938,7 +16730,7 @@
   <w:style w:type="paragraph" w:styleId="ListParagraph">
     <w:name w:val="List Paragraph"/>
     <w:basedOn w:val="Normal"/>
-    <w:uiPriority w:val="72"/>
+    <w:uiPriority w:val="34"/>
     <w:qFormat/>
     <w:rsid w:val="0005098A"/>
     <w:pPr>

</xml_diff>

<commit_message>
Ultimati i casi d'uso e aggiustati i docx
</commit_message>
<xml_diff>
--- a/Documents/01_NovaBiblioteca_ProblemStatement.docx
+++ b/Documents/01_NovaBiblioteca_ProblemStatement.docx
@@ -154,7 +154,7 @@
           <w:b/>
           <w:sz w:val="36"/>
         </w:rPr>
-        <w:t>4</w:t>
+        <w:t>5</w:t>
       </w:r>
     </w:p>
     <w:p>
@@ -402,7 +402,7 @@
         <w:rPr>
           <w:sz w:val="32"/>
         </w:rPr>
-        <w:t>7</w:t>
+        <w:t>8</w:t>
       </w:r>
       <w:r>
         <w:rPr>
@@ -1908,6 +1908,13 @@
                 <w:sz w:val="20"/>
               </w:rPr>
             </w:pPr>
+            <w:r>
+              <w:rPr>
+                <w:rFonts w:asciiTheme="minorHAnsi" w:hAnsiTheme="minorHAnsi"/>
+                <w:sz w:val="20"/>
+              </w:rPr>
+              <w:t>28/10/2026</w:t>
+            </w:r>
           </w:p>
         </w:tc>
         <w:tc>
@@ -1928,6 +1935,13 @@
                 <w:sz w:val="20"/>
               </w:rPr>
             </w:pPr>
+            <w:r>
+              <w:rPr>
+                <w:rFonts w:asciiTheme="minorHAnsi" w:hAnsiTheme="minorHAnsi"/>
+                <w:sz w:val="20"/>
+              </w:rPr>
+              <w:t>0.5</w:t>
+            </w:r>
           </w:p>
         </w:tc>
         <w:tc>
@@ -1948,6 +1962,13 @@
                 <w:sz w:val="20"/>
               </w:rPr>
             </w:pPr>
+            <w:r>
+              <w:rPr>
+                <w:rFonts w:asciiTheme="minorHAnsi" w:hAnsiTheme="minorHAnsi"/>
+                <w:sz w:val="20"/>
+              </w:rPr>
+              <w:t>Aggiustamento scenari Problem Statement</w:t>
+            </w:r>
           </w:p>
         </w:tc>
         <w:tc>
@@ -1969,6 +1990,13 @@
                 <w:sz w:val="20"/>
               </w:rPr>
             </w:pPr>
+            <w:r>
+              <w:rPr>
+                <w:rFonts w:asciiTheme="minorHAnsi" w:hAnsiTheme="minorHAnsi"/>
+                <w:sz w:val="20"/>
+              </w:rPr>
+              <w:t>Tutti i partecipanti</w:t>
+            </w:r>
           </w:p>
         </w:tc>
       </w:tr>
@@ -5106,6 +5134,7 @@
           <w:rFonts w:asciiTheme="minorHAnsi" w:hAnsiTheme="minorHAnsi"/>
         </w:rPr>
       </w:pPr>
+      <w:bookmarkStart w:id="4" w:name="_Toc244027833"/>
       <w:r>
         <w:rPr>
           <w:rFonts w:asciiTheme="minorHAnsi" w:hAnsiTheme="minorHAnsi"/>
@@ -5139,171 +5168,75 @@
         <w:rPr>
           <w:rFonts w:asciiTheme="minorHAnsi" w:hAnsiTheme="minorHAnsi"/>
         </w:rPr>
-        <w:t xml:space="preserve">Giacomo comunica a Grazia, operatrice della biblioteca, di volersi registrare. Grazia verifica un suo documento di identità e raccoglie il consenso al trattamento dei dati personali. Inserisce quindi nel sistema il </w:t>
-      </w:r>
-      <w:r>
-        <w:rPr>
-          <w:rFonts w:asciiTheme="minorHAnsi" w:hAnsiTheme="minorHAnsi"/>
-        </w:rPr>
-        <w:t>codice</w:t>
-      </w:r>
-      <w:r>
-        <w:rPr>
-          <w:rFonts w:asciiTheme="minorHAnsi" w:hAnsiTheme="minorHAnsi"/>
-        </w:rPr>
-        <w:t xml:space="preserve"> </w:t>
-      </w:r>
-      <w:r>
-        <w:rPr>
-          <w:rFonts w:asciiTheme="minorHAnsi" w:hAnsiTheme="minorHAnsi"/>
-        </w:rPr>
-        <w:t>f</w:t>
-      </w:r>
-      <w:r>
-        <w:rPr>
-          <w:rFonts w:asciiTheme="minorHAnsi" w:hAnsiTheme="minorHAnsi"/>
-        </w:rPr>
-        <w:t>iscale</w:t>
-      </w:r>
-      <w:r>
-        <w:rPr>
-          <w:rFonts w:asciiTheme="minorHAnsi" w:hAnsiTheme="minorHAnsi"/>
-        </w:rPr>
-        <w:t>, nome, cognome e l’e-mail di Giacomo.</w:t>
-      </w:r>
-    </w:p>
-    <w:p>
-      <w:pPr>
-        <w:jc w:val="both"/>
-        <w:rPr>
-          <w:rFonts w:asciiTheme="minorHAnsi" w:hAnsiTheme="minorHAnsi"/>
-        </w:rPr>
-      </w:pPr>
-    </w:p>
-    <w:p>
-      <w:pPr>
-        <w:jc w:val="both"/>
-        <w:rPr>
-          <w:rFonts w:asciiTheme="minorHAnsi" w:hAnsiTheme="minorHAnsi"/>
-        </w:rPr>
-      </w:pPr>
-      <w:r>
-        <w:rPr>
-          <w:rFonts w:asciiTheme="minorHAnsi" w:hAnsiTheme="minorHAnsi"/>
-        </w:rPr>
-        <w:t>Il sistema verifica se i dati sono validi. Se un dato non è valido, il sistema lo segnala e Grazia lo corregge con Giacomo</w:t>
-      </w:r>
-      <w:r>
-        <w:rPr>
-          <w:rFonts w:asciiTheme="minorHAnsi" w:hAnsiTheme="minorHAnsi"/>
-        </w:rPr>
-        <w:t xml:space="preserve"> prima di riprovare</w:t>
-      </w:r>
-      <w:r>
-        <w:rPr>
-          <w:rFonts w:asciiTheme="minorHAnsi" w:hAnsiTheme="minorHAnsi"/>
-        </w:rPr>
-        <w:t>. Se i dati sono corretti, il sistema</w:t>
-      </w:r>
-      <w:r>
-        <w:rPr>
-          <w:rFonts w:asciiTheme="minorHAnsi" w:hAnsiTheme="minorHAnsi"/>
-        </w:rPr>
-        <w:t xml:space="preserve"> mostra a Grazia tutti i dati inseriti, affinché possano essere convalidat</w:t>
-      </w:r>
-      <w:r>
-        <w:rPr>
-          <w:rFonts w:asciiTheme="minorHAnsi" w:hAnsiTheme="minorHAnsi"/>
-        </w:rPr>
-        <w:t xml:space="preserve">i. Quindi </w:t>
-      </w:r>
-      <w:r>
-        <w:rPr>
-          <w:rFonts w:asciiTheme="minorHAnsi" w:hAnsiTheme="minorHAnsi"/>
-        </w:rPr>
-        <w:t>il sistema</w:t>
-      </w:r>
-      <w:r>
-        <w:rPr>
-          <w:rFonts w:asciiTheme="minorHAnsi" w:hAnsiTheme="minorHAnsi"/>
-        </w:rPr>
-        <w:t xml:space="preserve"> crea l’account</w:t>
-      </w:r>
-      <w:r>
-        <w:rPr>
-          <w:rFonts w:asciiTheme="minorHAnsi" w:hAnsiTheme="minorHAnsi"/>
-        </w:rPr>
-        <w:t xml:space="preserve">, </w:t>
-      </w:r>
-      <w:r>
-        <w:rPr>
-          <w:rFonts w:asciiTheme="minorHAnsi" w:hAnsiTheme="minorHAnsi"/>
-        </w:rPr>
-        <w:t>genera</w:t>
-      </w:r>
-      <w:r>
-        <w:rPr>
-          <w:rFonts w:asciiTheme="minorHAnsi" w:hAnsiTheme="minorHAnsi"/>
-        </w:rPr>
-        <w:t>ndo</w:t>
-      </w:r>
-      <w:r>
-        <w:rPr>
-          <w:rFonts w:asciiTheme="minorHAnsi" w:hAnsiTheme="minorHAnsi"/>
-        </w:rPr>
-        <w:t xml:space="preserve"> una password temporanea</w:t>
-      </w:r>
-      <w:r>
-        <w:rPr>
-          <w:rFonts w:asciiTheme="minorHAnsi" w:hAnsiTheme="minorHAnsi"/>
-        </w:rPr>
-        <w:t xml:space="preserve"> che viene</w:t>
-      </w:r>
-      <w:r>
-        <w:rPr>
-          <w:rFonts w:asciiTheme="minorHAnsi" w:hAnsiTheme="minorHAnsi"/>
-        </w:rPr>
-        <w:t xml:space="preserve"> mostrata a Grazia e</w:t>
-      </w:r>
-      <w:r>
-        <w:rPr>
-          <w:rFonts w:asciiTheme="minorHAnsi" w:hAnsiTheme="minorHAnsi"/>
-        </w:rPr>
-        <w:t xml:space="preserve"> comunicata </w:t>
-      </w:r>
-      <w:r>
-        <w:rPr>
-          <w:rFonts w:asciiTheme="minorHAnsi" w:hAnsiTheme="minorHAnsi"/>
-        </w:rPr>
-        <w:t>a Giacomo</w:t>
-      </w:r>
-      <w:r>
-        <w:rPr>
-          <w:rFonts w:asciiTheme="minorHAnsi" w:hAnsiTheme="minorHAnsi"/>
-        </w:rPr>
-        <w:t>.</w:t>
-      </w:r>
-    </w:p>
-    <w:p>
-      <w:pPr>
-        <w:jc w:val="both"/>
-        <w:rPr>
-          <w:rFonts w:asciiTheme="minorHAnsi" w:hAnsiTheme="minorHAnsi"/>
-        </w:rPr>
-      </w:pPr>
-    </w:p>
-    <w:p>
-      <w:pPr>
-        <w:jc w:val="both"/>
-        <w:rPr>
-          <w:rFonts w:asciiTheme="minorHAnsi" w:hAnsiTheme="minorHAnsi"/>
-        </w:rPr>
-      </w:pPr>
-      <w:r>
-        <w:rPr>
-          <w:rFonts w:asciiTheme="minorHAnsi" w:hAnsiTheme="minorHAnsi"/>
-        </w:rPr>
-        <w:t>Quando Giacomo accede al sistema tramite e-mail e password temporanea, il sistema gli chiede di scegliere una nuova password.</w:t>
+        <w:t>Giacomo comunica a Grazia, operatrice della biblioteca, di volersi registrare. Grazia verifica un suo documento di identità e raccoglie il consenso al trattamento dei dati personali. Inserisce quindi nel sistema il codice fiscale, nome, cognome e l’e-mail di Giacomo.</w:t>
+      </w:r>
+    </w:p>
+    <w:p>
+      <w:pPr>
+        <w:jc w:val="both"/>
+        <w:rPr>
+          <w:rFonts w:asciiTheme="minorHAnsi" w:hAnsiTheme="minorHAnsi"/>
+        </w:rPr>
+      </w:pPr>
+    </w:p>
+    <w:p>
+      <w:pPr>
+        <w:jc w:val="both"/>
+        <w:rPr>
+          <w:rFonts w:asciiTheme="minorHAnsi" w:hAnsiTheme="minorHAnsi"/>
+        </w:rPr>
+      </w:pPr>
+      <w:r>
+        <w:rPr>
+          <w:rFonts w:asciiTheme="minorHAnsi" w:hAnsiTheme="minorHAnsi"/>
+        </w:rPr>
+        <w:t xml:space="preserve">Il sistema verifica se i dati sono validi. Se un dato non è valido, il sistema lo segnala e Grazia lo corregge con Giacomo prima di riprovare. Se i dati sono corretti, il sistema mostra a Grazia tutti i dati inseriti, affinché possano essere convalidati. Quindi il sistema crea l’account, generando una password </w:t>
+      </w:r>
+      <w:r>
+        <w:rPr>
+          <w:rFonts w:asciiTheme="minorHAnsi" w:hAnsiTheme="minorHAnsi"/>
+        </w:rPr>
+        <w:t>provvisoria</w:t>
+      </w:r>
+      <w:r>
+        <w:rPr>
+          <w:rFonts w:asciiTheme="minorHAnsi" w:hAnsiTheme="minorHAnsi"/>
+        </w:rPr>
+        <w:t xml:space="preserve"> che viene mostrata a Grazia e comunicata a Giacomo.</w:t>
+      </w:r>
+    </w:p>
+    <w:p>
+      <w:pPr>
+        <w:jc w:val="both"/>
+        <w:rPr>
+          <w:rFonts w:asciiTheme="minorHAnsi" w:hAnsiTheme="minorHAnsi"/>
+        </w:rPr>
+      </w:pPr>
+    </w:p>
+    <w:p>
+      <w:pPr>
+        <w:jc w:val="both"/>
+        <w:rPr>
+          <w:rFonts w:asciiTheme="minorHAnsi" w:hAnsiTheme="minorHAnsi"/>
+        </w:rPr>
+      </w:pPr>
+      <w:r>
+        <w:rPr>
+          <w:rFonts w:asciiTheme="minorHAnsi" w:hAnsiTheme="minorHAnsi"/>
+        </w:rPr>
+        <w:t xml:space="preserve">Quando Giacomo accede al sistema tramite e-mail e password </w:t>
+      </w:r>
+      <w:r>
+        <w:rPr>
+          <w:rFonts w:asciiTheme="minorHAnsi" w:hAnsiTheme="minorHAnsi"/>
+        </w:rPr>
+        <w:t>provvisoria</w:t>
+      </w:r>
+      <w:r>
+        <w:rPr>
+          <w:rFonts w:asciiTheme="minorHAnsi" w:hAnsiTheme="minorHAnsi"/>
+        </w:rPr>
+        <w:t>, il sistema gli chiede di scegliere una nuova password.</w:t>
       </w:r>
     </w:p>
     <w:p>
@@ -5336,7 +5269,6 @@
           <w:rFonts w:asciiTheme="minorHAnsi" w:hAnsiTheme="minorHAnsi"/>
         </w:rPr>
       </w:pPr>
-      <w:bookmarkStart w:id="4" w:name="_Toc244027833"/>
       <w:r>
         <w:rPr>
           <w:rFonts w:asciiTheme="minorHAnsi" w:hAnsiTheme="minorHAnsi"/>
@@ -5364,17 +5296,12 @@
           <w:rFonts w:asciiTheme="minorHAnsi" w:hAnsiTheme="minorHAnsi"/>
         </w:rPr>
       </w:pPr>
-      <w:r>
-        <w:rPr>
-          <w:rFonts w:asciiTheme="minorHAnsi" w:hAnsiTheme="minorHAnsi"/>
-        </w:rPr>
-        <w:t xml:space="preserve">Elsa </w:t>
-      </w:r>
-      <w:r>
-        <w:rPr>
-          <w:rFonts w:asciiTheme="minorHAnsi" w:hAnsiTheme="minorHAnsi"/>
-        </w:rPr>
-        <w:t xml:space="preserve">vuole leggere </w:t>
+      <w:bookmarkStart w:id="5" w:name="_Toc244027834"/>
+      <w:r>
+        <w:rPr>
+          <w:rFonts w:asciiTheme="minorHAnsi" w:hAnsiTheme="minorHAnsi"/>
+        </w:rPr>
+        <w:t xml:space="preserve">Elsa vuole leggere </w:t>
       </w:r>
       <w:r>
         <w:rPr>
@@ -5388,191 +5315,41 @@
         <w:rPr>
           <w:rFonts w:asciiTheme="minorHAnsi" w:hAnsiTheme="minorHAnsi"/>
         </w:rPr>
-        <w:t xml:space="preserve"> </w:t>
-      </w:r>
-      <w:r>
-        <w:rPr>
-          <w:rFonts w:asciiTheme="minorHAnsi" w:hAnsiTheme="minorHAnsi"/>
-        </w:rPr>
-        <w:t xml:space="preserve">e verifica la disponibilità </w:t>
-      </w:r>
-      <w:r>
-        <w:rPr>
-          <w:rFonts w:asciiTheme="minorHAnsi" w:hAnsiTheme="minorHAnsi"/>
-        </w:rPr>
-        <w:t>sul sistema</w:t>
-      </w:r>
-      <w:r>
-        <w:rPr>
-          <w:rFonts w:asciiTheme="minorHAnsi" w:hAnsiTheme="minorHAnsi"/>
-        </w:rPr>
-        <w:t xml:space="preserve"> prim</w:t>
-      </w:r>
-      <w:r>
-        <w:rPr>
-          <w:rFonts w:asciiTheme="minorHAnsi" w:hAnsiTheme="minorHAnsi"/>
-        </w:rPr>
-        <w:t>a di recarsi in biblioteca.</w:t>
-      </w:r>
-      <w:r>
-        <w:rPr>
-          <w:rFonts w:asciiTheme="minorHAnsi" w:hAnsiTheme="minorHAnsi"/>
-        </w:rPr>
-        <w:t xml:space="preserve"> Elsa non è registrata, ma poiché la consultazione del catalogo è libera, può cercare il libro nel catalogo.</w:t>
-      </w:r>
-      <w:r>
-        <w:rPr>
-          <w:rFonts w:asciiTheme="minorHAnsi" w:hAnsiTheme="minorHAnsi"/>
-        </w:rPr>
-        <w:t xml:space="preserve"> I</w:t>
-      </w:r>
-      <w:r>
-        <w:rPr>
-          <w:rFonts w:asciiTheme="minorHAnsi" w:hAnsiTheme="minorHAnsi"/>
-        </w:rPr>
-        <w:t xml:space="preserve">l sistema </w:t>
-      </w:r>
-      <w:r>
-        <w:rPr>
-          <w:rFonts w:asciiTheme="minorHAnsi" w:hAnsiTheme="minorHAnsi"/>
-        </w:rPr>
-        <w:t xml:space="preserve">elenca </w:t>
-      </w:r>
-      <w:r>
-        <w:rPr>
-          <w:rFonts w:asciiTheme="minorHAnsi" w:hAnsiTheme="minorHAnsi"/>
-        </w:rPr>
-        <w:t xml:space="preserve">i possibili risultati </w:t>
-      </w:r>
-      <w:r>
-        <w:rPr>
-          <w:rFonts w:asciiTheme="minorHAnsi" w:hAnsiTheme="minorHAnsi"/>
-        </w:rPr>
-        <w:t>che comprendono divers</w:t>
-      </w:r>
-      <w:r>
-        <w:rPr>
-          <w:rFonts w:asciiTheme="minorHAnsi" w:hAnsiTheme="minorHAnsi"/>
-        </w:rPr>
-        <w:t>e edizioni del libro</w:t>
-      </w:r>
-      <w:r>
-        <w:rPr>
-          <w:rFonts w:asciiTheme="minorHAnsi" w:hAnsiTheme="minorHAnsi"/>
-        </w:rPr>
-        <w:t xml:space="preserve">. </w:t>
-      </w:r>
-    </w:p>
-    <w:p>
-      <w:pPr>
-        <w:jc w:val="both"/>
-        <w:rPr>
-          <w:rFonts w:asciiTheme="minorHAnsi" w:hAnsiTheme="minorHAnsi"/>
-        </w:rPr>
-      </w:pPr>
-    </w:p>
-    <w:p>
-      <w:pPr>
-        <w:jc w:val="both"/>
-        <w:rPr>
-          <w:rFonts w:asciiTheme="minorHAnsi" w:hAnsiTheme="minorHAnsi"/>
-        </w:rPr>
-      </w:pPr>
-      <w:r>
-        <w:rPr>
-          <w:rFonts w:asciiTheme="minorHAnsi" w:hAnsiTheme="minorHAnsi"/>
-        </w:rPr>
-        <w:t xml:space="preserve">Per </w:t>
-      </w:r>
-      <w:r>
-        <w:rPr>
-          <w:rFonts w:asciiTheme="minorHAnsi" w:hAnsiTheme="minorHAnsi"/>
-        </w:rPr>
-        <w:t>restringere</w:t>
-      </w:r>
-      <w:r>
-        <w:rPr>
-          <w:rFonts w:asciiTheme="minorHAnsi" w:hAnsiTheme="minorHAnsi"/>
-        </w:rPr>
-        <w:t xml:space="preserve"> </w:t>
-      </w:r>
-      <w:r>
-        <w:rPr>
-          <w:rFonts w:asciiTheme="minorHAnsi" w:hAnsiTheme="minorHAnsi"/>
-        </w:rPr>
-        <w:t>i risultati</w:t>
-      </w:r>
-      <w:r>
-        <w:rPr>
-          <w:rFonts w:asciiTheme="minorHAnsi" w:hAnsiTheme="minorHAnsi"/>
-        </w:rPr>
-        <w:t xml:space="preserve">, Elsa </w:t>
-      </w:r>
-      <w:r>
-        <w:rPr>
-          <w:rFonts w:asciiTheme="minorHAnsi" w:hAnsiTheme="minorHAnsi"/>
-        </w:rPr>
-        <w:t>limita i risultati ai soli libri disponibili e</w:t>
-      </w:r>
-      <w:r>
-        <w:rPr>
-          <w:rFonts w:asciiTheme="minorHAnsi" w:hAnsiTheme="minorHAnsi"/>
-        </w:rPr>
-        <w:t xml:space="preserve"> aggiorna l’elenco</w:t>
-      </w:r>
-      <w:r>
-        <w:rPr>
-          <w:rFonts w:asciiTheme="minorHAnsi" w:hAnsiTheme="minorHAnsi"/>
-        </w:rPr>
-        <w:t xml:space="preserve">. </w:t>
-      </w:r>
-      <w:r>
-        <w:rPr>
-          <w:rFonts w:asciiTheme="minorHAnsi" w:hAnsiTheme="minorHAnsi"/>
-        </w:rPr>
-        <w:t xml:space="preserve">Elsa </w:t>
-      </w:r>
-      <w:r>
-        <w:rPr>
-          <w:rFonts w:asciiTheme="minorHAnsi" w:hAnsiTheme="minorHAnsi"/>
-        </w:rPr>
-        <w:t>seleziona</w:t>
-      </w:r>
-      <w:r>
-        <w:rPr>
-          <w:rFonts w:asciiTheme="minorHAnsi" w:hAnsiTheme="minorHAnsi"/>
-        </w:rPr>
-        <w:t xml:space="preserve"> </w:t>
-      </w:r>
-      <w:r>
-        <w:rPr>
-          <w:rFonts w:asciiTheme="minorHAnsi" w:hAnsiTheme="minorHAnsi"/>
-        </w:rPr>
-        <w:t>l’edizione che preferisce e il sistema mostra varie informazioni quali autore</w:t>
-      </w:r>
-      <w:r>
-        <w:rPr>
-          <w:rFonts w:asciiTheme="minorHAnsi" w:hAnsiTheme="minorHAnsi"/>
-        </w:rPr>
-        <w:t>,</w:t>
-      </w:r>
-      <w:r>
-        <w:rPr>
-          <w:rFonts w:asciiTheme="minorHAnsi" w:hAnsiTheme="minorHAnsi"/>
-        </w:rPr>
-        <w:t xml:space="preserve"> edizione</w:t>
-      </w:r>
-      <w:r>
-        <w:rPr>
-          <w:rFonts w:asciiTheme="minorHAnsi" w:hAnsiTheme="minorHAnsi"/>
-        </w:rPr>
-        <w:t xml:space="preserve"> e numero di copie disponibili</w:t>
-      </w:r>
-      <w:r>
-        <w:rPr>
-          <w:rFonts w:asciiTheme="minorHAnsi" w:hAnsiTheme="minorHAnsi"/>
-        </w:rPr>
-        <w:t xml:space="preserve">. </w:t>
+        <w:t xml:space="preserve"> e verifica la disponibilità sul sistema prima di recarsi in biblioteca. Elsa non è registrata, ma poiché la consultazione del catalogo è libera, può cercare il libro nel catalogo. Il sistema elenca i possibili risultati che comprendono diverse edizioni del libro. </w:t>
+      </w:r>
+    </w:p>
+    <w:p>
+      <w:pPr>
+        <w:jc w:val="both"/>
+        <w:rPr>
+          <w:rFonts w:asciiTheme="minorHAnsi" w:hAnsiTheme="minorHAnsi"/>
+        </w:rPr>
+      </w:pPr>
+    </w:p>
+    <w:p>
+      <w:pPr>
+        <w:jc w:val="both"/>
+        <w:rPr>
+          <w:rFonts w:asciiTheme="minorHAnsi" w:hAnsiTheme="minorHAnsi"/>
+        </w:rPr>
+      </w:pPr>
+      <w:r>
+        <w:rPr>
+          <w:rFonts w:asciiTheme="minorHAnsi" w:hAnsiTheme="minorHAnsi"/>
+        </w:rPr>
+        <w:t xml:space="preserve">Per restringere i risultati, Elsa limita i risultati ai soli libri disponibili e aggiorna l’elenco. Elsa seleziona l’edizione che preferisce e il sistema mostra varie informazioni quali autore, </w:t>
+      </w:r>
+      <w:r>
+        <w:rPr>
+          <w:rFonts w:asciiTheme="minorHAnsi" w:hAnsiTheme="minorHAnsi"/>
+        </w:rPr>
+        <w:t xml:space="preserve">titolo </w:t>
+      </w:r>
+      <w:r>
+        <w:rPr>
+          <w:rFonts w:asciiTheme="minorHAnsi" w:hAnsiTheme="minorHAnsi"/>
+        </w:rPr>
+        <w:t xml:space="preserve">e numero di copie disponibili. </w:t>
       </w:r>
     </w:p>
     <w:p>
@@ -5605,7 +5382,6 @@
           <w:rFonts w:ascii="Aptos" w:hAnsi="Aptos"/>
         </w:rPr>
       </w:pPr>
-      <w:bookmarkStart w:id="5" w:name="_Toc244027834"/>
       <w:r>
         <w:rPr>
           <w:rFonts w:ascii="Aptos" w:hAnsi="Aptos"/>
@@ -5633,35 +5409,12 @@
           <w:rFonts w:asciiTheme="minorHAnsi" w:hAnsiTheme="minorHAnsi"/>
         </w:rPr>
       </w:pPr>
-      <w:r>
-        <w:rPr>
-          <w:rFonts w:asciiTheme="minorHAnsi" w:hAnsiTheme="minorHAnsi"/>
-        </w:rPr>
-        <w:t>Francesco</w:t>
-      </w:r>
-      <w:r>
-        <w:rPr>
-          <w:rFonts w:asciiTheme="minorHAnsi" w:hAnsiTheme="minorHAnsi"/>
-        </w:rPr>
-        <w:t>,</w:t>
-      </w:r>
-      <w:r>
-        <w:rPr>
-          <w:rFonts w:asciiTheme="minorHAnsi" w:hAnsiTheme="minorHAnsi"/>
-        </w:rPr>
-        <w:t xml:space="preserve"> già registrato nel sistema</w:t>
-      </w:r>
-      <w:r>
-        <w:rPr>
-          <w:rFonts w:asciiTheme="minorHAnsi" w:hAnsiTheme="minorHAnsi"/>
-        </w:rPr>
-        <w:t>,</w:t>
-      </w:r>
-      <w:r>
-        <w:rPr>
-          <w:rFonts w:asciiTheme="minorHAnsi" w:hAnsiTheme="minorHAnsi"/>
-        </w:rPr>
-        <w:t xml:space="preserve"> vuole prenotare </w:t>
+      <w:bookmarkStart w:id="6" w:name="_Toc244027835"/>
+      <w:r>
+        <w:rPr>
+          <w:rFonts w:asciiTheme="minorHAnsi" w:hAnsiTheme="minorHAnsi"/>
+        </w:rPr>
+        <w:t xml:space="preserve">Francesco, già registrato nel sistema, vuole prenotare </w:t>
       </w:r>
       <w:r>
         <w:rPr>
@@ -5669,7 +5422,163 @@
           <w:i/>
           <w:iCs/>
         </w:rPr>
-        <w:t xml:space="preserve">La </w:t>
+        <w:t>La coscienza di Zeno</w:t>
+      </w:r>
+      <w:r>
+        <w:rPr>
+          <w:rFonts w:asciiTheme="minorHAnsi" w:hAnsiTheme="minorHAnsi"/>
+        </w:rPr>
+        <w:t>. Accede con e-mail e password, trova l’edizione richiesta nel catalogo e vede che una copia è disponibile. Sceglie quindi di prenotarla.</w:t>
+      </w:r>
+    </w:p>
+    <w:p>
+      <w:pPr>
+        <w:jc w:val="both"/>
+        <w:rPr>
+          <w:rFonts w:asciiTheme="minorHAnsi" w:hAnsiTheme="minorHAnsi"/>
+        </w:rPr>
+      </w:pPr>
+    </w:p>
+    <w:p>
+      <w:pPr>
+        <w:jc w:val="both"/>
+        <w:rPr>
+          <w:rFonts w:asciiTheme="minorHAnsi" w:hAnsiTheme="minorHAnsi"/>
+        </w:rPr>
+      </w:pPr>
+      <w:r>
+        <w:rPr>
+          <w:rFonts w:asciiTheme="minorHAnsi" w:hAnsiTheme="minorHAnsi"/>
+        </w:rPr>
+        <w:t>Il sistema verifica che la copia sia ancora disponibile e che Francesco non abbia già tre prenotazioni attive. Se non vi sono problemi, registra la prenotazione a nome di Francesco, segna la copia come riservata e gli comunica che può andare a ritirarla in biblioteca entro un periodo di tre giorni, al termine del quale la prenotazione scade, e la copia sarà nuovamente disponibile. Se, invece, un altro lettore ha prenotato l’ultima copia, il sistema avvisa Francesco che non è possibile effettuare la prenotazione.</w:t>
+      </w:r>
+    </w:p>
+    <w:p>
+      <w:pPr>
+        <w:jc w:val="both"/>
+        <w:rPr>
+          <w:rFonts w:asciiTheme="minorHAnsi" w:hAnsiTheme="minorHAnsi"/>
+        </w:rPr>
+      </w:pPr>
+    </w:p>
+    <w:p>
+      <w:pPr>
+        <w:jc w:val="both"/>
+        <w:rPr>
+          <w:rFonts w:asciiTheme="minorHAnsi" w:hAnsiTheme="minorHAnsi"/>
+        </w:rPr>
+      </w:pPr>
+      <w:r>
+        <w:rPr>
+          <w:rFonts w:asciiTheme="minorHAnsi" w:hAnsiTheme="minorHAnsi"/>
+        </w:rPr>
+        <w:t>Francesco può così ritirare il libro in biblioteca senza rischiare di trovarlo già in prestito.</w:t>
+      </w:r>
+    </w:p>
+    <w:p>
+      <w:pPr>
+        <w:pStyle w:val="Heading3"/>
+        <w:rPr>
+          <w:rFonts w:asciiTheme="minorHAnsi" w:hAnsiTheme="minorHAnsi"/>
+        </w:rPr>
+      </w:pPr>
+      <w:r>
+        <w:rPr>
+          <w:rFonts w:asciiTheme="minorHAnsi" w:hAnsiTheme="minorHAnsi"/>
+        </w:rPr>
+        <w:t xml:space="preserve">Scenario 4 – </w:t>
+      </w:r>
+      <w:r>
+        <w:rPr>
+          <w:rFonts w:asciiTheme="minorHAnsi" w:hAnsiTheme="minorHAnsi"/>
+        </w:rPr>
+        <w:t>Tentativo di prenotazione con s</w:t>
+      </w:r>
+      <w:r>
+        <w:rPr>
+          <w:rFonts w:asciiTheme="minorHAnsi" w:hAnsiTheme="minorHAnsi"/>
+        </w:rPr>
+        <w:t>ospensione</w:t>
+      </w:r>
+      <w:bookmarkEnd w:id="6"/>
+    </w:p>
+    <w:p>
+      <w:pPr>
+        <w:jc w:val="both"/>
+        <w:rPr>
+          <w:rFonts w:asciiTheme="minorHAnsi" w:hAnsiTheme="minorHAnsi"/>
+        </w:rPr>
+      </w:pPr>
+      <w:r>
+        <w:rPr>
+          <w:rFonts w:asciiTheme="minorHAnsi" w:hAnsiTheme="minorHAnsi"/>
+        </w:rPr>
+        <w:t>Luca, già registrato nel sistema, ha ricevuto una sospensione temporanea dalla biblioteca per aver restituito una copia presa in prestito oltre il termine stabilito.</w:t>
+      </w:r>
+    </w:p>
+    <w:p>
+      <w:pPr>
+        <w:jc w:val="both"/>
+        <w:rPr>
+          <w:rFonts w:asciiTheme="minorHAnsi" w:hAnsiTheme="minorHAnsi"/>
+        </w:rPr>
+      </w:pPr>
+    </w:p>
+    <w:p>
+      <w:pPr>
+        <w:jc w:val="both"/>
+        <w:rPr>
+          <w:rFonts w:asciiTheme="minorHAnsi" w:hAnsiTheme="minorHAnsi"/>
+        </w:rPr>
+      </w:pPr>
+      <w:r>
+        <w:rPr>
+          <w:rFonts w:asciiTheme="minorHAnsi" w:hAnsiTheme="minorHAnsi"/>
+        </w:rPr>
+        <w:t>Luca accede al sistema, ricerca nel catalogo un’edizione disponibile e prova ad effettuare una prenotazione per una copia. Il sistema rileva che Luca è in stato di sospensione e glielo comunica assieme alla data di fine della sospensione, impedendogli di effettuare la prenotazione.</w:t>
+      </w:r>
+    </w:p>
+    <w:p>
+      <w:pPr>
+        <w:pStyle w:val="Heading3"/>
+        <w:spacing w:line="276" w:lineRule="auto"/>
+        <w:rPr>
+          <w:rFonts w:ascii="Aptos" w:hAnsi="Aptos"/>
+        </w:rPr>
+      </w:pPr>
+      <w:bookmarkStart w:id="7" w:name="_Toc244027836"/>
+      <w:r>
+        <w:rPr>
+          <w:rFonts w:ascii="Aptos" w:hAnsi="Aptos"/>
+        </w:rPr>
+        <w:t xml:space="preserve">Scenario </w:t>
+      </w:r>
+      <w:r>
+        <w:rPr>
+          <w:rFonts w:ascii="Aptos" w:hAnsi="Aptos"/>
+        </w:rPr>
+        <w:t>5</w:t>
+      </w:r>
+      <w:r>
+        <w:rPr>
+          <w:rFonts w:ascii="Aptos" w:hAnsi="Aptos"/>
+        </w:rPr>
+        <w:t xml:space="preserve"> – Gestione delle proprie prenotazioni</w:t>
+      </w:r>
+      <w:bookmarkEnd w:id="7"/>
+    </w:p>
+    <w:p>
+      <w:pPr>
+        <w:jc w:val="both"/>
+        <w:rPr>
+          <w:rFonts w:asciiTheme="minorHAnsi" w:hAnsiTheme="minorHAnsi"/>
+        </w:rPr>
+      </w:pPr>
+      <w:r>
+        <w:rPr>
+          <w:rFonts w:asciiTheme="minorHAnsi" w:hAnsiTheme="minorHAnsi"/>
+        </w:rPr>
+        <w:t xml:space="preserve">Emma, già registrata nel sistema, ha prenotato una copia de </w:t>
       </w:r>
       <w:r>
         <w:rPr>
@@ -5677,7 +5586,546 @@
           <w:i/>
           <w:iCs/>
         </w:rPr>
-        <w:t>c</w:t>
+        <w:t>I promessi sposi</w:t>
+      </w:r>
+      <w:r>
+        <w:rPr>
+          <w:rFonts w:asciiTheme="minorHAnsi" w:hAnsiTheme="minorHAnsi"/>
+        </w:rPr>
+        <w:t xml:space="preserve"> ma si rende conto che non ne ha più bisogno. </w:t>
+      </w:r>
+    </w:p>
+    <w:p>
+      <w:pPr>
+        <w:jc w:val="both"/>
+        <w:rPr>
+          <w:rFonts w:asciiTheme="minorHAnsi" w:hAnsiTheme="minorHAnsi"/>
+        </w:rPr>
+      </w:pPr>
+    </w:p>
+    <w:p>
+      <w:pPr>
+        <w:jc w:val="both"/>
+        <w:rPr>
+          <w:rFonts w:asciiTheme="minorHAnsi" w:hAnsiTheme="minorHAnsi"/>
+        </w:rPr>
+      </w:pPr>
+      <w:r>
+        <w:rPr>
+          <w:rFonts w:asciiTheme="minorHAnsi" w:hAnsiTheme="minorHAnsi"/>
+        </w:rPr>
+        <w:t>Emma accede al sistema, si reca nella pagina di gestione delle prenotazioni, e annulla la prenotazione per la copia. Il sistema annulla la prenotazione e la copia riservata torna disponibile agli altri lettori.</w:t>
+      </w:r>
+    </w:p>
+    <w:p>
+      <w:pPr>
+        <w:pStyle w:val="Heading3"/>
+        <w:rPr>
+          <w:rFonts w:asciiTheme="minorHAnsi" w:hAnsiTheme="minorHAnsi"/>
+        </w:rPr>
+      </w:pPr>
+      <w:bookmarkStart w:id="8" w:name="_Toc244027837"/>
+      <w:r>
+        <w:rPr>
+          <w:rFonts w:asciiTheme="minorHAnsi" w:hAnsiTheme="minorHAnsi"/>
+        </w:rPr>
+        <w:t xml:space="preserve">Scenario </w:t>
+      </w:r>
+      <w:r>
+        <w:rPr>
+          <w:rFonts w:asciiTheme="minorHAnsi" w:hAnsiTheme="minorHAnsi"/>
+        </w:rPr>
+        <w:t>6</w:t>
+      </w:r>
+      <w:r>
+        <w:rPr>
+          <w:rFonts w:asciiTheme="minorHAnsi" w:hAnsiTheme="minorHAnsi"/>
+        </w:rPr>
+        <w:t xml:space="preserve"> – Registrazione di un prestito </w:t>
+      </w:r>
+      <w:r>
+        <w:rPr>
+          <w:rFonts w:asciiTheme="minorHAnsi" w:hAnsiTheme="minorHAnsi"/>
+        </w:rPr>
+        <w:t>senza prenotazione</w:t>
+      </w:r>
+      <w:bookmarkEnd w:id="8"/>
+    </w:p>
+    <w:p>
+      <w:pPr>
+        <w:jc w:val="both"/>
+        <w:rPr>
+          <w:rFonts w:asciiTheme="minorHAnsi" w:hAnsiTheme="minorHAnsi"/>
+        </w:rPr>
+      </w:pPr>
+      <w:bookmarkStart w:id="9" w:name="_Toc244027838"/>
+      <w:r>
+        <w:rPr>
+          <w:rFonts w:asciiTheme="minorHAnsi" w:hAnsiTheme="minorHAnsi"/>
+        </w:rPr>
+        <w:t>Gianni è un lettore e si è recato in biblioteca per prendere in prestito un libro.</w:t>
+      </w:r>
+    </w:p>
+    <w:p>
+      <w:pPr>
+        <w:jc w:val="both"/>
+        <w:rPr>
+          <w:rFonts w:asciiTheme="minorHAnsi" w:hAnsiTheme="minorHAnsi"/>
+        </w:rPr>
+      </w:pPr>
+    </w:p>
+    <w:p>
+      <w:pPr>
+        <w:jc w:val="both"/>
+        <w:rPr>
+          <w:rFonts w:asciiTheme="minorHAnsi" w:hAnsiTheme="minorHAnsi"/>
+        </w:rPr>
+      </w:pPr>
+      <w:r>
+        <w:rPr>
+          <w:rFonts w:asciiTheme="minorHAnsi" w:hAnsiTheme="minorHAnsi"/>
+        </w:rPr>
+        <w:t>Grazia, operatrice della biblioteca, verifica il suo documento d’identità e verifica se è disponibile una copia dell’edizione che Gianni vuole prendere in prestito.</w:t>
+      </w:r>
+    </w:p>
+    <w:p>
+      <w:pPr>
+        <w:jc w:val="both"/>
+        <w:rPr>
+          <w:rFonts w:asciiTheme="minorHAnsi" w:hAnsiTheme="minorHAnsi"/>
+        </w:rPr>
+      </w:pPr>
+    </w:p>
+    <w:p>
+      <w:pPr>
+        <w:jc w:val="both"/>
+        <w:rPr>
+          <w:rFonts w:asciiTheme="minorHAnsi" w:hAnsiTheme="minorHAnsi"/>
+        </w:rPr>
+      </w:pPr>
+      <w:r>
+        <w:rPr>
+          <w:rFonts w:asciiTheme="minorHAnsi" w:hAnsiTheme="minorHAnsi"/>
+        </w:rPr>
+        <w:t xml:space="preserve">Se almeno una copia è disponibile, Grazia registra il prestito a nome di Gianni, scegliendo anche la data di scadenza, e gli consegna la copia. La copia consegnata risulta, quindi, </w:t>
+      </w:r>
+      <w:r>
+        <w:rPr>
+          <w:rFonts w:asciiTheme="minorHAnsi" w:hAnsiTheme="minorHAnsi"/>
+        </w:rPr>
+        <w:t>in prestito</w:t>
+      </w:r>
+      <w:r>
+        <w:rPr>
+          <w:rFonts w:asciiTheme="minorHAnsi" w:hAnsiTheme="minorHAnsi"/>
+        </w:rPr>
+        <w:t xml:space="preserve"> Altrimenti informa Gianni che al momento non è possibile concedere il prestito.</w:t>
+      </w:r>
+    </w:p>
+    <w:p>
+      <w:pPr>
+        <w:pStyle w:val="Heading3"/>
+        <w:spacing w:line="276" w:lineRule="auto"/>
+        <w:rPr>
+          <w:rFonts w:asciiTheme="minorHAnsi" w:hAnsiTheme="minorHAnsi"/>
+        </w:rPr>
+      </w:pPr>
+      <w:r>
+        <w:rPr>
+          <w:rFonts w:asciiTheme="minorHAnsi" w:hAnsiTheme="minorHAnsi"/>
+        </w:rPr>
+        <w:t>Scenario</w:t>
+      </w:r>
+      <w:r>
+        <w:rPr>
+          <w:rFonts w:asciiTheme="minorHAnsi" w:hAnsiTheme="minorHAnsi"/>
+        </w:rPr>
+        <w:t xml:space="preserve"> </w:t>
+      </w:r>
+      <w:r>
+        <w:rPr>
+          <w:rFonts w:asciiTheme="minorHAnsi" w:hAnsiTheme="minorHAnsi"/>
+        </w:rPr>
+        <w:t>7</w:t>
+      </w:r>
+      <w:r>
+        <w:rPr>
+          <w:rFonts w:asciiTheme="minorHAnsi" w:hAnsiTheme="minorHAnsi"/>
+        </w:rPr>
+        <w:t xml:space="preserve"> – Registrazione di un prestito</w:t>
+      </w:r>
+      <w:r>
+        <w:rPr>
+          <w:rFonts w:asciiTheme="minorHAnsi" w:hAnsiTheme="minorHAnsi"/>
+        </w:rPr>
+        <w:t xml:space="preserve"> con prenotazione</w:t>
+      </w:r>
+      <w:bookmarkEnd w:id="9"/>
+    </w:p>
+    <w:p>
+      <w:pPr>
+        <w:jc w:val="both"/>
+        <w:rPr>
+          <w:rFonts w:asciiTheme="minorHAnsi" w:hAnsiTheme="minorHAnsi"/>
+        </w:rPr>
+      </w:pPr>
+      <w:bookmarkStart w:id="10" w:name="_Toc244027839"/>
+      <w:r>
+        <w:rPr>
+          <w:rFonts w:asciiTheme="minorHAnsi" w:hAnsiTheme="minorHAnsi"/>
+        </w:rPr>
+        <w:t xml:space="preserve">Giacomo, già registrato nel sistema, ha prenotato un libro online e si reca in biblioteca per ritirarlo. </w:t>
+      </w:r>
+    </w:p>
+    <w:p>
+      <w:pPr>
+        <w:jc w:val="both"/>
+        <w:rPr>
+          <w:rFonts w:asciiTheme="minorHAnsi" w:hAnsiTheme="minorHAnsi"/>
+        </w:rPr>
+      </w:pPr>
+    </w:p>
+    <w:p>
+      <w:pPr>
+        <w:jc w:val="both"/>
+        <w:rPr>
+          <w:rFonts w:asciiTheme="minorHAnsi" w:hAnsiTheme="minorHAnsi"/>
+        </w:rPr>
+      </w:pPr>
+      <w:r>
+        <w:rPr>
+          <w:rFonts w:asciiTheme="minorHAnsi" w:hAnsiTheme="minorHAnsi"/>
+        </w:rPr>
+        <w:t xml:space="preserve">Grazia, operatrice della biblioteca, verifica il suo documento d’identità e cerca il lettore tramite codice fiscale. Il sistema mostra la prenotazione attiva di Giacomo. Grazia registra il prestito a nome di Giacomo, scegliendo anche la data di scadenza, e consegna la copia riservata. La copia consegnata risulta, quindi, </w:t>
+      </w:r>
+      <w:r>
+        <w:rPr>
+          <w:rFonts w:asciiTheme="minorHAnsi" w:hAnsiTheme="minorHAnsi"/>
+        </w:rPr>
+        <w:t>in prestito</w:t>
+      </w:r>
+      <w:r>
+        <w:rPr>
+          <w:rFonts w:asciiTheme="minorHAnsi" w:hAnsiTheme="minorHAnsi"/>
+        </w:rPr>
+        <w:t xml:space="preserve"> e la prenotazione sarà eliminata.</w:t>
+      </w:r>
+    </w:p>
+    <w:p>
+      <w:pPr>
+        <w:pStyle w:val="Heading3"/>
+        <w:rPr>
+          <w:rFonts w:asciiTheme="minorHAnsi" w:hAnsiTheme="minorHAnsi"/>
+        </w:rPr>
+      </w:pPr>
+      <w:r>
+        <w:rPr>
+          <w:rFonts w:asciiTheme="minorHAnsi" w:hAnsiTheme="minorHAnsi"/>
+        </w:rPr>
+        <w:t xml:space="preserve">Scenario 8 – </w:t>
+      </w:r>
+      <w:r>
+        <w:rPr>
+          <w:rFonts w:asciiTheme="minorHAnsi" w:hAnsiTheme="minorHAnsi"/>
+        </w:rPr>
+        <w:t>Tentativo di ottenere un prestito con sospensione</w:t>
+      </w:r>
+      <w:bookmarkEnd w:id="10"/>
+    </w:p>
+    <w:p>
+      <w:pPr>
+        <w:jc w:val="both"/>
+        <w:rPr>
+          <w:rFonts w:asciiTheme="minorHAnsi" w:hAnsiTheme="minorHAnsi"/>
+        </w:rPr>
+      </w:pPr>
+      <w:bookmarkStart w:id="11" w:name="_Toc244027840"/>
+      <w:r>
+        <w:rPr>
+          <w:rFonts w:asciiTheme="minorHAnsi" w:hAnsiTheme="minorHAnsi"/>
+        </w:rPr>
+        <w:t>Luca è un lettore e ha ricevuto una sospensione temporanea dalla biblioteca per aver restituito una copia presa in prestito oltre il termine stabilito.</w:t>
+      </w:r>
+    </w:p>
+    <w:p>
+      <w:pPr>
+        <w:jc w:val="both"/>
+        <w:rPr>
+          <w:rFonts w:asciiTheme="minorHAnsi" w:hAnsiTheme="minorHAnsi"/>
+        </w:rPr>
+      </w:pPr>
+    </w:p>
+    <w:p>
+      <w:pPr>
+        <w:jc w:val="both"/>
+        <w:rPr>
+          <w:rFonts w:asciiTheme="minorHAnsi" w:hAnsiTheme="minorHAnsi"/>
+        </w:rPr>
+      </w:pPr>
+      <w:r>
+        <w:rPr>
+          <w:rFonts w:asciiTheme="minorHAnsi" w:hAnsiTheme="minorHAnsi"/>
+        </w:rPr>
+        <w:t>Si reca in biblioteca e chiede a Mario, operatore della biblioteca, se può prendere in prestito una copia di un’edizione di suo interesse.</w:t>
+      </w:r>
+    </w:p>
+    <w:p>
+      <w:pPr>
+        <w:jc w:val="both"/>
+        <w:rPr>
+          <w:rFonts w:asciiTheme="minorHAnsi" w:hAnsiTheme="minorHAnsi"/>
+        </w:rPr>
+      </w:pPr>
+    </w:p>
+    <w:p>
+      <w:pPr>
+        <w:jc w:val="both"/>
+        <w:rPr>
+          <w:rFonts w:asciiTheme="minorHAnsi" w:hAnsiTheme="minorHAnsi"/>
+        </w:rPr>
+      </w:pPr>
+      <w:r>
+        <w:rPr>
+          <w:rFonts w:asciiTheme="minorHAnsi" w:hAnsiTheme="minorHAnsi"/>
+        </w:rPr>
+        <w:t>Se almeno una copia è disponibile, Mario prova a registrare il prestito a nome di Luca, ma il sistema rileva una sospensione a suo nome, impedendo la registrazione del prestito. Mario informa Luca.</w:t>
+      </w:r>
+    </w:p>
+    <w:p>
+      <w:pPr>
+        <w:pStyle w:val="Heading3"/>
+        <w:spacing w:line="276" w:lineRule="auto"/>
+        <w:rPr>
+          <w:rFonts w:asciiTheme="minorHAnsi" w:hAnsiTheme="minorHAnsi"/>
+        </w:rPr>
+      </w:pPr>
+      <w:r>
+        <w:rPr>
+          <w:rFonts w:asciiTheme="minorHAnsi" w:hAnsiTheme="minorHAnsi"/>
+        </w:rPr>
+        <w:lastRenderedPageBreak/>
+        <w:t xml:space="preserve">Scenario </w:t>
+      </w:r>
+      <w:r>
+        <w:rPr>
+          <w:rFonts w:asciiTheme="minorHAnsi" w:hAnsiTheme="minorHAnsi"/>
+        </w:rPr>
+        <w:t>9</w:t>
+      </w:r>
+      <w:r>
+        <w:rPr>
+          <w:rFonts w:asciiTheme="minorHAnsi" w:hAnsiTheme="minorHAnsi"/>
+        </w:rPr>
+        <w:t xml:space="preserve"> – Registrazione di una restituzione</w:t>
+      </w:r>
+      <w:r>
+        <w:rPr>
+          <w:rFonts w:asciiTheme="minorHAnsi" w:hAnsiTheme="minorHAnsi"/>
+        </w:rPr>
+        <w:t xml:space="preserve"> in tempo</w:t>
+      </w:r>
+      <w:bookmarkEnd w:id="11"/>
+    </w:p>
+    <w:p>
+      <w:pPr>
+        <w:jc w:val="both"/>
+        <w:rPr>
+          <w:rFonts w:asciiTheme="minorHAnsi" w:hAnsiTheme="minorHAnsi"/>
+        </w:rPr>
+      </w:pPr>
+      <w:bookmarkStart w:id="12" w:name="_Toc244027841"/>
+      <w:r>
+        <w:rPr>
+          <w:rFonts w:asciiTheme="minorHAnsi" w:hAnsiTheme="minorHAnsi"/>
+        </w:rPr>
+        <w:t>Anna si presenta in biblioteca per restituire la copia del libro che aveva preso in prestito.</w:t>
+      </w:r>
+    </w:p>
+    <w:p>
+      <w:pPr>
+        <w:jc w:val="both"/>
+        <w:rPr>
+          <w:rFonts w:asciiTheme="minorHAnsi" w:hAnsiTheme="minorHAnsi"/>
+        </w:rPr>
+      </w:pPr>
+    </w:p>
+    <w:p>
+      <w:pPr>
+        <w:jc w:val="both"/>
+        <w:rPr>
+          <w:rFonts w:asciiTheme="minorHAnsi" w:hAnsiTheme="minorHAnsi"/>
+        </w:rPr>
+      </w:pPr>
+      <w:r>
+        <w:rPr>
+          <w:rFonts w:asciiTheme="minorHAnsi" w:hAnsiTheme="minorHAnsi"/>
+        </w:rPr>
+        <w:t>Mario, operatore della biblioteca, verifica il suo documento d’identità e cerca la lettrice tramite codice fiscale. Se tra i prestiti attivi c’è quello relativo alla copia riportata da Anna, Mario ritira la copia e registra la restituzione: il sistema verifica che la restituzione è avvenuta nei tempi, quindi chiude il prestito e la copia torna disponibile nel catalogo. Se tra i prestiti attivi di Anna non risulta quello relativo alla copia riportata, Mario avverte Anna e non registra la restituzione.</w:t>
+      </w:r>
+    </w:p>
+    <w:p>
+      <w:pPr>
+        <w:pStyle w:val="Heading3"/>
+        <w:rPr>
+          <w:rFonts w:asciiTheme="minorHAnsi" w:hAnsiTheme="minorHAnsi"/>
+        </w:rPr>
+      </w:pPr>
+      <w:r>
+        <w:rPr>
+          <w:rFonts w:asciiTheme="minorHAnsi" w:hAnsiTheme="minorHAnsi"/>
+        </w:rPr>
+        <w:t xml:space="preserve">Scenario </w:t>
+      </w:r>
+      <w:r>
+        <w:rPr>
+          <w:rFonts w:asciiTheme="minorHAnsi" w:hAnsiTheme="minorHAnsi"/>
+        </w:rPr>
+        <w:t>10</w:t>
+      </w:r>
+      <w:r>
+        <w:rPr>
+          <w:rFonts w:asciiTheme="minorHAnsi" w:hAnsiTheme="minorHAnsi"/>
+        </w:rPr>
+        <w:t xml:space="preserve"> – Registrazione di una restituzione </w:t>
+      </w:r>
+      <w:r>
+        <w:rPr>
+          <w:rFonts w:asciiTheme="minorHAnsi" w:hAnsiTheme="minorHAnsi"/>
+        </w:rPr>
+        <w:t>fuori tempo</w:t>
+      </w:r>
+      <w:bookmarkEnd w:id="12"/>
+    </w:p>
+    <w:p>
+      <w:pPr>
+        <w:jc w:val="both"/>
+        <w:rPr>
+          <w:rFonts w:asciiTheme="minorHAnsi" w:hAnsiTheme="minorHAnsi"/>
+        </w:rPr>
+      </w:pPr>
+      <w:bookmarkStart w:id="13" w:name="_Toc244027842"/>
+      <w:r>
+        <w:rPr>
+          <w:rFonts w:asciiTheme="minorHAnsi" w:hAnsiTheme="minorHAnsi"/>
+        </w:rPr>
+        <w:t>Luca è un lettore che si reca in biblioteca per restituire una copia oltre il termine stabilito.</w:t>
+      </w:r>
+    </w:p>
+    <w:p>
+      <w:pPr>
+        <w:jc w:val="both"/>
+        <w:rPr>
+          <w:rFonts w:asciiTheme="minorHAnsi" w:hAnsiTheme="minorHAnsi"/>
+        </w:rPr>
+      </w:pPr>
+    </w:p>
+    <w:p>
+      <w:pPr>
+        <w:jc w:val="both"/>
+        <w:rPr>
+          <w:rFonts w:asciiTheme="minorHAnsi" w:hAnsiTheme="minorHAnsi"/>
+        </w:rPr>
+      </w:pPr>
+      <w:r>
+        <w:rPr>
+          <w:rFonts w:asciiTheme="minorHAnsi" w:hAnsiTheme="minorHAnsi"/>
+        </w:rPr>
+        <w:t xml:space="preserve">Mario, operatore della biblioteca, verifica il suo documento d’identità e cerca il lettore tramite codice fiscale. Se tra i prestiti attivi c’è quello relativo alla copia riportata da Luca, Mario ritira la copia e registra la restituzione: il sistema verifica che la restituzione è avvenuta in ritardo e comunica di conseguenza a Mario l’entità del ritardo. Poi chiude il prestito e la copia torna disponibile nel catalogo. </w:t>
+      </w:r>
+    </w:p>
+    <w:p>
+      <w:pPr>
+        <w:jc w:val="both"/>
+        <w:rPr>
+          <w:rFonts w:asciiTheme="minorHAnsi" w:hAnsiTheme="minorHAnsi"/>
+        </w:rPr>
+      </w:pPr>
+    </w:p>
+    <w:p>
+      <w:pPr>
+        <w:jc w:val="both"/>
+        <w:rPr>
+          <w:rFonts w:asciiTheme="minorHAnsi" w:hAnsiTheme="minorHAnsi"/>
+        </w:rPr>
+      </w:pPr>
+      <w:r>
+        <w:rPr>
+          <w:rFonts w:asciiTheme="minorHAnsi" w:hAnsiTheme="minorHAnsi"/>
+        </w:rPr>
+        <w:t>Se le regole della biblioteca lo prevedono, Mario avverte Luca e registra una sospensione a suo nome, indicandone la durata. La sospensione annulla anche eventuali prenotazioni effettuate online da Luca.</w:t>
+      </w:r>
+    </w:p>
+    <w:p>
+      <w:pPr>
+        <w:pStyle w:val="Heading3"/>
+        <w:spacing w:line="276" w:lineRule="auto"/>
+        <w:rPr>
+          <w:rFonts w:asciiTheme="minorHAnsi" w:hAnsiTheme="minorHAnsi"/>
+        </w:rPr>
+      </w:pPr>
+      <w:r>
+        <w:rPr>
+          <w:rFonts w:asciiTheme="minorHAnsi" w:hAnsiTheme="minorHAnsi"/>
+        </w:rPr>
+        <w:t xml:space="preserve">Scenario </w:t>
+      </w:r>
+      <w:r>
+        <w:rPr>
+          <w:rFonts w:asciiTheme="minorHAnsi" w:hAnsiTheme="minorHAnsi"/>
+        </w:rPr>
+        <w:t>1</w:t>
+      </w:r>
+      <w:r>
+        <w:rPr>
+          <w:rFonts w:asciiTheme="minorHAnsi" w:hAnsiTheme="minorHAnsi"/>
+        </w:rPr>
+        <w:t>1</w:t>
+      </w:r>
+      <w:r>
+        <w:rPr>
+          <w:rFonts w:asciiTheme="minorHAnsi" w:hAnsiTheme="minorHAnsi"/>
+        </w:rPr>
+        <w:t xml:space="preserve"> – </w:t>
+      </w:r>
+      <w:r>
+        <w:rPr>
+          <w:rFonts w:asciiTheme="minorHAnsi" w:hAnsiTheme="minorHAnsi"/>
+        </w:rPr>
+        <w:t>Aggiunta nel catalogo</w:t>
+      </w:r>
+      <w:r>
+        <w:rPr>
+          <w:rFonts w:asciiTheme="minorHAnsi" w:hAnsiTheme="minorHAnsi"/>
+        </w:rPr>
+        <w:t xml:space="preserve"> di </w:t>
+      </w:r>
+      <w:r>
+        <w:rPr>
+          <w:rFonts w:asciiTheme="minorHAnsi" w:hAnsiTheme="minorHAnsi"/>
+        </w:rPr>
+        <w:t>una nuova edizione</w:t>
+      </w:r>
+      <w:bookmarkEnd w:id="13"/>
+    </w:p>
+    <w:p>
+      <w:pPr>
+        <w:jc w:val="both"/>
+        <w:rPr>
+          <w:rFonts w:asciiTheme="minorHAnsi" w:hAnsiTheme="minorHAnsi"/>
+        </w:rPr>
+      </w:pPr>
+      <w:bookmarkStart w:id="14" w:name="_Toc244027843"/>
+      <w:r>
+        <w:rPr>
+          <w:rFonts w:asciiTheme="minorHAnsi" w:hAnsiTheme="minorHAnsi"/>
+        </w:rPr>
+        <w:t>Mario</w:t>
+      </w:r>
+      <w:r>
+        <w:rPr>
+          <w:rFonts w:asciiTheme="minorHAnsi" w:hAnsiTheme="minorHAnsi"/>
+        </w:rPr>
+        <w:t xml:space="preserve">, operatore della biblioteca, deve inserire nel catalogo </w:t>
       </w:r>
       <w:r>
         <w:rPr>
@@ -5685,111 +6133,25 @@
           <w:i/>
           <w:iCs/>
         </w:rPr>
-        <w:t>oscienza di Zeno</w:t>
-      </w:r>
-      <w:r>
-        <w:rPr>
-          <w:rFonts w:asciiTheme="minorHAnsi" w:hAnsiTheme="minorHAnsi"/>
-        </w:rPr>
-        <w:t xml:space="preserve">. Accede con e-mail e password, trova </w:t>
-      </w:r>
-      <w:r>
-        <w:rPr>
-          <w:rFonts w:asciiTheme="minorHAnsi" w:hAnsiTheme="minorHAnsi"/>
-        </w:rPr>
-        <w:t>l’edizione richiesta</w:t>
-      </w:r>
-      <w:r>
-        <w:rPr>
-          <w:rFonts w:asciiTheme="minorHAnsi" w:hAnsiTheme="minorHAnsi"/>
-        </w:rPr>
-        <w:t xml:space="preserve"> nel catalogo e vede che una copia è disponibile. Sceglie quindi di prenotarla.</w:t>
-      </w:r>
-    </w:p>
-    <w:p>
-      <w:pPr>
-        <w:jc w:val="both"/>
-        <w:rPr>
-          <w:rFonts w:asciiTheme="minorHAnsi" w:hAnsiTheme="minorHAnsi"/>
-        </w:rPr>
-      </w:pPr>
-    </w:p>
-    <w:p>
-      <w:pPr>
-        <w:jc w:val="both"/>
-        <w:rPr>
-          <w:rFonts w:asciiTheme="minorHAnsi" w:hAnsiTheme="minorHAnsi"/>
-        </w:rPr>
-      </w:pPr>
-      <w:r>
-        <w:rPr>
-          <w:rFonts w:asciiTheme="minorHAnsi" w:hAnsiTheme="minorHAnsi"/>
-        </w:rPr>
-        <w:t xml:space="preserve">Il </w:t>
-      </w:r>
-      <w:r>
-        <w:rPr>
-          <w:rFonts w:asciiTheme="minorHAnsi" w:hAnsiTheme="minorHAnsi"/>
-        </w:rPr>
-        <w:t>sistema verifica che la copia sia ancora disponibile</w:t>
-      </w:r>
-      <w:r>
-        <w:rPr>
-          <w:rFonts w:asciiTheme="minorHAnsi" w:hAnsiTheme="minorHAnsi"/>
-        </w:rPr>
-        <w:t xml:space="preserve"> e che Francesco non abbia già tre prenotazioni attive</w:t>
-      </w:r>
-      <w:r>
-        <w:rPr>
-          <w:rFonts w:asciiTheme="minorHAnsi" w:hAnsiTheme="minorHAnsi"/>
-        </w:rPr>
-        <w:t xml:space="preserve">. Se </w:t>
-      </w:r>
-      <w:r>
-        <w:rPr>
-          <w:rFonts w:asciiTheme="minorHAnsi" w:hAnsiTheme="minorHAnsi"/>
-        </w:rPr>
-        <w:t>non vi sono problemi</w:t>
-      </w:r>
-      <w:r>
-        <w:rPr>
-          <w:rFonts w:asciiTheme="minorHAnsi" w:hAnsiTheme="minorHAnsi"/>
-        </w:rPr>
-        <w:t xml:space="preserve">, </w:t>
-      </w:r>
-      <w:r>
-        <w:rPr>
-          <w:rFonts w:asciiTheme="minorHAnsi" w:hAnsiTheme="minorHAnsi"/>
-        </w:rPr>
-        <w:t>registra la prenotazione a nome di Francesco, segna la copia come riservata e gli comunica che può andare a ritirarla in bibliotec</w:t>
-      </w:r>
-      <w:r>
-        <w:rPr>
-          <w:rFonts w:asciiTheme="minorHAnsi" w:hAnsiTheme="minorHAnsi"/>
-        </w:rPr>
-        <w:t xml:space="preserve">a entro un periodo di </w:t>
-      </w:r>
-      <w:r>
-        <w:rPr>
-          <w:rFonts w:asciiTheme="minorHAnsi" w:hAnsiTheme="minorHAnsi"/>
-        </w:rPr>
-        <w:t>72 ore</w:t>
-      </w:r>
-      <w:r>
-        <w:rPr>
-          <w:rFonts w:asciiTheme="minorHAnsi" w:hAnsiTheme="minorHAnsi"/>
-        </w:rPr>
-        <w:t>, al termine del quale la prenotazione scade, e la copia sarà nuovamente disponibile</w:t>
-      </w:r>
-      <w:r>
-        <w:rPr>
-          <w:rFonts w:asciiTheme="minorHAnsi" w:hAnsiTheme="minorHAnsi"/>
-        </w:rPr>
-        <w:t>.</w:t>
-      </w:r>
-      <w:r>
-        <w:rPr>
-          <w:rFonts w:asciiTheme="minorHAnsi" w:hAnsiTheme="minorHAnsi"/>
+        <w:t>Il barone rampante</w:t>
+      </w:r>
+      <w:r>
+        <w:rPr>
+          <w:rFonts w:asciiTheme="minorHAnsi" w:hAnsiTheme="minorHAnsi"/>
+        </w:rPr>
+        <w:t>,</w:t>
+      </w:r>
+      <w:r>
+        <w:rPr>
+          <w:rFonts w:asciiTheme="minorHAnsi" w:hAnsiTheme="minorHAnsi"/>
+        </w:rPr>
+        <w:t xml:space="preserve"> libro</w:t>
+      </w:r>
+      <w:r>
+        <w:rPr>
+          <w:rFonts w:asciiTheme="minorHAnsi" w:hAnsiTheme="minorHAnsi"/>
+          <w:i/>
+          <w:iCs/>
         </w:rPr>
         <w:t xml:space="preserve"> </w:t>
       </w:r>
@@ -5797,177 +6159,7 @@
         <w:rPr>
           <w:rFonts w:asciiTheme="minorHAnsi" w:hAnsiTheme="minorHAnsi"/>
         </w:rPr>
-        <w:t xml:space="preserve">Se, invece, </w:t>
-      </w:r>
-      <w:r>
-        <w:rPr>
-          <w:rFonts w:asciiTheme="minorHAnsi" w:hAnsiTheme="minorHAnsi"/>
-        </w:rPr>
-        <w:t>un altro lettore ha prenotato l’ultima copia, il sistema avvisa Francesco</w:t>
-      </w:r>
-      <w:r>
-        <w:rPr>
-          <w:rFonts w:asciiTheme="minorHAnsi" w:hAnsiTheme="minorHAnsi"/>
-        </w:rPr>
-        <w:t xml:space="preserve"> che non è possibile effettuare la prenotazione</w:t>
-      </w:r>
-      <w:r>
-        <w:rPr>
-          <w:rFonts w:asciiTheme="minorHAnsi" w:hAnsiTheme="minorHAnsi"/>
-        </w:rPr>
-        <w:t>.</w:t>
-      </w:r>
-    </w:p>
-    <w:p>
-      <w:pPr>
-        <w:jc w:val="both"/>
-        <w:rPr>
-          <w:rFonts w:asciiTheme="minorHAnsi" w:hAnsiTheme="minorHAnsi"/>
-        </w:rPr>
-      </w:pPr>
-    </w:p>
-    <w:p>
-      <w:pPr>
-        <w:jc w:val="both"/>
-        <w:rPr>
-          <w:rFonts w:asciiTheme="minorHAnsi" w:hAnsiTheme="minorHAnsi"/>
-        </w:rPr>
-      </w:pPr>
-      <w:r>
-        <w:rPr>
-          <w:rFonts w:asciiTheme="minorHAnsi" w:hAnsiTheme="minorHAnsi"/>
-        </w:rPr>
-        <w:t>Francesco può così ritirare il libro in biblioteca senza rischiare di trovarlo già in prestito.</w:t>
-      </w:r>
-    </w:p>
-    <w:p>
-      <w:pPr>
-        <w:pStyle w:val="Heading3"/>
-        <w:rPr>
-          <w:rFonts w:asciiTheme="minorHAnsi" w:hAnsiTheme="minorHAnsi"/>
-        </w:rPr>
-      </w:pPr>
-      <w:bookmarkStart w:id="6" w:name="_Toc244027835"/>
-      <w:r>
-        <w:rPr>
-          <w:rFonts w:asciiTheme="minorHAnsi" w:hAnsiTheme="minorHAnsi"/>
-        </w:rPr>
-        <w:t xml:space="preserve">Scenario 4 – </w:t>
-      </w:r>
-      <w:r>
-        <w:rPr>
-          <w:rFonts w:asciiTheme="minorHAnsi" w:hAnsiTheme="minorHAnsi"/>
-        </w:rPr>
-        <w:t>Tentativo di prenotazione con s</w:t>
-      </w:r>
-      <w:r>
-        <w:rPr>
-          <w:rFonts w:asciiTheme="minorHAnsi" w:hAnsiTheme="minorHAnsi"/>
-        </w:rPr>
-        <w:t>ospensione</w:t>
-      </w:r>
-      <w:bookmarkEnd w:id="6"/>
-    </w:p>
-    <w:p>
-      <w:pPr>
-        <w:jc w:val="both"/>
-        <w:rPr>
-          <w:rFonts w:asciiTheme="minorHAnsi" w:hAnsiTheme="minorHAnsi"/>
-        </w:rPr>
-      </w:pPr>
-      <w:r>
-        <w:rPr>
-          <w:rFonts w:asciiTheme="minorHAnsi" w:hAnsiTheme="minorHAnsi"/>
-        </w:rPr>
-        <w:t xml:space="preserve">Luca, già registrato nel sistema, ha ricevuto una sospensione temporanea </w:t>
-      </w:r>
-      <w:r>
-        <w:rPr>
-          <w:rFonts w:asciiTheme="minorHAnsi" w:hAnsiTheme="minorHAnsi"/>
-        </w:rPr>
-        <w:t>dalla biblioteca</w:t>
-      </w:r>
-      <w:r>
-        <w:rPr>
-          <w:rFonts w:asciiTheme="minorHAnsi" w:hAnsiTheme="minorHAnsi"/>
-        </w:rPr>
-        <w:t xml:space="preserve"> per aver restituito un</w:t>
-      </w:r>
-      <w:r>
-        <w:rPr>
-          <w:rFonts w:asciiTheme="minorHAnsi" w:hAnsiTheme="minorHAnsi"/>
-        </w:rPr>
-        <w:t>a copia</w:t>
-      </w:r>
-      <w:r>
-        <w:rPr>
-          <w:rFonts w:asciiTheme="minorHAnsi" w:hAnsiTheme="minorHAnsi"/>
-        </w:rPr>
-        <w:t xml:space="preserve"> presa in </w:t>
-      </w:r>
-      <w:r>
-        <w:rPr>
-          <w:rFonts w:asciiTheme="minorHAnsi" w:hAnsiTheme="minorHAnsi"/>
-        </w:rPr>
-        <w:t>prestito oltre il termine stabilito</w:t>
-      </w:r>
-      <w:r>
-        <w:rPr>
-          <w:rFonts w:asciiTheme="minorHAnsi" w:hAnsiTheme="minorHAnsi"/>
-        </w:rPr>
-        <w:t>.</w:t>
-      </w:r>
-    </w:p>
-    <w:p>
-      <w:pPr>
-        <w:jc w:val="both"/>
-        <w:rPr>
-          <w:rFonts w:asciiTheme="minorHAnsi" w:hAnsiTheme="minorHAnsi"/>
-        </w:rPr>
-      </w:pPr>
-    </w:p>
-    <w:p>
-      <w:pPr>
-        <w:jc w:val="both"/>
-        <w:rPr>
-          <w:rFonts w:asciiTheme="minorHAnsi" w:hAnsiTheme="minorHAnsi"/>
-        </w:rPr>
-      </w:pPr>
-      <w:r>
-        <w:rPr>
-          <w:rFonts w:asciiTheme="minorHAnsi" w:hAnsiTheme="minorHAnsi"/>
-        </w:rPr>
-        <w:t>Luca accede al sistema, ricerca nel catalogo un’edizione</w:t>
-      </w:r>
-      <w:r>
-        <w:rPr>
-          <w:rFonts w:asciiTheme="minorHAnsi" w:hAnsiTheme="minorHAnsi"/>
-        </w:rPr>
-        <w:t xml:space="preserve"> disponibile e prova ad effettuare una prenotazione per una copia. Il sistema rileva che Luca è in stato di sospensione e </w:t>
-      </w:r>
-      <w:r>
-        <w:rPr>
-          <w:rFonts w:asciiTheme="minorHAnsi" w:hAnsiTheme="minorHAnsi"/>
-        </w:rPr>
-        <w:t>glielo comunica assieme alla data di fine della sospensione</w:t>
-      </w:r>
-      <w:r>
-        <w:rPr>
-          <w:rFonts w:asciiTheme="minorHAnsi" w:hAnsiTheme="minorHAnsi"/>
-        </w:rPr>
-        <w:t>, impedendo</w:t>
-      </w:r>
-      <w:r>
-        <w:rPr>
-          <w:rFonts w:asciiTheme="minorHAnsi" w:hAnsiTheme="minorHAnsi"/>
-        </w:rPr>
-        <w:t>gli</w:t>
-      </w:r>
-      <w:r>
-        <w:rPr>
-          <w:rFonts w:asciiTheme="minorHAnsi" w:hAnsiTheme="minorHAnsi"/>
-        </w:rPr>
-        <w:t xml:space="preserve"> di effettuare la prenotazione.</w:t>
+        <w:t>appena acquisito dalla biblioteca la cui edizione non è mai stata inserita nel catalogo. Mario accede al sistema e inserisce le informazioni dell’edizione ovvero: titolo, autori, editore, categorie, lingua, data di pubblicazione e ISBN. Se i dati sono corretti, il sistema registra l’edizione.</w:t>
       </w:r>
     </w:p>
     <w:p>
@@ -5975,84 +6167,54 @@
         <w:pStyle w:val="Heading3"/>
         <w:spacing w:line="276" w:lineRule="auto"/>
         <w:rPr>
-          <w:rFonts w:ascii="Aptos" w:hAnsi="Aptos"/>
-        </w:rPr>
-      </w:pPr>
-      <w:bookmarkStart w:id="7" w:name="_Toc244027836"/>
-      <w:r>
-        <w:rPr>
-          <w:rFonts w:ascii="Aptos" w:hAnsi="Aptos"/>
+          <w:rFonts w:asciiTheme="minorHAnsi" w:hAnsiTheme="minorHAnsi"/>
+        </w:rPr>
+      </w:pPr>
+      <w:r>
+        <w:rPr>
+          <w:rFonts w:asciiTheme="minorHAnsi" w:hAnsiTheme="minorHAnsi"/>
         </w:rPr>
         <w:t xml:space="preserve">Scenario </w:t>
       </w:r>
       <w:r>
         <w:rPr>
-          <w:rFonts w:ascii="Aptos" w:hAnsi="Aptos"/>
-        </w:rPr>
-        <w:t>5</w:t>
-      </w:r>
-      <w:r>
-        <w:rPr>
-          <w:rFonts w:ascii="Aptos" w:hAnsi="Aptos"/>
-        </w:rPr>
-        <w:t xml:space="preserve"> – Gestione delle proprie prenotazioni</w:t>
-      </w:r>
-      <w:bookmarkEnd w:id="7"/>
-    </w:p>
-    <w:p>
-      <w:pPr>
-        <w:jc w:val="both"/>
-        <w:rPr>
-          <w:rFonts w:asciiTheme="minorHAnsi" w:hAnsiTheme="minorHAnsi"/>
-        </w:rPr>
-      </w:pPr>
-      <w:r>
-        <w:rPr>
-          <w:rFonts w:asciiTheme="minorHAnsi" w:hAnsiTheme="minorHAnsi"/>
-        </w:rPr>
-        <w:t>Emma</w:t>
-      </w:r>
-      <w:r>
-        <w:rPr>
-          <w:rFonts w:asciiTheme="minorHAnsi" w:hAnsiTheme="minorHAnsi"/>
-        </w:rPr>
-        <w:t>,</w:t>
-      </w:r>
-      <w:r>
-        <w:rPr>
-          <w:rFonts w:asciiTheme="minorHAnsi" w:hAnsiTheme="minorHAnsi"/>
-        </w:rPr>
-        <w:t xml:space="preserve"> già registrata nel sistema</w:t>
-      </w:r>
-      <w:r>
-        <w:rPr>
-          <w:rFonts w:asciiTheme="minorHAnsi" w:hAnsiTheme="minorHAnsi"/>
-        </w:rPr>
-        <w:t>,</w:t>
-      </w:r>
-      <w:r>
-        <w:rPr>
-          <w:rFonts w:asciiTheme="minorHAnsi" w:hAnsiTheme="minorHAnsi"/>
-        </w:rPr>
-        <w:t xml:space="preserve"> </w:t>
-      </w:r>
-      <w:r>
-        <w:rPr>
-          <w:rFonts w:asciiTheme="minorHAnsi" w:hAnsiTheme="minorHAnsi"/>
-        </w:rPr>
-        <w:t>ha prenotato</w:t>
-      </w:r>
-      <w:r>
-        <w:rPr>
-          <w:rFonts w:asciiTheme="minorHAnsi" w:hAnsiTheme="minorHAnsi"/>
-        </w:rPr>
-        <w:t xml:space="preserve"> una copia de</w:t>
-      </w:r>
-      <w:r>
-        <w:rPr>
-          <w:rFonts w:asciiTheme="minorHAnsi" w:hAnsiTheme="minorHAnsi"/>
-        </w:rPr>
-        <w:t xml:space="preserve"> </w:t>
+          <w:rFonts w:asciiTheme="minorHAnsi" w:hAnsiTheme="minorHAnsi"/>
+        </w:rPr>
+        <w:t>1</w:t>
+      </w:r>
+      <w:r>
+        <w:rPr>
+          <w:rFonts w:asciiTheme="minorHAnsi" w:hAnsiTheme="minorHAnsi"/>
+        </w:rPr>
+        <w:t>2</w:t>
+      </w:r>
+      <w:r>
+        <w:rPr>
+          <w:rFonts w:asciiTheme="minorHAnsi" w:hAnsiTheme="minorHAnsi"/>
+        </w:rPr>
+        <w:t xml:space="preserve"> – </w:t>
+      </w:r>
+      <w:r>
+        <w:rPr>
+          <w:rFonts w:asciiTheme="minorHAnsi" w:hAnsiTheme="minorHAnsi"/>
+        </w:rPr>
+        <w:t>Aggiunta nel catalogo di una copia</w:t>
+      </w:r>
+      <w:bookmarkEnd w:id="14"/>
+    </w:p>
+    <w:p>
+      <w:pPr>
+        <w:jc w:val="both"/>
+        <w:rPr>
+          <w:rFonts w:asciiTheme="minorHAnsi" w:hAnsiTheme="minorHAnsi"/>
+        </w:rPr>
+      </w:pPr>
+      <w:bookmarkStart w:id="15" w:name="_Toc244027844"/>
+      <w:r>
+        <w:rPr>
+          <w:rFonts w:asciiTheme="minorHAnsi" w:hAnsiTheme="minorHAnsi"/>
+        </w:rPr>
+        <w:t xml:space="preserve">Mario, operatore della biblioteca, deve inserire nel catalogo una nuova copia di un’edizione di </w:t>
       </w:r>
       <w:r>
         <w:rPr>
@@ -6060,7 +6222,67 @@
           <w:i/>
           <w:iCs/>
         </w:rPr>
-        <w:t xml:space="preserve">I </w:t>
+        <w:t>I dolori del giovane Werther</w:t>
+      </w:r>
+      <w:r>
+        <w:rPr>
+          <w:rFonts w:asciiTheme="minorHAnsi" w:hAnsiTheme="minorHAnsi"/>
+        </w:rPr>
+        <w:t xml:space="preserve"> già presente all’interno del catalogo. Mario accede al sistema, seleziona l’edizione e inserisce la nuova copia. Il sistema registra la nuova copia, assegnandole un identificativo.</w:t>
+      </w:r>
+    </w:p>
+    <w:p>
+      <w:pPr>
+        <w:pStyle w:val="Heading3"/>
+        <w:rPr>
+          <w:rFonts w:asciiTheme="minorHAnsi" w:hAnsiTheme="minorHAnsi"/>
+        </w:rPr>
+      </w:pPr>
+      <w:r>
+        <w:rPr>
+          <w:rFonts w:asciiTheme="minorHAnsi" w:hAnsiTheme="minorHAnsi"/>
+        </w:rPr>
+        <w:t xml:space="preserve">Scenario </w:t>
+      </w:r>
+      <w:r>
+        <w:rPr>
+          <w:rFonts w:asciiTheme="minorHAnsi" w:hAnsiTheme="minorHAnsi"/>
+        </w:rPr>
+        <w:t>1</w:t>
+      </w:r>
+      <w:r>
+        <w:rPr>
+          <w:rFonts w:asciiTheme="minorHAnsi" w:hAnsiTheme="minorHAnsi"/>
+        </w:rPr>
+        <w:t>3</w:t>
+      </w:r>
+      <w:r>
+        <w:rPr>
+          <w:rFonts w:asciiTheme="minorHAnsi" w:hAnsiTheme="minorHAnsi"/>
+        </w:rPr>
+        <w:t xml:space="preserve"> – Rimozione dal catalogo</w:t>
+      </w:r>
+      <w:r>
+        <w:rPr>
+          <w:rFonts w:asciiTheme="minorHAnsi" w:hAnsiTheme="minorHAnsi"/>
+        </w:rPr>
+        <w:t xml:space="preserve"> di una copia</w:t>
+      </w:r>
+      <w:bookmarkEnd w:id="15"/>
+    </w:p>
+    <w:p>
+      <w:pPr>
+        <w:jc w:val="both"/>
+        <w:rPr>
+          <w:rFonts w:asciiTheme="minorHAnsi" w:hAnsiTheme="minorHAnsi"/>
+        </w:rPr>
+      </w:pPr>
+      <w:bookmarkStart w:id="16" w:name="_Toc244027845"/>
+      <w:r>
+        <w:rPr>
+          <w:rFonts w:asciiTheme="minorHAnsi" w:hAnsiTheme="minorHAnsi"/>
+        </w:rPr>
+        <w:t xml:space="preserve">Mario, operatore della biblioteca, deve rimuovere una copia di </w:t>
       </w:r>
       <w:r>
         <w:rPr>
@@ -6068,95 +6290,448 @@
           <w:i/>
           <w:iCs/>
         </w:rPr>
-        <w:t>p</w:t>
-      </w:r>
-      <w:r>
-        <w:rPr>
-          <w:rFonts w:asciiTheme="minorHAnsi" w:hAnsiTheme="minorHAnsi"/>
-          <w:i/>
-          <w:iCs/>
-        </w:rPr>
-        <w:t xml:space="preserve">romessi </w:t>
-      </w:r>
-      <w:r>
-        <w:rPr>
-          <w:rFonts w:asciiTheme="minorHAnsi" w:hAnsiTheme="minorHAnsi"/>
-          <w:i/>
-          <w:iCs/>
-        </w:rPr>
-        <w:t>s</w:t>
-      </w:r>
-      <w:r>
-        <w:rPr>
-          <w:rFonts w:asciiTheme="minorHAnsi" w:hAnsiTheme="minorHAnsi"/>
-          <w:i/>
-          <w:iCs/>
-        </w:rPr>
-        <w:t>posi</w:t>
-      </w:r>
-      <w:r>
-        <w:rPr>
-          <w:rFonts w:asciiTheme="minorHAnsi" w:hAnsiTheme="minorHAnsi"/>
-        </w:rPr>
-        <w:t xml:space="preserve"> ma si</w:t>
-      </w:r>
-      <w:r>
-        <w:rPr>
-          <w:rFonts w:asciiTheme="minorHAnsi" w:hAnsiTheme="minorHAnsi"/>
-        </w:rPr>
-        <w:t xml:space="preserve"> rende conto </w:t>
-      </w:r>
-      <w:r>
-        <w:rPr>
-          <w:rFonts w:asciiTheme="minorHAnsi" w:hAnsiTheme="minorHAnsi"/>
-        </w:rPr>
-        <w:t xml:space="preserve">che non ne ha più bisogno. </w:t>
-      </w:r>
-    </w:p>
-    <w:p>
-      <w:pPr>
-        <w:jc w:val="both"/>
-        <w:rPr>
-          <w:rFonts w:asciiTheme="minorHAnsi" w:hAnsiTheme="minorHAnsi"/>
-        </w:rPr>
-      </w:pPr>
-    </w:p>
-    <w:p>
-      <w:pPr>
-        <w:jc w:val="both"/>
-        <w:rPr>
-          <w:rFonts w:asciiTheme="minorHAnsi" w:hAnsiTheme="minorHAnsi"/>
-        </w:rPr>
-      </w:pPr>
-      <w:r>
-        <w:rPr>
-          <w:rFonts w:asciiTheme="minorHAnsi" w:hAnsiTheme="minorHAnsi"/>
-        </w:rPr>
-        <w:t xml:space="preserve">Emma accede al sistema, si reca nella pagina di gestione delle prenotazioni, e </w:t>
-      </w:r>
-      <w:r>
-        <w:rPr>
-          <w:rFonts w:asciiTheme="minorHAnsi" w:hAnsiTheme="minorHAnsi"/>
-        </w:rPr>
-        <w:t>annulla</w:t>
-      </w:r>
-      <w:r>
-        <w:rPr>
-          <w:rFonts w:asciiTheme="minorHAnsi" w:hAnsiTheme="minorHAnsi"/>
-        </w:rPr>
-        <w:t xml:space="preserve"> la prenotazione</w:t>
-      </w:r>
-      <w:r>
-        <w:rPr>
-          <w:rFonts w:asciiTheme="minorHAnsi" w:hAnsiTheme="minorHAnsi"/>
-        </w:rPr>
-        <w:t xml:space="preserve"> </w:t>
-      </w:r>
-      <w:r>
-        <w:rPr>
-          <w:rFonts w:asciiTheme="minorHAnsi" w:hAnsiTheme="minorHAnsi"/>
-        </w:rPr>
-        <w:t>per la copia</w:t>
+        <w:t>Oliver Twist</w:t>
+      </w:r>
+      <w:r>
+        <w:rPr>
+          <w:rFonts w:asciiTheme="minorHAnsi" w:hAnsiTheme="minorHAnsi"/>
+        </w:rPr>
+        <w:t xml:space="preserve"> dal catalogo, in quanto il libro è stato ceduto. Mario accede al sistema, ricerca la copia e se essa è disponibile, la rimuove e il sistema aggiorna il catalogo affinché la copia non sia più presente. Se la copia è riservata o in prestito, la rimozione non sarà possibile.</w:t>
+      </w:r>
+    </w:p>
+    <w:p>
+      <w:pPr>
+        <w:pStyle w:val="Heading3"/>
+        <w:rPr>
+          <w:rFonts w:asciiTheme="minorHAnsi" w:hAnsiTheme="minorHAnsi"/>
+        </w:rPr>
+      </w:pPr>
+      <w:r>
+        <w:rPr>
+          <w:rFonts w:asciiTheme="minorHAnsi" w:hAnsiTheme="minorHAnsi"/>
+        </w:rPr>
+        <w:t xml:space="preserve">Scenario 14 – </w:t>
+      </w:r>
+      <w:r>
+        <w:rPr>
+          <w:rFonts w:asciiTheme="minorHAnsi" w:hAnsiTheme="minorHAnsi"/>
+        </w:rPr>
+        <w:t xml:space="preserve">Ricerca di informazioni su un </w:t>
+      </w:r>
+      <w:r>
+        <w:rPr>
+          <w:rFonts w:asciiTheme="minorHAnsi" w:hAnsiTheme="minorHAnsi"/>
+        </w:rPr>
+        <w:t>lettore</w:t>
+      </w:r>
+      <w:bookmarkEnd w:id="16"/>
+    </w:p>
+    <w:p>
+      <w:pPr>
+        <w:jc w:val="both"/>
+        <w:rPr>
+          <w:rFonts w:asciiTheme="minorHAnsi" w:hAnsiTheme="minorHAnsi"/>
+        </w:rPr>
+      </w:pPr>
+      <w:bookmarkStart w:id="17" w:name="_Toc244027846"/>
+      <w:r>
+        <w:rPr>
+          <w:rFonts w:asciiTheme="minorHAnsi" w:hAnsiTheme="minorHAnsi"/>
+        </w:rPr>
+        <w:t>Grazia, operatrice della biblioteca, deve ottenere delle informazioni su un lettore della biblioteca.</w:t>
+      </w:r>
+    </w:p>
+    <w:p>
+      <w:pPr>
+        <w:jc w:val="both"/>
+        <w:rPr>
+          <w:rFonts w:asciiTheme="minorHAnsi" w:hAnsiTheme="minorHAnsi"/>
+        </w:rPr>
+      </w:pPr>
+    </w:p>
+    <w:p>
+      <w:pPr>
+        <w:jc w:val="both"/>
+        <w:rPr>
+          <w:rFonts w:asciiTheme="minorHAnsi" w:hAnsiTheme="minorHAnsi"/>
+        </w:rPr>
+      </w:pPr>
+      <w:r>
+        <w:rPr>
+          <w:rFonts w:asciiTheme="minorHAnsi" w:hAnsiTheme="minorHAnsi"/>
+        </w:rPr>
+        <w:lastRenderedPageBreak/>
+        <w:t xml:space="preserve">Grazia accede al sistema e ricerca il lettore tramite codice fiscale. Il sistema presenta a Grazia il suo storico dei prestiti, delle restituzioni e delle sospensioni e le sue prenotazioni attive. Se il lettore è registrato, il sistema lo mostra. </w:t>
+      </w:r>
+    </w:p>
+    <w:p>
+      <w:pPr>
+        <w:pStyle w:val="Heading3"/>
+        <w:rPr>
+          <w:rFonts w:asciiTheme="minorHAnsi" w:hAnsiTheme="minorHAnsi"/>
+        </w:rPr>
+      </w:pPr>
+      <w:r>
+        <w:rPr>
+          <w:rFonts w:asciiTheme="minorHAnsi" w:hAnsiTheme="minorHAnsi"/>
+        </w:rPr>
+        <w:t>Scenario 1</w:t>
+      </w:r>
+      <w:r>
+        <w:rPr>
+          <w:rFonts w:asciiTheme="minorHAnsi" w:hAnsiTheme="minorHAnsi"/>
+        </w:rPr>
+        <w:t>5</w:t>
+      </w:r>
+      <w:r>
+        <w:rPr>
+          <w:rFonts w:asciiTheme="minorHAnsi" w:hAnsiTheme="minorHAnsi"/>
+        </w:rPr>
+        <w:t xml:space="preserve"> – </w:t>
+      </w:r>
+      <w:r>
+        <w:rPr>
+          <w:rFonts w:asciiTheme="minorHAnsi" w:hAnsiTheme="minorHAnsi"/>
+        </w:rPr>
+        <w:t>Modifica di un edizione presente nel catalogo</w:t>
+      </w:r>
+      <w:bookmarkEnd w:id="17"/>
+    </w:p>
+    <w:p>
+      <w:pPr>
+        <w:jc w:val="both"/>
+        <w:rPr>
+          <w:rFonts w:asciiTheme="minorHAnsi" w:hAnsiTheme="minorHAnsi"/>
+        </w:rPr>
+      </w:pPr>
+      <w:bookmarkStart w:id="18" w:name="_Toc244027847"/>
+      <w:r>
+        <w:rPr>
+          <w:rFonts w:asciiTheme="minorHAnsi" w:hAnsiTheme="minorHAnsi"/>
+        </w:rPr>
+        <w:t>Grazia, operatrice della biblioteca, deve modificare delle informazioni di un’edizione già presente nel catalogo. Grazia accede al sistema, seleziona l’edizione e ne modifica le informazioni. Il sistema registra le modifiche, aggiornando anche le informazioni mostrate nel catalogo.</w:t>
+      </w:r>
+    </w:p>
+    <w:p>
+      <w:pPr>
+        <w:pStyle w:val="Heading3"/>
+        <w:rPr>
+          <w:rFonts w:asciiTheme="minorHAnsi" w:hAnsiTheme="minorHAnsi"/>
+        </w:rPr>
+      </w:pPr>
+      <w:r>
+        <w:rPr>
+          <w:rFonts w:asciiTheme="minorHAnsi" w:hAnsiTheme="minorHAnsi"/>
+        </w:rPr>
+        <w:t>Scenario 16 – Modifica delle informazioni di un account lettore</w:t>
+      </w:r>
+      <w:bookmarkEnd w:id="18"/>
+    </w:p>
+    <w:p>
+      <w:pPr>
+        <w:jc w:val="both"/>
+        <w:rPr>
+          <w:rFonts w:asciiTheme="minorHAnsi" w:hAnsiTheme="minorHAnsi"/>
+        </w:rPr>
+      </w:pPr>
+      <w:bookmarkStart w:id="19" w:name="_Toc244027848"/>
+      <w:r>
+        <w:rPr>
+          <w:rFonts w:asciiTheme="minorHAnsi" w:hAnsiTheme="minorHAnsi"/>
+        </w:rPr>
+        <w:t>Grazia, operatrice della biblioteca, deve modificare un’informazione associata all’account di Giuseppe, lettore registrato.</w:t>
+      </w:r>
+    </w:p>
+    <w:p>
+      <w:pPr>
+        <w:jc w:val="both"/>
+        <w:rPr>
+          <w:rFonts w:asciiTheme="minorHAnsi" w:hAnsiTheme="minorHAnsi"/>
+        </w:rPr>
+      </w:pPr>
+    </w:p>
+    <w:p>
+      <w:pPr>
+        <w:jc w:val="both"/>
+        <w:rPr>
+          <w:rFonts w:asciiTheme="minorHAnsi" w:hAnsiTheme="minorHAnsi"/>
+        </w:rPr>
+      </w:pPr>
+      <w:r>
+        <w:rPr>
+          <w:rFonts w:asciiTheme="minorHAnsi" w:hAnsiTheme="minorHAnsi"/>
+        </w:rPr>
+        <w:t>Grazia accede al sistema e ricerca il lettore tramite codice fiscale. Il sistema presenta a Grazia le sue informazioni.</w:t>
+      </w:r>
+    </w:p>
+    <w:p>
+      <w:pPr>
+        <w:jc w:val="both"/>
+        <w:rPr>
+          <w:rFonts w:asciiTheme="minorHAnsi" w:hAnsiTheme="minorHAnsi"/>
+        </w:rPr>
+      </w:pPr>
+    </w:p>
+    <w:p>
+      <w:pPr>
+        <w:jc w:val="both"/>
+        <w:rPr>
+          <w:rFonts w:asciiTheme="minorHAnsi" w:hAnsiTheme="minorHAnsi"/>
+        </w:rPr>
+      </w:pPr>
+      <w:r>
+        <w:rPr>
+          <w:rFonts w:asciiTheme="minorHAnsi" w:hAnsiTheme="minorHAnsi"/>
+        </w:rPr>
+        <w:t>Grazia procede modificando le informazioni del lettore. Il sistema verifica la validità delle modifiche. Se sono valide, aggiorna le informazioni dell’account; altrimenti le rifiuta e segnala a Grazia i problemi riscontrati.</w:t>
+      </w:r>
+    </w:p>
+    <w:p>
+      <w:pPr>
+        <w:pStyle w:val="Heading3"/>
+        <w:rPr>
+          <w:rFonts w:asciiTheme="minorHAnsi" w:hAnsiTheme="minorHAnsi"/>
+        </w:rPr>
+      </w:pPr>
+      <w:r>
+        <w:rPr>
+          <w:rFonts w:asciiTheme="minorHAnsi" w:hAnsiTheme="minorHAnsi"/>
+        </w:rPr>
+        <w:t>Scenario 1</w:t>
+      </w:r>
+      <w:r>
+        <w:rPr>
+          <w:rFonts w:asciiTheme="minorHAnsi" w:hAnsiTheme="minorHAnsi"/>
+        </w:rPr>
+        <w:t>7</w:t>
+      </w:r>
+      <w:r>
+        <w:rPr>
+          <w:rFonts w:asciiTheme="minorHAnsi" w:hAnsiTheme="minorHAnsi"/>
+        </w:rPr>
+        <w:t xml:space="preserve"> – </w:t>
+      </w:r>
+      <w:r>
+        <w:rPr>
+          <w:rFonts w:asciiTheme="minorHAnsi" w:hAnsiTheme="minorHAnsi"/>
+        </w:rPr>
+        <w:t xml:space="preserve">Richiesta di modifica della password </w:t>
+      </w:r>
+      <w:r>
+        <w:rPr>
+          <w:rFonts w:asciiTheme="minorHAnsi" w:hAnsiTheme="minorHAnsi"/>
+        </w:rPr>
+        <w:t>dell’account</w:t>
+      </w:r>
+      <w:bookmarkEnd w:id="19"/>
+    </w:p>
+    <w:p>
+      <w:pPr>
+        <w:jc w:val="both"/>
+        <w:rPr>
+          <w:rFonts w:asciiTheme="minorHAnsi" w:hAnsiTheme="minorHAnsi"/>
+        </w:rPr>
+      </w:pPr>
+      <w:bookmarkStart w:id="20" w:name="_Toc244027849"/>
+      <w:r>
+        <w:rPr>
+          <w:rFonts w:asciiTheme="minorHAnsi" w:hAnsiTheme="minorHAnsi"/>
+        </w:rPr>
+        <w:t>Alessandro, lettore registrato, si reca in biblioteca per richiedere una modifica della password del proprio account.</w:t>
+      </w:r>
+    </w:p>
+    <w:p>
+      <w:pPr>
+        <w:jc w:val="both"/>
+        <w:rPr>
+          <w:rFonts w:asciiTheme="minorHAnsi" w:hAnsiTheme="minorHAnsi"/>
+        </w:rPr>
+      </w:pPr>
+    </w:p>
+    <w:p>
+      <w:pPr>
+        <w:jc w:val="both"/>
+        <w:rPr>
+          <w:rFonts w:asciiTheme="minorHAnsi" w:hAnsiTheme="minorHAnsi"/>
+        </w:rPr>
+      </w:pPr>
+      <w:r>
+        <w:rPr>
+          <w:rFonts w:asciiTheme="minorHAnsi" w:hAnsiTheme="minorHAnsi"/>
+        </w:rPr>
+        <w:t>Grazia, operatrice della biblioteca, accede al sistema e ricerca il lettore tramite codice fiscale. Il sistema presenta a Grazia le informazioni che riguardano il lettore, e se è registrato, mostrerà anche un’opzione che consente di resettare la password dell’account di Alessandro.</w:t>
+      </w:r>
+    </w:p>
+    <w:p>
+      <w:pPr>
+        <w:jc w:val="both"/>
+        <w:rPr>
+          <w:rFonts w:asciiTheme="minorHAnsi" w:hAnsiTheme="minorHAnsi"/>
+        </w:rPr>
+      </w:pPr>
+    </w:p>
+    <w:p>
+      <w:pPr>
+        <w:jc w:val="both"/>
+        <w:rPr>
+          <w:rFonts w:asciiTheme="minorHAnsi" w:hAnsiTheme="minorHAnsi"/>
+        </w:rPr>
+      </w:pPr>
+      <w:r>
+        <w:rPr>
+          <w:rFonts w:asciiTheme="minorHAnsi" w:hAnsiTheme="minorHAnsi"/>
+        </w:rPr>
+        <w:t xml:space="preserve">Una volta che Grazia ha richiesto il reset, il sistema mostra su schermo la nuova password </w:t>
+      </w:r>
+      <w:r>
+        <w:rPr>
+          <w:rFonts w:asciiTheme="minorHAnsi" w:hAnsiTheme="minorHAnsi"/>
+        </w:rPr>
+        <w:t>provvisoria</w:t>
+      </w:r>
+      <w:r>
+        <w:rPr>
+          <w:rFonts w:asciiTheme="minorHAnsi" w:hAnsiTheme="minorHAnsi"/>
+        </w:rPr>
+        <w:t xml:space="preserve"> che viene comunicata ad Alessandro.</w:t>
+      </w:r>
+    </w:p>
+    <w:p>
+      <w:pPr>
+        <w:jc w:val="both"/>
+        <w:rPr>
+          <w:rFonts w:asciiTheme="minorHAnsi" w:hAnsiTheme="minorHAnsi"/>
+        </w:rPr>
+      </w:pPr>
+    </w:p>
+    <w:p>
+      <w:pPr>
+        <w:jc w:val="both"/>
+        <w:rPr>
+          <w:rFonts w:asciiTheme="minorHAnsi" w:hAnsiTheme="minorHAnsi"/>
+        </w:rPr>
+      </w:pPr>
+      <w:r>
+        <w:rPr>
+          <w:rFonts w:asciiTheme="minorHAnsi" w:hAnsiTheme="minorHAnsi"/>
+        </w:rPr>
+        <w:t xml:space="preserve">Quando Alessandro accede al sistema tramite e-mail e password </w:t>
+      </w:r>
+      <w:r>
+        <w:rPr>
+          <w:rFonts w:asciiTheme="minorHAnsi" w:hAnsiTheme="minorHAnsi"/>
+        </w:rPr>
+        <w:t>provvisoria</w:t>
+      </w:r>
+      <w:r>
+        <w:rPr>
+          <w:rFonts w:asciiTheme="minorHAnsi" w:hAnsiTheme="minorHAnsi"/>
+        </w:rPr>
+        <w:t>, il sistema gli chiede di scegliere una nuova password.</w:t>
+      </w:r>
+    </w:p>
+    <w:p>
+      <w:pPr>
+        <w:pStyle w:val="Heading3"/>
+        <w:rPr>
+          <w:rFonts w:asciiTheme="minorHAnsi" w:hAnsiTheme="minorHAnsi"/>
+        </w:rPr>
+      </w:pPr>
+      <w:r>
+        <w:rPr>
+          <w:rFonts w:asciiTheme="minorHAnsi" w:hAnsiTheme="minorHAnsi"/>
+        </w:rPr>
+        <w:t>Scenario 1</w:t>
+      </w:r>
+      <w:r>
+        <w:rPr>
+          <w:rFonts w:asciiTheme="minorHAnsi" w:hAnsiTheme="minorHAnsi"/>
+        </w:rPr>
+        <w:t>8</w:t>
+      </w:r>
+      <w:r>
+        <w:rPr>
+          <w:rFonts w:asciiTheme="minorHAnsi" w:hAnsiTheme="minorHAnsi"/>
+        </w:rPr>
+        <w:t xml:space="preserve"> – Registrazione di una sospensione</w:t>
+      </w:r>
+      <w:bookmarkEnd w:id="20"/>
+    </w:p>
+    <w:p>
+      <w:pPr>
+        <w:jc w:val="both"/>
+        <w:rPr>
+          <w:rFonts w:asciiTheme="minorHAnsi" w:hAnsiTheme="minorHAnsi"/>
+        </w:rPr>
+      </w:pPr>
+      <w:bookmarkStart w:id="21" w:name="_Toc244027850"/>
+      <w:r>
+        <w:rPr>
+          <w:rFonts w:asciiTheme="minorHAnsi" w:hAnsiTheme="minorHAnsi"/>
+        </w:rPr>
+        <w:t xml:space="preserve">Mario, operatore della biblioteca, deve </w:t>
+      </w:r>
+      <w:r>
+        <w:rPr>
+          <w:rFonts w:asciiTheme="minorHAnsi" w:hAnsiTheme="minorHAnsi"/>
+        </w:rPr>
+        <w:t xml:space="preserve">assegnare </w:t>
+      </w:r>
+      <w:r>
+        <w:rPr>
+          <w:rFonts w:asciiTheme="minorHAnsi" w:hAnsiTheme="minorHAnsi"/>
+        </w:rPr>
+        <w:t>una sospensione temporanea a Luca, lettore della biblioteca.</w:t>
+      </w:r>
+    </w:p>
+    <w:p>
+      <w:pPr>
+        <w:jc w:val="both"/>
+        <w:rPr>
+          <w:rFonts w:asciiTheme="minorHAnsi" w:hAnsiTheme="minorHAnsi"/>
+        </w:rPr>
+      </w:pPr>
+    </w:p>
+    <w:p>
+      <w:pPr>
+        <w:jc w:val="both"/>
+        <w:rPr>
+          <w:rFonts w:asciiTheme="minorHAnsi" w:hAnsiTheme="minorHAnsi"/>
+        </w:rPr>
+      </w:pPr>
+      <w:r>
+        <w:rPr>
+          <w:rFonts w:asciiTheme="minorHAnsi" w:hAnsiTheme="minorHAnsi"/>
+        </w:rPr>
+        <w:t>Mario accede al sistema e ricerca il lettore tramite codice fiscale. Il sistema presenta a Mario le informazioni che riguardano Luca.</w:t>
+      </w:r>
+    </w:p>
+    <w:p>
+      <w:pPr>
+        <w:jc w:val="both"/>
+        <w:rPr>
+          <w:rFonts w:asciiTheme="minorHAnsi" w:hAnsiTheme="minorHAnsi"/>
+        </w:rPr>
+      </w:pPr>
+    </w:p>
+    <w:p>
+      <w:pPr>
+        <w:jc w:val="both"/>
+        <w:rPr>
+          <w:rFonts w:asciiTheme="minorHAnsi" w:hAnsiTheme="minorHAnsi"/>
+        </w:rPr>
+      </w:pPr>
+      <w:r>
+        <w:rPr>
+          <w:rFonts w:asciiTheme="minorHAnsi" w:hAnsiTheme="minorHAnsi"/>
+        </w:rPr>
+        <w:t>Mario preme sul pulsante dedicato e registra una sospensione a Luca</w:t>
+      </w:r>
+      <w:r>
+        <w:rPr>
+          <w:rFonts w:asciiTheme="minorHAnsi" w:hAnsiTheme="minorHAnsi"/>
+        </w:rPr>
+        <w:t>, indicando motivazione e data di termine</w:t>
       </w:r>
       <w:r>
         <w:rPr>
@@ -6164,12 +6739,6 @@
         </w:rPr>
         <w:t>.</w:t>
       </w:r>
-      <w:r>
-        <w:rPr>
-          <w:rFonts w:asciiTheme="minorHAnsi" w:hAnsiTheme="minorHAnsi"/>
-        </w:rPr>
-        <w:t xml:space="preserve"> Il sistema annulla la prenotazione e la copia riservata torna disponibile agli altri lettori.</w:t>
-      </w:r>
     </w:p>
     <w:p>
       <w:pPr>
@@ -6178,1866 +6747,6 @@
           <w:rFonts w:asciiTheme="minorHAnsi" w:hAnsiTheme="minorHAnsi"/>
         </w:rPr>
       </w:pPr>
-      <w:bookmarkStart w:id="8" w:name="_Toc244027837"/>
-      <w:r>
-        <w:rPr>
-          <w:rFonts w:asciiTheme="minorHAnsi" w:hAnsiTheme="minorHAnsi"/>
-        </w:rPr>
-        <w:t xml:space="preserve">Scenario </w:t>
-      </w:r>
-      <w:r>
-        <w:rPr>
-          <w:rFonts w:asciiTheme="minorHAnsi" w:hAnsiTheme="minorHAnsi"/>
-        </w:rPr>
-        <w:t>6</w:t>
-      </w:r>
-      <w:r>
-        <w:rPr>
-          <w:rFonts w:asciiTheme="minorHAnsi" w:hAnsiTheme="minorHAnsi"/>
-        </w:rPr>
-        <w:t xml:space="preserve"> – Registrazione di un prestito </w:t>
-      </w:r>
-      <w:r>
-        <w:rPr>
-          <w:rFonts w:asciiTheme="minorHAnsi" w:hAnsiTheme="minorHAnsi"/>
-        </w:rPr>
-        <w:t>senza prenotazione</w:t>
-      </w:r>
-      <w:bookmarkEnd w:id="8"/>
-    </w:p>
-    <w:p>
-      <w:pPr>
-        <w:jc w:val="both"/>
-        <w:rPr>
-          <w:rFonts w:asciiTheme="minorHAnsi" w:hAnsiTheme="minorHAnsi"/>
-        </w:rPr>
-      </w:pPr>
-      <w:r>
-        <w:rPr>
-          <w:rFonts w:asciiTheme="minorHAnsi" w:hAnsiTheme="minorHAnsi"/>
-        </w:rPr>
-        <w:t>Gianni</w:t>
-      </w:r>
-      <w:r>
-        <w:rPr>
-          <w:rFonts w:asciiTheme="minorHAnsi" w:hAnsiTheme="minorHAnsi"/>
-        </w:rPr>
-        <w:t xml:space="preserve"> è un lettore e</w:t>
-      </w:r>
-      <w:r>
-        <w:rPr>
-          <w:rFonts w:asciiTheme="minorHAnsi" w:hAnsiTheme="minorHAnsi"/>
-        </w:rPr>
-        <w:t xml:space="preserve"> si è recato in biblioteca </w:t>
-      </w:r>
-      <w:r>
-        <w:rPr>
-          <w:rFonts w:asciiTheme="minorHAnsi" w:hAnsiTheme="minorHAnsi"/>
-        </w:rPr>
-        <w:t>per</w:t>
-      </w:r>
-      <w:r>
-        <w:rPr>
-          <w:rFonts w:asciiTheme="minorHAnsi" w:hAnsiTheme="minorHAnsi"/>
-        </w:rPr>
-        <w:t xml:space="preserve"> prendere in prestito un libro.</w:t>
-      </w:r>
-    </w:p>
-    <w:p>
-      <w:pPr>
-        <w:jc w:val="both"/>
-        <w:rPr>
-          <w:rFonts w:asciiTheme="minorHAnsi" w:hAnsiTheme="minorHAnsi"/>
-        </w:rPr>
-      </w:pPr>
-    </w:p>
-    <w:p>
-      <w:pPr>
-        <w:jc w:val="both"/>
-        <w:rPr>
-          <w:rFonts w:asciiTheme="minorHAnsi" w:hAnsiTheme="minorHAnsi"/>
-        </w:rPr>
-      </w:pPr>
-      <w:r>
-        <w:rPr>
-          <w:rFonts w:asciiTheme="minorHAnsi" w:hAnsiTheme="minorHAnsi"/>
-        </w:rPr>
-        <w:t xml:space="preserve">Grazia, operatrice della biblioteca, verifica il suo documento d’identità e verifica se è disponibile una copia </w:t>
-      </w:r>
-      <w:r>
-        <w:rPr>
-          <w:rFonts w:asciiTheme="minorHAnsi" w:hAnsiTheme="minorHAnsi"/>
-        </w:rPr>
-        <w:t>dell’edizione</w:t>
-      </w:r>
-      <w:r>
-        <w:rPr>
-          <w:rFonts w:asciiTheme="minorHAnsi" w:hAnsiTheme="minorHAnsi"/>
-        </w:rPr>
-        <w:t xml:space="preserve"> che </w:t>
-      </w:r>
-      <w:r>
-        <w:rPr>
-          <w:rFonts w:asciiTheme="minorHAnsi" w:hAnsiTheme="minorHAnsi"/>
-        </w:rPr>
-        <w:t>Gianni</w:t>
-      </w:r>
-      <w:r>
-        <w:rPr>
-          <w:rFonts w:asciiTheme="minorHAnsi" w:hAnsiTheme="minorHAnsi"/>
-        </w:rPr>
-        <w:t xml:space="preserve"> vuole prendere in prestito.</w:t>
-      </w:r>
-    </w:p>
-    <w:p>
-      <w:pPr>
-        <w:jc w:val="both"/>
-        <w:rPr>
-          <w:rFonts w:asciiTheme="minorHAnsi" w:hAnsiTheme="minorHAnsi"/>
-        </w:rPr>
-      </w:pPr>
-    </w:p>
-    <w:p>
-      <w:pPr>
-        <w:jc w:val="both"/>
-        <w:rPr>
-          <w:rFonts w:asciiTheme="minorHAnsi" w:hAnsiTheme="minorHAnsi"/>
-        </w:rPr>
-      </w:pPr>
-      <w:r>
-        <w:rPr>
-          <w:rFonts w:asciiTheme="minorHAnsi" w:hAnsiTheme="minorHAnsi"/>
-        </w:rPr>
-        <w:t xml:space="preserve">Se almeno una copia è disponibile, Grazia registra il prestito a nome di </w:t>
-      </w:r>
-      <w:r>
-        <w:rPr>
-          <w:rFonts w:asciiTheme="minorHAnsi" w:hAnsiTheme="minorHAnsi"/>
-        </w:rPr>
-        <w:t>Gianni</w:t>
-      </w:r>
-      <w:r>
-        <w:rPr>
-          <w:rFonts w:asciiTheme="minorHAnsi" w:hAnsiTheme="minorHAnsi"/>
-        </w:rPr>
-        <w:t>, scegliendo anche la data di scadenza,</w:t>
-      </w:r>
-      <w:r>
-        <w:rPr>
-          <w:rFonts w:asciiTheme="minorHAnsi" w:hAnsiTheme="minorHAnsi"/>
-        </w:rPr>
-        <w:t xml:space="preserve"> e gli consegna la copia. La copia consegnata</w:t>
-      </w:r>
-      <w:r>
-        <w:rPr>
-          <w:rFonts w:asciiTheme="minorHAnsi" w:hAnsiTheme="minorHAnsi"/>
-        </w:rPr>
-        <w:t xml:space="preserve"> risulta, quindi, non disponibile. Altrimenti informa </w:t>
-      </w:r>
-      <w:r>
-        <w:rPr>
-          <w:rFonts w:asciiTheme="minorHAnsi" w:hAnsiTheme="minorHAnsi"/>
-        </w:rPr>
-        <w:t>Gianni</w:t>
-      </w:r>
-      <w:r>
-        <w:rPr>
-          <w:rFonts w:asciiTheme="minorHAnsi" w:hAnsiTheme="minorHAnsi"/>
-        </w:rPr>
-        <w:t xml:space="preserve"> che al momento non è possibile </w:t>
-      </w:r>
-      <w:r>
-        <w:rPr>
-          <w:rFonts w:asciiTheme="minorHAnsi" w:hAnsiTheme="minorHAnsi"/>
-        </w:rPr>
-        <w:t>concedere il prestito</w:t>
-      </w:r>
-      <w:r>
-        <w:rPr>
-          <w:rFonts w:asciiTheme="minorHAnsi" w:hAnsiTheme="minorHAnsi"/>
-        </w:rPr>
-        <w:t>.</w:t>
-      </w:r>
-    </w:p>
-    <w:p>
-      <w:pPr>
-        <w:pStyle w:val="Heading3"/>
-        <w:spacing w:line="276" w:lineRule="auto"/>
-        <w:rPr>
-          <w:rFonts w:asciiTheme="minorHAnsi" w:hAnsiTheme="minorHAnsi"/>
-        </w:rPr>
-      </w:pPr>
-      <w:bookmarkStart w:id="9" w:name="_Toc244027838"/>
-      <w:r>
-        <w:rPr>
-          <w:rFonts w:asciiTheme="minorHAnsi" w:hAnsiTheme="minorHAnsi"/>
-        </w:rPr>
-        <w:t>Scenario</w:t>
-      </w:r>
-      <w:r>
-        <w:rPr>
-          <w:rFonts w:asciiTheme="minorHAnsi" w:hAnsiTheme="minorHAnsi"/>
-        </w:rPr>
-        <w:t xml:space="preserve"> </w:t>
-      </w:r>
-      <w:r>
-        <w:rPr>
-          <w:rFonts w:asciiTheme="minorHAnsi" w:hAnsiTheme="minorHAnsi"/>
-        </w:rPr>
-        <w:t>7</w:t>
-      </w:r>
-      <w:r>
-        <w:rPr>
-          <w:rFonts w:asciiTheme="minorHAnsi" w:hAnsiTheme="minorHAnsi"/>
-        </w:rPr>
-        <w:t xml:space="preserve"> – Registrazione di un prestito</w:t>
-      </w:r>
-      <w:r>
-        <w:rPr>
-          <w:rFonts w:asciiTheme="minorHAnsi" w:hAnsiTheme="minorHAnsi"/>
-        </w:rPr>
-        <w:t xml:space="preserve"> con prenotazione</w:t>
-      </w:r>
-      <w:bookmarkEnd w:id="9"/>
-    </w:p>
-    <w:p>
-      <w:pPr>
-        <w:jc w:val="both"/>
-        <w:rPr>
-          <w:rFonts w:asciiTheme="minorHAnsi" w:hAnsiTheme="minorHAnsi"/>
-        </w:rPr>
-      </w:pPr>
-      <w:r>
-        <w:rPr>
-          <w:rFonts w:asciiTheme="minorHAnsi" w:hAnsiTheme="minorHAnsi"/>
-        </w:rPr>
-        <w:t xml:space="preserve">Giacomo, già registrato nel sistema, ha prenotato un libro online e si reca in biblioteca per ritirarlo. </w:t>
-      </w:r>
-    </w:p>
-    <w:p>
-      <w:pPr>
-        <w:jc w:val="both"/>
-        <w:rPr>
-          <w:rFonts w:asciiTheme="minorHAnsi" w:hAnsiTheme="minorHAnsi"/>
-        </w:rPr>
-      </w:pPr>
-    </w:p>
-    <w:p>
-      <w:pPr>
-        <w:jc w:val="both"/>
-        <w:rPr>
-          <w:rFonts w:asciiTheme="minorHAnsi" w:hAnsiTheme="minorHAnsi"/>
-        </w:rPr>
-      </w:pPr>
-      <w:r>
-        <w:rPr>
-          <w:rFonts w:asciiTheme="minorHAnsi" w:hAnsiTheme="minorHAnsi"/>
-        </w:rPr>
-        <w:t>Grazia, operatrice della biblioteca, verifica il suo documento d’identità e cerca il lettore tramite codice fiscale. Il sistema mostra la prenotazione attiva di Giacomo.</w:t>
-      </w:r>
-      <w:r>
-        <w:rPr>
-          <w:rFonts w:asciiTheme="minorHAnsi" w:hAnsiTheme="minorHAnsi"/>
-        </w:rPr>
-        <w:t xml:space="preserve"> </w:t>
-      </w:r>
-      <w:r>
-        <w:rPr>
-          <w:rFonts w:asciiTheme="minorHAnsi" w:hAnsiTheme="minorHAnsi"/>
-        </w:rPr>
-        <w:t xml:space="preserve">Grazia registra il prestito a nome di Giacomo, scegliendo anche la data di scadenza, e </w:t>
-      </w:r>
-      <w:r>
-        <w:rPr>
-          <w:rFonts w:asciiTheme="minorHAnsi" w:hAnsiTheme="minorHAnsi"/>
-        </w:rPr>
-        <w:t>consegna la copia riservata. La copia consegnata risulta, quindi, non dispon</w:t>
-      </w:r>
-      <w:r>
-        <w:rPr>
-          <w:rFonts w:asciiTheme="minorHAnsi" w:hAnsiTheme="minorHAnsi"/>
-        </w:rPr>
-        <w:t>i</w:t>
-      </w:r>
-      <w:r>
-        <w:rPr>
-          <w:rFonts w:asciiTheme="minorHAnsi" w:hAnsiTheme="minorHAnsi"/>
-        </w:rPr>
-        <w:t>bile</w:t>
-      </w:r>
-      <w:r>
-        <w:rPr>
-          <w:rFonts w:asciiTheme="minorHAnsi" w:hAnsiTheme="minorHAnsi"/>
-        </w:rPr>
-        <w:t xml:space="preserve"> e la prenotazione sarà </w:t>
-      </w:r>
-      <w:r>
-        <w:rPr>
-          <w:rFonts w:asciiTheme="minorHAnsi" w:hAnsiTheme="minorHAnsi"/>
-        </w:rPr>
-        <w:t>eliminata</w:t>
-      </w:r>
-      <w:r>
-        <w:rPr>
-          <w:rFonts w:asciiTheme="minorHAnsi" w:hAnsiTheme="minorHAnsi"/>
-        </w:rPr>
-        <w:t>.</w:t>
-      </w:r>
-    </w:p>
-    <w:p>
-      <w:pPr>
-        <w:pStyle w:val="Heading3"/>
-        <w:rPr>
-          <w:rFonts w:asciiTheme="minorHAnsi" w:hAnsiTheme="minorHAnsi"/>
-        </w:rPr>
-      </w:pPr>
-      <w:bookmarkStart w:id="10" w:name="_Toc244027839"/>
-      <w:r>
-        <w:rPr>
-          <w:rFonts w:asciiTheme="minorHAnsi" w:hAnsiTheme="minorHAnsi"/>
-        </w:rPr>
-        <w:t xml:space="preserve">Scenario 8 – </w:t>
-      </w:r>
-      <w:r>
-        <w:rPr>
-          <w:rFonts w:asciiTheme="minorHAnsi" w:hAnsiTheme="minorHAnsi"/>
-        </w:rPr>
-        <w:t>Tentativo di ottenere un prestito con sospensione</w:t>
-      </w:r>
-      <w:bookmarkEnd w:id="10"/>
-    </w:p>
-    <w:p>
-      <w:pPr>
-        <w:rPr>
-          <w:rFonts w:asciiTheme="minorHAnsi" w:hAnsiTheme="minorHAnsi"/>
-        </w:rPr>
-      </w:pPr>
-      <w:r>
-        <w:rPr>
-          <w:rFonts w:asciiTheme="minorHAnsi" w:hAnsiTheme="minorHAnsi"/>
-        </w:rPr>
-        <w:t>Luca è un lettore e ha ricevuto una sospe</w:t>
-      </w:r>
-      <w:r>
-        <w:rPr>
-          <w:rFonts w:asciiTheme="minorHAnsi" w:hAnsiTheme="minorHAnsi"/>
-        </w:rPr>
-        <w:t>n</w:t>
-      </w:r>
-      <w:r>
-        <w:rPr>
-          <w:rFonts w:asciiTheme="minorHAnsi" w:hAnsiTheme="minorHAnsi"/>
-        </w:rPr>
-        <w:t xml:space="preserve">sione temporanea </w:t>
-      </w:r>
-      <w:r>
-        <w:rPr>
-          <w:rFonts w:asciiTheme="minorHAnsi" w:hAnsiTheme="minorHAnsi"/>
-        </w:rPr>
-        <w:t xml:space="preserve">dalla biblioteca </w:t>
-      </w:r>
-      <w:r>
-        <w:rPr>
-          <w:rFonts w:asciiTheme="minorHAnsi" w:hAnsiTheme="minorHAnsi"/>
-        </w:rPr>
-        <w:t>per aver restituito un</w:t>
-      </w:r>
-      <w:r>
-        <w:rPr>
-          <w:rFonts w:asciiTheme="minorHAnsi" w:hAnsiTheme="minorHAnsi"/>
-        </w:rPr>
-        <w:t>a copia</w:t>
-      </w:r>
-      <w:r>
-        <w:rPr>
-          <w:rFonts w:asciiTheme="minorHAnsi" w:hAnsiTheme="minorHAnsi"/>
-        </w:rPr>
-        <w:t xml:space="preserve"> presa in prestito </w:t>
-      </w:r>
-      <w:r>
-        <w:rPr>
-          <w:rFonts w:asciiTheme="minorHAnsi" w:hAnsiTheme="minorHAnsi"/>
-        </w:rPr>
-        <w:t>oltre il termine stabilito</w:t>
-      </w:r>
-      <w:r>
-        <w:rPr>
-          <w:rFonts w:asciiTheme="minorHAnsi" w:hAnsiTheme="minorHAnsi"/>
-        </w:rPr>
-        <w:t>.</w:t>
-      </w:r>
-    </w:p>
-    <w:p>
-      <w:pPr>
-        <w:rPr>
-          <w:rFonts w:asciiTheme="minorHAnsi" w:hAnsiTheme="minorHAnsi"/>
-        </w:rPr>
-      </w:pPr>
-    </w:p>
-    <w:p>
-      <w:pPr>
-        <w:rPr>
-          <w:rFonts w:asciiTheme="minorHAnsi" w:hAnsiTheme="minorHAnsi"/>
-        </w:rPr>
-      </w:pPr>
-      <w:r>
-        <w:rPr>
-          <w:rFonts w:asciiTheme="minorHAnsi" w:hAnsiTheme="minorHAnsi"/>
-        </w:rPr>
-        <w:t>Si reca in biblioteca e chiede a Mario, operatore della biblioteca, se può prendere in prestito una copia di un’edizione di suo interesse.</w:t>
-      </w:r>
-    </w:p>
-    <w:p>
-      <w:pPr>
-        <w:rPr>
-          <w:rFonts w:asciiTheme="minorHAnsi" w:hAnsiTheme="minorHAnsi"/>
-        </w:rPr>
-      </w:pPr>
-    </w:p>
-    <w:p>
-      <w:pPr>
-        <w:jc w:val="both"/>
-        <w:rPr>
-          <w:rFonts w:asciiTheme="minorHAnsi" w:hAnsiTheme="minorHAnsi"/>
-        </w:rPr>
-      </w:pPr>
-      <w:r>
-        <w:rPr>
-          <w:rFonts w:asciiTheme="minorHAnsi" w:hAnsiTheme="minorHAnsi"/>
-        </w:rPr>
-        <w:t>Se almeno una copia è disponibile, Mario prova a registra</w:t>
-      </w:r>
-      <w:r>
-        <w:rPr>
-          <w:rFonts w:asciiTheme="minorHAnsi" w:hAnsiTheme="minorHAnsi"/>
-        </w:rPr>
-        <w:t>re</w:t>
-      </w:r>
-      <w:r>
-        <w:rPr>
-          <w:rFonts w:asciiTheme="minorHAnsi" w:hAnsiTheme="minorHAnsi"/>
-        </w:rPr>
-        <w:t xml:space="preserve"> il prestito a nome di Luca, ma il sistema rileva una sospensione a suo nome, impedendo la registrazione del prestito.</w:t>
-      </w:r>
-      <w:r>
-        <w:rPr>
-          <w:rFonts w:asciiTheme="minorHAnsi" w:hAnsiTheme="minorHAnsi"/>
-        </w:rPr>
-        <w:t xml:space="preserve"> Mario informa Luca.</w:t>
-      </w:r>
-    </w:p>
-    <w:p>
-      <w:pPr>
-        <w:pStyle w:val="Heading3"/>
-        <w:spacing w:line="276" w:lineRule="auto"/>
-        <w:rPr>
-          <w:rFonts w:asciiTheme="minorHAnsi" w:hAnsiTheme="minorHAnsi"/>
-        </w:rPr>
-      </w:pPr>
-      <w:bookmarkStart w:id="11" w:name="_Toc244027840"/>
-      <w:r>
-        <w:rPr>
-          <w:rFonts w:asciiTheme="minorHAnsi" w:hAnsiTheme="minorHAnsi"/>
-        </w:rPr>
-        <w:lastRenderedPageBreak/>
-        <w:t xml:space="preserve">Scenario </w:t>
-      </w:r>
-      <w:r>
-        <w:rPr>
-          <w:rFonts w:asciiTheme="minorHAnsi" w:hAnsiTheme="minorHAnsi"/>
-        </w:rPr>
-        <w:t>9</w:t>
-      </w:r>
-      <w:r>
-        <w:rPr>
-          <w:rFonts w:asciiTheme="minorHAnsi" w:hAnsiTheme="minorHAnsi"/>
-        </w:rPr>
-        <w:t xml:space="preserve"> – Registrazione di una restituzione</w:t>
-      </w:r>
-      <w:r>
-        <w:rPr>
-          <w:rFonts w:asciiTheme="minorHAnsi" w:hAnsiTheme="minorHAnsi"/>
-        </w:rPr>
-        <w:t xml:space="preserve"> in tempo</w:t>
-      </w:r>
-      <w:bookmarkEnd w:id="11"/>
-    </w:p>
-    <w:p>
-      <w:pPr>
-        <w:jc w:val="both"/>
-        <w:rPr>
-          <w:rFonts w:asciiTheme="minorHAnsi" w:hAnsiTheme="minorHAnsi"/>
-        </w:rPr>
-      </w:pPr>
-      <w:r>
-        <w:rPr>
-          <w:rFonts w:asciiTheme="minorHAnsi" w:hAnsiTheme="minorHAnsi"/>
-        </w:rPr>
-        <w:t>Anna</w:t>
-      </w:r>
-      <w:r>
-        <w:rPr>
-          <w:rFonts w:asciiTheme="minorHAnsi" w:hAnsiTheme="minorHAnsi"/>
-        </w:rPr>
-        <w:t xml:space="preserve"> </w:t>
-      </w:r>
-      <w:r>
-        <w:rPr>
-          <w:rFonts w:asciiTheme="minorHAnsi" w:hAnsiTheme="minorHAnsi"/>
-        </w:rPr>
-        <w:t>si presenta in biblioteca per res</w:t>
-      </w:r>
-      <w:r>
-        <w:rPr>
-          <w:rFonts w:asciiTheme="minorHAnsi" w:hAnsiTheme="minorHAnsi"/>
-        </w:rPr>
-        <w:t>tituire la copia del libro che aveva preso in prestito.</w:t>
-      </w:r>
-    </w:p>
-    <w:p>
-      <w:pPr>
-        <w:jc w:val="both"/>
-        <w:rPr>
-          <w:rFonts w:asciiTheme="minorHAnsi" w:hAnsiTheme="minorHAnsi"/>
-        </w:rPr>
-      </w:pPr>
-    </w:p>
-    <w:p>
-      <w:pPr>
-        <w:jc w:val="both"/>
-        <w:rPr>
-          <w:rFonts w:asciiTheme="minorHAnsi" w:hAnsiTheme="minorHAnsi"/>
-        </w:rPr>
-      </w:pPr>
-      <w:r>
-        <w:rPr>
-          <w:rFonts w:asciiTheme="minorHAnsi" w:hAnsiTheme="minorHAnsi"/>
-        </w:rPr>
-        <w:t xml:space="preserve">Mario, operatore della biblioteca, verifica il suo documento d’identità e cerca </w:t>
-      </w:r>
-      <w:r>
-        <w:rPr>
-          <w:rFonts w:asciiTheme="minorHAnsi" w:hAnsiTheme="minorHAnsi"/>
-        </w:rPr>
-        <w:t>la lettrice tramite codice fiscale</w:t>
-      </w:r>
-      <w:r>
-        <w:rPr>
-          <w:rFonts w:asciiTheme="minorHAnsi" w:hAnsiTheme="minorHAnsi"/>
-        </w:rPr>
-        <w:t xml:space="preserve">. Se </w:t>
-      </w:r>
-      <w:r>
-        <w:rPr>
-          <w:rFonts w:asciiTheme="minorHAnsi" w:hAnsiTheme="minorHAnsi"/>
-        </w:rPr>
-        <w:t>tra i</w:t>
-      </w:r>
-      <w:r>
-        <w:rPr>
-          <w:rFonts w:asciiTheme="minorHAnsi" w:hAnsiTheme="minorHAnsi"/>
-        </w:rPr>
-        <w:t xml:space="preserve"> prestit</w:t>
-      </w:r>
-      <w:r>
-        <w:rPr>
-          <w:rFonts w:asciiTheme="minorHAnsi" w:hAnsiTheme="minorHAnsi"/>
-        </w:rPr>
-        <w:t>i attivi c’è quello relativo alla copia riportata da Anna</w:t>
-      </w:r>
-      <w:r>
-        <w:rPr>
-          <w:rFonts w:asciiTheme="minorHAnsi" w:hAnsiTheme="minorHAnsi"/>
-        </w:rPr>
-        <w:t>, Mario ritira la copia e registra la restituzione: il sistema</w:t>
-      </w:r>
-      <w:r>
-        <w:rPr>
-          <w:rFonts w:asciiTheme="minorHAnsi" w:hAnsiTheme="minorHAnsi"/>
-        </w:rPr>
-        <w:t xml:space="preserve"> verifica che la restituzione è avvenuta nei tempi, quindi</w:t>
-      </w:r>
-      <w:r>
-        <w:rPr>
-          <w:rFonts w:asciiTheme="minorHAnsi" w:hAnsiTheme="minorHAnsi"/>
-        </w:rPr>
-        <w:t xml:space="preserve"> chiude il prestito e la copia torna dispon</w:t>
-      </w:r>
-      <w:r>
-        <w:rPr>
-          <w:rFonts w:asciiTheme="minorHAnsi" w:hAnsiTheme="minorHAnsi"/>
-        </w:rPr>
-        <w:t>i</w:t>
-      </w:r>
-      <w:r>
-        <w:rPr>
-          <w:rFonts w:asciiTheme="minorHAnsi" w:hAnsiTheme="minorHAnsi"/>
-        </w:rPr>
-        <w:t xml:space="preserve">bile nel catalogo. Se </w:t>
-      </w:r>
-      <w:r>
-        <w:rPr>
-          <w:rFonts w:asciiTheme="minorHAnsi" w:hAnsiTheme="minorHAnsi"/>
-        </w:rPr>
-        <w:t>tra i prestiti attivi di Anna non risulta quello relativo alla copia riportata</w:t>
-      </w:r>
-      <w:r>
-        <w:rPr>
-          <w:rFonts w:asciiTheme="minorHAnsi" w:hAnsiTheme="minorHAnsi"/>
-        </w:rPr>
-        <w:t>, Mario</w:t>
-      </w:r>
-      <w:r>
-        <w:rPr>
-          <w:rFonts w:asciiTheme="minorHAnsi" w:hAnsiTheme="minorHAnsi"/>
-        </w:rPr>
-        <w:t xml:space="preserve"> avverte Anna e</w:t>
-      </w:r>
-      <w:r>
-        <w:rPr>
-          <w:rFonts w:asciiTheme="minorHAnsi" w:hAnsiTheme="minorHAnsi"/>
-        </w:rPr>
-        <w:t xml:space="preserve"> non registra la restituzione.</w:t>
-      </w:r>
-    </w:p>
-    <w:p>
-      <w:pPr>
-        <w:pStyle w:val="Heading3"/>
-        <w:rPr>
-          <w:rFonts w:asciiTheme="minorHAnsi" w:hAnsiTheme="minorHAnsi"/>
-        </w:rPr>
-      </w:pPr>
-      <w:bookmarkStart w:id="12" w:name="_Toc244027841"/>
-      <w:r>
-        <w:rPr>
-          <w:rFonts w:asciiTheme="minorHAnsi" w:hAnsiTheme="minorHAnsi"/>
-        </w:rPr>
-        <w:t xml:space="preserve">Scenario </w:t>
-      </w:r>
-      <w:r>
-        <w:rPr>
-          <w:rFonts w:asciiTheme="minorHAnsi" w:hAnsiTheme="minorHAnsi"/>
-        </w:rPr>
-        <w:t>10</w:t>
-      </w:r>
-      <w:r>
-        <w:rPr>
-          <w:rFonts w:asciiTheme="minorHAnsi" w:hAnsiTheme="minorHAnsi"/>
-        </w:rPr>
-        <w:t xml:space="preserve"> – Registrazione di una restituzione </w:t>
-      </w:r>
-      <w:r>
-        <w:rPr>
-          <w:rFonts w:asciiTheme="minorHAnsi" w:hAnsiTheme="minorHAnsi"/>
-        </w:rPr>
-        <w:t>fuori tempo</w:t>
-      </w:r>
-      <w:bookmarkEnd w:id="12"/>
-    </w:p>
-    <w:p>
-      <w:pPr>
-        <w:jc w:val="both"/>
-        <w:rPr>
-          <w:rFonts w:asciiTheme="minorHAnsi" w:hAnsiTheme="minorHAnsi"/>
-        </w:rPr>
-      </w:pPr>
-      <w:r>
-        <w:rPr>
-          <w:rFonts w:asciiTheme="minorHAnsi" w:hAnsiTheme="minorHAnsi"/>
-        </w:rPr>
-        <w:t xml:space="preserve">Luca </w:t>
-      </w:r>
-      <w:r>
-        <w:rPr>
-          <w:rFonts w:asciiTheme="minorHAnsi" w:hAnsiTheme="minorHAnsi"/>
-        </w:rPr>
-        <w:t>è un lettore</w:t>
-      </w:r>
-      <w:r>
-        <w:rPr>
-          <w:rFonts w:asciiTheme="minorHAnsi" w:hAnsiTheme="minorHAnsi"/>
-        </w:rPr>
-        <w:t xml:space="preserve"> che</w:t>
-      </w:r>
-      <w:r>
-        <w:rPr>
-          <w:rFonts w:asciiTheme="minorHAnsi" w:hAnsiTheme="minorHAnsi"/>
-        </w:rPr>
-        <w:t xml:space="preserve"> </w:t>
-      </w:r>
-      <w:r>
-        <w:rPr>
-          <w:rFonts w:asciiTheme="minorHAnsi" w:hAnsiTheme="minorHAnsi"/>
-        </w:rPr>
-        <w:t>si reca in biblioteca</w:t>
-      </w:r>
-      <w:r>
-        <w:rPr>
-          <w:rFonts w:asciiTheme="minorHAnsi" w:hAnsiTheme="minorHAnsi"/>
-        </w:rPr>
-        <w:t xml:space="preserve"> </w:t>
-      </w:r>
-      <w:r>
-        <w:rPr>
-          <w:rFonts w:asciiTheme="minorHAnsi" w:hAnsiTheme="minorHAnsi"/>
-        </w:rPr>
-        <w:t xml:space="preserve">per </w:t>
-      </w:r>
-      <w:r>
-        <w:rPr>
-          <w:rFonts w:asciiTheme="minorHAnsi" w:hAnsiTheme="minorHAnsi"/>
-        </w:rPr>
-        <w:t>restituire</w:t>
-      </w:r>
-      <w:r>
-        <w:rPr>
-          <w:rFonts w:asciiTheme="minorHAnsi" w:hAnsiTheme="minorHAnsi"/>
-        </w:rPr>
-        <w:t xml:space="preserve"> una</w:t>
-      </w:r>
-      <w:r>
-        <w:rPr>
-          <w:rFonts w:asciiTheme="minorHAnsi" w:hAnsiTheme="minorHAnsi"/>
-        </w:rPr>
-        <w:t xml:space="preserve"> copia</w:t>
-      </w:r>
-      <w:r>
-        <w:rPr>
-          <w:rFonts w:asciiTheme="minorHAnsi" w:hAnsiTheme="minorHAnsi"/>
-        </w:rPr>
-        <w:t xml:space="preserve"> oltre il termine stabilito</w:t>
-      </w:r>
-      <w:r>
-        <w:rPr>
-          <w:rFonts w:asciiTheme="minorHAnsi" w:hAnsiTheme="minorHAnsi"/>
-        </w:rPr>
-        <w:t>.</w:t>
-      </w:r>
-    </w:p>
-    <w:p>
-      <w:pPr>
-        <w:jc w:val="both"/>
-        <w:rPr>
-          <w:rFonts w:asciiTheme="minorHAnsi" w:hAnsiTheme="minorHAnsi"/>
-        </w:rPr>
-      </w:pPr>
-    </w:p>
-    <w:p>
-      <w:pPr>
-        <w:jc w:val="both"/>
-        <w:rPr>
-          <w:rFonts w:asciiTheme="minorHAnsi" w:hAnsiTheme="minorHAnsi"/>
-        </w:rPr>
-      </w:pPr>
-      <w:r>
-        <w:rPr>
-          <w:rFonts w:asciiTheme="minorHAnsi" w:hAnsiTheme="minorHAnsi"/>
-        </w:rPr>
-        <w:t xml:space="preserve">Mario, operatore della biblioteca, verifica il suo documento d’identità e cerca </w:t>
-      </w:r>
-      <w:r>
-        <w:rPr>
-          <w:rFonts w:asciiTheme="minorHAnsi" w:hAnsiTheme="minorHAnsi"/>
-        </w:rPr>
-        <w:t>il lettore</w:t>
-      </w:r>
-      <w:r>
-        <w:rPr>
-          <w:rFonts w:asciiTheme="minorHAnsi" w:hAnsiTheme="minorHAnsi"/>
-        </w:rPr>
-        <w:t xml:space="preserve"> tramite codice fiscale. Se tra i prestiti attivi c’è quello relativo alla copia riportata da </w:t>
-      </w:r>
-      <w:r>
-        <w:rPr>
-          <w:rFonts w:asciiTheme="minorHAnsi" w:hAnsiTheme="minorHAnsi"/>
-        </w:rPr>
-        <w:t>Luca</w:t>
-      </w:r>
-      <w:r>
-        <w:rPr>
-          <w:rFonts w:asciiTheme="minorHAnsi" w:hAnsiTheme="minorHAnsi"/>
-        </w:rPr>
-        <w:t xml:space="preserve">, Mario ritira la copia e registra la restituzione: il sistema </w:t>
-      </w:r>
-      <w:r>
-        <w:rPr>
-          <w:rFonts w:asciiTheme="minorHAnsi" w:hAnsiTheme="minorHAnsi"/>
-        </w:rPr>
-        <w:t xml:space="preserve">verifica che la restituzione è avvenuta in ritardo e comunica di conseguenza a Mario l’entità del ritardo. Poi </w:t>
-      </w:r>
-      <w:r>
-        <w:rPr>
-          <w:rFonts w:asciiTheme="minorHAnsi" w:hAnsiTheme="minorHAnsi"/>
-        </w:rPr>
-        <w:t xml:space="preserve">chiude il prestito e la copia torna disponibile nel catalogo. </w:t>
-      </w:r>
-    </w:p>
-    <w:p>
-      <w:pPr>
-        <w:jc w:val="both"/>
-        <w:rPr>
-          <w:rFonts w:asciiTheme="minorHAnsi" w:hAnsiTheme="minorHAnsi"/>
-        </w:rPr>
-      </w:pPr>
-    </w:p>
-    <w:p>
-      <w:pPr>
-        <w:jc w:val="both"/>
-        <w:rPr>
-          <w:rFonts w:asciiTheme="minorHAnsi" w:hAnsiTheme="minorHAnsi"/>
-        </w:rPr>
-      </w:pPr>
-      <w:r>
-        <w:rPr>
-          <w:rFonts w:asciiTheme="minorHAnsi" w:hAnsiTheme="minorHAnsi"/>
-        </w:rPr>
-        <w:t>Se le regole della biblioteca lo prevedono, Mario avverte Luca e registra una sospensione a suo nome, indicando</w:t>
-      </w:r>
-      <w:r>
-        <w:rPr>
-          <w:rFonts w:asciiTheme="minorHAnsi" w:hAnsiTheme="minorHAnsi"/>
-        </w:rPr>
-        <w:t xml:space="preserve">ne la </w:t>
-      </w:r>
-      <w:r>
-        <w:rPr>
-          <w:rFonts w:asciiTheme="minorHAnsi" w:hAnsiTheme="minorHAnsi"/>
-        </w:rPr>
-        <w:t>durata.</w:t>
-      </w:r>
-      <w:r>
-        <w:rPr>
-          <w:rFonts w:asciiTheme="minorHAnsi" w:hAnsiTheme="minorHAnsi"/>
-        </w:rPr>
-        <w:t xml:space="preserve"> La sospensione annulla anche eventuali prenotazioni effettuate online da Luca.</w:t>
-      </w:r>
-    </w:p>
-    <w:p>
-      <w:pPr>
-        <w:pStyle w:val="Heading3"/>
-        <w:spacing w:line="276" w:lineRule="auto"/>
-        <w:rPr>
-          <w:rFonts w:asciiTheme="minorHAnsi" w:hAnsiTheme="minorHAnsi"/>
-        </w:rPr>
-      </w:pPr>
-      <w:bookmarkStart w:id="13" w:name="_Toc244027842"/>
-      <w:r>
-        <w:rPr>
-          <w:rFonts w:asciiTheme="minorHAnsi" w:hAnsiTheme="minorHAnsi"/>
-        </w:rPr>
-        <w:t xml:space="preserve">Scenario </w:t>
-      </w:r>
-      <w:r>
-        <w:rPr>
-          <w:rFonts w:asciiTheme="minorHAnsi" w:hAnsiTheme="minorHAnsi"/>
-        </w:rPr>
-        <w:t>1</w:t>
-      </w:r>
-      <w:r>
-        <w:rPr>
-          <w:rFonts w:asciiTheme="minorHAnsi" w:hAnsiTheme="minorHAnsi"/>
-        </w:rPr>
-        <w:t>1</w:t>
-      </w:r>
-      <w:r>
-        <w:rPr>
-          <w:rFonts w:asciiTheme="minorHAnsi" w:hAnsiTheme="minorHAnsi"/>
-        </w:rPr>
-        <w:t xml:space="preserve"> – </w:t>
-      </w:r>
-      <w:r>
-        <w:rPr>
-          <w:rFonts w:asciiTheme="minorHAnsi" w:hAnsiTheme="minorHAnsi"/>
-        </w:rPr>
-        <w:t>Aggiunta nel catalogo</w:t>
-      </w:r>
-      <w:r>
-        <w:rPr>
-          <w:rFonts w:asciiTheme="minorHAnsi" w:hAnsiTheme="minorHAnsi"/>
-        </w:rPr>
-        <w:t xml:space="preserve"> di </w:t>
-      </w:r>
-      <w:r>
-        <w:rPr>
-          <w:rFonts w:asciiTheme="minorHAnsi" w:hAnsiTheme="minorHAnsi"/>
-        </w:rPr>
-        <w:t>una nuova edizione</w:t>
-      </w:r>
-      <w:bookmarkEnd w:id="13"/>
-    </w:p>
-    <w:p>
-      <w:pPr>
-        <w:jc w:val="both"/>
-        <w:rPr>
-          <w:rFonts w:asciiTheme="minorHAnsi" w:hAnsiTheme="minorHAnsi"/>
-        </w:rPr>
-      </w:pPr>
-      <w:r>
-        <w:rPr>
-          <w:rFonts w:asciiTheme="minorHAnsi" w:hAnsiTheme="minorHAnsi"/>
-        </w:rPr>
-        <w:t>Mario</w:t>
-      </w:r>
-      <w:r>
-        <w:rPr>
-          <w:rFonts w:asciiTheme="minorHAnsi" w:hAnsiTheme="minorHAnsi"/>
-        </w:rPr>
-        <w:t>, operatore della biblioteca, dev</w:t>
-      </w:r>
-      <w:r>
-        <w:rPr>
-          <w:rFonts w:asciiTheme="minorHAnsi" w:hAnsiTheme="minorHAnsi"/>
-        </w:rPr>
-        <w:t xml:space="preserve">e inserire nel catalogo </w:t>
-      </w:r>
-      <w:r>
-        <w:rPr>
-          <w:rFonts w:asciiTheme="minorHAnsi" w:hAnsiTheme="minorHAnsi"/>
-          <w:i/>
-          <w:iCs/>
-        </w:rPr>
-        <w:t>Il barone rampante</w:t>
-      </w:r>
-      <w:r>
-        <w:rPr>
-          <w:rFonts w:asciiTheme="minorHAnsi" w:hAnsiTheme="minorHAnsi"/>
-        </w:rPr>
-        <w:t>,</w:t>
-      </w:r>
-      <w:r>
-        <w:rPr>
-          <w:rFonts w:asciiTheme="minorHAnsi" w:hAnsiTheme="minorHAnsi"/>
-        </w:rPr>
-        <w:t xml:space="preserve"> libro</w:t>
-      </w:r>
-      <w:r>
-        <w:rPr>
-          <w:rFonts w:asciiTheme="minorHAnsi" w:hAnsiTheme="minorHAnsi"/>
-          <w:i/>
-          <w:iCs/>
-        </w:rPr>
-        <w:t xml:space="preserve"> </w:t>
-      </w:r>
-      <w:r>
-        <w:rPr>
-          <w:rFonts w:asciiTheme="minorHAnsi" w:hAnsiTheme="minorHAnsi"/>
-        </w:rPr>
-        <w:t>appena acquisito dalla biblioteca</w:t>
-      </w:r>
-      <w:r>
-        <w:rPr>
-          <w:rFonts w:asciiTheme="minorHAnsi" w:hAnsiTheme="minorHAnsi"/>
-        </w:rPr>
-        <w:t xml:space="preserve"> la cui edizione non è mai stata inserita nel catalogo</w:t>
-      </w:r>
-      <w:r>
-        <w:rPr>
-          <w:rFonts w:asciiTheme="minorHAnsi" w:hAnsiTheme="minorHAnsi"/>
-        </w:rPr>
-        <w:t>.</w:t>
-      </w:r>
-      <w:r>
-        <w:rPr>
-          <w:rFonts w:asciiTheme="minorHAnsi" w:hAnsiTheme="minorHAnsi"/>
-        </w:rPr>
-        <w:t xml:space="preserve"> Mario accede al sistema e inserisce le informazioni del libro, quali titolo, autor</w:t>
-      </w:r>
-      <w:r>
-        <w:rPr>
-          <w:rFonts w:asciiTheme="minorHAnsi" w:hAnsiTheme="minorHAnsi"/>
-        </w:rPr>
-        <w:t>i</w:t>
-      </w:r>
-      <w:r>
-        <w:rPr>
-          <w:rFonts w:asciiTheme="minorHAnsi" w:hAnsiTheme="minorHAnsi"/>
-        </w:rPr>
-        <w:t>, edi</w:t>
-      </w:r>
-      <w:r>
-        <w:rPr>
-          <w:rFonts w:asciiTheme="minorHAnsi" w:hAnsiTheme="minorHAnsi"/>
-        </w:rPr>
-        <w:t>tore</w:t>
-      </w:r>
-      <w:r>
-        <w:rPr>
-          <w:rFonts w:asciiTheme="minorHAnsi" w:hAnsiTheme="minorHAnsi"/>
-        </w:rPr>
-        <w:t>, categorie</w:t>
-      </w:r>
-      <w:r>
-        <w:rPr>
-          <w:rFonts w:asciiTheme="minorHAnsi" w:hAnsiTheme="minorHAnsi"/>
-        </w:rPr>
-        <w:t>, lingua, data di pubblicazione e ISBN</w:t>
-      </w:r>
-      <w:r>
-        <w:rPr>
-          <w:rFonts w:asciiTheme="minorHAnsi" w:hAnsiTheme="minorHAnsi"/>
-        </w:rPr>
-        <w:t xml:space="preserve">. Se i dati sono corretti, il sistema registra </w:t>
-      </w:r>
-      <w:r>
-        <w:rPr>
-          <w:rFonts w:asciiTheme="minorHAnsi" w:hAnsiTheme="minorHAnsi"/>
-        </w:rPr>
-        <w:t>l’edizione</w:t>
-      </w:r>
-      <w:r>
-        <w:rPr>
-          <w:rFonts w:asciiTheme="minorHAnsi" w:hAnsiTheme="minorHAnsi"/>
-        </w:rPr>
-        <w:t>.</w:t>
-      </w:r>
-    </w:p>
-    <w:p>
-      <w:pPr>
-        <w:pStyle w:val="Heading3"/>
-        <w:spacing w:line="276" w:lineRule="auto"/>
-        <w:rPr>
-          <w:rFonts w:asciiTheme="minorHAnsi" w:hAnsiTheme="minorHAnsi"/>
-        </w:rPr>
-      </w:pPr>
-      <w:bookmarkStart w:id="14" w:name="_Toc244027843"/>
-      <w:r>
-        <w:rPr>
-          <w:rFonts w:asciiTheme="minorHAnsi" w:hAnsiTheme="minorHAnsi"/>
-        </w:rPr>
-        <w:t xml:space="preserve">Scenario </w:t>
-      </w:r>
-      <w:r>
-        <w:rPr>
-          <w:rFonts w:asciiTheme="minorHAnsi" w:hAnsiTheme="minorHAnsi"/>
-        </w:rPr>
-        <w:t>1</w:t>
-      </w:r>
-      <w:r>
-        <w:rPr>
-          <w:rFonts w:asciiTheme="minorHAnsi" w:hAnsiTheme="minorHAnsi"/>
-        </w:rPr>
-        <w:t>2</w:t>
-      </w:r>
-      <w:r>
-        <w:rPr>
-          <w:rFonts w:asciiTheme="minorHAnsi" w:hAnsiTheme="minorHAnsi"/>
-        </w:rPr>
-        <w:t xml:space="preserve"> – </w:t>
-      </w:r>
-      <w:r>
-        <w:rPr>
-          <w:rFonts w:asciiTheme="minorHAnsi" w:hAnsiTheme="minorHAnsi"/>
-        </w:rPr>
-        <w:t>Aggiunta nel catalogo di una copia</w:t>
-      </w:r>
-      <w:bookmarkEnd w:id="14"/>
-    </w:p>
-    <w:p>
-      <w:pPr>
-        <w:jc w:val="both"/>
-        <w:rPr>
-          <w:rFonts w:asciiTheme="minorHAnsi" w:hAnsiTheme="minorHAnsi"/>
-        </w:rPr>
-      </w:pPr>
-      <w:r>
-        <w:rPr>
-          <w:rFonts w:asciiTheme="minorHAnsi" w:hAnsiTheme="minorHAnsi"/>
-        </w:rPr>
-        <w:t xml:space="preserve">Mario, operatore della biblioteca, deve inserire nel catalogo una nuova copia </w:t>
-      </w:r>
-      <w:r>
-        <w:rPr>
-          <w:rFonts w:asciiTheme="minorHAnsi" w:hAnsiTheme="minorHAnsi"/>
-        </w:rPr>
-        <w:t>di un’</w:t>
-      </w:r>
-      <w:r>
-        <w:rPr>
-          <w:rFonts w:asciiTheme="minorHAnsi" w:hAnsiTheme="minorHAnsi"/>
-        </w:rPr>
-        <w:t xml:space="preserve">edizione di </w:t>
-      </w:r>
-      <w:r>
-        <w:rPr>
-          <w:rFonts w:asciiTheme="minorHAnsi" w:hAnsiTheme="minorHAnsi"/>
-          <w:i/>
-          <w:iCs/>
-        </w:rPr>
-        <w:t>I dolori del giovane Werther</w:t>
-      </w:r>
-      <w:r>
-        <w:rPr>
-          <w:rFonts w:asciiTheme="minorHAnsi" w:hAnsiTheme="minorHAnsi"/>
-        </w:rPr>
-        <w:t xml:space="preserve"> </w:t>
-      </w:r>
-      <w:r>
-        <w:rPr>
-          <w:rFonts w:asciiTheme="minorHAnsi" w:hAnsiTheme="minorHAnsi"/>
-        </w:rPr>
-        <w:t>già presente</w:t>
-      </w:r>
-      <w:r>
-        <w:rPr>
-          <w:rFonts w:asciiTheme="minorHAnsi" w:hAnsiTheme="minorHAnsi"/>
-        </w:rPr>
-        <w:t xml:space="preserve"> all’interno del catalogo. Mario accede al sistema</w:t>
-      </w:r>
-      <w:r>
-        <w:rPr>
-          <w:rFonts w:asciiTheme="minorHAnsi" w:hAnsiTheme="minorHAnsi"/>
-        </w:rPr>
-        <w:t>, seleziona l’edizione e</w:t>
-      </w:r>
-      <w:r>
-        <w:rPr>
-          <w:rFonts w:asciiTheme="minorHAnsi" w:hAnsiTheme="minorHAnsi"/>
-        </w:rPr>
-        <w:t xml:space="preserve"> inserisce la nuova copia</w:t>
-      </w:r>
-      <w:r>
-        <w:rPr>
-          <w:rFonts w:asciiTheme="minorHAnsi" w:hAnsiTheme="minorHAnsi"/>
-        </w:rPr>
-        <w:t xml:space="preserve">. </w:t>
-      </w:r>
-      <w:r>
-        <w:rPr>
-          <w:rFonts w:asciiTheme="minorHAnsi" w:hAnsiTheme="minorHAnsi"/>
-        </w:rPr>
-        <w:t>Il</w:t>
-      </w:r>
-      <w:r>
-        <w:rPr>
-          <w:rFonts w:asciiTheme="minorHAnsi" w:hAnsiTheme="minorHAnsi"/>
-        </w:rPr>
-        <w:t xml:space="preserve"> sistema registra </w:t>
-      </w:r>
-      <w:r>
-        <w:rPr>
-          <w:rFonts w:asciiTheme="minorHAnsi" w:hAnsiTheme="minorHAnsi"/>
-        </w:rPr>
-        <w:t>la nuova copia</w:t>
-      </w:r>
-      <w:r>
-        <w:rPr>
-          <w:rFonts w:asciiTheme="minorHAnsi" w:hAnsiTheme="minorHAnsi"/>
-        </w:rPr>
-        <w:t xml:space="preserve">, </w:t>
-      </w:r>
-      <w:r>
-        <w:rPr>
-          <w:rFonts w:asciiTheme="minorHAnsi" w:hAnsiTheme="minorHAnsi"/>
-        </w:rPr>
-        <w:t>assegnandole un identificativo</w:t>
-      </w:r>
-      <w:r>
-        <w:rPr>
-          <w:rFonts w:asciiTheme="minorHAnsi" w:hAnsiTheme="minorHAnsi"/>
-        </w:rPr>
-        <w:t>.</w:t>
-      </w:r>
-    </w:p>
-    <w:p>
-      <w:pPr>
-        <w:pStyle w:val="Heading3"/>
-        <w:rPr>
-          <w:rFonts w:asciiTheme="minorHAnsi" w:hAnsiTheme="minorHAnsi"/>
-        </w:rPr>
-      </w:pPr>
-      <w:bookmarkStart w:id="15" w:name="_Toc244027844"/>
-      <w:r>
-        <w:rPr>
-          <w:rFonts w:asciiTheme="minorHAnsi" w:hAnsiTheme="minorHAnsi"/>
-        </w:rPr>
-        <w:t xml:space="preserve">Scenario </w:t>
-      </w:r>
-      <w:r>
-        <w:rPr>
-          <w:rFonts w:asciiTheme="minorHAnsi" w:hAnsiTheme="minorHAnsi"/>
-        </w:rPr>
-        <w:t>1</w:t>
-      </w:r>
-      <w:r>
-        <w:rPr>
-          <w:rFonts w:asciiTheme="minorHAnsi" w:hAnsiTheme="minorHAnsi"/>
-        </w:rPr>
-        <w:t>3</w:t>
-      </w:r>
-      <w:r>
-        <w:rPr>
-          <w:rFonts w:asciiTheme="minorHAnsi" w:hAnsiTheme="minorHAnsi"/>
-        </w:rPr>
-        <w:t xml:space="preserve"> – Rimozione dal catalogo</w:t>
-      </w:r>
-      <w:r>
-        <w:rPr>
-          <w:rFonts w:asciiTheme="minorHAnsi" w:hAnsiTheme="minorHAnsi"/>
-        </w:rPr>
-        <w:t xml:space="preserve"> di una copia</w:t>
-      </w:r>
-      <w:bookmarkEnd w:id="15"/>
-    </w:p>
-    <w:p>
-      <w:pPr>
-        <w:jc w:val="both"/>
-        <w:rPr>
-          <w:rFonts w:asciiTheme="minorHAnsi" w:hAnsiTheme="minorHAnsi"/>
-        </w:rPr>
-      </w:pPr>
-      <w:r>
-        <w:rPr>
-          <w:rFonts w:asciiTheme="minorHAnsi" w:hAnsiTheme="minorHAnsi"/>
-        </w:rPr>
-        <w:t xml:space="preserve">Mario, operatore della biblioteca, deve rimuovere una copia di </w:t>
-      </w:r>
-      <w:r>
-        <w:rPr>
-          <w:rFonts w:asciiTheme="minorHAnsi" w:hAnsiTheme="minorHAnsi"/>
-          <w:i/>
-          <w:iCs/>
-        </w:rPr>
-        <w:t>Oliver Twist</w:t>
-      </w:r>
-      <w:r>
-        <w:rPr>
-          <w:rFonts w:asciiTheme="minorHAnsi" w:hAnsiTheme="minorHAnsi"/>
-        </w:rPr>
-        <w:t xml:space="preserve"> dal catalogo, in quanto il libro è stato ceduto. Mario accede al sistema, ricerca la copia e se essa è disponibile, la rimuove</w:t>
-      </w:r>
-      <w:r>
-        <w:rPr>
-          <w:rFonts w:asciiTheme="minorHAnsi" w:hAnsiTheme="minorHAnsi"/>
-        </w:rPr>
-        <w:t xml:space="preserve"> e il </w:t>
-      </w:r>
-      <w:r>
-        <w:rPr>
-          <w:rFonts w:asciiTheme="minorHAnsi" w:hAnsiTheme="minorHAnsi"/>
-        </w:rPr>
-        <w:t>sistema aggiorna</w:t>
-      </w:r>
-      <w:r>
-        <w:rPr>
-          <w:rFonts w:asciiTheme="minorHAnsi" w:hAnsiTheme="minorHAnsi"/>
-        </w:rPr>
-        <w:t xml:space="preserve"> il catalogo affinché la copia non sia più presente</w:t>
-      </w:r>
-      <w:r>
-        <w:rPr>
-          <w:rFonts w:asciiTheme="minorHAnsi" w:hAnsiTheme="minorHAnsi"/>
-        </w:rPr>
-        <w:t>.</w:t>
-      </w:r>
-      <w:r>
-        <w:rPr>
-          <w:rFonts w:asciiTheme="minorHAnsi" w:hAnsiTheme="minorHAnsi"/>
-        </w:rPr>
-        <w:t xml:space="preserve"> Se la copia è riservata o in prestito, la rimozione non sarà possibile.</w:t>
-      </w:r>
-    </w:p>
-    <w:p>
-      <w:pPr>
-        <w:jc w:val="both"/>
-        <w:rPr>
-          <w:rFonts w:asciiTheme="minorHAnsi" w:hAnsiTheme="minorHAnsi"/>
-        </w:rPr>
-      </w:pPr>
-    </w:p>
-    <w:p>
-      <w:pPr>
-        <w:jc w:val="both"/>
-        <w:rPr>
-          <w:rFonts w:asciiTheme="minorHAnsi" w:hAnsiTheme="minorHAnsi"/>
-        </w:rPr>
-      </w:pPr>
-      <w:r>
-        <w:rPr>
-          <w:rFonts w:asciiTheme="minorHAnsi" w:hAnsiTheme="minorHAnsi"/>
-        </w:rPr>
-        <w:t>Se la copia rimossa era l’ultima, allora l’edizione sarà rimossa dal catalogo.</w:t>
-      </w:r>
-    </w:p>
-    <w:p>
-      <w:pPr>
-        <w:pStyle w:val="Heading3"/>
-        <w:rPr>
-          <w:rFonts w:asciiTheme="minorHAnsi" w:hAnsiTheme="minorHAnsi"/>
-        </w:rPr>
-      </w:pPr>
-      <w:bookmarkStart w:id="16" w:name="_Toc244027845"/>
-      <w:r>
-        <w:rPr>
-          <w:rFonts w:asciiTheme="minorHAnsi" w:hAnsiTheme="minorHAnsi"/>
-        </w:rPr>
-        <w:t xml:space="preserve">Scenario 14 – </w:t>
-      </w:r>
-      <w:r>
-        <w:rPr>
-          <w:rFonts w:asciiTheme="minorHAnsi" w:hAnsiTheme="minorHAnsi"/>
-        </w:rPr>
-        <w:t xml:space="preserve">Ricerca di informazioni su un </w:t>
-      </w:r>
-      <w:r>
-        <w:rPr>
-          <w:rFonts w:asciiTheme="minorHAnsi" w:hAnsiTheme="minorHAnsi"/>
-        </w:rPr>
-        <w:t>lettore</w:t>
-      </w:r>
-      <w:bookmarkEnd w:id="16"/>
-    </w:p>
-    <w:p>
-      <w:pPr>
-        <w:jc w:val="both"/>
-        <w:rPr>
-          <w:rFonts w:asciiTheme="minorHAnsi" w:hAnsiTheme="minorHAnsi"/>
-        </w:rPr>
-      </w:pPr>
-      <w:r>
-        <w:rPr>
-          <w:rFonts w:asciiTheme="minorHAnsi" w:hAnsiTheme="minorHAnsi"/>
-        </w:rPr>
-        <w:t xml:space="preserve">Grazia, operatrice della biblioteca, deve </w:t>
-      </w:r>
-      <w:r>
-        <w:rPr>
-          <w:rFonts w:asciiTheme="minorHAnsi" w:hAnsiTheme="minorHAnsi"/>
-        </w:rPr>
-        <w:t xml:space="preserve">ottenere delle informazioni su un lettore della </w:t>
-      </w:r>
-      <w:r>
-        <w:rPr>
-          <w:rFonts w:asciiTheme="minorHAnsi" w:hAnsiTheme="minorHAnsi"/>
-        </w:rPr>
-        <w:lastRenderedPageBreak/>
-        <w:t>biblioteca.</w:t>
-      </w:r>
-    </w:p>
-    <w:p>
-      <w:pPr>
-        <w:jc w:val="both"/>
-        <w:rPr>
-          <w:rFonts w:asciiTheme="minorHAnsi" w:hAnsiTheme="minorHAnsi"/>
-        </w:rPr>
-      </w:pPr>
-    </w:p>
-    <w:p>
-      <w:pPr>
-        <w:jc w:val="both"/>
-        <w:rPr>
-          <w:rFonts w:asciiTheme="minorHAnsi" w:hAnsiTheme="minorHAnsi"/>
-        </w:rPr>
-      </w:pPr>
-      <w:r>
-        <w:rPr>
-          <w:rFonts w:asciiTheme="minorHAnsi" w:hAnsiTheme="minorHAnsi"/>
-        </w:rPr>
-        <w:t>Grazia accede al sistema e ricerca il lettore</w:t>
-      </w:r>
-      <w:r>
-        <w:rPr>
-          <w:rFonts w:asciiTheme="minorHAnsi" w:hAnsiTheme="minorHAnsi"/>
-        </w:rPr>
-        <w:t xml:space="preserve"> tramite codice fiscale</w:t>
-      </w:r>
-      <w:r>
-        <w:rPr>
-          <w:rFonts w:asciiTheme="minorHAnsi" w:hAnsiTheme="minorHAnsi"/>
-        </w:rPr>
-        <w:t xml:space="preserve">. Il sistema presenta a Grazia </w:t>
-      </w:r>
-      <w:r>
-        <w:rPr>
-          <w:rFonts w:asciiTheme="minorHAnsi" w:hAnsiTheme="minorHAnsi"/>
-        </w:rPr>
-        <w:t>il suo</w:t>
-      </w:r>
-      <w:r>
-        <w:rPr>
-          <w:rFonts w:asciiTheme="minorHAnsi" w:hAnsiTheme="minorHAnsi"/>
-        </w:rPr>
-        <w:t xml:space="preserve"> storico dei prestiti, delle restituzioni e delle sospensioni</w:t>
-      </w:r>
-      <w:r>
-        <w:rPr>
-          <w:rFonts w:asciiTheme="minorHAnsi" w:hAnsiTheme="minorHAnsi"/>
-        </w:rPr>
-        <w:t xml:space="preserve"> e le </w:t>
-      </w:r>
-      <w:r>
-        <w:rPr>
-          <w:rFonts w:asciiTheme="minorHAnsi" w:hAnsiTheme="minorHAnsi"/>
-        </w:rPr>
-        <w:t xml:space="preserve">sue </w:t>
-      </w:r>
-      <w:r>
-        <w:rPr>
-          <w:rFonts w:asciiTheme="minorHAnsi" w:hAnsiTheme="minorHAnsi"/>
-        </w:rPr>
-        <w:t>prenotazioni attive</w:t>
-      </w:r>
-      <w:r>
-        <w:rPr>
-          <w:rFonts w:asciiTheme="minorHAnsi" w:hAnsiTheme="minorHAnsi"/>
-        </w:rPr>
-        <w:t xml:space="preserve">. </w:t>
-      </w:r>
-      <w:r>
-        <w:rPr>
-          <w:rFonts w:asciiTheme="minorHAnsi" w:hAnsiTheme="minorHAnsi"/>
-        </w:rPr>
-        <w:t xml:space="preserve">Se il lettore è registrato, il sistema lo mostra. </w:t>
-      </w:r>
-    </w:p>
-    <w:p>
-      <w:pPr>
-        <w:pStyle w:val="Heading3"/>
-        <w:rPr>
-          <w:rFonts w:asciiTheme="minorHAnsi" w:hAnsiTheme="minorHAnsi"/>
-        </w:rPr>
-      </w:pPr>
-      <w:bookmarkStart w:id="17" w:name="_Toc244027846"/>
-      <w:r>
-        <w:rPr>
-          <w:rFonts w:asciiTheme="minorHAnsi" w:hAnsiTheme="minorHAnsi"/>
-        </w:rPr>
-        <w:t>Scenario 1</w:t>
-      </w:r>
-      <w:r>
-        <w:rPr>
-          <w:rFonts w:asciiTheme="minorHAnsi" w:hAnsiTheme="minorHAnsi"/>
-        </w:rPr>
-        <w:t>5</w:t>
-      </w:r>
-      <w:r>
-        <w:rPr>
-          <w:rFonts w:asciiTheme="minorHAnsi" w:hAnsiTheme="minorHAnsi"/>
-        </w:rPr>
-        <w:t xml:space="preserve"> – </w:t>
-      </w:r>
-      <w:r>
-        <w:rPr>
-          <w:rFonts w:asciiTheme="minorHAnsi" w:hAnsiTheme="minorHAnsi"/>
-        </w:rPr>
-        <w:t>Modifica di un edizione presente nel catalogo</w:t>
-      </w:r>
-      <w:bookmarkEnd w:id="17"/>
-    </w:p>
-    <w:p>
-      <w:pPr>
-        <w:rPr>
-          <w:rFonts w:asciiTheme="minorHAnsi" w:hAnsiTheme="minorHAnsi"/>
-        </w:rPr>
-      </w:pPr>
-      <w:r>
-        <w:rPr>
-          <w:rFonts w:asciiTheme="minorHAnsi" w:hAnsiTheme="minorHAnsi"/>
-        </w:rPr>
-        <w:t>Grazia, operatrice della biblioteca, deve modificare delle informazioni di un’edizione già presente nel catalogo. Grazia accede al sistema, seleziona l’edizione e ne modifica le informazioni. Il sistema registra le modifiche, aggiornando anche le informazioni mostrate nel catalogo.</w:t>
-      </w:r>
-    </w:p>
-    <w:p>
-      <w:pPr>
-        <w:pStyle w:val="Heading3"/>
-        <w:rPr>
-          <w:rFonts w:asciiTheme="minorHAnsi" w:hAnsiTheme="minorHAnsi"/>
-        </w:rPr>
-      </w:pPr>
-      <w:bookmarkStart w:id="18" w:name="_Toc244027847"/>
-      <w:r>
-        <w:rPr>
-          <w:rFonts w:asciiTheme="minorHAnsi" w:hAnsiTheme="minorHAnsi"/>
-        </w:rPr>
-        <w:t>Scenario 16 – Modifica delle informazioni di un account lettore</w:t>
-      </w:r>
-      <w:bookmarkEnd w:id="18"/>
-    </w:p>
-    <w:p>
-      <w:pPr>
-        <w:jc w:val="both"/>
-        <w:rPr>
-          <w:rFonts w:asciiTheme="minorHAnsi" w:hAnsiTheme="minorHAnsi"/>
-        </w:rPr>
-      </w:pPr>
-      <w:r>
-        <w:rPr>
-          <w:rFonts w:asciiTheme="minorHAnsi" w:hAnsiTheme="minorHAnsi"/>
-        </w:rPr>
-        <w:t>Grazia, operatrice della biblioteca, deve modificare un’informazione associata all’account di Giuseppe, lettore registrato.</w:t>
-      </w:r>
-    </w:p>
-    <w:p>
-      <w:pPr>
-        <w:jc w:val="both"/>
-        <w:rPr>
-          <w:rFonts w:asciiTheme="minorHAnsi" w:hAnsiTheme="minorHAnsi"/>
-        </w:rPr>
-      </w:pPr>
-    </w:p>
-    <w:p>
-      <w:pPr>
-        <w:jc w:val="both"/>
-        <w:rPr>
-          <w:rFonts w:asciiTheme="minorHAnsi" w:hAnsiTheme="minorHAnsi"/>
-        </w:rPr>
-      </w:pPr>
-      <w:r>
-        <w:rPr>
-          <w:rFonts w:asciiTheme="minorHAnsi" w:hAnsiTheme="minorHAnsi"/>
-        </w:rPr>
-        <w:t>Grazia accede al sistema e ricerca il lettore tramite codice fiscale. Il sistema presenta a Grazia le sue informazioni.</w:t>
-      </w:r>
-    </w:p>
-    <w:p>
-      <w:pPr>
-        <w:jc w:val="both"/>
-        <w:rPr>
-          <w:rFonts w:asciiTheme="minorHAnsi" w:hAnsiTheme="minorHAnsi"/>
-        </w:rPr>
-      </w:pPr>
-    </w:p>
-    <w:p>
-      <w:pPr>
-        <w:jc w:val="both"/>
-        <w:rPr>
-          <w:rFonts w:asciiTheme="minorHAnsi" w:hAnsiTheme="minorHAnsi"/>
-        </w:rPr>
-      </w:pPr>
-      <w:r>
-        <w:rPr>
-          <w:rFonts w:asciiTheme="minorHAnsi" w:hAnsiTheme="minorHAnsi"/>
-        </w:rPr>
-        <w:t xml:space="preserve">Grazia procede modificando le informazioni del lettore. </w:t>
-      </w:r>
-      <w:r>
-        <w:rPr>
-          <w:rFonts w:asciiTheme="minorHAnsi" w:hAnsiTheme="minorHAnsi"/>
-        </w:rPr>
-        <w:t>Il sistema verifica la validità delle modifiche. Se sono valide, aggiorna le informazioni dell’account; altrimenti le rifiuta e segnala a Grazia i problemi riscontrati.</w:t>
-      </w:r>
-    </w:p>
-    <w:p>
-      <w:pPr>
-        <w:pStyle w:val="Heading3"/>
-        <w:rPr>
-          <w:rFonts w:asciiTheme="minorHAnsi" w:hAnsiTheme="minorHAnsi"/>
-        </w:rPr>
-      </w:pPr>
-      <w:bookmarkStart w:id="19" w:name="_Toc244027848"/>
-      <w:r>
-        <w:rPr>
-          <w:rFonts w:asciiTheme="minorHAnsi" w:hAnsiTheme="minorHAnsi"/>
-        </w:rPr>
-        <w:t>Scenario 1</w:t>
-      </w:r>
-      <w:r>
-        <w:rPr>
-          <w:rFonts w:asciiTheme="minorHAnsi" w:hAnsiTheme="minorHAnsi"/>
-        </w:rPr>
-        <w:t>7</w:t>
-      </w:r>
-      <w:r>
-        <w:rPr>
-          <w:rFonts w:asciiTheme="minorHAnsi" w:hAnsiTheme="minorHAnsi"/>
-        </w:rPr>
-        <w:t xml:space="preserve"> – </w:t>
-      </w:r>
-      <w:r>
-        <w:rPr>
-          <w:rFonts w:asciiTheme="minorHAnsi" w:hAnsiTheme="minorHAnsi"/>
-        </w:rPr>
-        <w:t xml:space="preserve">Richiesta di modifica della password </w:t>
-      </w:r>
-      <w:r>
-        <w:rPr>
-          <w:rFonts w:asciiTheme="minorHAnsi" w:hAnsiTheme="minorHAnsi"/>
-        </w:rPr>
-        <w:t>dell’account</w:t>
-      </w:r>
-      <w:bookmarkEnd w:id="19"/>
-    </w:p>
-    <w:p>
-      <w:pPr>
-        <w:rPr>
-          <w:rFonts w:asciiTheme="minorHAnsi" w:hAnsiTheme="minorHAnsi"/>
-        </w:rPr>
-      </w:pPr>
-      <w:r>
-        <w:rPr>
-          <w:rFonts w:asciiTheme="minorHAnsi" w:hAnsiTheme="minorHAnsi"/>
-        </w:rPr>
-        <w:t>Alessandro, lettore registrato, si reca in biblioteca per richiedere una modifica della password del proprio account.</w:t>
-      </w:r>
-    </w:p>
-    <w:p>
-      <w:pPr>
-        <w:rPr>
-          <w:rFonts w:asciiTheme="minorHAnsi" w:hAnsiTheme="minorHAnsi"/>
-        </w:rPr>
-      </w:pPr>
-    </w:p>
-    <w:p>
-      <w:pPr>
-        <w:rPr>
-          <w:rFonts w:asciiTheme="minorHAnsi" w:hAnsiTheme="minorHAnsi"/>
-        </w:rPr>
-      </w:pPr>
-      <w:r>
-        <w:rPr>
-          <w:rFonts w:asciiTheme="minorHAnsi" w:hAnsiTheme="minorHAnsi"/>
-        </w:rPr>
-        <w:t xml:space="preserve">Grazia, operatrice della biblioteca, </w:t>
-      </w:r>
-      <w:r>
-        <w:rPr>
-          <w:rFonts w:asciiTheme="minorHAnsi" w:hAnsiTheme="minorHAnsi"/>
-        </w:rPr>
-        <w:t>accede al sistema e ricerca il lettore tramite codice fiscale. Il sistema presenta a Grazia le informazioni che riguardano il lettore, e se è registrato, mostrerà anche un’opzione che consente di resettare la password dell’account di Alessandro.</w:t>
-      </w:r>
-    </w:p>
-    <w:p>
-      <w:pPr>
-        <w:rPr>
-          <w:rFonts w:asciiTheme="minorHAnsi" w:hAnsiTheme="minorHAnsi"/>
-        </w:rPr>
-      </w:pPr>
-    </w:p>
-    <w:p>
-      <w:pPr>
-        <w:rPr>
-          <w:rFonts w:asciiTheme="minorHAnsi" w:hAnsiTheme="minorHAnsi"/>
-        </w:rPr>
-      </w:pPr>
-      <w:r>
-        <w:rPr>
-          <w:rFonts w:asciiTheme="minorHAnsi" w:hAnsiTheme="minorHAnsi"/>
-        </w:rPr>
-        <w:t xml:space="preserve">Una </w:t>
-      </w:r>
-      <w:r>
-        <w:rPr>
-          <w:rFonts w:asciiTheme="minorHAnsi" w:hAnsiTheme="minorHAnsi"/>
-        </w:rPr>
-        <w:t xml:space="preserve">volta </w:t>
-      </w:r>
-      <w:r>
-        <w:rPr>
-          <w:rFonts w:asciiTheme="minorHAnsi" w:hAnsiTheme="minorHAnsi"/>
-        </w:rPr>
-        <w:t>che Grazia ha richiesto il reset, i</w:t>
-      </w:r>
-      <w:r>
-        <w:rPr>
-          <w:rFonts w:asciiTheme="minorHAnsi" w:hAnsiTheme="minorHAnsi"/>
-        </w:rPr>
-        <w:t>l sistema mostra su schermo la nuova password temporanea che</w:t>
-      </w:r>
-      <w:r>
-        <w:rPr>
-          <w:rFonts w:asciiTheme="minorHAnsi" w:hAnsiTheme="minorHAnsi"/>
-        </w:rPr>
-        <w:t xml:space="preserve"> viene</w:t>
-      </w:r>
-      <w:r>
-        <w:rPr>
-          <w:rFonts w:asciiTheme="minorHAnsi" w:hAnsiTheme="minorHAnsi"/>
-        </w:rPr>
-        <w:t xml:space="preserve"> comunica</w:t>
-      </w:r>
-      <w:r>
-        <w:rPr>
-          <w:rFonts w:asciiTheme="minorHAnsi" w:hAnsiTheme="minorHAnsi"/>
-        </w:rPr>
-        <w:t xml:space="preserve">ta </w:t>
-      </w:r>
-      <w:r>
-        <w:rPr>
-          <w:rFonts w:asciiTheme="minorHAnsi" w:hAnsiTheme="minorHAnsi"/>
-        </w:rPr>
-        <w:t>ad Alessandro.</w:t>
-      </w:r>
-    </w:p>
-    <w:p>
-      <w:pPr>
-        <w:rPr>
-          <w:rFonts w:asciiTheme="minorHAnsi" w:hAnsiTheme="minorHAnsi"/>
-        </w:rPr>
-      </w:pPr>
-    </w:p>
-    <w:p>
-      <w:pPr>
-        <w:jc w:val="both"/>
-        <w:rPr>
-          <w:rFonts w:asciiTheme="minorHAnsi" w:hAnsiTheme="minorHAnsi"/>
-        </w:rPr>
-      </w:pPr>
-      <w:r>
-        <w:rPr>
-          <w:rFonts w:asciiTheme="minorHAnsi" w:hAnsiTheme="minorHAnsi"/>
-        </w:rPr>
-        <w:t>Quando Alessandro accede al sistema tramite e-mail e password temporanea, il sistema gli chiede di scegliere una nuova password.</w:t>
-      </w:r>
-    </w:p>
-    <w:p>
-      <w:pPr>
-        <w:pStyle w:val="Heading3"/>
-        <w:rPr>
-          <w:rFonts w:asciiTheme="minorHAnsi" w:hAnsiTheme="minorHAnsi"/>
-        </w:rPr>
-      </w:pPr>
-      <w:bookmarkStart w:id="20" w:name="_Toc244027849"/>
-      <w:r>
-        <w:rPr>
-          <w:rFonts w:asciiTheme="minorHAnsi" w:hAnsiTheme="minorHAnsi"/>
-        </w:rPr>
-        <w:t>Scenario 1</w:t>
-      </w:r>
-      <w:r>
-        <w:rPr>
-          <w:rFonts w:asciiTheme="minorHAnsi" w:hAnsiTheme="minorHAnsi"/>
-        </w:rPr>
-        <w:t>8</w:t>
-      </w:r>
-      <w:r>
-        <w:rPr>
-          <w:rFonts w:asciiTheme="minorHAnsi" w:hAnsiTheme="minorHAnsi"/>
-        </w:rPr>
-        <w:t xml:space="preserve"> – Registrazione di una sospensione</w:t>
-      </w:r>
-      <w:bookmarkEnd w:id="20"/>
-    </w:p>
-    <w:p>
-      <w:pPr>
-        <w:jc w:val="both"/>
-        <w:rPr>
-          <w:rFonts w:asciiTheme="minorHAnsi" w:hAnsiTheme="minorHAnsi"/>
-        </w:rPr>
-      </w:pPr>
-      <w:r>
-        <w:rPr>
-          <w:rFonts w:asciiTheme="minorHAnsi" w:hAnsiTheme="minorHAnsi"/>
-        </w:rPr>
-        <w:t>Mario, oper</w:t>
-      </w:r>
-      <w:r>
-        <w:rPr>
-          <w:rFonts w:asciiTheme="minorHAnsi" w:hAnsiTheme="minorHAnsi"/>
-        </w:rPr>
-        <w:t>a</w:t>
-      </w:r>
-      <w:r>
-        <w:rPr>
-          <w:rFonts w:asciiTheme="minorHAnsi" w:hAnsiTheme="minorHAnsi"/>
-        </w:rPr>
-        <w:t xml:space="preserve">tore della biblioteca, deve </w:t>
-      </w:r>
-      <w:r>
-        <w:rPr>
-          <w:rFonts w:asciiTheme="minorHAnsi" w:hAnsiTheme="minorHAnsi"/>
-        </w:rPr>
-        <w:t xml:space="preserve">inserire una </w:t>
-      </w:r>
-      <w:r>
-        <w:rPr>
-          <w:rFonts w:asciiTheme="minorHAnsi" w:hAnsiTheme="minorHAnsi"/>
-        </w:rPr>
-        <w:t xml:space="preserve">sospensione </w:t>
-      </w:r>
-      <w:r>
-        <w:rPr>
-          <w:rFonts w:asciiTheme="minorHAnsi" w:hAnsiTheme="minorHAnsi"/>
-        </w:rPr>
-        <w:t>temporanea</w:t>
-      </w:r>
-      <w:r>
-        <w:rPr>
-          <w:rFonts w:asciiTheme="minorHAnsi" w:hAnsiTheme="minorHAnsi"/>
-        </w:rPr>
-        <w:t xml:space="preserve"> a Luca, lettore della biblioteca.</w:t>
-      </w:r>
-    </w:p>
-    <w:p>
-      <w:pPr>
-        <w:jc w:val="both"/>
-        <w:rPr>
-          <w:rFonts w:asciiTheme="minorHAnsi" w:hAnsiTheme="minorHAnsi"/>
-        </w:rPr>
-      </w:pPr>
-    </w:p>
-    <w:p>
-      <w:pPr>
-        <w:jc w:val="both"/>
-        <w:rPr>
-          <w:rFonts w:asciiTheme="minorHAnsi" w:hAnsiTheme="minorHAnsi"/>
-        </w:rPr>
-      </w:pPr>
-      <w:r>
-        <w:rPr>
-          <w:rFonts w:asciiTheme="minorHAnsi" w:hAnsiTheme="minorHAnsi"/>
-        </w:rPr>
-        <w:t>Mario accede al sistema e ricerca il lettore tramite codice fiscale. Il sistema presenta a Mario le informa</w:t>
-      </w:r>
-      <w:r>
-        <w:rPr>
-          <w:rFonts w:asciiTheme="minorHAnsi" w:hAnsiTheme="minorHAnsi"/>
-        </w:rPr>
-        <w:t>z</w:t>
-      </w:r>
-      <w:r>
-        <w:rPr>
-          <w:rFonts w:asciiTheme="minorHAnsi" w:hAnsiTheme="minorHAnsi"/>
-        </w:rPr>
-        <w:t xml:space="preserve">ioni che riguardano </w:t>
-      </w:r>
-      <w:r>
-        <w:rPr>
-          <w:rFonts w:asciiTheme="minorHAnsi" w:hAnsiTheme="minorHAnsi"/>
-        </w:rPr>
-        <w:t>Luca.</w:t>
-      </w:r>
-    </w:p>
-    <w:p>
-      <w:pPr>
-        <w:jc w:val="both"/>
-        <w:rPr>
-          <w:rFonts w:asciiTheme="minorHAnsi" w:hAnsiTheme="minorHAnsi"/>
-        </w:rPr>
-      </w:pPr>
-    </w:p>
-    <w:p>
-      <w:pPr>
-        <w:jc w:val="both"/>
-        <w:rPr>
-          <w:rFonts w:asciiTheme="minorHAnsi" w:hAnsiTheme="minorHAnsi"/>
-        </w:rPr>
-      </w:pPr>
-      <w:r>
-        <w:rPr>
-          <w:rFonts w:asciiTheme="minorHAnsi" w:hAnsiTheme="minorHAnsi"/>
-        </w:rPr>
-        <w:t xml:space="preserve">Mario preme sul pulsante dedicato e </w:t>
-      </w:r>
-      <w:r>
-        <w:rPr>
-          <w:rFonts w:asciiTheme="minorHAnsi" w:hAnsiTheme="minorHAnsi"/>
-        </w:rPr>
-        <w:t>registra una sospensione a Luca</w:t>
-      </w:r>
-      <w:r>
-        <w:rPr>
-          <w:rFonts w:asciiTheme="minorHAnsi" w:hAnsiTheme="minorHAnsi"/>
-        </w:rPr>
-        <w:t>.</w:t>
-      </w:r>
-    </w:p>
-    <w:p>
-      <w:pPr>
-        <w:pStyle w:val="Heading3"/>
-        <w:rPr>
-          <w:rFonts w:asciiTheme="minorHAnsi" w:hAnsiTheme="minorHAnsi"/>
-        </w:rPr>
-      </w:pPr>
-      <w:bookmarkStart w:id="21" w:name="_Toc244027850"/>
       <w:r>
         <w:rPr>
           <w:rFonts w:asciiTheme="minorHAnsi" w:hAnsiTheme="minorHAnsi"/>
@@ -8082,19 +6791,19 @@
         <w:rPr>
           <w:rFonts w:asciiTheme="minorHAnsi" w:hAnsiTheme="minorHAnsi"/>
         </w:rPr>
-        <w:t>Mario, oper</w:t>
-      </w:r>
-      <w:r>
-        <w:rPr>
-          <w:rFonts w:asciiTheme="minorHAnsi" w:hAnsiTheme="minorHAnsi"/>
-        </w:rPr>
-        <w:t>a</w:t>
-      </w:r>
-      <w:r>
-        <w:rPr>
-          <w:rFonts w:asciiTheme="minorHAnsi" w:hAnsiTheme="minorHAnsi"/>
-        </w:rPr>
-        <w:t>tore della biblioteca, deve annullare una sospensione assegnata a Luca, lettore della biblioteca.</w:t>
+        <w:t xml:space="preserve">Mario, operatore della biblioteca, deve </w:t>
+      </w:r>
+      <w:r>
+        <w:rPr>
+          <w:rFonts w:asciiTheme="minorHAnsi" w:hAnsiTheme="minorHAnsi"/>
+        </w:rPr>
+        <w:t>revocare</w:t>
+      </w:r>
+      <w:r>
+        <w:rPr>
+          <w:rFonts w:asciiTheme="minorHAnsi" w:hAnsiTheme="minorHAnsi"/>
+        </w:rPr>
+        <w:t xml:space="preserve"> una sospensione assegnata a Luca, lettore della biblioteca.</w:t>
       </w:r>
     </w:p>
     <w:p>
@@ -8138,7 +6847,31 @@
         <w:rPr>
           <w:rFonts w:asciiTheme="minorHAnsi" w:hAnsiTheme="minorHAnsi"/>
         </w:rPr>
-        <w:t>Mario preme sul pulsante dedicato e sospensione di Luca sarà annullata.</w:t>
+        <w:t xml:space="preserve">Mario preme sul pulsante dedicato e </w:t>
+      </w:r>
+      <w:r>
+        <w:rPr>
+          <w:rFonts w:asciiTheme="minorHAnsi" w:hAnsiTheme="minorHAnsi"/>
+        </w:rPr>
+        <w:t xml:space="preserve">la </w:t>
+      </w:r>
+      <w:r>
+        <w:rPr>
+          <w:rFonts w:asciiTheme="minorHAnsi" w:hAnsiTheme="minorHAnsi"/>
+        </w:rPr>
+        <w:t xml:space="preserve">sospensione di Luca sarà </w:t>
+      </w:r>
+      <w:r>
+        <w:rPr>
+          <w:rFonts w:asciiTheme="minorHAnsi" w:hAnsiTheme="minorHAnsi"/>
+        </w:rPr>
+        <w:t>revocata</w:t>
+      </w:r>
+      <w:r>
+        <w:rPr>
+          <w:rFonts w:asciiTheme="minorHAnsi" w:hAnsiTheme="minorHAnsi"/>
+        </w:rPr>
+        <w:t>.</w:t>
       </w:r>
     </w:p>
     <w:p>
@@ -8224,7 +6957,55 @@
         <w:rPr>
           <w:rFonts w:asciiTheme="minorHAnsi" w:hAnsiTheme="minorHAnsi"/>
         </w:rPr>
-        <w:t>Un operatore può registrare un lettore inserendo codice fiscale, nome, cognome ed e-mail. Il sistema deve creare l’account del lettore dopo la validazione dei dati, generare una password temporanea.</w:t>
+        <w:t>Un operatore può registrare un lettore</w:t>
+      </w:r>
+      <w:r>
+        <w:rPr>
+          <w:rFonts w:asciiTheme="minorHAnsi" w:hAnsiTheme="minorHAnsi"/>
+        </w:rPr>
+        <w:t xml:space="preserve"> tramite</w:t>
+      </w:r>
+      <w:r>
+        <w:rPr>
+          <w:rFonts w:asciiTheme="minorHAnsi" w:hAnsiTheme="minorHAnsi"/>
+        </w:rPr>
+        <w:t xml:space="preserve"> codice fiscale</w:t>
+      </w:r>
+      <w:r>
+        <w:rPr>
+          <w:rFonts w:asciiTheme="minorHAnsi" w:hAnsiTheme="minorHAnsi"/>
+        </w:rPr>
+        <w:t>, inserendo</w:t>
+      </w:r>
+      <w:r>
+        <w:rPr>
+          <w:rFonts w:asciiTheme="minorHAnsi" w:hAnsiTheme="minorHAnsi"/>
+        </w:rPr>
+        <w:t xml:space="preserve"> nome, cognome ed e-mail. Il sistema deve creare l’account del lettore dopo la validazione dei dati</w:t>
+      </w:r>
+      <w:r>
+        <w:rPr>
+          <w:rFonts w:asciiTheme="minorHAnsi" w:hAnsiTheme="minorHAnsi"/>
+        </w:rPr>
+        <w:t xml:space="preserve"> e </w:t>
+      </w:r>
+      <w:r>
+        <w:rPr>
+          <w:rFonts w:asciiTheme="minorHAnsi" w:hAnsiTheme="minorHAnsi"/>
+        </w:rPr>
+        <w:t xml:space="preserve">generare una password </w:t>
+      </w:r>
+      <w:r>
+        <w:rPr>
+          <w:rFonts w:asciiTheme="minorHAnsi" w:hAnsiTheme="minorHAnsi"/>
+        </w:rPr>
+        <w:t>provvisoria</w:t>
+      </w:r>
+      <w:r>
+        <w:rPr>
+          <w:rFonts w:asciiTheme="minorHAnsi" w:hAnsiTheme="minorHAnsi"/>
+        </w:rPr>
+        <w:t>.</w:t>
       </w:r>
     </w:p>
     <w:p>
@@ -8278,7 +7059,7 @@
         <w:rPr>
           <w:rFonts w:asciiTheme="minorHAnsi" w:hAnsiTheme="minorHAnsi"/>
         </w:rPr>
-        <w:t xml:space="preserve"> Al primo accesso, o in seguito ad una richiesta di reset della password, sarà richiesto a lettore di inserire una nuova password.</w:t>
+        <w:t xml:space="preserve"> Al primo accesso, o in seguito ad una richiesta di reset della password, sarà richiesto al lettore di inserire una nuova password. La nuova password dovrà essere lunga almeno 8 caratteri e deve contenere almeno un numero come carattere.</w:t>
       </w:r>
     </w:p>
     <w:p>
@@ -8378,7 +7159,13 @@
         <w:rPr>
           <w:rFonts w:asciiTheme="minorHAnsi" w:hAnsiTheme="minorHAnsi"/>
         </w:rPr>
-        <w:t>Il sistema deve consentire a qualsiasi utente, anche non registrato, di consultare il catalogo e cercare i libri di interesse, anche sulla base di filtri di ricerca, mostrando solo i risultati corrispondenti.</w:t>
+        <w:t xml:space="preserve">Il sistema deve consentire a qualsiasi utente, anche non registrato, di consultare il catalogo </w:t>
+      </w:r>
+      <w:r>
+        <w:rPr>
+          <w:rFonts w:asciiTheme="minorHAnsi" w:hAnsiTheme="minorHAnsi"/>
+        </w:rPr>
+        <w:t>delle edizioni tramite titolo, ISBN, editore o autore. Deve inoltre permettere di filtrare i risultati per una o più categorie, lingua e disponibilità di almeno una copia, mostrando esclusivamente le edizioni che soddisfano i criteri selezionati.</w:t>
       </w:r>
     </w:p>
     <w:p>
@@ -8486,7 +7273,13 @@
         <w:rPr>
           <w:rFonts w:asciiTheme="minorHAnsi" w:hAnsiTheme="minorHAnsi"/>
         </w:rPr>
-        <w:t>presente nel catalogo, nel rispetto dei vincoli stabiliti dalla biblioteca come ad esempio assenza di sospensioni, numero massimo di prenotazioni.</w:t>
+        <w:t>presente nel catalogo</w:t>
+      </w:r>
+      <w:r>
+        <w:rPr>
+          <w:rFonts w:asciiTheme="minorHAnsi" w:hAnsiTheme="minorHAnsi"/>
+        </w:rPr>
+        <w:t>. Il sistema deve consentire la prenotazione soltanto se il lettore non è sospeso e possiede meno di tre prenotazioni attive.</w:t>
       </w:r>
     </w:p>
     <w:p>
@@ -8534,7 +7327,19 @@
         <w:rPr>
           <w:rFonts w:asciiTheme="minorHAnsi" w:hAnsiTheme="minorHAnsi"/>
         </w:rPr>
-        <w:t>Un lettore autenticato deve poter visualizzare e annullare le proprie prenotazioni attive, rendendo nuovamente disponibile la copia riservata dopo l’annullamento.</w:t>
+        <w:t xml:space="preserve">Un lettore autenticato deve poter visualizzare e </w:t>
+      </w:r>
+      <w:r>
+        <w:rPr>
+          <w:rFonts w:asciiTheme="minorHAnsi" w:hAnsiTheme="minorHAnsi"/>
+        </w:rPr>
+        <w:t>cancellare</w:t>
+      </w:r>
+      <w:r>
+        <w:rPr>
+          <w:rFonts w:asciiTheme="minorHAnsi" w:hAnsiTheme="minorHAnsi"/>
+        </w:rPr>
+        <w:t xml:space="preserve"> le proprie prenotazioni attive, rendendo nuovamente disponibile la copia riservata dopo l’annullamento.</w:t>
       </w:r>
     </w:p>
     <w:p>
@@ -8560,6 +7365,7 @@
           <w:b/>
           <w:bCs/>
         </w:rPr>
+        <w:lastRenderedPageBreak/>
         <w:t>FR8</w:t>
       </w:r>
       <w:r>
@@ -8582,14 +7388,7 @@
         <w:rPr>
           <w:rFonts w:asciiTheme="minorHAnsi" w:hAnsiTheme="minorHAnsi"/>
         </w:rPr>
-        <w:t xml:space="preserve">Un operatore deve poter ricercare un lettore tramite codice fiscale e visualizzarne le </w:t>
-      </w:r>
-      <w:r>
-        <w:rPr>
-          <w:rFonts w:asciiTheme="minorHAnsi" w:hAnsiTheme="minorHAnsi"/>
-        </w:rPr>
-        <w:lastRenderedPageBreak/>
-        <w:t>prenotazioni attive, lo storico dei prestiti e delle restituzioni e lo storico delle sospensioni.</w:t>
+        <w:t>Un operatore deve poter ricercare un lettore tramite codice fiscale e visualizzarne le prenotazioni attive, lo storico dei prestiti e delle restituzioni e lo storico delle sospensioni.</w:t>
       </w:r>
     </w:p>
     <w:p>
@@ -8794,7 +7593,7 @@
           <w:b/>
           <w:bCs/>
         </w:rPr>
-        <w:t>Aggiunta e rimozione edizioni</w:t>
+        <w:t>Aggiunta e modifica edizioni</w:t>
       </w:r>
     </w:p>
     <w:p>
@@ -8814,7 +7613,7 @@
         <w:rPr>
           <w:rFonts w:asciiTheme="minorHAnsi" w:hAnsiTheme="minorHAnsi"/>
         </w:rPr>
-        <w:t>aggiungere e rimuovere edizioni, mantenendo aggiornate le informazioni consultabili dal catalogo.</w:t>
+        <w:t>aggiungere e modificare edizioni, mantenendo aggiornate le informazioni consultabili dal catalogo.</w:t>
       </w:r>
     </w:p>
     <w:p>
@@ -8956,7 +7755,31 @@
         <w:rPr>
           <w:rFonts w:asciiTheme="minorHAnsi" w:hAnsiTheme="minorHAnsi"/>
         </w:rPr>
-        <w:t>Un operatore deve poter registrare una sospensione a un lettore, indicando data di inizio e durata, aggiungendola allo storico del lettore. Per tutta la durata della sospensione, il sistema deve impedire al lettore di effettuare prenotazioni e ottenere prestiti. Inoltre</w:t>
+        <w:t xml:space="preserve">Un operatore deve poter registrare una sospensione a un lettore, indicando </w:t>
+      </w:r>
+      <w:r>
+        <w:rPr>
+          <w:rFonts w:asciiTheme="minorHAnsi" w:hAnsiTheme="minorHAnsi"/>
+        </w:rPr>
+        <w:t xml:space="preserve">motivazione </w:t>
+      </w:r>
+      <w:r>
+        <w:rPr>
+          <w:rFonts w:asciiTheme="minorHAnsi" w:hAnsiTheme="minorHAnsi"/>
+        </w:rPr>
+        <w:t xml:space="preserve">e </w:t>
+      </w:r>
+      <w:r>
+        <w:rPr>
+          <w:rFonts w:asciiTheme="minorHAnsi" w:hAnsiTheme="minorHAnsi"/>
+        </w:rPr>
+        <w:t>data di termine</w:t>
+      </w:r>
+      <w:r>
+        <w:rPr>
+          <w:rFonts w:asciiTheme="minorHAnsi" w:hAnsiTheme="minorHAnsi"/>
+        </w:rPr>
+        <w:t>, aggiungendola allo storico del lettore. Per tutta la durata della sospensione, il sistema deve impedire al lettore di effettuare prenotazioni e ottenere prestiti. Inoltre</w:t>
       </w:r>
       <w:r>
         <w:rPr>
@@ -9054,65 +7877,65 @@
           <w:b/>
           <w:bCs/>
         </w:rPr>
-        <w:t xml:space="preserve"> – Annullamento di una sospensione</w:t>
-      </w:r>
-    </w:p>
-    <w:p>
-      <w:pPr>
-        <w:jc w:val="both"/>
-        <w:rPr>
-          <w:rFonts w:asciiTheme="minorHAnsi" w:hAnsiTheme="minorHAnsi"/>
-        </w:rPr>
-      </w:pPr>
-      <w:r>
-        <w:rPr>
-          <w:rFonts w:asciiTheme="minorHAnsi" w:hAnsiTheme="minorHAnsi"/>
-        </w:rPr>
-        <w:t>Un operatore deve poter annullare una sospensione a un lettore assegnata in precedenza.</w:t>
-      </w:r>
-    </w:p>
-    <w:p>
-      <w:pPr>
-        <w:jc w:val="both"/>
+        <w:t xml:space="preserve"> – </w:t>
+      </w:r>
+      <w:r>
         <w:rPr>
           <w:rFonts w:asciiTheme="minorHAnsi" w:hAnsiTheme="minorHAnsi"/>
           <w:b/>
           <w:bCs/>
         </w:rPr>
-      </w:pPr>
-    </w:p>
-    <w:p>
-      <w:pPr>
-        <w:jc w:val="both"/>
+        <w:t xml:space="preserve">Revoca </w:t>
+      </w:r>
+      <w:r>
         <w:rPr>
           <w:rFonts w:asciiTheme="minorHAnsi" w:hAnsiTheme="minorHAnsi"/>
           <w:b/>
           <w:bCs/>
         </w:rPr>
-      </w:pPr>
-      <w:r>
+        <w:t>di una sospensione</w:t>
+      </w:r>
+    </w:p>
+    <w:p>
+      <w:pPr>
+        <w:jc w:val="both"/>
+        <w:rPr>
+          <w:rFonts w:asciiTheme="minorHAnsi" w:hAnsiTheme="minorHAnsi"/>
+        </w:rPr>
+      </w:pPr>
+      <w:r>
+        <w:rPr>
+          <w:rFonts w:asciiTheme="minorHAnsi" w:hAnsiTheme="minorHAnsi"/>
+        </w:rPr>
+        <w:t>Un operatore deve poter revocare una sospensione a un lettore assegnata in precedenza.</w:t>
+      </w:r>
+    </w:p>
+    <w:p>
+      <w:pPr>
+        <w:jc w:val="both"/>
         <w:rPr>
           <w:rFonts w:asciiTheme="minorHAnsi" w:hAnsiTheme="minorHAnsi"/>
           <w:b/>
           <w:bCs/>
         </w:rPr>
-        <w:t>FR</w:t>
-      </w:r>
-      <w:r>
+      </w:pPr>
+    </w:p>
+    <w:p>
+      <w:pPr>
+        <w:jc w:val="both"/>
         <w:rPr>
           <w:rFonts w:asciiTheme="minorHAnsi" w:hAnsiTheme="minorHAnsi"/>
           <w:b/>
           <w:bCs/>
         </w:rPr>
-        <w:t>1</w:t>
-      </w:r>
+      </w:pPr>
       <w:r>
         <w:rPr>
           <w:rFonts w:asciiTheme="minorHAnsi" w:hAnsiTheme="minorHAnsi"/>
           <w:b/>
           <w:bCs/>
         </w:rPr>
-        <w:t>5</w:t>
+        <w:t>FR</w:t>
       </w:r>
       <w:r>
         <w:rPr>
@@ -9120,63 +7943,63 @@
           <w:b/>
           <w:bCs/>
         </w:rPr>
-        <w:t xml:space="preserve"> – Modifica informazioni lettore registrato</w:t>
-      </w:r>
-    </w:p>
-    <w:p>
-      <w:pPr>
-        <w:jc w:val="both"/>
-        <w:rPr>
-          <w:rFonts w:asciiTheme="minorHAnsi" w:hAnsiTheme="minorHAnsi"/>
-        </w:rPr>
-      </w:pPr>
-      <w:r>
-        <w:rPr>
-          <w:rFonts w:asciiTheme="minorHAnsi" w:hAnsiTheme="minorHAnsi"/>
-        </w:rPr>
-        <w:t>Il sistema deve consentire ad un operatore di modificare nome, cognome ed e-mail di un lettore registrato.</w:t>
-      </w:r>
-    </w:p>
-    <w:p>
-      <w:pPr>
-        <w:jc w:val="both"/>
-        <w:rPr>
-          <w:rFonts w:asciiTheme="minorHAnsi" w:hAnsiTheme="minorHAnsi"/>
-        </w:rPr>
-      </w:pPr>
-    </w:p>
-    <w:p>
-      <w:pPr>
-        <w:jc w:val="both"/>
+        <w:t>1</w:t>
+      </w:r>
+      <w:r>
         <w:rPr>
           <w:rFonts w:asciiTheme="minorHAnsi" w:hAnsiTheme="minorHAnsi"/>
           <w:b/>
           <w:bCs/>
         </w:rPr>
-      </w:pPr>
+        <w:t>5</w:t>
+      </w:r>
       <w:r>
         <w:rPr>
           <w:rFonts w:asciiTheme="minorHAnsi" w:hAnsiTheme="minorHAnsi"/>
           <w:b/>
           <w:bCs/>
         </w:rPr>
-        <w:t>FR</w:t>
-      </w:r>
-      <w:r>
+        <w:t xml:space="preserve"> – Modifica informazioni lettore registrato</w:t>
+      </w:r>
+    </w:p>
+    <w:p>
+      <w:pPr>
+        <w:jc w:val="both"/>
+        <w:rPr>
+          <w:rFonts w:asciiTheme="minorHAnsi" w:hAnsiTheme="minorHAnsi"/>
+        </w:rPr>
+      </w:pPr>
+      <w:r>
+        <w:rPr>
+          <w:rFonts w:asciiTheme="minorHAnsi" w:hAnsiTheme="minorHAnsi"/>
+        </w:rPr>
+        <w:t>Il sistema deve consentire ad un operatore di modificare nome, cognome ed e-mail di un lettore registrato.</w:t>
+      </w:r>
+    </w:p>
+    <w:p>
+      <w:pPr>
+        <w:jc w:val="both"/>
+        <w:rPr>
+          <w:rFonts w:asciiTheme="minorHAnsi" w:hAnsiTheme="minorHAnsi"/>
+        </w:rPr>
+      </w:pPr>
+    </w:p>
+    <w:p>
+      <w:pPr>
+        <w:jc w:val="both"/>
         <w:rPr>
           <w:rFonts w:asciiTheme="minorHAnsi" w:hAnsiTheme="minorHAnsi"/>
           <w:b/>
           <w:bCs/>
         </w:rPr>
-        <w:t>1</w:t>
-      </w:r>
+      </w:pPr>
       <w:r>
         <w:rPr>
           <w:rFonts w:asciiTheme="minorHAnsi" w:hAnsiTheme="minorHAnsi"/>
           <w:b/>
           <w:bCs/>
         </w:rPr>
-        <w:t xml:space="preserve">6 </w:t>
+        <w:t>FR</w:t>
       </w:r>
       <w:r>
         <w:rPr>
@@ -9184,63 +8007,63 @@
           <w:b/>
           <w:bCs/>
         </w:rPr>
-        <w:t>– Reset della password</w:t>
-      </w:r>
-    </w:p>
-    <w:p>
-      <w:pPr>
-        <w:jc w:val="both"/>
-        <w:rPr>
-          <w:rFonts w:asciiTheme="minorHAnsi" w:hAnsiTheme="minorHAnsi"/>
-        </w:rPr>
-      </w:pPr>
-      <w:r>
-        <w:rPr>
-          <w:rFonts w:asciiTheme="minorHAnsi" w:hAnsiTheme="minorHAnsi"/>
-        </w:rPr>
-        <w:t>Il sistema deve consentire ad un operatore di resettare la password dell’account di un lettore registrato, assegnando una nuova password temporanea.</w:t>
-      </w:r>
-    </w:p>
-    <w:p>
-      <w:pPr>
-        <w:jc w:val="both"/>
-        <w:rPr>
-          <w:rFonts w:asciiTheme="minorHAnsi" w:hAnsiTheme="minorHAnsi"/>
-        </w:rPr>
-      </w:pPr>
-    </w:p>
-    <w:p>
-      <w:pPr>
-        <w:jc w:val="both"/>
+        <w:t>1</w:t>
+      </w:r>
+      <w:r>
         <w:rPr>
           <w:rFonts w:asciiTheme="minorHAnsi" w:hAnsiTheme="minorHAnsi"/>
           <w:b/>
           <w:bCs/>
         </w:rPr>
-      </w:pPr>
+        <w:t xml:space="preserve">6 </w:t>
+      </w:r>
       <w:r>
         <w:rPr>
           <w:rFonts w:asciiTheme="minorHAnsi" w:hAnsiTheme="minorHAnsi"/>
           <w:b/>
           <w:bCs/>
         </w:rPr>
-        <w:t>FR</w:t>
-      </w:r>
-      <w:r>
+        <w:t>– Reset della password</w:t>
+      </w:r>
+    </w:p>
+    <w:p>
+      <w:pPr>
+        <w:jc w:val="both"/>
+        <w:rPr>
+          <w:rFonts w:asciiTheme="minorHAnsi" w:hAnsiTheme="minorHAnsi"/>
+        </w:rPr>
+      </w:pPr>
+      <w:r>
+        <w:rPr>
+          <w:rFonts w:asciiTheme="minorHAnsi" w:hAnsiTheme="minorHAnsi"/>
+        </w:rPr>
+        <w:t>Il sistema deve consentire ad un operatore di resettare la password dell’account di un lettore registrato, assegnando una nuova password provvisoria.</w:t>
+      </w:r>
+    </w:p>
+    <w:p>
+      <w:pPr>
+        <w:jc w:val="both"/>
+        <w:rPr>
+          <w:rFonts w:asciiTheme="minorHAnsi" w:hAnsiTheme="minorHAnsi"/>
+        </w:rPr>
+      </w:pPr>
+    </w:p>
+    <w:p>
+      <w:pPr>
+        <w:jc w:val="both"/>
         <w:rPr>
           <w:rFonts w:asciiTheme="minorHAnsi" w:hAnsiTheme="minorHAnsi"/>
           <w:b/>
           <w:bCs/>
         </w:rPr>
-        <w:t>1</w:t>
-      </w:r>
+      </w:pPr>
       <w:r>
         <w:rPr>
           <w:rFonts w:asciiTheme="minorHAnsi" w:hAnsiTheme="minorHAnsi"/>
           <w:b/>
           <w:bCs/>
         </w:rPr>
-        <w:t>7</w:t>
+        <w:t>FR</w:t>
       </w:r>
       <w:r>
         <w:rPr>
@@ -9248,7 +8071,7 @@
           <w:b/>
           <w:bCs/>
         </w:rPr>
-        <w:t xml:space="preserve"> – Cancellazione automatica delle prenotazioni</w:t>
+        <w:t>1</w:t>
       </w:r>
       <w:r>
         <w:rPr>
@@ -9256,62 +8079,78 @@
           <w:b/>
           <w:bCs/>
         </w:rPr>
-        <w:t xml:space="preserve"> scadute</w:t>
-      </w:r>
-    </w:p>
-    <w:p>
-      <w:pPr>
-        <w:jc w:val="both"/>
-        <w:rPr>
-          <w:rFonts w:asciiTheme="minorHAnsi" w:hAnsiTheme="minorHAnsi"/>
-        </w:rPr>
-      </w:pPr>
-      <w:r>
-        <w:rPr>
-          <w:rFonts w:asciiTheme="minorHAnsi" w:hAnsiTheme="minorHAnsi"/>
-        </w:rPr>
-        <w:t>Il sistema deve controllare periodicamente che le prenotazioni non siano scadute. Nel caso in cui lo siano deve eliminarle.</w:t>
-      </w:r>
-    </w:p>
-    <w:p>
-      <w:pPr>
-        <w:jc w:val="both"/>
-        <w:rPr>
-          <w:rFonts w:asciiTheme="minorHAnsi" w:hAnsiTheme="minorHAnsi"/>
-        </w:rPr>
-      </w:pPr>
-    </w:p>
-    <w:p>
-      <w:pPr>
-        <w:jc w:val="both"/>
+        <w:t>7</w:t>
+      </w:r>
+      <w:r>
         <w:rPr>
           <w:rFonts w:asciiTheme="minorHAnsi" w:hAnsiTheme="minorHAnsi"/>
           <w:b/>
           <w:bCs/>
         </w:rPr>
-      </w:pPr>
+        <w:t xml:space="preserve"> – Cancellazione automatica delle prenotazioni</w:t>
+      </w:r>
       <w:r>
         <w:rPr>
           <w:rFonts w:asciiTheme="minorHAnsi" w:hAnsiTheme="minorHAnsi"/>
           <w:b/>
           <w:bCs/>
         </w:rPr>
-        <w:t>FR1</w:t>
-      </w:r>
-      <w:r>
+        <w:t xml:space="preserve"> scadute</w:t>
+      </w:r>
+    </w:p>
+    <w:p>
+      <w:pPr>
+        <w:jc w:val="both"/>
+        <w:rPr>
+          <w:rFonts w:asciiTheme="minorHAnsi" w:hAnsiTheme="minorHAnsi"/>
+        </w:rPr>
+      </w:pPr>
+      <w:r>
+        <w:rPr>
+          <w:rFonts w:asciiTheme="minorHAnsi" w:hAnsiTheme="minorHAnsi"/>
+        </w:rPr>
+        <w:t>Il sistema deve controllare periodicamente che le prenotazioni non siano scadute. Nel caso in cui lo siano deve eliminarle.</w:t>
+      </w:r>
+    </w:p>
+    <w:p>
+      <w:pPr>
+        <w:jc w:val="both"/>
+        <w:rPr>
+          <w:rFonts w:asciiTheme="minorHAnsi" w:hAnsiTheme="minorHAnsi"/>
+        </w:rPr>
+      </w:pPr>
+    </w:p>
+    <w:p>
+      <w:pPr>
+        <w:jc w:val="both"/>
         <w:rPr>
           <w:rFonts w:asciiTheme="minorHAnsi" w:hAnsiTheme="minorHAnsi"/>
           <w:b/>
           <w:bCs/>
         </w:rPr>
-        <w:t>8</w:t>
-      </w:r>
+      </w:pPr>
       <w:r>
         <w:rPr>
           <w:rFonts w:asciiTheme="minorHAnsi" w:hAnsiTheme="minorHAnsi"/>
           <w:b/>
           <w:bCs/>
         </w:rPr>
+        <w:t>FR1</w:t>
+      </w:r>
+      <w:r>
+        <w:rPr>
+          <w:rFonts w:asciiTheme="minorHAnsi" w:hAnsiTheme="minorHAnsi"/>
+          <w:b/>
+          <w:bCs/>
+        </w:rPr>
+        <w:t>8</w:t>
+      </w:r>
+      <w:r>
+        <w:rPr>
+          <w:rFonts w:asciiTheme="minorHAnsi" w:hAnsiTheme="minorHAnsi"/>
+          <w:b/>
+          <w:bCs/>
+        </w:rPr>
         <w:t xml:space="preserve"> – Specializzazione delle pagine</w:t>
       </w:r>
     </w:p>
@@ -9326,7 +8165,6 @@
         <w:rPr>
           <w:rFonts w:asciiTheme="minorHAnsi" w:hAnsiTheme="minorHAnsi"/>
         </w:rPr>
-        <w:lastRenderedPageBreak/>
         <w:t>Pagine come l’home page devono mostrare contenuti diversi in base al ruolo dell’utente che accede ad esse.</w:t>
       </w:r>
     </w:p>
@@ -10007,6 +8845,7 @@
           <w:b/>
           <w:bCs/>
         </w:rPr>
+        <w:lastRenderedPageBreak/>
         <w:t xml:space="preserve">NFR12 - </w:t>
       </w:r>
       <w:r>
@@ -10061,7 +8900,6 @@
           <w:sz w:val="28"/>
           <w:szCs w:val="28"/>
         </w:rPr>
-        <w:lastRenderedPageBreak/>
         <w:t>I</w:t>
       </w:r>
       <w:r>
@@ -11141,7 +9979,7 @@
               <w:b w:val="0"/>
               <w:sz w:val="20"/>
             </w:rPr>
-            <w:t>3</w:t>
+            <w:t>5</w:t>
           </w:r>
         </w:p>
       </w:tc>
@@ -11220,7 +10058,7 @@
               <w:rFonts w:asciiTheme="minorHAnsi" w:hAnsiTheme="minorHAnsi"/>
               <w:sz w:val="20"/>
             </w:rPr>
-            <w:t>7</w:t>
+            <w:t>8</w:t>
           </w:r>
           <w:r>
             <w:rPr>
@@ -11309,7 +10147,7 @@
         <v:path o:extrusionok="f" gradientshapeok="t" o:connecttype="rect"/>
         <o:lock v:ext="edit" aspectratio="t"/>
       </v:shapetype>
-      <v:shape id="_x0000_i1025" type="#_x0000_t75" style="width:316.5pt;height:252pt" o:bullet="t" filled="t">
+      <v:shape id="_x0000_i1025" type="#_x0000_t75" style="width:317pt;height:252.45pt" o:bullet="t" filled="t">
         <v:fill color2="black"/>
         <v:imagedata r:id="rId1" o:title=""/>
       </v:shape>

</xml_diff>